<commit_message>
Referee pass 03/05/06/07: author details (IIMA email, New Delhi address, phone), AI statement per Doc, data/code availability statement (no GitHub link in anonymised files), associational wording in 03, softened 'discrimination' claim in 06, keywords trimmed to 6 (05/06/07; JDS 1-6), re-knitted on real TUS 2024 data
</commit_message>
<xml_diff>
--- a/submission/05_marriage_time_reallocation/package/manuscript_anonymised.docx
+++ b/submission/05_marriage_time_reallocation/package/manuscript_anonymised.docx
@@ -145,7 +145,7 @@
         <w:t xml:space="preserve"> </w:t>
       </w:r>
       <w:r>
-        <w:t xml:space="preserve">marriage, time use, unpaid work, gender, patrilocality, sleep, India</w:t>
+        <w:t xml:space="preserve">marriage, time use, unpaid work, gender, patrilocality, India</w:t>
       </w:r>
     </w:p>
     <w:bookmarkStart w:id="9" w:name="introduction"/>
@@ -10864,12 +10864,54 @@
     </w:p>
     <w:bookmarkEnd w:id="49"/>
     <w:bookmarkEnd w:id="50"/>
-    <w:bookmarkStart w:id="129" w:name="references"/>
+    <w:bookmarkStart w:id="51" w:name="data-and-code-availability"/>
     <w:p>
       <w:pPr>
         <w:pStyle w:val="Heading1"/>
       </w:pPr>
       <w:r>
+        <w:t xml:space="preserve">Data and code availability</w:t>
+      </w:r>
+    </w:p>
+    <w:p>
+      <w:pPr>
+        <w:pStyle w:val="FirstParagraph"/>
+      </w:pPr>
+      <w:r>
+        <w:t xml:space="preserve">The Time Use Survey 2024 unit-level data are distributed by the National</w:t>
+      </w:r>
+      <w:r>
+        <w:t xml:space="preserve"> </w:t>
+      </w:r>
+      <w:r>
+        <w:t xml:space="preserve">Statistics Office, Ministry of Statistics and Programme Implementation,</w:t>
+      </w:r>
+      <w:r>
+        <w:t xml:space="preserve"> </w:t>
+      </w:r>
+      <w:r>
+        <w:t xml:space="preserve">Government of India (microdata.gov.in, catalogue 236), to registered</w:t>
+      </w:r>
+      <w:r>
+        <w:t xml:space="preserve"> </w:t>
+      </w:r>
+      <w:r>
+        <w:t xml:space="preserve">users. Code available from the author on request; will be made public on</w:t>
+      </w:r>
+      <w:r>
+        <w:t xml:space="preserve"> </w:t>
+      </w:r>
+      <w:r>
+        <w:t xml:space="preserve">acceptance.</w:t>
+      </w:r>
+    </w:p>
+    <w:bookmarkEnd w:id="51"/>
+    <w:bookmarkStart w:id="130" w:name="references"/>
+    <w:p>
+      <w:pPr>
+        <w:pStyle w:val="Heading1"/>
+      </w:pPr>
+      <w:r>
         <w:t xml:space="preserve">References</w:t>
       </w:r>
     </w:p>
@@ -10877,8 +10919,8 @@
       <w:pPr>
         <w:pStyle w:val="FirstParagraph"/>
       </w:pPr>
-      <w:bookmarkStart w:id="51" w:name="refs"/>
-      <w:bookmarkEnd w:id="51"/>
+      <w:bookmarkStart w:id="52" w:name="refs"/>
+      <w:bookmarkEnd w:id="52"/>
     </w:p>
     <w:p>
       <w:pPr>
@@ -11003,7 +11045,7 @@
       <w:r>
         <w:t xml:space="preserve"> </w:t>
       </w:r>
-      <w:hyperlink r:id="rId52">
+      <w:hyperlink r:id="rId53">
         <w:r>
           <w:rPr>
             <w:rStyle w:val="Hyperlink"/>
@@ -11066,7 +11108,7 @@
       <w:r>
         <w:t xml:space="preserve"> </w:t>
       </w:r>
-      <w:hyperlink r:id="rId53">
+      <w:hyperlink r:id="rId54">
         <w:r>
           <w:rPr>
             <w:rStyle w:val="Hyperlink"/>
@@ -11131,7 +11173,7 @@
       <w:r>
         <w:t xml:space="preserve"> </w:t>
       </w:r>
-      <w:hyperlink r:id="rId54">
+      <w:hyperlink r:id="rId55">
         <w:r>
           <w:rPr>
             <w:rStyle w:val="Hyperlink"/>
@@ -11176,7 +11218,7 @@
       <w:r>
         <w:t xml:space="preserve"> </w:t>
       </w:r>
-      <w:hyperlink r:id="rId55">
+      <w:hyperlink r:id="rId56">
         <w:r>
           <w:rPr>
             <w:rStyle w:val="Hyperlink"/>
@@ -11250,7 +11292,7 @@
       <w:r>
         <w:t xml:space="preserve"> </w:t>
       </w:r>
-      <w:hyperlink r:id="rId56">
+      <w:hyperlink r:id="rId57">
         <w:r>
           <w:rPr>
             <w:rStyle w:val="Hyperlink"/>
@@ -11319,7 +11361,7 @@
       <w:r>
         <w:t xml:space="preserve"> </w:t>
       </w:r>
-      <w:hyperlink r:id="rId57">
+      <w:hyperlink r:id="rId58">
         <w:r>
           <w:rPr>
             <w:rStyle w:val="Hyperlink"/>
@@ -11442,7 +11484,7 @@
       <w:r>
         <w:t xml:space="preserve"> </w:t>
       </w:r>
-      <w:hyperlink r:id="rId58">
+      <w:hyperlink r:id="rId59">
         <w:r>
           <w:rPr>
             <w:rStyle w:val="Hyperlink"/>
@@ -11508,7 +11550,7 @@
       <w:r>
         <w:t xml:space="preserve"> </w:t>
       </w:r>
-      <w:hyperlink r:id="rId59">
+      <w:hyperlink r:id="rId60">
         <w:r>
           <w:rPr>
             <w:rStyle w:val="Hyperlink"/>
@@ -11559,7 +11601,7 @@
       <w:r>
         <w:t xml:space="preserve"> </w:t>
       </w:r>
-      <w:hyperlink r:id="rId60">
+      <w:hyperlink r:id="rId61">
         <w:r>
           <w:rPr>
             <w:rStyle w:val="Hyperlink"/>
@@ -11618,7 +11660,7 @@
       <w:r>
         <w:t xml:space="preserve"> </w:t>
       </w:r>
-      <w:hyperlink r:id="rId61">
+      <w:hyperlink r:id="rId62">
         <w:r>
           <w:rPr>
             <w:rStyle w:val="Hyperlink"/>
@@ -11669,7 +11711,7 @@
       <w:r>
         <w:t xml:space="preserve"> </w:t>
       </w:r>
-      <w:hyperlink r:id="rId62">
+      <w:hyperlink r:id="rId63">
         <w:r>
           <w:rPr>
             <w:rStyle w:val="Hyperlink"/>
@@ -11710,7 +11752,7 @@
       <w:r>
         <w:t xml:space="preserve"> </w:t>
       </w:r>
-      <w:hyperlink r:id="rId63">
+      <w:hyperlink r:id="rId64">
         <w:r>
           <w:rPr>
             <w:rStyle w:val="Hyperlink"/>
@@ -11775,7 +11817,7 @@
       <w:r>
         <w:t xml:space="preserve"> </w:t>
       </w:r>
-      <w:hyperlink r:id="rId64">
+      <w:hyperlink r:id="rId65">
         <w:r>
           <w:rPr>
             <w:rStyle w:val="Hyperlink"/>
@@ -11832,7 +11874,7 @@
       <w:r>
         <w:t xml:space="preserve"> </w:t>
       </w:r>
-      <w:hyperlink r:id="rId65">
+      <w:hyperlink r:id="rId66">
         <w:r>
           <w:rPr>
             <w:rStyle w:val="Hyperlink"/>
@@ -11883,7 +11925,7 @@
       <w:r>
         <w:t xml:space="preserve"> </w:t>
       </w:r>
-      <w:hyperlink r:id="rId66">
+      <w:hyperlink r:id="rId67">
         <w:r>
           <w:rPr>
             <w:rStyle w:val="Hyperlink"/>
@@ -11934,7 +11976,7 @@
       <w:r>
         <w:t xml:space="preserve"> </w:t>
       </w:r>
-      <w:hyperlink r:id="rId67">
+      <w:hyperlink r:id="rId68">
         <w:r>
           <w:rPr>
             <w:rStyle w:val="Hyperlink"/>
@@ -11991,7 +12033,7 @@
       <w:r>
         <w:t xml:space="preserve"> </w:t>
       </w:r>
-      <w:hyperlink r:id="rId68">
+      <w:hyperlink r:id="rId69">
         <w:r>
           <w:rPr>
             <w:rStyle w:val="Hyperlink"/>
@@ -12083,7 +12125,7 @@
       <w:r>
         <w:t xml:space="preserve"> </w:t>
       </w:r>
-      <w:hyperlink r:id="rId69">
+      <w:hyperlink r:id="rId70">
         <w:r>
           <w:rPr>
             <w:rStyle w:val="Hyperlink"/>
@@ -12134,7 +12176,7 @@
       <w:r>
         <w:t xml:space="preserve"> </w:t>
       </w:r>
-      <w:hyperlink r:id="rId70">
+      <w:hyperlink r:id="rId71">
         <w:r>
           <w:rPr>
             <w:rStyle w:val="Hyperlink"/>
@@ -12203,7 +12245,7 @@
       <w:r>
         <w:t xml:space="preserve"> </w:t>
       </w:r>
-      <w:hyperlink r:id="rId71">
+      <w:hyperlink r:id="rId72">
         <w:r>
           <w:rPr>
             <w:rStyle w:val="Hyperlink"/>
@@ -12268,7 +12310,7 @@
       <w:r>
         <w:t xml:space="preserve"> </w:t>
       </w:r>
-      <w:hyperlink r:id="rId72">
+      <w:hyperlink r:id="rId73">
         <w:r>
           <w:rPr>
             <w:rStyle w:val="Hyperlink"/>
@@ -12313,7 +12355,7 @@
       <w:r>
         <w:t xml:space="preserve"> </w:t>
       </w:r>
-      <w:hyperlink r:id="rId73">
+      <w:hyperlink r:id="rId74">
         <w:r>
           <w:rPr>
             <w:rStyle w:val="Hyperlink"/>
@@ -12378,7 +12420,7 @@
       <w:r>
         <w:t xml:space="preserve"> </w:t>
       </w:r>
-      <w:hyperlink r:id="rId74">
+      <w:hyperlink r:id="rId75">
         <w:r>
           <w:rPr>
             <w:rStyle w:val="Hyperlink"/>
@@ -12424,7 +12466,7 @@
       <w:r>
         <w:t xml:space="preserve"> </w:t>
       </w:r>
-      <w:hyperlink r:id="rId75">
+      <w:hyperlink r:id="rId76">
         <w:r>
           <w:rPr>
             <w:rStyle w:val="Hyperlink"/>
@@ -12475,7 +12517,7 @@
       <w:r>
         <w:t xml:space="preserve"> </w:t>
       </w:r>
-      <w:hyperlink r:id="rId76">
+      <w:hyperlink r:id="rId77">
         <w:r>
           <w:rPr>
             <w:rStyle w:val="Hyperlink"/>
@@ -12526,7 +12568,7 @@
       <w:r>
         <w:t xml:space="preserve"> </w:t>
       </w:r>
-      <w:hyperlink r:id="rId77">
+      <w:hyperlink r:id="rId78">
         <w:r>
           <w:rPr>
             <w:rStyle w:val="Hyperlink"/>
@@ -12580,7 +12622,7 @@
       <w:r>
         <w:t xml:space="preserve"> </w:t>
       </w:r>
-      <w:hyperlink r:id="rId78">
+      <w:hyperlink r:id="rId79">
         <w:r>
           <w:rPr>
             <w:rStyle w:val="Hyperlink"/>
@@ -12640,7 +12682,7 @@
       <w:r>
         <w:t xml:space="preserve"> </w:t>
       </w:r>
-      <w:hyperlink r:id="rId79">
+      <w:hyperlink r:id="rId80">
         <w:r>
           <w:rPr>
             <w:rStyle w:val="Hyperlink"/>
@@ -12697,7 +12739,7 @@
       <w:r>
         <w:t xml:space="preserve"> </w:t>
       </w:r>
-      <w:hyperlink r:id="rId80">
+      <w:hyperlink r:id="rId81">
         <w:r>
           <w:rPr>
             <w:rStyle w:val="Hyperlink"/>
@@ -12771,7 +12813,7 @@
       <w:r>
         <w:t xml:space="preserve"> </w:t>
       </w:r>
-      <w:hyperlink r:id="rId81">
+      <w:hyperlink r:id="rId82">
         <w:r>
           <w:rPr>
             <w:rStyle w:val="Hyperlink"/>
@@ -12845,7 +12887,7 @@
       <w:r>
         <w:t xml:space="preserve"> </w:t>
       </w:r>
-      <w:hyperlink r:id="rId82">
+      <w:hyperlink r:id="rId83">
         <w:r>
           <w:rPr>
             <w:rStyle w:val="Hyperlink"/>
@@ -12917,7 +12959,7 @@
       <w:r>
         <w:t xml:space="preserve"> </w:t>
       </w:r>
-      <w:hyperlink r:id="rId83">
+      <w:hyperlink r:id="rId84">
         <w:r>
           <w:rPr>
             <w:rStyle w:val="Hyperlink"/>
@@ -12991,7 +13033,7 @@
       <w:r>
         <w:t xml:space="preserve"> </w:t>
       </w:r>
-      <w:hyperlink r:id="rId84">
+      <w:hyperlink r:id="rId85">
         <w:r>
           <w:rPr>
             <w:rStyle w:val="Hyperlink"/>
@@ -13048,7 +13090,7 @@
       <w:r>
         <w:t xml:space="preserve"> </w:t>
       </w:r>
-      <w:hyperlink r:id="rId85">
+      <w:hyperlink r:id="rId86">
         <w:r>
           <w:rPr>
             <w:rStyle w:val="Hyperlink"/>
@@ -13144,7 +13186,7 @@
       <w:r>
         <w:t xml:space="preserve"> </w:t>
       </w:r>
-      <w:hyperlink r:id="rId86">
+      <w:hyperlink r:id="rId87">
         <w:r>
           <w:rPr>
             <w:rStyle w:val="Hyperlink"/>
@@ -13236,7 +13278,7 @@
       <w:r>
         <w:t xml:space="preserve"> </w:t>
       </w:r>
-      <w:hyperlink r:id="rId87">
+      <w:hyperlink r:id="rId88">
         <w:r>
           <w:rPr>
             <w:rStyle w:val="Hyperlink"/>
@@ -13287,7 +13329,7 @@
       <w:r>
         <w:t xml:space="preserve"> </w:t>
       </w:r>
-      <w:hyperlink r:id="rId88">
+      <w:hyperlink r:id="rId89">
         <w:r>
           <w:rPr>
             <w:rStyle w:val="Hyperlink"/>
@@ -13352,7 +13394,7 @@
       <w:r>
         <w:t xml:space="preserve"> </w:t>
       </w:r>
-      <w:hyperlink r:id="rId89">
+      <w:hyperlink r:id="rId90">
         <w:r>
           <w:rPr>
             <w:rStyle w:val="Hyperlink"/>
@@ -13403,7 +13445,7 @@
       <w:r>
         <w:t xml:space="preserve"> </w:t>
       </w:r>
-      <w:hyperlink r:id="rId90">
+      <w:hyperlink r:id="rId91">
         <w:r>
           <w:rPr>
             <w:rStyle w:val="Hyperlink"/>
@@ -13454,7 +13496,7 @@
       <w:r>
         <w:t xml:space="preserve"> </w:t>
       </w:r>
-      <w:hyperlink r:id="rId91">
+      <w:hyperlink r:id="rId92">
         <w:r>
           <w:rPr>
             <w:rStyle w:val="Hyperlink"/>
@@ -13519,7 +13561,7 @@
       <w:r>
         <w:t xml:space="preserve"> </w:t>
       </w:r>
-      <w:hyperlink r:id="rId92">
+      <w:hyperlink r:id="rId93">
         <w:r>
           <w:rPr>
             <w:rStyle w:val="Hyperlink"/>
@@ -13579,7 +13621,7 @@
       <w:r>
         <w:t xml:space="preserve"> </w:t>
       </w:r>
-      <w:hyperlink r:id="rId93">
+      <w:hyperlink r:id="rId94">
         <w:r>
           <w:rPr>
             <w:rStyle w:val="Hyperlink"/>
@@ -13630,7 +13672,7 @@
       <w:r>
         <w:t xml:space="preserve"> </w:t>
       </w:r>
-      <w:hyperlink r:id="rId94">
+      <w:hyperlink r:id="rId95">
         <w:r>
           <w:rPr>
             <w:rStyle w:val="Hyperlink"/>
@@ -13695,7 +13737,7 @@
       <w:r>
         <w:t xml:space="preserve"> </w:t>
       </w:r>
-      <w:hyperlink r:id="rId95">
+      <w:hyperlink r:id="rId96">
         <w:r>
           <w:rPr>
             <w:rStyle w:val="Hyperlink"/>
@@ -13760,7 +13802,7 @@
       <w:r>
         <w:t xml:space="preserve"> </w:t>
       </w:r>
-      <w:hyperlink r:id="rId96">
+      <w:hyperlink r:id="rId97">
         <w:r>
           <w:rPr>
             <w:rStyle w:val="Hyperlink"/>
@@ -13817,7 +13859,7 @@
       <w:r>
         <w:t xml:space="preserve"> </w:t>
       </w:r>
-      <w:hyperlink r:id="rId97">
+      <w:hyperlink r:id="rId98">
         <w:r>
           <w:rPr>
             <w:rStyle w:val="Hyperlink"/>
@@ -13897,7 +13939,7 @@
       <w:r>
         <w:t xml:space="preserve"> </w:t>
       </w:r>
-      <w:hyperlink r:id="rId98">
+      <w:hyperlink r:id="rId99">
         <w:r>
           <w:rPr>
             <w:rStyle w:val="Hyperlink"/>
@@ -13957,7 +13999,7 @@
       <w:r>
         <w:t xml:space="preserve"> </w:t>
       </w:r>
-      <w:hyperlink r:id="rId99">
+      <w:hyperlink r:id="rId100">
         <w:r>
           <w:rPr>
             <w:rStyle w:val="Hyperlink"/>
@@ -14060,7 +14102,7 @@
       <w:r>
         <w:t xml:space="preserve"> </w:t>
       </w:r>
-      <w:hyperlink r:id="rId100">
+      <w:hyperlink r:id="rId101">
         <w:r>
           <w:rPr>
             <w:rStyle w:val="Hyperlink"/>
@@ -14119,7 +14161,7 @@
       <w:r>
         <w:t xml:space="preserve"> </w:t>
       </w:r>
-      <w:hyperlink r:id="rId101">
+      <w:hyperlink r:id="rId102">
         <w:r>
           <w:rPr>
             <w:rStyle w:val="Hyperlink"/>
@@ -14193,7 +14235,7 @@
       <w:r>
         <w:t xml:space="preserve"> </w:t>
       </w:r>
-      <w:hyperlink r:id="rId102">
+      <w:hyperlink r:id="rId103">
         <w:r>
           <w:rPr>
             <w:rStyle w:val="Hyperlink"/>
@@ -14244,7 +14286,7 @@
       <w:r>
         <w:t xml:space="preserve"> </w:t>
       </w:r>
-      <w:hyperlink r:id="rId103">
+      <w:hyperlink r:id="rId104">
         <w:r>
           <w:rPr>
             <w:rStyle w:val="Hyperlink"/>
@@ -14381,7 +14423,7 @@
       <w:r>
         <w:t xml:space="preserve"> </w:t>
       </w:r>
-      <w:hyperlink r:id="rId104">
+      <w:hyperlink r:id="rId105">
         <w:r>
           <w:rPr>
             <w:rStyle w:val="Hyperlink"/>
@@ -14432,7 +14474,7 @@
       <w:r>
         <w:t xml:space="preserve"> </w:t>
       </w:r>
-      <w:hyperlink r:id="rId105">
+      <w:hyperlink r:id="rId106">
         <w:r>
           <w:rPr>
             <w:rStyle w:val="Hyperlink"/>
@@ -14489,7 +14531,7 @@
       <w:r>
         <w:t xml:space="preserve"> </w:t>
       </w:r>
-      <w:hyperlink r:id="rId106">
+      <w:hyperlink r:id="rId107">
         <w:r>
           <w:rPr>
             <w:rStyle w:val="Hyperlink"/>
@@ -14546,7 +14588,7 @@
       <w:r>
         <w:t xml:space="preserve"> </w:t>
       </w:r>
-      <w:hyperlink r:id="rId107">
+      <w:hyperlink r:id="rId108">
         <w:r>
           <w:rPr>
             <w:rStyle w:val="Hyperlink"/>
@@ -14597,7 +14639,7 @@
       <w:r>
         <w:t xml:space="preserve"> </w:t>
       </w:r>
-      <w:hyperlink r:id="rId108">
+      <w:hyperlink r:id="rId109">
         <w:r>
           <w:rPr>
             <w:rStyle w:val="Hyperlink"/>
@@ -14674,7 +14716,7 @@
       <w:r>
         <w:t xml:space="preserve"> </w:t>
       </w:r>
-      <w:hyperlink r:id="rId109">
+      <w:hyperlink r:id="rId110">
         <w:r>
           <w:rPr>
             <w:rStyle w:val="Hyperlink"/>
@@ -14725,7 +14767,7 @@
       <w:r>
         <w:t xml:space="preserve"> </w:t>
       </w:r>
-      <w:hyperlink r:id="rId110">
+      <w:hyperlink r:id="rId111">
         <w:r>
           <w:rPr>
             <w:rStyle w:val="Hyperlink"/>
@@ -14776,7 +14818,7 @@
       <w:r>
         <w:t xml:space="preserve"> </w:t>
       </w:r>
-      <w:hyperlink r:id="rId111">
+      <w:hyperlink r:id="rId112">
         <w:r>
           <w:rPr>
             <w:rStyle w:val="Hyperlink"/>
@@ -14836,7 +14878,7 @@
       <w:r>
         <w:t xml:space="preserve"> </w:t>
       </w:r>
-      <w:hyperlink r:id="rId112">
+      <w:hyperlink r:id="rId113">
         <w:r>
           <w:rPr>
             <w:rStyle w:val="Hyperlink"/>
@@ -14949,7 +14991,7 @@
       <w:r>
         <w:t xml:space="preserve"> </w:t>
       </w:r>
-      <w:hyperlink r:id="rId113">
+      <w:hyperlink r:id="rId114">
         <w:r>
           <w:rPr>
             <w:rStyle w:val="Hyperlink"/>
@@ -15000,7 +15042,7 @@
       <w:r>
         <w:t xml:space="preserve"> </w:t>
       </w:r>
-      <w:hyperlink r:id="rId114">
+      <w:hyperlink r:id="rId115">
         <w:r>
           <w:rPr>
             <w:rStyle w:val="Hyperlink"/>
@@ -15078,7 +15120,7 @@
       <w:r>
         <w:t xml:space="preserve"> </w:t>
       </w:r>
-      <w:hyperlink r:id="rId115">
+      <w:hyperlink r:id="rId116">
         <w:r>
           <w:rPr>
             <w:rStyle w:val="Hyperlink"/>
@@ -15250,7 +15292,7 @@
       <w:r>
         <w:t xml:space="preserve"> </w:t>
       </w:r>
-      <w:hyperlink r:id="rId116">
+      <w:hyperlink r:id="rId117">
         <w:r>
           <w:rPr>
             <w:rStyle w:val="Hyperlink"/>
@@ -15315,7 +15357,7 @@
       <w:r>
         <w:t xml:space="preserve"> </w:t>
       </w:r>
-      <w:hyperlink r:id="rId117">
+      <w:hyperlink r:id="rId118">
         <w:r>
           <w:rPr>
             <w:rStyle w:val="Hyperlink"/>
@@ -15426,7 +15468,7 @@
       <w:r>
         <w:t xml:space="preserve"> </w:t>
       </w:r>
-      <w:hyperlink r:id="rId118">
+      <w:hyperlink r:id="rId119">
         <w:r>
           <w:rPr>
             <w:rStyle w:val="Hyperlink"/>
@@ -15477,7 +15519,7 @@
       <w:r>
         <w:t xml:space="preserve"> </w:t>
       </w:r>
-      <w:hyperlink r:id="rId119">
+      <w:hyperlink r:id="rId120">
         <w:r>
           <w:rPr>
             <w:rStyle w:val="Hyperlink"/>
@@ -15528,7 +15570,7 @@
       <w:r>
         <w:t xml:space="preserve"> </w:t>
       </w:r>
-      <w:hyperlink r:id="rId120">
+      <w:hyperlink r:id="rId121">
         <w:r>
           <w:rPr>
             <w:rStyle w:val="Hyperlink"/>
@@ -15603,7 +15645,7 @@
       <w:r>
         <w:t xml:space="preserve"> </w:t>
       </w:r>
-      <w:hyperlink r:id="rId121">
+      <w:hyperlink r:id="rId122">
         <w:r>
           <w:rPr>
             <w:rStyle w:val="Hyperlink"/>
@@ -15660,7 +15702,7 @@
       <w:r>
         <w:t xml:space="preserve"> </w:t>
       </w:r>
-      <w:hyperlink r:id="rId122">
+      <w:hyperlink r:id="rId123">
         <w:r>
           <w:rPr>
             <w:rStyle w:val="Hyperlink"/>
@@ -15711,7 +15753,7 @@
       <w:r>
         <w:t xml:space="preserve"> </w:t>
       </w:r>
-      <w:hyperlink r:id="rId123">
+      <w:hyperlink r:id="rId124">
         <w:r>
           <w:rPr>
             <w:rStyle w:val="Hyperlink"/>
@@ -15776,7 +15818,7 @@
       <w:r>
         <w:t xml:space="preserve"> </w:t>
       </w:r>
-      <w:hyperlink r:id="rId124">
+      <w:hyperlink r:id="rId125">
         <w:r>
           <w:rPr>
             <w:rStyle w:val="Hyperlink"/>
@@ -15833,7 +15875,7 @@
       <w:r>
         <w:t xml:space="preserve"> </w:t>
       </w:r>
-      <w:hyperlink r:id="rId125">
+      <w:hyperlink r:id="rId126">
         <w:r>
           <w:rPr>
             <w:rStyle w:val="Hyperlink"/>
@@ -15952,7 +15994,7 @@
       <w:r>
         <w:t xml:space="preserve"> </w:t>
       </w:r>
-      <w:hyperlink r:id="rId126">
+      <w:hyperlink r:id="rId127">
         <w:r>
           <w:rPr>
             <w:rStyle w:val="Hyperlink"/>
@@ -15997,7 +16039,7 @@
       <w:r>
         <w:t xml:space="preserve"> </w:t>
       </w:r>
-      <w:hyperlink r:id="rId127">
+      <w:hyperlink r:id="rId128">
         <w:r>
           <w:rPr>
             <w:rStyle w:val="Hyperlink"/>
@@ -16056,7 +16098,7 @@
       <w:r>
         <w:t xml:space="preserve"> </w:t>
       </w:r>
-      <w:hyperlink r:id="rId128">
+      <w:hyperlink r:id="rId129">
         <w:r>
           <w:rPr>
             <w:rStyle w:val="Hyperlink"/>
@@ -16065,7 +16107,7 @@
         </w:r>
       </w:hyperlink>
     </w:p>
-    <w:bookmarkEnd w:id="129"/>
+    <w:bookmarkEnd w:id="130"/>
     <w:sectPr>
       <w:footnotePr>
         <w:numRestart w:val="eachSect"/>

</xml_diff>

<commit_message>
Rebuilt packages 03/05/06/07 (AI declaration, diary accounting); 07 trimmed under 10k
</commit_message>
<xml_diff>
--- a/submission/05_marriage_time_reallocation/package/manuscript_anonymised.docx
+++ b/submission/05_marriage_time_reallocation/package/manuscript_anonymised.docx
@@ -2238,43 +2238,55 @@
         <w:t xml:space="preserve"> </w:t>
       </w:r>
       <w:r>
-        <w:t xml:space="preserve">the person-day, so each diary partitions 1,440 minutes; 100.0% of</w:t>
-      </w:r>
-      <w:r>
-        <w:t xml:space="preserve"> </w:t>
-      </w:r>
-      <w:r>
-        <w:t xml:space="preserve">diaries do so exactly. Some diaries are reported by another household</w:t>
-      </w:r>
-      <w:r>
-        <w:t xml:space="preserve"> </w:t>
-      </w:r>
-      <w:r>
-        <w:t xml:space="preserve">member; I control for proxy reporting and drop proxy diaries in a</w:t>
-      </w:r>
-      <w:r>
-        <w:t xml:space="preserve"> </w:t>
-      </w:r>
-      <w:r>
-        <w:t xml:space="preserve">robustness check. All estimates use the survey multipliers, and standard</w:t>
-      </w:r>
-      <w:r>
-        <w:t xml:space="preserve"> </w:t>
-      </w:r>
-      <w:r>
-        <w:t xml:space="preserve">errors are clustered on the first-stage unit, the primary sampling unit</w:t>
-      </w:r>
-      <w:r>
-        <w:t xml:space="preserve"> </w:t>
-      </w:r>
-      <w:r>
-        <w:t xml:space="preserve">(;</w:t>
-      </w:r>
-      <w:r>
-        <w:t xml:space="preserve"> </w:t>
-      </w:r>
-      <w:r>
-        <w:t xml:space="preserve">).</w:t>
+        <w:t xml:space="preserve">the person-day, so all but 5 of the 450,457 diaries partition exactly</w:t>
+      </w:r>
+      <w:r>
+        <w:t xml:space="preserve"> </w:t>
+      </w:r>
+      <w:r>
+        <w:t xml:space="preserve">1,440 minutes. The roster lists 454,192 persons aged six and above;</w:t>
+      </w:r>
+      <w:r>
+        <w:t xml:space="preserve"> </w:t>
+      </w:r>
+      <w:r>
+        <w:t xml:space="preserve">3,735 of them have no diary records in the file, which leaves the</w:t>
+      </w:r>
+      <w:r>
+        <w:t xml:space="preserve"> </w:t>
+      </w:r>
+      <w:r>
+        <w:t xml:space="preserve">450,457 diaries, and the 49 diaries of third-gender respondents are</w:t>
+      </w:r>
+      <w:r>
+        <w:t xml:space="preserve"> </w:t>
+      </w:r>
+      <w:r>
+        <w:t xml:space="preserve">excluded from the comparisons of women and men. Some diaries are</w:t>
+      </w:r>
+      <w:r>
+        <w:t xml:space="preserve"> </w:t>
+      </w:r>
+      <w:r>
+        <w:t xml:space="preserve">reported by another household member; I control for proxy reporting and</w:t>
+      </w:r>
+      <w:r>
+        <w:t xml:space="preserve"> </w:t>
+      </w:r>
+      <w:r>
+        <w:t xml:space="preserve">drop proxy diaries in a robustness check. All estimates use the survey</w:t>
+      </w:r>
+      <w:r>
+        <w:t xml:space="preserve"> </w:t>
+      </w:r>
+      <w:r>
+        <w:t xml:space="preserve">multipliers, and standard errors are clustered on the first-stage unit,</w:t>
+      </w:r>
+      <w:r>
+        <w:t xml:space="preserve"> </w:t>
+      </w:r>
+      <w:r>
+        <w:t xml:space="preserve">the primary sampling unit (; ).</w:t>
       </w:r>
     </w:p>
     <w:bookmarkEnd w:id="16"/>
@@ -2912,13 +2924,13 @@
         <w:t xml:space="preserve"> </w:t>
       </w:r>
       <w:r>
-        <w:t xml:space="preserve">minutes for every diary and every regression uses the same sample,</w:t>
-      </w:r>
-      <w:r>
-        <w:t xml:space="preserve"> </w:t>
-      </w:r>
-      <w:r>
-        <w:t xml:space="preserve">weights and regressors,</w:t>
+        <w:t xml:space="preserve">minutes for all but 5 of the 450,457 diaries and every regression uses</w:t>
+      </w:r>
+      <w:r>
+        <w:t xml:space="preserve"> </w:t>
+      </w:r>
+      <w:r>
+        <w:t xml:space="preserve">the same sample, weights and regressors,</w:t>
       </w:r>
       <w:r>
         <w:t xml:space="preserve"> </w:t>
@@ -2977,19 +2989,25 @@
         <w:t xml:space="preserve"> </w:t>
       </w:r>
       <w:r>
-        <w:t xml:space="preserve">exactly. The</w:t>
-      </w:r>
-      <w:r>
-        <w:t xml:space="preserve"> </w:t>
-      </w:r>
-      <w:r>
-        <w:t xml:space="preserve">coefficients decompose the adjusted married–never-married difference</w:t>
-      </w:r>
-      <w:r>
-        <w:t xml:space="preserve"> </w:t>
-      </w:r>
-      <w:r>
-        <w:t xml:space="preserve">into its sources. A pooled model with a married</w:t>
+        <w:t xml:space="preserve">up</w:t>
+      </w:r>
+      <w:r>
+        <w:t xml:space="preserve"> </w:t>
+      </w:r>
+      <w:r>
+        <w:t xml:space="preserve">to rounding. The coefficients decompose the adjusted</w:t>
+      </w:r>
+      <w:r>
+        <w:t xml:space="preserve"> </w:t>
+      </w:r>
+      <w:r>
+        <w:t xml:space="preserve">married–never-married difference into its sources. A pooled model with</w:t>
+      </w:r>
+      <w:r>
+        <w:t xml:space="preserve"> </w:t>
+      </w:r>
+      <w:r>
+        <w:t xml:space="preserve">a married</w:t>
       </w:r>
       <w:r>
         <w:t xml:space="preserve"> </w:t>
@@ -3006,43 +3024,43 @@
         <w:t xml:space="preserve"> </w:t>
       </w:r>
       <w:r>
-        <w:t xml:space="preserve">woman</w:t>
-      </w:r>
-      <w:r>
-        <w:t xml:space="preserve"> </w:t>
-      </w:r>
-      <w:r>
-        <w:t xml:space="preserve">interaction and sex-specific age, state and day effects tests whether</w:t>
-      </w:r>
-      <w:r>
-        <w:t xml:space="preserve"> </w:t>
-      </w:r>
-      <w:r>
-        <w:t xml:space="preserve">the unpaid-work difference is gendered. Heterogeneity by residence</w:t>
-      </w:r>
-      <w:r>
-        <w:t xml:space="preserve"> </w:t>
-      </w:r>
-      <w:r>
-        <w:t xml:space="preserve">replaces the married indicator with indicators for the three residence</w:t>
-      </w:r>
-      <w:r>
-        <w:t xml:space="preserve"> </w:t>
-      </w:r>
-      <w:r>
-        <w:t xml:space="preserve">types, each compared with the same never-married group. A model</w:t>
-      </w:r>
-      <w:r>
-        <w:t xml:space="preserve"> </w:t>
-      </w:r>
-      <w:r>
-        <w:t xml:space="preserve">restricted to married women tests whether daughters-in-law differ from</w:t>
-      </w:r>
-      <w:r>
-        <w:t xml:space="preserve"> </w:t>
-      </w:r>
-      <w:r>
-        <w:t xml:space="preserve">wives in households without a parent generation.</w:t>
+        <w:t xml:space="preserve">woman interaction and sex-specific age, state and</w:t>
+      </w:r>
+      <w:r>
+        <w:t xml:space="preserve"> </w:t>
+      </w:r>
+      <w:r>
+        <w:t xml:space="preserve">day effects tests whether the unpaid-work difference is gendered.</w:t>
+      </w:r>
+      <w:r>
+        <w:t xml:space="preserve"> </w:t>
+      </w:r>
+      <w:r>
+        <w:t xml:space="preserve">Heterogeneity by residence replaces the married indicator with</w:t>
+      </w:r>
+      <w:r>
+        <w:t xml:space="preserve"> </w:t>
+      </w:r>
+      <w:r>
+        <w:t xml:space="preserve">indicators for the three residence types, each compared with the same</w:t>
+      </w:r>
+      <w:r>
+        <w:t xml:space="preserve"> </w:t>
+      </w:r>
+      <w:r>
+        <w:t xml:space="preserve">never-married group. A model restricted to married women tests whether</w:t>
+      </w:r>
+      <w:r>
+        <w:t xml:space="preserve"> </w:t>
+      </w:r>
+      <w:r>
+        <w:t xml:space="preserve">daughters-in-law differ from wives in households without a parent</w:t>
+      </w:r>
+      <w:r>
+        <w:t xml:space="preserve"> </w:t>
+      </w:r>
+      <w:r>
+        <w:t xml:space="preserve">generation.</w:t>
       </w:r>
     </w:p>
     <w:p>
@@ -10847,29 +10865,77 @@
         <w:t xml:space="preserve"> </w:t>
       </w:r>
       <w:r>
-        <w:t xml:space="preserve">budget. They are more likely to succeed if they also reduce the domestic</w:t>
-      </w:r>
-      <w:r>
-        <w:t xml:space="preserve"> </w:t>
-      </w:r>
-      <w:r>
-        <w:t xml:space="preserve">work that marriage adds, since that work otherwise comes out of women’s</w:t>
-      </w:r>
-      <w:r>
-        <w:t xml:space="preserve"> </w:t>
-      </w:r>
-      <w:r>
-        <w:t xml:space="preserve">paid work, learning, leisure or sleep.</w:t>
+        <w:t xml:space="preserve">budget. They are more likely to succeed if they also reduce the unpaid</w:t>
+      </w:r>
+      <w:r>
+        <w:t xml:space="preserve"> </w:t>
+      </w:r>
+      <w:r>
+        <w:t xml:space="preserve">domestic and care work that marriage adds, since that work otherwise</w:t>
+      </w:r>
+      <w:r>
+        <w:t xml:space="preserve"> </w:t>
+      </w:r>
+      <w:r>
+        <w:t xml:space="preserve">comes out of women’s paid work, learning, leisure or sleep.</w:t>
       </w:r>
     </w:p>
     <w:bookmarkEnd w:id="49"/>
     <w:bookmarkEnd w:id="50"/>
-    <w:bookmarkStart w:id="51" w:name="data-and-code-availability"/>
+    <w:bookmarkStart w:id="51" w:name="declaration-of-generative-ai-use"/>
     <w:p>
       <w:pPr>
         <w:pStyle w:val="Heading1"/>
       </w:pPr>
       <w:r>
+        <w:t xml:space="preserve">Declaration of generative AI</w:t>
+      </w:r>
+      <w:r>
+        <w:t xml:space="preserve"> </w:t>
+      </w:r>
+      <w:r>
+        <w:t xml:space="preserve">use</w:t>
+      </w:r>
+    </w:p>
+    <w:p>
+      <w:pPr>
+        <w:pStyle w:val="FirstParagraph"/>
+      </w:pPr>
+      <w:r>
+        <w:t xml:space="preserve">Generative AI tools (Claude, Anthropic; and other AI assistants) were</w:t>
+      </w:r>
+      <w:r>
+        <w:t xml:space="preserve"> </w:t>
+      </w:r>
+      <w:r>
+        <w:t xml:space="preserve">used to assist with writing and debugging analysis code, checking</w:t>
+      </w:r>
+      <w:r>
+        <w:t xml:space="preserve"> </w:t>
+      </w:r>
+      <w:r>
+        <w:t xml:space="preserve">references, and drafting and editing text. The author reviewed and</w:t>
+      </w:r>
+      <w:r>
+        <w:t xml:space="preserve"> </w:t>
+      </w:r>
+      <w:r>
+        <w:t xml:space="preserve">verified all analyses, results, and text, and takes full responsibility</w:t>
+      </w:r>
+      <w:r>
+        <w:t xml:space="preserve"> </w:t>
+      </w:r>
+      <w:r>
+        <w:t xml:space="preserve">for the content.</w:t>
+      </w:r>
+    </w:p>
+    <w:bookmarkEnd w:id="51"/>
+    <w:bookmarkStart w:id="52" w:name="data-and-code-availability"/>
+    <w:p>
+      <w:pPr>
+        <w:pStyle w:val="Heading1"/>
+      </w:pPr>
+      <w:r>
         <w:t xml:space="preserve">Data and code availability</w:t>
       </w:r>
     </w:p>
@@ -10905,8 +10971,8 @@
         <w:t xml:space="preserve">acceptance.</w:t>
       </w:r>
     </w:p>
-    <w:bookmarkEnd w:id="51"/>
-    <w:bookmarkStart w:id="130" w:name="references"/>
+    <w:bookmarkEnd w:id="52"/>
+    <w:bookmarkStart w:id="131" w:name="references"/>
     <w:p>
       <w:pPr>
         <w:pStyle w:val="Heading1"/>
@@ -10919,8 +10985,8 @@
       <w:pPr>
         <w:pStyle w:val="FirstParagraph"/>
       </w:pPr>
-      <w:bookmarkStart w:id="52" w:name="refs"/>
-      <w:bookmarkEnd w:id="52"/>
+      <w:bookmarkStart w:id="53" w:name="refs"/>
+      <w:bookmarkEnd w:id="53"/>
     </w:p>
     <w:p>
       <w:pPr>
@@ -11045,7 +11111,7 @@
       <w:r>
         <w:t xml:space="preserve"> </w:t>
       </w:r>
-      <w:hyperlink r:id="rId53">
+      <w:hyperlink r:id="rId54">
         <w:r>
           <w:rPr>
             <w:rStyle w:val="Hyperlink"/>
@@ -11108,7 +11174,7 @@
       <w:r>
         <w:t xml:space="preserve"> </w:t>
       </w:r>
-      <w:hyperlink r:id="rId54">
+      <w:hyperlink r:id="rId55">
         <w:r>
           <w:rPr>
             <w:rStyle w:val="Hyperlink"/>
@@ -11173,7 +11239,7 @@
       <w:r>
         <w:t xml:space="preserve"> </w:t>
       </w:r>
-      <w:hyperlink r:id="rId55">
+      <w:hyperlink r:id="rId56">
         <w:r>
           <w:rPr>
             <w:rStyle w:val="Hyperlink"/>
@@ -11218,7 +11284,7 @@
       <w:r>
         <w:t xml:space="preserve"> </w:t>
       </w:r>
-      <w:hyperlink r:id="rId56">
+      <w:hyperlink r:id="rId57">
         <w:r>
           <w:rPr>
             <w:rStyle w:val="Hyperlink"/>
@@ -11292,7 +11358,7 @@
       <w:r>
         <w:t xml:space="preserve"> </w:t>
       </w:r>
-      <w:hyperlink r:id="rId57">
+      <w:hyperlink r:id="rId58">
         <w:r>
           <w:rPr>
             <w:rStyle w:val="Hyperlink"/>
@@ -11361,7 +11427,7 @@
       <w:r>
         <w:t xml:space="preserve"> </w:t>
       </w:r>
-      <w:hyperlink r:id="rId58">
+      <w:hyperlink r:id="rId59">
         <w:r>
           <w:rPr>
             <w:rStyle w:val="Hyperlink"/>
@@ -11484,7 +11550,7 @@
       <w:r>
         <w:t xml:space="preserve"> </w:t>
       </w:r>
-      <w:hyperlink r:id="rId59">
+      <w:hyperlink r:id="rId60">
         <w:r>
           <w:rPr>
             <w:rStyle w:val="Hyperlink"/>
@@ -11550,7 +11616,7 @@
       <w:r>
         <w:t xml:space="preserve"> </w:t>
       </w:r>
-      <w:hyperlink r:id="rId60">
+      <w:hyperlink r:id="rId61">
         <w:r>
           <w:rPr>
             <w:rStyle w:val="Hyperlink"/>
@@ -11601,7 +11667,7 @@
       <w:r>
         <w:t xml:space="preserve"> </w:t>
       </w:r>
-      <w:hyperlink r:id="rId61">
+      <w:hyperlink r:id="rId62">
         <w:r>
           <w:rPr>
             <w:rStyle w:val="Hyperlink"/>
@@ -11660,7 +11726,7 @@
       <w:r>
         <w:t xml:space="preserve"> </w:t>
       </w:r>
-      <w:hyperlink r:id="rId62">
+      <w:hyperlink r:id="rId63">
         <w:r>
           <w:rPr>
             <w:rStyle w:val="Hyperlink"/>
@@ -11711,7 +11777,7 @@
       <w:r>
         <w:t xml:space="preserve"> </w:t>
       </w:r>
-      <w:hyperlink r:id="rId63">
+      <w:hyperlink r:id="rId64">
         <w:r>
           <w:rPr>
             <w:rStyle w:val="Hyperlink"/>
@@ -11752,7 +11818,7 @@
       <w:r>
         <w:t xml:space="preserve"> </w:t>
       </w:r>
-      <w:hyperlink r:id="rId64">
+      <w:hyperlink r:id="rId65">
         <w:r>
           <w:rPr>
             <w:rStyle w:val="Hyperlink"/>
@@ -11817,7 +11883,7 @@
       <w:r>
         <w:t xml:space="preserve"> </w:t>
       </w:r>
-      <w:hyperlink r:id="rId65">
+      <w:hyperlink r:id="rId66">
         <w:r>
           <w:rPr>
             <w:rStyle w:val="Hyperlink"/>
@@ -11874,7 +11940,7 @@
       <w:r>
         <w:t xml:space="preserve"> </w:t>
       </w:r>
-      <w:hyperlink r:id="rId66">
+      <w:hyperlink r:id="rId67">
         <w:r>
           <w:rPr>
             <w:rStyle w:val="Hyperlink"/>
@@ -11925,7 +11991,7 @@
       <w:r>
         <w:t xml:space="preserve"> </w:t>
       </w:r>
-      <w:hyperlink r:id="rId67">
+      <w:hyperlink r:id="rId68">
         <w:r>
           <w:rPr>
             <w:rStyle w:val="Hyperlink"/>
@@ -11976,7 +12042,7 @@
       <w:r>
         <w:t xml:space="preserve"> </w:t>
       </w:r>
-      <w:hyperlink r:id="rId68">
+      <w:hyperlink r:id="rId69">
         <w:r>
           <w:rPr>
             <w:rStyle w:val="Hyperlink"/>
@@ -12033,7 +12099,7 @@
       <w:r>
         <w:t xml:space="preserve"> </w:t>
       </w:r>
-      <w:hyperlink r:id="rId69">
+      <w:hyperlink r:id="rId70">
         <w:r>
           <w:rPr>
             <w:rStyle w:val="Hyperlink"/>
@@ -12125,7 +12191,7 @@
       <w:r>
         <w:t xml:space="preserve"> </w:t>
       </w:r>
-      <w:hyperlink r:id="rId70">
+      <w:hyperlink r:id="rId71">
         <w:r>
           <w:rPr>
             <w:rStyle w:val="Hyperlink"/>
@@ -12176,7 +12242,7 @@
       <w:r>
         <w:t xml:space="preserve"> </w:t>
       </w:r>
-      <w:hyperlink r:id="rId71">
+      <w:hyperlink r:id="rId72">
         <w:r>
           <w:rPr>
             <w:rStyle w:val="Hyperlink"/>
@@ -12245,7 +12311,7 @@
       <w:r>
         <w:t xml:space="preserve"> </w:t>
       </w:r>
-      <w:hyperlink r:id="rId72">
+      <w:hyperlink r:id="rId73">
         <w:r>
           <w:rPr>
             <w:rStyle w:val="Hyperlink"/>
@@ -12310,7 +12376,7 @@
       <w:r>
         <w:t xml:space="preserve"> </w:t>
       </w:r>
-      <w:hyperlink r:id="rId73">
+      <w:hyperlink r:id="rId74">
         <w:r>
           <w:rPr>
             <w:rStyle w:val="Hyperlink"/>
@@ -12355,7 +12421,7 @@
       <w:r>
         <w:t xml:space="preserve"> </w:t>
       </w:r>
-      <w:hyperlink r:id="rId74">
+      <w:hyperlink r:id="rId75">
         <w:r>
           <w:rPr>
             <w:rStyle w:val="Hyperlink"/>
@@ -12420,7 +12486,7 @@
       <w:r>
         <w:t xml:space="preserve"> </w:t>
       </w:r>
-      <w:hyperlink r:id="rId75">
+      <w:hyperlink r:id="rId76">
         <w:r>
           <w:rPr>
             <w:rStyle w:val="Hyperlink"/>
@@ -12466,7 +12532,7 @@
       <w:r>
         <w:t xml:space="preserve"> </w:t>
       </w:r>
-      <w:hyperlink r:id="rId76">
+      <w:hyperlink r:id="rId77">
         <w:r>
           <w:rPr>
             <w:rStyle w:val="Hyperlink"/>
@@ -12517,7 +12583,7 @@
       <w:r>
         <w:t xml:space="preserve"> </w:t>
       </w:r>
-      <w:hyperlink r:id="rId77">
+      <w:hyperlink r:id="rId78">
         <w:r>
           <w:rPr>
             <w:rStyle w:val="Hyperlink"/>
@@ -12568,7 +12634,7 @@
       <w:r>
         <w:t xml:space="preserve"> </w:t>
       </w:r>
-      <w:hyperlink r:id="rId78">
+      <w:hyperlink r:id="rId79">
         <w:r>
           <w:rPr>
             <w:rStyle w:val="Hyperlink"/>
@@ -12622,7 +12688,7 @@
       <w:r>
         <w:t xml:space="preserve"> </w:t>
       </w:r>
-      <w:hyperlink r:id="rId79">
+      <w:hyperlink r:id="rId80">
         <w:r>
           <w:rPr>
             <w:rStyle w:val="Hyperlink"/>
@@ -12682,7 +12748,7 @@
       <w:r>
         <w:t xml:space="preserve"> </w:t>
       </w:r>
-      <w:hyperlink r:id="rId80">
+      <w:hyperlink r:id="rId81">
         <w:r>
           <w:rPr>
             <w:rStyle w:val="Hyperlink"/>
@@ -12739,7 +12805,7 @@
       <w:r>
         <w:t xml:space="preserve"> </w:t>
       </w:r>
-      <w:hyperlink r:id="rId81">
+      <w:hyperlink r:id="rId82">
         <w:r>
           <w:rPr>
             <w:rStyle w:val="Hyperlink"/>
@@ -12813,7 +12879,7 @@
       <w:r>
         <w:t xml:space="preserve"> </w:t>
       </w:r>
-      <w:hyperlink r:id="rId82">
+      <w:hyperlink r:id="rId83">
         <w:r>
           <w:rPr>
             <w:rStyle w:val="Hyperlink"/>
@@ -12887,7 +12953,7 @@
       <w:r>
         <w:t xml:space="preserve"> </w:t>
       </w:r>
-      <w:hyperlink r:id="rId83">
+      <w:hyperlink r:id="rId84">
         <w:r>
           <w:rPr>
             <w:rStyle w:val="Hyperlink"/>
@@ -12959,7 +13025,7 @@
       <w:r>
         <w:t xml:space="preserve"> </w:t>
       </w:r>
-      <w:hyperlink r:id="rId84">
+      <w:hyperlink r:id="rId85">
         <w:r>
           <w:rPr>
             <w:rStyle w:val="Hyperlink"/>
@@ -13033,7 +13099,7 @@
       <w:r>
         <w:t xml:space="preserve"> </w:t>
       </w:r>
-      <w:hyperlink r:id="rId85">
+      <w:hyperlink r:id="rId86">
         <w:r>
           <w:rPr>
             <w:rStyle w:val="Hyperlink"/>
@@ -13090,7 +13156,7 @@
       <w:r>
         <w:t xml:space="preserve"> </w:t>
       </w:r>
-      <w:hyperlink r:id="rId86">
+      <w:hyperlink r:id="rId87">
         <w:r>
           <w:rPr>
             <w:rStyle w:val="Hyperlink"/>
@@ -13186,7 +13252,7 @@
       <w:r>
         <w:t xml:space="preserve"> </w:t>
       </w:r>
-      <w:hyperlink r:id="rId87">
+      <w:hyperlink r:id="rId88">
         <w:r>
           <w:rPr>
             <w:rStyle w:val="Hyperlink"/>
@@ -13278,7 +13344,7 @@
       <w:r>
         <w:t xml:space="preserve"> </w:t>
       </w:r>
-      <w:hyperlink r:id="rId88">
+      <w:hyperlink r:id="rId89">
         <w:r>
           <w:rPr>
             <w:rStyle w:val="Hyperlink"/>
@@ -13329,7 +13395,7 @@
       <w:r>
         <w:t xml:space="preserve"> </w:t>
       </w:r>
-      <w:hyperlink r:id="rId89">
+      <w:hyperlink r:id="rId90">
         <w:r>
           <w:rPr>
             <w:rStyle w:val="Hyperlink"/>
@@ -13394,7 +13460,7 @@
       <w:r>
         <w:t xml:space="preserve"> </w:t>
       </w:r>
-      <w:hyperlink r:id="rId90">
+      <w:hyperlink r:id="rId91">
         <w:r>
           <w:rPr>
             <w:rStyle w:val="Hyperlink"/>
@@ -13445,7 +13511,7 @@
       <w:r>
         <w:t xml:space="preserve"> </w:t>
       </w:r>
-      <w:hyperlink r:id="rId91">
+      <w:hyperlink r:id="rId92">
         <w:r>
           <w:rPr>
             <w:rStyle w:val="Hyperlink"/>
@@ -13496,7 +13562,7 @@
       <w:r>
         <w:t xml:space="preserve"> </w:t>
       </w:r>
-      <w:hyperlink r:id="rId92">
+      <w:hyperlink r:id="rId93">
         <w:r>
           <w:rPr>
             <w:rStyle w:val="Hyperlink"/>
@@ -13561,7 +13627,7 @@
       <w:r>
         <w:t xml:space="preserve"> </w:t>
       </w:r>
-      <w:hyperlink r:id="rId93">
+      <w:hyperlink r:id="rId94">
         <w:r>
           <w:rPr>
             <w:rStyle w:val="Hyperlink"/>
@@ -13621,7 +13687,7 @@
       <w:r>
         <w:t xml:space="preserve"> </w:t>
       </w:r>
-      <w:hyperlink r:id="rId94">
+      <w:hyperlink r:id="rId95">
         <w:r>
           <w:rPr>
             <w:rStyle w:val="Hyperlink"/>
@@ -13672,7 +13738,7 @@
       <w:r>
         <w:t xml:space="preserve"> </w:t>
       </w:r>
-      <w:hyperlink r:id="rId95">
+      <w:hyperlink r:id="rId96">
         <w:r>
           <w:rPr>
             <w:rStyle w:val="Hyperlink"/>
@@ -13737,7 +13803,7 @@
       <w:r>
         <w:t xml:space="preserve"> </w:t>
       </w:r>
-      <w:hyperlink r:id="rId96">
+      <w:hyperlink r:id="rId97">
         <w:r>
           <w:rPr>
             <w:rStyle w:val="Hyperlink"/>
@@ -13802,7 +13868,7 @@
       <w:r>
         <w:t xml:space="preserve"> </w:t>
       </w:r>
-      <w:hyperlink r:id="rId97">
+      <w:hyperlink r:id="rId98">
         <w:r>
           <w:rPr>
             <w:rStyle w:val="Hyperlink"/>
@@ -13859,7 +13925,7 @@
       <w:r>
         <w:t xml:space="preserve"> </w:t>
       </w:r>
-      <w:hyperlink r:id="rId98">
+      <w:hyperlink r:id="rId99">
         <w:r>
           <w:rPr>
             <w:rStyle w:val="Hyperlink"/>
@@ -13939,7 +14005,7 @@
       <w:r>
         <w:t xml:space="preserve"> </w:t>
       </w:r>
-      <w:hyperlink r:id="rId99">
+      <w:hyperlink r:id="rId100">
         <w:r>
           <w:rPr>
             <w:rStyle w:val="Hyperlink"/>
@@ -13999,7 +14065,7 @@
       <w:r>
         <w:t xml:space="preserve"> </w:t>
       </w:r>
-      <w:hyperlink r:id="rId100">
+      <w:hyperlink r:id="rId101">
         <w:r>
           <w:rPr>
             <w:rStyle w:val="Hyperlink"/>
@@ -14102,7 +14168,7 @@
       <w:r>
         <w:t xml:space="preserve"> </w:t>
       </w:r>
-      <w:hyperlink r:id="rId101">
+      <w:hyperlink r:id="rId102">
         <w:r>
           <w:rPr>
             <w:rStyle w:val="Hyperlink"/>
@@ -14161,7 +14227,7 @@
       <w:r>
         <w:t xml:space="preserve"> </w:t>
       </w:r>
-      <w:hyperlink r:id="rId102">
+      <w:hyperlink r:id="rId103">
         <w:r>
           <w:rPr>
             <w:rStyle w:val="Hyperlink"/>
@@ -14235,7 +14301,7 @@
       <w:r>
         <w:t xml:space="preserve"> </w:t>
       </w:r>
-      <w:hyperlink r:id="rId103">
+      <w:hyperlink r:id="rId104">
         <w:r>
           <w:rPr>
             <w:rStyle w:val="Hyperlink"/>
@@ -14286,7 +14352,7 @@
       <w:r>
         <w:t xml:space="preserve"> </w:t>
       </w:r>
-      <w:hyperlink r:id="rId104">
+      <w:hyperlink r:id="rId105">
         <w:r>
           <w:rPr>
             <w:rStyle w:val="Hyperlink"/>
@@ -14423,7 +14489,7 @@
       <w:r>
         <w:t xml:space="preserve"> </w:t>
       </w:r>
-      <w:hyperlink r:id="rId105">
+      <w:hyperlink r:id="rId106">
         <w:r>
           <w:rPr>
             <w:rStyle w:val="Hyperlink"/>
@@ -14474,7 +14540,7 @@
       <w:r>
         <w:t xml:space="preserve"> </w:t>
       </w:r>
-      <w:hyperlink r:id="rId106">
+      <w:hyperlink r:id="rId107">
         <w:r>
           <w:rPr>
             <w:rStyle w:val="Hyperlink"/>
@@ -14531,7 +14597,7 @@
       <w:r>
         <w:t xml:space="preserve"> </w:t>
       </w:r>
-      <w:hyperlink r:id="rId107">
+      <w:hyperlink r:id="rId108">
         <w:r>
           <w:rPr>
             <w:rStyle w:val="Hyperlink"/>
@@ -14588,7 +14654,7 @@
       <w:r>
         <w:t xml:space="preserve"> </w:t>
       </w:r>
-      <w:hyperlink r:id="rId108">
+      <w:hyperlink r:id="rId109">
         <w:r>
           <w:rPr>
             <w:rStyle w:val="Hyperlink"/>
@@ -14639,7 +14705,7 @@
       <w:r>
         <w:t xml:space="preserve"> </w:t>
       </w:r>
-      <w:hyperlink r:id="rId109">
+      <w:hyperlink r:id="rId110">
         <w:r>
           <w:rPr>
             <w:rStyle w:val="Hyperlink"/>
@@ -14716,7 +14782,7 @@
       <w:r>
         <w:t xml:space="preserve"> </w:t>
       </w:r>
-      <w:hyperlink r:id="rId110">
+      <w:hyperlink r:id="rId111">
         <w:r>
           <w:rPr>
             <w:rStyle w:val="Hyperlink"/>
@@ -14767,7 +14833,7 @@
       <w:r>
         <w:t xml:space="preserve"> </w:t>
       </w:r>
-      <w:hyperlink r:id="rId111">
+      <w:hyperlink r:id="rId112">
         <w:r>
           <w:rPr>
             <w:rStyle w:val="Hyperlink"/>
@@ -14818,7 +14884,7 @@
       <w:r>
         <w:t xml:space="preserve"> </w:t>
       </w:r>
-      <w:hyperlink r:id="rId112">
+      <w:hyperlink r:id="rId113">
         <w:r>
           <w:rPr>
             <w:rStyle w:val="Hyperlink"/>
@@ -14878,7 +14944,7 @@
       <w:r>
         <w:t xml:space="preserve"> </w:t>
       </w:r>
-      <w:hyperlink r:id="rId113">
+      <w:hyperlink r:id="rId114">
         <w:r>
           <w:rPr>
             <w:rStyle w:val="Hyperlink"/>
@@ -14991,7 +15057,7 @@
       <w:r>
         <w:t xml:space="preserve"> </w:t>
       </w:r>
-      <w:hyperlink r:id="rId114">
+      <w:hyperlink r:id="rId115">
         <w:r>
           <w:rPr>
             <w:rStyle w:val="Hyperlink"/>
@@ -15042,7 +15108,7 @@
       <w:r>
         <w:t xml:space="preserve"> </w:t>
       </w:r>
-      <w:hyperlink r:id="rId115">
+      <w:hyperlink r:id="rId116">
         <w:r>
           <w:rPr>
             <w:rStyle w:val="Hyperlink"/>
@@ -15120,7 +15186,7 @@
       <w:r>
         <w:t xml:space="preserve"> </w:t>
       </w:r>
-      <w:hyperlink r:id="rId116">
+      <w:hyperlink r:id="rId117">
         <w:r>
           <w:rPr>
             <w:rStyle w:val="Hyperlink"/>
@@ -15292,7 +15358,7 @@
       <w:r>
         <w:t xml:space="preserve"> </w:t>
       </w:r>
-      <w:hyperlink r:id="rId117">
+      <w:hyperlink r:id="rId118">
         <w:r>
           <w:rPr>
             <w:rStyle w:val="Hyperlink"/>
@@ -15357,7 +15423,7 @@
       <w:r>
         <w:t xml:space="preserve"> </w:t>
       </w:r>
-      <w:hyperlink r:id="rId118">
+      <w:hyperlink r:id="rId119">
         <w:r>
           <w:rPr>
             <w:rStyle w:val="Hyperlink"/>
@@ -15468,7 +15534,7 @@
       <w:r>
         <w:t xml:space="preserve"> </w:t>
       </w:r>
-      <w:hyperlink r:id="rId119">
+      <w:hyperlink r:id="rId120">
         <w:r>
           <w:rPr>
             <w:rStyle w:val="Hyperlink"/>
@@ -15519,7 +15585,7 @@
       <w:r>
         <w:t xml:space="preserve"> </w:t>
       </w:r>
-      <w:hyperlink r:id="rId120">
+      <w:hyperlink r:id="rId121">
         <w:r>
           <w:rPr>
             <w:rStyle w:val="Hyperlink"/>
@@ -15570,7 +15636,7 @@
       <w:r>
         <w:t xml:space="preserve"> </w:t>
       </w:r>
-      <w:hyperlink r:id="rId121">
+      <w:hyperlink r:id="rId122">
         <w:r>
           <w:rPr>
             <w:rStyle w:val="Hyperlink"/>
@@ -15645,7 +15711,7 @@
       <w:r>
         <w:t xml:space="preserve"> </w:t>
       </w:r>
-      <w:hyperlink r:id="rId122">
+      <w:hyperlink r:id="rId123">
         <w:r>
           <w:rPr>
             <w:rStyle w:val="Hyperlink"/>
@@ -15702,7 +15768,7 @@
       <w:r>
         <w:t xml:space="preserve"> </w:t>
       </w:r>
-      <w:hyperlink r:id="rId123">
+      <w:hyperlink r:id="rId124">
         <w:r>
           <w:rPr>
             <w:rStyle w:val="Hyperlink"/>
@@ -15753,7 +15819,7 @@
       <w:r>
         <w:t xml:space="preserve"> </w:t>
       </w:r>
-      <w:hyperlink r:id="rId124">
+      <w:hyperlink r:id="rId125">
         <w:r>
           <w:rPr>
             <w:rStyle w:val="Hyperlink"/>
@@ -15818,7 +15884,7 @@
       <w:r>
         <w:t xml:space="preserve"> </w:t>
       </w:r>
-      <w:hyperlink r:id="rId125">
+      <w:hyperlink r:id="rId126">
         <w:r>
           <w:rPr>
             <w:rStyle w:val="Hyperlink"/>
@@ -15875,7 +15941,7 @@
       <w:r>
         <w:t xml:space="preserve"> </w:t>
       </w:r>
-      <w:hyperlink r:id="rId126">
+      <w:hyperlink r:id="rId127">
         <w:r>
           <w:rPr>
             <w:rStyle w:val="Hyperlink"/>
@@ -15994,7 +16060,7 @@
       <w:r>
         <w:t xml:space="preserve"> </w:t>
       </w:r>
-      <w:hyperlink r:id="rId127">
+      <w:hyperlink r:id="rId128">
         <w:r>
           <w:rPr>
             <w:rStyle w:val="Hyperlink"/>
@@ -16039,7 +16105,7 @@
       <w:r>
         <w:t xml:space="preserve"> </w:t>
       </w:r>
-      <w:hyperlink r:id="rId128">
+      <w:hyperlink r:id="rId129">
         <w:r>
           <w:rPr>
             <w:rStyle w:val="Hyperlink"/>
@@ -16098,7 +16164,7 @@
       <w:r>
         <w:t xml:space="preserve"> </w:t>
       </w:r>
-      <w:hyperlink r:id="rId129">
+      <w:hyperlink r:id="rId130">
         <w:r>
           <w:rPr>
             <w:rStyle w:val="Hyperlink"/>
@@ -16107,7 +16173,7 @@
         </w:r>
       </w:hyperlink>
     </w:p>
-    <w:bookmarkEnd w:id="130"/>
+    <w:bookmarkEnd w:id="131"/>
     <w:sectPr>
       <w:footnotePr>
         <w:numRestart w:val="eachSect"/>

</xml_diff>

<commit_message>
05: Roo must-fixes - descriptive title/wording, no-under-6 check, trimming/ESS + overlap fig, age-gap reconciliation, couples N, Janiso 2024 cite, Coser DOI removed, 12pt double-spaced, cover letter code statement
</commit_message>
<xml_diff>
--- a/submission/05_marriage_time_reallocation/package/manuscript_anonymised.docx
+++ b/submission/05_marriage_time_reallocation/package/manuscript_anonymised.docx
@@ -7,13 +7,13 @@
         <w:pStyle w:val="Title"/>
       </w:pPr>
       <w:r>
-        <w:t xml:space="preserve">Where Do the Minutes Come From? Marriage and the Reallocation of</w:t>
-      </w:r>
-      <w:r>
-        <w:t xml:space="preserve"> </w:t>
-      </w:r>
-      <w:r>
-        <w:t xml:space="preserve">Women’s and Men’s Days in India</w:t>
+        <w:t xml:space="preserve">Married and Never-Married Days: Marriage, Gender and the Full</w:t>
+      </w:r>
+      <w:r>
+        <w:t xml:space="preserve"> </w:t>
+      </w:r>
+      <w:r>
+        <w:t xml:space="preserve">Time Budget in India</w:t>
       </w:r>
     </w:p>
     <w:p>
@@ -127,7 +127,7 @@
         <w:t xml:space="preserve"> </w:t>
       </w:r>
       <w:r>
-        <w:t xml:space="preserve">Marriage reorganises Indian women’s days far more than men’s, and a full time-budget accounting shows which activities absorb the change.</w:t>
+        <w:t xml:space="preserve">Married and never-married women’s days differ far more than men’s, and a full time-budget accounting shows which activities differ alongside unpaid work.</w:t>
       </w:r>
     </w:p>
     <w:p>
@@ -162,19 +162,31 @@
         <w:pStyle w:val="FirstParagraph"/>
       </w:pPr>
       <w:r>
-        <w:t xml:space="preserve">Marriage reorganises time. In diary studies from high-income countries,</w:t>
-      </w:r>
-      <w:r>
-        <w:t xml:space="preserve"> </w:t>
-      </w:r>
-      <w:r>
-        <w:t xml:space="preserve">married women do more housework than women in other living arrangements,</w:t>
-      </w:r>
-      <w:r>
-        <w:t xml:space="preserve"> </w:t>
-      </w:r>
-      <w:r>
-        <w:t xml:space="preserve">and the gender gap in housework is largest among the married</w:t>
+        <w:t xml:space="preserve">Marriage is closely tied to how time is used. In diary studies from</w:t>
+      </w:r>
+      <w:r>
+        <w:t xml:space="preserve"> </w:t>
+      </w:r>
+      <w:r>
+        <w:t xml:space="preserve">high-income countries, married women do more housework than women in</w:t>
+      </w:r>
+      <w:r>
+        <w:t xml:space="preserve"> </w:t>
+      </w:r>
+      <w:r>
+        <w:t xml:space="preserve">other living arrangements, and the gender gap in housework is largest</w:t>
+      </w:r>
+      <w:r>
+        <w:t xml:space="preserve"> </w:t>
+      </w:r>
+      <w:r>
+        <w:t xml:space="preserve">among the married (; ). Men’s</w:t>
+      </w:r>
+      <w:r>
+        <w:t xml:space="preserve"> </w:t>
+      </w:r>
+      <w:r>
+        <w:t xml:space="preserve">housework, in contrast, falls or stays flat when they enter a union</w:t>
       </w:r>
       <w:r>
         <w:t xml:space="preserve"> </w:t>
@@ -186,13 +198,37 @@
         <w:t xml:space="preserve"> </w:t>
       </w:r>
       <w:r>
-        <w:t xml:space="preserve">). Men’s</w:t>
-      </w:r>
-      <w:r>
-        <w:t xml:space="preserve"> </w:t>
-      </w:r>
-      <w:r>
-        <w:t xml:space="preserve">housework, in contrast, falls or stays flat when they enter a union</w:t>
+        <w:t xml:space="preserve">). Explanations range</w:t>
+      </w:r>
+      <w:r>
+        <w:t xml:space="preserve"> </w:t>
+      </w:r>
+      <w:r>
+        <w:t xml:space="preserve">from specialisation within the household</w:t>
+      </w:r>
+      <w:r>
+        <w:t xml:space="preserve"> </w:t>
+      </w:r>
+      <w:r>
+        <w:t xml:space="preserve">(,</w:t>
+      </w:r>
+      <w:r>
+        <w:t xml:space="preserve"> </w:t>
+      </w:r>
+      <w:r>
+        <w:t xml:space="preserve">) and bargaining over the</w:t>
+      </w:r>
+      <w:r>
+        <w:t xml:space="preserve"> </w:t>
+      </w:r>
+      <w:r>
+        <w:t xml:space="preserve">division of labour (; )</w:t>
+      </w:r>
+      <w:r>
+        <w:t xml:space="preserve"> </w:t>
+      </w:r>
+      <w:r>
+        <w:t xml:space="preserve">to the performance of gender in everyday interaction</w:t>
       </w:r>
       <w:r>
         <w:t xml:space="preserve"> </w:t>
@@ -204,37 +240,33 @@
         <w:t xml:space="preserve"> </w:t>
       </w:r>
       <w:r>
-        <w:t xml:space="preserve">). Explanations range</w:t>
-      </w:r>
-      <w:r>
-        <w:t xml:space="preserve"> </w:t>
-      </w:r>
-      <w:r>
-        <w:t xml:space="preserve">from specialisation within the household</w:t>
-      </w:r>
-      <w:r>
-        <w:t xml:space="preserve"> </w:t>
-      </w:r>
-      <w:r>
-        <w:t xml:space="preserve">(,</w:t>
-      </w:r>
-      <w:r>
-        <w:t xml:space="preserve"> </w:t>
-      </w:r>
-      <w:r>
-        <w:t xml:space="preserve">) and bargaining over the</w:t>
-      </w:r>
-      <w:r>
-        <w:t xml:space="preserve"> </w:t>
-      </w:r>
-      <w:r>
-        <w:t xml:space="preserve">division of labour (; )</w:t>
-      </w:r>
-      <w:r>
-        <w:t xml:space="preserve"> </w:t>
-      </w:r>
-      <w:r>
-        <w:t xml:space="preserve">to the performance of gender in everyday interaction</w:t>
+        <w:t xml:space="preserve">;</w:t>
+      </w:r>
+      <w:r>
+        <w:t xml:space="preserve"> </w:t>
+      </w:r>
+      <w:r>
+        <w:t xml:space="preserve">).</w:t>
+      </w:r>
+    </w:p>
+    <w:p>
+      <w:pPr>
+        <w:pStyle w:val="BodyText"/>
+      </w:pPr>
+      <w:r>
+        <w:t xml:space="preserve">India offers a sharp setting for these questions. In the Time Use Survey</w:t>
+      </w:r>
+      <w:r>
+        <w:t xml:space="preserve"> </w:t>
+      </w:r>
+      <w:r>
+        <w:t xml:space="preserve">2024, 99% of women and 95% of men aged 35 to 39 have ever been</w:t>
+      </w:r>
+      <w:r>
+        <w:t xml:space="preserve"> </w:t>
+      </w:r>
+      <w:r>
+        <w:t xml:space="preserve">married. Residence after marriage is usually with the husband’s family</w:t>
       </w:r>
       <w:r>
         <w:t xml:space="preserve"> </w:t>
@@ -246,13 +278,49 @@
         <w:t xml:space="preserve"> </w:t>
       </w:r>
       <w:r>
+        <w:t xml:space="preserve">): 29% of</w:t>
+      </w:r>
+      <w:r>
+        <w:t xml:space="preserve"> </w:t>
+      </w:r>
+      <w:r>
+        <w:t xml:space="preserve">married women aged 20 to 39 in the survey are daughters-in-law of the</w:t>
+      </w:r>
+      <w:r>
+        <w:t xml:space="preserve"> </w:t>
+      </w:r>
+      <w:r>
+        <w:t xml:space="preserve">household head. Married women’s employment is low and has not risen with</w:t>
+      </w:r>
+      <w:r>
+        <w:t xml:space="preserve"> </w:t>
+      </w:r>
+      <w:r>
+        <w:t xml:space="preserve">education (;</w:t>
+      </w:r>
+      <w:r>
+        <w:t xml:space="preserve"> </w:t>
+      </w:r>
+      <w:r>
         <w:t xml:space="preserve">;</w:t>
       </w:r>
       <w:r>
         <w:t xml:space="preserve"> </w:t>
       </w:r>
       <w:r>
-        <w:t xml:space="preserve">).</w:t>
+        <w:t xml:space="preserve">). For most</w:t>
+      </w:r>
+      <w:r>
+        <w:t xml:space="preserve"> </w:t>
+      </w:r>
+      <w:r>
+        <w:t xml:space="preserve">Indian women, marriage is the transition that sets the terms of adult</w:t>
+      </w:r>
+      <w:r>
+        <w:t xml:space="preserve"> </w:t>
+      </w:r>
+      <w:r>
+        <w:t xml:space="preserve">time use.</w:t>
       </w:r>
     </w:p>
     <w:p>
@@ -260,19 +328,13 @@
         <w:pStyle w:val="BodyText"/>
       </w:pPr>
       <w:r>
-        <w:t xml:space="preserve">India offers a sharp setting for these questions. In the Time Use Survey</w:t>
-      </w:r>
-      <w:r>
-        <w:t xml:space="preserve"> </w:t>
-      </w:r>
-      <w:r>
-        <w:t xml:space="preserve">2024, 99% of women and 95% of men aged 35 to 39 have ever been</w:t>
-      </w:r>
-      <w:r>
-        <w:t xml:space="preserve"> </w:t>
-      </w:r>
-      <w:r>
-        <w:t xml:space="preserve">married. Residence after marriage is usually with the husband’s family</w:t>
+        <w:t xml:space="preserve">Most studies of marriage and time use take one outcome at a time.</w:t>
+      </w:r>
+      <w:r>
+        <w:t xml:space="preserve"> </w:t>
+      </w:r>
+      <w:r>
+        <w:t xml:space="preserve">Separate literatures examine housework</w:t>
       </w:r>
       <w:r>
         <w:t xml:space="preserve"> </w:t>
@@ -284,74 +346,6 @@
         <w:t xml:space="preserve"> </w:t>
       </w:r>
       <w:r>
-        <w:t xml:space="preserve">): 29% of</w:t>
-      </w:r>
-      <w:r>
-        <w:t xml:space="preserve"> </w:t>
-      </w:r>
-      <w:r>
-        <w:t xml:space="preserve">married women aged 20 to 39 in the survey are daughters-in-law of the</w:t>
-      </w:r>
-      <w:r>
-        <w:t xml:space="preserve"> </w:t>
-      </w:r>
-      <w:r>
-        <w:t xml:space="preserve">household head. Married women’s employment is low and has not risen with</w:t>
-      </w:r>
-      <w:r>
-        <w:t xml:space="preserve"> </w:t>
-      </w:r>
-      <w:r>
-        <w:t xml:space="preserve">education (;</w:t>
-      </w:r>
-      <w:r>
-        <w:t xml:space="preserve"> </w:t>
-      </w:r>
-      <w:r>
-        <w:t xml:space="preserve">;</w:t>
-      </w:r>
-      <w:r>
-        <w:t xml:space="preserve"> </w:t>
-      </w:r>
-      <w:r>
-        <w:t xml:space="preserve">). For most</w:t>
-      </w:r>
-      <w:r>
-        <w:t xml:space="preserve"> </w:t>
-      </w:r>
-      <w:r>
-        <w:t xml:space="preserve">Indian women, marriage is the transition that sets the terms of adult</w:t>
-      </w:r>
-      <w:r>
-        <w:t xml:space="preserve"> </w:t>
-      </w:r>
-      <w:r>
-        <w:t xml:space="preserve">time use.</w:t>
-      </w:r>
-    </w:p>
-    <w:p>
-      <w:pPr>
-        <w:pStyle w:val="BodyText"/>
-      </w:pPr>
-      <w:r>
-        <w:t xml:space="preserve">Most studies of marriage and time use take one outcome at a time.</w:t>
-      </w:r>
-      <w:r>
-        <w:t xml:space="preserve"> </w:t>
-      </w:r>
-      <w:r>
-        <w:t xml:space="preserve">Separate literatures examine housework</w:t>
-      </w:r>
-      <w:r>
-        <w:t xml:space="preserve"> </w:t>
-      </w:r>
-      <w:r>
-        <w:t xml:space="preserve">(;</w:t>
-      </w:r>
-      <w:r>
-        <w:t xml:space="preserve"> </w:t>
-      </w:r>
-      <w:r>
         <w:t xml:space="preserve">),</w:t>
       </w:r>
       <w:r>
@@ -418,25 +412,49 @@
         <w:t xml:space="preserve"> </w:t>
       </w:r>
       <w:r>
-        <w:t xml:space="preserve">samples and specifications need not add up. This paper estimates them</w:t>
-      </w:r>
-      <w:r>
-        <w:t xml:space="preserve"> </w:t>
-      </w:r>
-      <w:r>
-        <w:t xml:space="preserve">together. I decompose the married–never-married difference into all</w:t>
-      </w:r>
-      <w:r>
-        <w:t xml:space="preserve"> </w:t>
-      </w:r>
-      <w:r>
-        <w:t xml:space="preserve">nine divisions of the International Classification of Activities for</w:t>
-      </w:r>
-      <w:r>
-        <w:t xml:space="preserve"> </w:t>
-      </w:r>
-      <w:r>
-        <w:t xml:space="preserve">Time-Use Statistics 2016 (ICATUS 2016,</w:t>
+        <w:t xml:space="preserve">samples and specifications need not add up. For India, Janiso et al.</w:t>
+      </w:r>
+      <w:r>
+        <w:t xml:space="preserve"> </w:t>
+      </w:r>
+      <w:r>
+        <w:t xml:space="preserve">() use the Time Use Survey 2019</w:t>
+      </w:r>
+      <w:r>
+        <w:t xml:space="preserve"> </w:t>
+      </w:r>
+      <w:r>
+        <w:t xml:space="preserve">and find that being married is associated with about 135 more minutes a</w:t>
+      </w:r>
+      <w:r>
+        <w:t xml:space="preserve"> </w:t>
+      </w:r>
+      <w:r>
+        <w:t xml:space="preserve">day of housework for women; this paper extends that comparison from one</w:t>
+      </w:r>
+      <w:r>
+        <w:t xml:space="preserve"> </w:t>
+      </w:r>
+      <w:r>
+        <w:t xml:space="preserve">activity to the whole day, using the 2024 round. This paper estimates</w:t>
+      </w:r>
+      <w:r>
+        <w:t xml:space="preserve"> </w:t>
+      </w:r>
+      <w:r>
+        <w:t xml:space="preserve">the components together. I decompose the married–never-married</w:t>
+      </w:r>
+      <w:r>
+        <w:t xml:space="preserve"> </w:t>
+      </w:r>
+      <w:r>
+        <w:t xml:space="preserve">difference into all nine divisions of the International Classification</w:t>
+      </w:r>
+      <w:r>
+        <w:t xml:space="preserve"> </w:t>
+      </w:r>
+      <w:r>
+        <w:t xml:space="preserve">of Activities for Time-Use Statistics 2016 (ICATUS 2016,</w:t>
       </w:r>
       <w:r>
         <w:t xml:space="preserve"> </w:t>
@@ -2372,7 +2390,13 @@
         <w:t xml:space="preserve"> </w:t>
       </w:r>
       <w:r>
-        <w:t xml:space="preserve">joint households. I keep linked wives aged 20 to 59 (106,858 couples).</w:t>
+        <w:t xml:space="preserve">joint households. I keep linked wives aged 20 to 59 (106,858 couples;</w:t>
+      </w:r>
+      <w:r>
+        <w:t xml:space="preserve"> </w:t>
+      </w:r>
+      <w:r>
+        <w:t xml:space="preserve">106,424 have complete covariates and enter the couple regressions).</w:t>
       </w:r>
       <w:r>
         <w:t xml:space="preserve"> </w:t>
@@ -5369,13 +5393,81 @@
         <w:t xml:space="preserve"> </w:t>
       </w:r>
       <w:r>
-        <w:t xml:space="preserve">marriage is associated with a much larger increase in women’s unpaid</w:t>
-      </w:r>
-      <w:r>
-        <w:t xml:space="preserve"> </w:t>
-      </w:r>
-      <w:r>
-        <w:t xml:space="preserve">work than in men’s.</w:t>
+        <w:t xml:space="preserve">marriage is associated with much more unpaid work for women than for</w:t>
+      </w:r>
+      <w:r>
+        <w:t xml:space="preserve"> </w:t>
+      </w:r>
+      <w:r>
+        <w:t xml:space="preserve">men.</w:t>
+      </w:r>
+    </w:p>
+    <w:p>
+      <w:pPr>
+        <w:pStyle w:val="BodyText"/>
+      </w:pPr>
+      <w:r>
+        <w:t xml:space="preserve">Part of this difference reflects motherhood rather than marriage as</w:t>
+      </w:r>
+      <w:r>
+        <w:t xml:space="preserve"> </w:t>
+      </w:r>
+      <w:r>
+        <w:t xml:space="preserve">such: married women are far more likely to live with young children, and</w:t>
+      </w:r>
+      <w:r>
+        <w:t xml:space="preserve"> </w:t>
+      </w:r>
+      <w:r>
+        <w:t xml:space="preserve">caregiving accounts for 115 of the 280 minutes. Among women in</w:t>
+      </w:r>
+      <w:r>
+        <w:t xml:space="preserve"> </w:t>
+      </w:r>
+      <w:r>
+        <w:t xml:space="preserve">households with no child under six (38,541 women, 70% of them married),</w:t>
+      </w:r>
+      <w:r>
+        <w:t xml:space="preserve"> </w:t>
+      </w:r>
+      <w:r>
+        <w:t xml:space="preserve">the married–never-married difference in unpaid work is 186.6 minutes</w:t>
+      </w:r>
+      <w:r>
+        <w:t xml:space="preserve"> </w:t>
+      </w:r>
+      <w:r>
+        <w:t xml:space="preserve">(SE 3.0): 175.5 minutes (SE 2.9) in domestic work and 11.1 minutes (SE</w:t>
+      </w:r>
+      <w:r>
+        <w:t xml:space="preserve"> </w:t>
+      </w:r>
+      <w:r>
+        <w:t xml:space="preserve">0.5) in caregiving. The domestic-work difference largely persists</w:t>
+      </w:r>
+      <w:r>
+        <w:t xml:space="preserve"> </w:t>
+      </w:r>
+      <w:r>
+        <w:t xml:space="preserve">without young children in the household, whereas most of the caregiving</w:t>
+      </w:r>
+      <w:r>
+        <w:t xml:space="preserve"> </w:t>
+      </w:r>
+      <w:r>
+        <w:t xml:space="preserve">difference does not. The estimates are therefore best read as the</w:t>
+      </w:r>
+      <w:r>
+        <w:t xml:space="preserve"> </w:t>
+      </w:r>
+      <w:r>
+        <w:t xml:space="preserve">difference that accompanies marriage, including the motherhood that</w:t>
+      </w:r>
+      <w:r>
+        <w:t xml:space="preserve"> </w:t>
+      </w:r>
+      <w:r>
+        <w:t xml:space="preserve">usually follows it, not as what marriage alone adds.</w:t>
       </w:r>
     </w:p>
     <w:p>
@@ -7722,6 +7814,115 @@
       </w:r>
       <w:r>
         <w:t xml:space="preserve">Baseline: the decomposition for ages 20–39. Ages 20–26: same model on women aged 20–26. Reweighted: never-married women reweighted to the covariate distribution of married women (DiNardo-Fortin-Lemieux odds weights from a logit on single-year age, state, education, urban, caste and religion; propensities capped at 0.99), with the baseline controls. Bias-adjusted: Oster (2019) coefficient with delta = 1 and R-max = 1.3 times the controlled R-squared, relative to a regression on the married indicator alone. Breakdown delta: the delta at which the bias-adjusted coefficient is zero. FSU-clustered SEs in parentheses. * p&lt;0.10, ** p&lt;0.05, *** p&lt;0.01.</w:t>
+      </w:r>
+    </w:p>
+    <w:p>
+      <w:pPr>
+        <w:pStyle w:val="BodyText"/>
+      </w:pPr>
+      <w:r>
+        <w:t xml:space="preserve">Reweighting leans on a small number of never-married women who resemble</w:t>
+      </w:r>
+      <w:r>
+        <w:t xml:space="preserve"> </w:t>
+      </w:r>
+      <w:r>
+        <w:t xml:space="preserve">the married: the effective sample of never-married women falls to 1,209</w:t>
+      </w:r>
+      <w:r>
+        <w:t xml:space="preserve"> </w:t>
+      </w:r>
+      <w:r>
+        <w:t xml:space="preserve">from 13,940. Trimming observations with propensities outside</w:t>
+      </w:r>
+      <w:r>
+        <w:t xml:space="preserve"> </w:t>
+      </w:r>
+      <w:r>
+        <w:t xml:space="preserve">[</w:t>
+      </w:r>
+      <w:r>
+        <w:t xml:space="preserve">0.05,</w:t>
+      </w:r>
+      <w:r>
+        <w:t xml:space="preserve"> </w:t>
+      </w:r>
+      <w:r>
+        <w:t xml:space="preserve">0.95</w:t>
+      </w:r>
+      <w:r>
+        <w:t xml:space="preserve">]</w:t>
+      </w:r>
+      <w:r>
+        <w:t xml:space="preserve"> </w:t>
+      </w:r>
+      <w:r>
+        <w:t xml:space="preserve">gives an unpaid-work difference of 270.5 minutes (SE 3.1)</w:t>
+      </w:r>
+      <w:r>
+        <w:t xml:space="preserve"> </w:t>
+      </w:r>
+      <w:r>
+        <w:t xml:space="preserve">(effective never-married sample 3,006), and outside</w:t>
+      </w:r>
+      <w:r>
+        <w:t xml:space="preserve"> </w:t>
+      </w:r>
+      <w:r>
+        <w:t xml:space="preserve">[</w:t>
+      </w:r>
+      <w:r>
+        <w:t xml:space="preserve">0.10, 0.90</w:t>
+      </w:r>
+      <w:r>
+        <w:t xml:space="preserve">]</w:t>
+      </w:r>
+      <w:r>
+        <w:t xml:space="preserve"> </w:t>
+      </w:r>
+      <w:r>
+        <w:t xml:space="preserve">268.6 minutes (SE 3.1) (3,842) (). The learning and employment coefficients move more across</w:t>
+      </w:r>
+      <w:r>
+        <w:t xml:space="preserve"> </w:t>
+      </w:r>
+      <w:r>
+        <w:t xml:space="preserve">these weightings (learning -70.5 and -88.7; employment -106.9 and</w:t>
+      </w:r>
+      <w:r>
+        <w:t xml:space="preserve"> </w:t>
+      </w:r>
+      <w:r>
+        <w:t xml:space="preserve">-98.1), so the reweighted estimates for those divisions are imprecise</w:t>
+      </w:r>
+      <w:r>
+        <w:t xml:space="preserve"> </w:t>
+      </w:r>
+      <w:r>
+        <w:t xml:space="preserve">guides. Figure</w:t>
+      </w:r>
+      <w:r>
+        <w:t xml:space="preserve"> </w:t>
+      </w:r>
+      <w:hyperlink w:anchor="S-fig:fig-overlap">
+        <w:r>
+          <w:rPr>
+            <w:rStyle w:val="Hyperlink"/>
+          </w:rPr>
+          <w:t xml:space="preserve">[S-fig:fig-overlap]</w:t>
+        </w:r>
+      </w:hyperlink>
+      <w:r>
+        <w:t xml:space="preserve"> </w:t>
+      </w:r>
+      <w:r>
+        <w:t xml:space="preserve">in the online supplement shows the</w:t>
+      </w:r>
+      <w:r>
+        <w:t xml:space="preserve"> </w:t>
+      </w:r>
+      <w:r>
+        <w:t xml:space="preserve">overlap of propensity scores.</w:t>
       </w:r>
     </w:p>
     <w:p>
@@ -9417,25 +9618,63 @@
         <w:t xml:space="preserve"> </w:t>
       </w:r>
       <w:r>
-        <w:t xml:space="preserve">Larger age gaps go with a more unequal division, consistent with age</w:t>
-      </w:r>
-      <w:r>
-        <w:t xml:space="preserve"> </w:t>
-      </w:r>
-      <w:r>
-        <w:t xml:space="preserve">seniority adding to gender hierarchy in marriage (H4). Because larger</w:t>
-      </w:r>
-      <w:r>
-        <w:t xml:space="preserve"> </w:t>
-      </w:r>
-      <w:r>
-        <w:t xml:space="preserve">age gaps are more common when women marry young, the age gap also stands</w:t>
-      </w:r>
-      <w:r>
-        <w:t xml:space="preserve"> </w:t>
-      </w:r>
-      <w:r>
-        <w:t xml:space="preserve">in for the wife’s age at marriage and its correlates</w:t>
+        <w:t xml:space="preserve">Unadjusted, the gap is 370 minutes where the husband is the same age or</w:t>
+      </w:r>
+      <w:r>
+        <w:t xml:space="preserve"> </w:t>
+      </w:r>
+      <w:r>
+        <w:t xml:space="preserve">younger and 346 where he is ten or more years older (Table</w:t>
+      </w:r>
+      <w:r>
+        <w:t xml:space="preserve"> </w:t>
+      </w:r>
+      <w:hyperlink w:anchor="tab:couple">
+        <w:r>
+          <w:rPr>
+            <w:rStyle w:val="Hyperlink"/>
+          </w:rPr>
+          <w:t xml:space="preserve">5</w:t>
+        </w:r>
+      </w:hyperlink>
+      <w:r>
+        <w:t xml:space="preserve">), so in raw terms the division is less unequal when the</w:t>
+      </w:r>
+      <w:r>
+        <w:t xml:space="preserve"> </w:t>
+      </w:r>
+      <w:r>
+        <w:t xml:space="preserve">husband is much older; large age gaps are concentrated among older</w:t>
+      </w:r>
+      <w:r>
+        <w:t xml:space="preserve"> </w:t>
+      </w:r>
+      <w:r>
+        <w:t xml:space="preserve">wives, whose unpaid work is lower. Net of the wife’s age, the minute gap</w:t>
+      </w:r>
+      <w:r>
+        <w:t xml:space="preserve"> </w:t>
+      </w:r>
+      <w:r>
+        <w:t xml:space="preserve">is larger but the wife’s share is smaller, so the evidence on the</w:t>
+      </w:r>
+      <w:r>
+        <w:t xml:space="preserve"> </w:t>
+      </w:r>
+      <w:r>
+        <w:t xml:space="preserve">seniority interpretation of H4 is mixed. Because larger age gaps are</w:t>
+      </w:r>
+      <w:r>
+        <w:t xml:space="preserve"> </w:t>
+      </w:r>
+      <w:r>
+        <w:t xml:space="preserve">more common when women marry young, the age gap also stands in for the</w:t>
+      </w:r>
+      <w:r>
+        <w:t xml:space="preserve"> </w:t>
+      </w:r>
+      <w:r>
+        <w:t xml:space="preserve">wife’s age at marriage and its correlates</w:t>
       </w:r>
       <w:r>
         <w:t xml:space="preserve"> </w:t>
@@ -10448,13 +10687,13 @@
         <w:pStyle w:val="FirstParagraph"/>
       </w:pPr>
       <w:r>
-        <w:t xml:space="preserve">Because the day is fixed, every additional minute of unpaid work has a</w:t>
-      </w:r>
-      <w:r>
-        <w:t xml:space="preserve"> </w:t>
-      </w:r>
-      <w:r>
-        <w:t xml:space="preserve">source. This paper replaces separate estimates of marriage</w:t>
+        <w:t xml:space="preserve">Because the day is fixed, more unpaid work must coincide with less of</w:t>
+      </w:r>
+      <w:r>
+        <w:t xml:space="preserve"> </w:t>
+      </w:r>
+      <w:r>
+        <w:t xml:space="preserve">something else. This paper replaces separate estimates of marriage</w:t>
       </w:r>
       <w:r>
         <w:t xml:space="preserve"> </w:t>
@@ -10466,55 +10705,55 @@
         <w:t xml:space="preserve"> </w:t>
       </w:r>
       <w:r>
-        <w:t xml:space="preserve">in housework, sleep, social life and exercise with one decomposition in</w:t>
-      </w:r>
-      <w:r>
-        <w:t xml:space="preserve"> </w:t>
-      </w:r>
-      <w:r>
-        <w:t xml:space="preserve">which the parts must add up. In India in 2024, married women aged 20 to</w:t>
-      </w:r>
-      <w:r>
-        <w:t xml:space="preserve"> </w:t>
-      </w:r>
-      <w:r>
-        <w:t xml:space="preserve">39 do substantially more unpaid domestic and care work than</w:t>
-      </w:r>
-      <w:r>
-        <w:t xml:space="preserve"> </w:t>
-      </w:r>
-      <w:r>
-        <w:t xml:space="preserve">never-married women, and the difference is far larger for women than for</w:t>
-      </w:r>
-      <w:r>
-        <w:t xml:space="preserve"> </w:t>
-      </w:r>
-      <w:r>
-        <w:t xml:space="preserve">men. Most of the time comes out of paid work and learning, which fits</w:t>
-      </w:r>
-      <w:r>
-        <w:t xml:space="preserve"> </w:t>
-      </w:r>
-      <w:r>
-        <w:t xml:space="preserve">the specialisation account, but specialisation in India happens against</w:t>
-      </w:r>
-      <w:r>
-        <w:t xml:space="preserve"> </w:t>
-      </w:r>
-      <w:r>
-        <w:t xml:space="preserve">a background of low and falling married women’s employment and strong</w:t>
-      </w:r>
-      <w:r>
-        <w:t xml:space="preserve"> </w:t>
-      </w:r>
-      <w:r>
-        <w:t xml:space="preserve">norms about women’s work outside the home, so it is not necessarily a</w:t>
-      </w:r>
-      <w:r>
-        <w:t xml:space="preserve"> </w:t>
-      </w:r>
-      <w:r>
-        <w:t xml:space="preserve">choice made within the couple.</w:t>
+        <w:t xml:space="preserve">in housework, sleep, social life and exercise with one</w:t>
+      </w:r>
+      <w:r>
+        <w:t xml:space="preserve"> </w:t>
+      </w:r>
+      <w:r>
+        <w:t xml:space="preserve">decomposition in which the parts must add up. In India in 2024, married</w:t>
+      </w:r>
+      <w:r>
+        <w:t xml:space="preserve"> </w:t>
+      </w:r>
+      <w:r>
+        <w:t xml:space="preserve">women aged 20 to 39 do substantially more unpaid domestic and care work</w:t>
+      </w:r>
+      <w:r>
+        <w:t xml:space="preserve"> </w:t>
+      </w:r>
+      <w:r>
+        <w:t xml:space="preserve">than never-married women, and the difference is far larger for women</w:t>
+      </w:r>
+      <w:r>
+        <w:t xml:space="preserve"> </w:t>
+      </w:r>
+      <w:r>
+        <w:t xml:space="preserve">than for men. The offsetting differences are mostly in paid work and</w:t>
+      </w:r>
+      <w:r>
+        <w:t xml:space="preserve"> </w:t>
+      </w:r>
+      <w:r>
+        <w:t xml:space="preserve">learning, which fits the specialisation account, but specialisation in</w:t>
+      </w:r>
+      <w:r>
+        <w:t xml:space="preserve"> </w:t>
+      </w:r>
+      <w:r>
+        <w:t xml:space="preserve">India happens against a background of low and falling married women’s</w:t>
+      </w:r>
+      <w:r>
+        <w:t xml:space="preserve"> </w:t>
+      </w:r>
+      <w:r>
+        <w:t xml:space="preserve">employment and strong norms about women’s work outside the home, so it</w:t>
+      </w:r>
+      <w:r>
+        <w:t xml:space="preserve"> </w:t>
+      </w:r>
+      <w:r>
+        <w:t xml:space="preserve">is not necessarily a choice made within the couple.</w:t>
       </w:r>
     </w:p>
     <w:p>
@@ -10823,61 +11062,67 @@
         <w:pStyle w:val="FirstParagraph"/>
       </w:pPr>
       <w:r>
-        <w:t xml:space="preserve">For most Indian women, marriage changes how the day is spent. It adds</w:t>
-      </w:r>
-      <w:r>
-        <w:t xml:space="preserve"> </w:t>
-      </w:r>
-      <w:r>
-        <w:t xml:space="preserve">unpaid domestic and care work on a scale that has no counterpart for</w:t>
-      </w:r>
-      <w:r>
-        <w:t xml:space="preserve"> </w:t>
-      </w:r>
-      <w:r>
-        <w:t xml:space="preserve">men. A time-budget decomposition shows where that work comes from, and</w:t>
-      </w:r>
-      <w:r>
-        <w:t xml:space="preserve"> </w:t>
-      </w:r>
-      <w:r>
-        <w:t xml:space="preserve">the household roster shows how the change depends on whether a young</w:t>
-      </w:r>
-      <w:r>
-        <w:t xml:space="preserve"> </w:t>
-      </w:r>
-      <w:r>
-        <w:t xml:space="preserve">wife joins her husband’s parents’ household and on her standing relative</w:t>
-      </w:r>
-      <w:r>
-        <w:t xml:space="preserve"> </w:t>
-      </w:r>
-      <w:r>
-        <w:t xml:space="preserve">to her husband. Policies that aim to raise married women’s employment,</w:t>
-      </w:r>
-      <w:r>
-        <w:t xml:space="preserve"> </w:t>
-      </w:r>
-      <w:r>
-        <w:t xml:space="preserve">such as childcare, safe transport or flexible work, operate within this</w:t>
-      </w:r>
-      <w:r>
-        <w:t xml:space="preserve"> </w:t>
-      </w:r>
-      <w:r>
-        <w:t xml:space="preserve">budget. They are more likely to succeed if they also reduce the unpaid</w:t>
-      </w:r>
-      <w:r>
-        <w:t xml:space="preserve"> </w:t>
-      </w:r>
-      <w:r>
-        <w:t xml:space="preserve">domestic and care work that marriage adds, since that work otherwise</w:t>
-      </w:r>
-      <w:r>
-        <w:t xml:space="preserve"> </w:t>
-      </w:r>
-      <w:r>
-        <w:t xml:space="preserve">comes out of women’s paid work, learning, leisure or sleep.</w:t>
+        <w:t xml:space="preserve">Married and never-married Indian women spend the day very differently.</w:t>
+      </w:r>
+      <w:r>
+        <w:t xml:space="preserve"> </w:t>
+      </w:r>
+      <w:r>
+        <w:t xml:space="preserve">Married women do far more unpaid domestic and care work, a difference</w:t>
+      </w:r>
+      <w:r>
+        <w:t xml:space="preserve"> </w:t>
+      </w:r>
+      <w:r>
+        <w:t xml:space="preserve">with no counterpart among men. A time-budget decomposition shows which</w:t>
+      </w:r>
+      <w:r>
+        <w:t xml:space="preserve"> </w:t>
+      </w:r>
+      <w:r>
+        <w:t xml:space="preserve">activities differ alongside that work, and the household roster shows</w:t>
+      </w:r>
+      <w:r>
+        <w:t xml:space="preserve"> </w:t>
+      </w:r>
+      <w:r>
+        <w:t xml:space="preserve">how the change depends on whether a young wife joins her husband’s</w:t>
+      </w:r>
+      <w:r>
+        <w:t xml:space="preserve"> </w:t>
+      </w:r>
+      <w:r>
+        <w:t xml:space="preserve">parents’ household and on her standing relative to her husband. Policies</w:t>
+      </w:r>
+      <w:r>
+        <w:t xml:space="preserve"> </w:t>
+      </w:r>
+      <w:r>
+        <w:t xml:space="preserve">that aim to raise married women’s employment, such as childcare, safe</w:t>
+      </w:r>
+      <w:r>
+        <w:t xml:space="preserve"> </w:t>
+      </w:r>
+      <w:r>
+        <w:t xml:space="preserve">transport or flexible work, operate within this budget. They are more</w:t>
+      </w:r>
+      <w:r>
+        <w:t xml:space="preserve"> </w:t>
+      </w:r>
+      <w:r>
+        <w:t xml:space="preserve">likely to succeed if they also reduce the unpaid domestic and care work</w:t>
+      </w:r>
+      <w:r>
+        <w:t xml:space="preserve"> </w:t>
+      </w:r>
+      <w:r>
+        <w:t xml:space="preserve">that accompanies marriage and motherhood, since that work competes with</w:t>
+      </w:r>
+      <w:r>
+        <w:t xml:space="preserve"> </w:t>
+      </w:r>
+      <w:r>
+        <w:t xml:space="preserve">women’s paid work, learning, leisure or sleep.</w:t>
       </w:r>
     </w:p>
     <w:bookmarkEnd w:id="49"/>
@@ -10902,31 +11147,25 @@
         <w:pStyle w:val="FirstParagraph"/>
       </w:pPr>
       <w:r>
-        <w:t xml:space="preserve">Generative AI tools (Claude, Anthropic; and other AI assistants) were</w:t>
-      </w:r>
-      <w:r>
-        <w:t xml:space="preserve"> </w:t>
-      </w:r>
-      <w:r>
-        <w:t xml:space="preserve">used to assist with writing and debugging analysis code, checking</w:t>
-      </w:r>
-      <w:r>
-        <w:t xml:space="preserve"> </w:t>
-      </w:r>
-      <w:r>
-        <w:t xml:space="preserve">references, and drafting and editing text. The author reviewed and</w:t>
-      </w:r>
-      <w:r>
-        <w:t xml:space="preserve"> </w:t>
-      </w:r>
-      <w:r>
-        <w:t xml:space="preserve">verified all analyses, results, and text, and takes full responsibility</w:t>
-      </w:r>
-      <w:r>
-        <w:t xml:space="preserve"> </w:t>
-      </w:r>
-      <w:r>
-        <w:t xml:space="preserve">for the content.</w:t>
+        <w:t xml:space="preserve">Generative AI tools (Claude, Anthropic) were used to assist with writing</w:t>
+      </w:r>
+      <w:r>
+        <w:t xml:space="preserve"> </w:t>
+      </w:r>
+      <w:r>
+        <w:t xml:space="preserve">and debugging analysis code, checking references, and drafting and</w:t>
+      </w:r>
+      <w:r>
+        <w:t xml:space="preserve"> </w:t>
+      </w:r>
+      <w:r>
+        <w:t xml:space="preserve">editing text. The author reviewed and verified all analyses, results,</w:t>
+      </w:r>
+      <w:r>
+        <w:t xml:space="preserve"> </w:t>
+      </w:r>
+      <w:r>
+        <w:t xml:space="preserve">and text, and takes full responsibility for the content.</w:t>
       </w:r>
     </w:p>
     <w:bookmarkEnd w:id="51"/>
@@ -10972,7 +11211,7 @@
       </w:r>
     </w:p>
     <w:bookmarkEnd w:id="52"/>
-    <w:bookmarkStart w:id="131" w:name="references"/>
+    <w:bookmarkStart w:id="132" w:name="references"/>
     <w:p>
       <w:pPr>
         <w:pStyle w:val="Heading1"/>
@@ -12529,6 +12768,46 @@
       <w:r>
         <w:t xml:space="preserve">. Free Press.</w:t>
       </w:r>
+    </w:p>
+    <w:p>
+      <w:pPr>
+        <w:pStyle w:val="BodyText"/>
+      </w:pPr>
+      <w:r>
+        <w:t xml:space="preserve">Crump, R. K., Hotz, V. J., Imbens, G. W., &amp; Mitnik, O. A. (2009).</w:t>
+      </w:r>
+      <w:r>
+        <w:t xml:space="preserve"> </w:t>
+      </w:r>
+      <w:r>
+        <w:t xml:space="preserve">Dealing with limited overlap in estimation of average treatment effects.</w:t>
+      </w:r>
+      <w:r>
+        <w:t xml:space="preserve"> </w:t>
+      </w:r>
+      <w:r>
+        <w:rPr>
+          <w:i/>
+          <w:iCs/>
+        </w:rPr>
+        <w:t xml:space="preserve">Biometrika</w:t>
+      </w:r>
+      <w:r>
+        <w:t xml:space="preserve">,</w:t>
+      </w:r>
+      <w:r>
+        <w:t xml:space="preserve"> </w:t>
+      </w:r>
+      <w:r>
+        <w:rPr>
+          <w:i/>
+          <w:iCs/>
+        </w:rPr>
+        <w:t xml:space="preserve">96</w:t>
+      </w:r>
+      <w:r>
+        <w:t xml:space="preserve">(1), 187–199.</w:t>
+      </w:r>
       <w:r>
         <w:t xml:space="preserve"> </w:t>
       </w:r>
@@ -12537,7 +12816,7 @@
           <w:rPr>
             <w:rStyle w:val="Hyperlink"/>
           </w:rPr>
-          <w:t xml:space="preserve">https://doi.org/10.2307/3710623</w:t>
+          <w:t xml:space="preserve">https://doi.org/10.1093/biomet/asn055</w:t>
         </w:r>
       </w:hyperlink>
     </w:p>
@@ -13882,6 +14161,66 @@
         <w:pStyle w:val="BodyText"/>
       </w:pPr>
       <w:r>
+        <w:t xml:space="preserve">Janiso, A., Shukla, P. K., &amp; Reddy, A. B. (2024). What explains the</w:t>
+      </w:r>
+      <w:r>
+        <w:t xml:space="preserve"> </w:t>
+      </w:r>
+      <w:r>
+        <w:t xml:space="preserve">gender gap in unpaid housework and care work in</w:t>
+      </w:r>
+      <w:r>
+        <w:t xml:space="preserve"> </w:t>
+      </w:r>
+      <w:r>
+        <w:t xml:space="preserve">India</w:t>
+      </w:r>
+      <w:r>
+        <w:t xml:space="preserve">?</w:t>
+      </w:r>
+      <w:r>
+        <w:t xml:space="preserve"> </w:t>
+      </w:r>
+      <w:r>
+        <w:rPr>
+          <w:i/>
+          <w:iCs/>
+        </w:rPr>
+        <w:t xml:space="preserve">Development Policy Review</w:t>
+      </w:r>
+      <w:r>
+        <w:t xml:space="preserve">,</w:t>
+      </w:r>
+      <w:r>
+        <w:t xml:space="preserve"> </w:t>
+      </w:r>
+      <w:r>
+        <w:rPr>
+          <w:i/>
+          <w:iCs/>
+        </w:rPr>
+        <w:t xml:space="preserve">42</w:t>
+      </w:r>
+      <w:r>
+        <w:t xml:space="preserve">(1), e12730.</w:t>
+      </w:r>
+      <w:r>
+        <w:t xml:space="preserve"> </w:t>
+      </w:r>
+      <w:hyperlink r:id="rId99">
+        <w:r>
+          <w:rPr>
+            <w:rStyle w:val="Hyperlink"/>
+          </w:rPr>
+          <w:t xml:space="preserve">https://doi.org/10.1111/dpr.12730</w:t>
+        </w:r>
+      </w:hyperlink>
+    </w:p>
+    <w:p>
+      <w:pPr>
+        <w:pStyle w:val="BodyText"/>
+      </w:pPr>
+      <w:r>
         <w:t xml:space="preserve">Jayachandran, S. (2021). Social norms as a barrier to women’s employment</w:t>
       </w:r>
       <w:r>
@@ -13925,7 +14264,7 @@
       <w:r>
         <w:t xml:space="preserve"> </w:t>
       </w:r>
-      <w:hyperlink r:id="rId99">
+      <w:hyperlink r:id="rId100">
         <w:r>
           <w:rPr>
             <w:rStyle w:val="Hyperlink"/>
@@ -14005,7 +14344,7 @@
       <w:r>
         <w:t xml:space="preserve"> </w:t>
       </w:r>
-      <w:hyperlink r:id="rId100">
+      <w:hyperlink r:id="rId101">
         <w:r>
           <w:rPr>
             <w:rStyle w:val="Hyperlink"/>
@@ -14065,7 +14404,7 @@
       <w:r>
         <w:t xml:space="preserve"> </w:t>
       </w:r>
-      <w:hyperlink r:id="rId101">
+      <w:hyperlink r:id="rId102">
         <w:r>
           <w:rPr>
             <w:rStyle w:val="Hyperlink"/>
@@ -14168,7 +14507,7 @@
       <w:r>
         <w:t xml:space="preserve"> </w:t>
       </w:r>
-      <w:hyperlink r:id="rId102">
+      <w:hyperlink r:id="rId103">
         <w:r>
           <w:rPr>
             <w:rStyle w:val="Hyperlink"/>
@@ -14227,7 +14566,7 @@
       <w:r>
         <w:t xml:space="preserve"> </w:t>
       </w:r>
-      <w:hyperlink r:id="rId103">
+      <w:hyperlink r:id="rId104">
         <w:r>
           <w:rPr>
             <w:rStyle w:val="Hyperlink"/>
@@ -14301,7 +14640,7 @@
       <w:r>
         <w:t xml:space="preserve"> </w:t>
       </w:r>
-      <w:hyperlink r:id="rId104">
+      <w:hyperlink r:id="rId105">
         <w:r>
           <w:rPr>
             <w:rStyle w:val="Hyperlink"/>
@@ -14352,7 +14691,7 @@
       <w:r>
         <w:t xml:space="preserve"> </w:t>
       </w:r>
-      <w:hyperlink r:id="rId105">
+      <w:hyperlink r:id="rId106">
         <w:r>
           <w:rPr>
             <w:rStyle w:val="Hyperlink"/>
@@ -14489,7 +14828,7 @@
       <w:r>
         <w:t xml:space="preserve"> </w:t>
       </w:r>
-      <w:hyperlink r:id="rId106">
+      <w:hyperlink r:id="rId107">
         <w:r>
           <w:rPr>
             <w:rStyle w:val="Hyperlink"/>
@@ -14540,7 +14879,7 @@
       <w:r>
         <w:t xml:space="preserve"> </w:t>
       </w:r>
-      <w:hyperlink r:id="rId107">
+      <w:hyperlink r:id="rId108">
         <w:r>
           <w:rPr>
             <w:rStyle w:val="Hyperlink"/>
@@ -14597,7 +14936,7 @@
       <w:r>
         <w:t xml:space="preserve"> </w:t>
       </w:r>
-      <w:hyperlink r:id="rId108">
+      <w:hyperlink r:id="rId109">
         <w:r>
           <w:rPr>
             <w:rStyle w:val="Hyperlink"/>
@@ -14654,7 +14993,7 @@
       <w:r>
         <w:t xml:space="preserve"> </w:t>
       </w:r>
-      <w:hyperlink r:id="rId109">
+      <w:hyperlink r:id="rId110">
         <w:r>
           <w:rPr>
             <w:rStyle w:val="Hyperlink"/>
@@ -14705,7 +15044,7 @@
       <w:r>
         <w:t xml:space="preserve"> </w:t>
       </w:r>
-      <w:hyperlink r:id="rId110">
+      <w:hyperlink r:id="rId111">
         <w:r>
           <w:rPr>
             <w:rStyle w:val="Hyperlink"/>
@@ -14782,7 +15121,7 @@
       <w:r>
         <w:t xml:space="preserve"> </w:t>
       </w:r>
-      <w:hyperlink r:id="rId111">
+      <w:hyperlink r:id="rId112">
         <w:r>
           <w:rPr>
             <w:rStyle w:val="Hyperlink"/>
@@ -14833,7 +15172,7 @@
       <w:r>
         <w:t xml:space="preserve"> </w:t>
       </w:r>
-      <w:hyperlink r:id="rId112">
+      <w:hyperlink r:id="rId113">
         <w:r>
           <w:rPr>
             <w:rStyle w:val="Hyperlink"/>
@@ -14884,7 +15223,7 @@
       <w:r>
         <w:t xml:space="preserve"> </w:t>
       </w:r>
-      <w:hyperlink r:id="rId113">
+      <w:hyperlink r:id="rId114">
         <w:r>
           <w:rPr>
             <w:rStyle w:val="Hyperlink"/>
@@ -14944,7 +15283,7 @@
       <w:r>
         <w:t xml:space="preserve"> </w:t>
       </w:r>
-      <w:hyperlink r:id="rId114">
+      <w:hyperlink r:id="rId115">
         <w:r>
           <w:rPr>
             <w:rStyle w:val="Hyperlink"/>
@@ -15057,7 +15396,7 @@
       <w:r>
         <w:t xml:space="preserve"> </w:t>
       </w:r>
-      <w:hyperlink r:id="rId115">
+      <w:hyperlink r:id="rId116">
         <w:r>
           <w:rPr>
             <w:rStyle w:val="Hyperlink"/>
@@ -15108,7 +15447,7 @@
       <w:r>
         <w:t xml:space="preserve"> </w:t>
       </w:r>
-      <w:hyperlink r:id="rId116">
+      <w:hyperlink r:id="rId117">
         <w:r>
           <w:rPr>
             <w:rStyle w:val="Hyperlink"/>
@@ -15186,7 +15525,7 @@
       <w:r>
         <w:t xml:space="preserve"> </w:t>
       </w:r>
-      <w:hyperlink r:id="rId117">
+      <w:hyperlink r:id="rId118">
         <w:r>
           <w:rPr>
             <w:rStyle w:val="Hyperlink"/>
@@ -15358,7 +15697,7 @@
       <w:r>
         <w:t xml:space="preserve"> </w:t>
       </w:r>
-      <w:hyperlink r:id="rId118">
+      <w:hyperlink r:id="rId119">
         <w:r>
           <w:rPr>
             <w:rStyle w:val="Hyperlink"/>
@@ -15423,7 +15762,7 @@
       <w:r>
         <w:t xml:space="preserve"> </w:t>
       </w:r>
-      <w:hyperlink r:id="rId119">
+      <w:hyperlink r:id="rId120">
         <w:r>
           <w:rPr>
             <w:rStyle w:val="Hyperlink"/>
@@ -15534,7 +15873,7 @@
       <w:r>
         <w:t xml:space="preserve"> </w:t>
       </w:r>
-      <w:hyperlink r:id="rId120">
+      <w:hyperlink r:id="rId121">
         <w:r>
           <w:rPr>
             <w:rStyle w:val="Hyperlink"/>
@@ -15585,7 +15924,7 @@
       <w:r>
         <w:t xml:space="preserve"> </w:t>
       </w:r>
-      <w:hyperlink r:id="rId121">
+      <w:hyperlink r:id="rId122">
         <w:r>
           <w:rPr>
             <w:rStyle w:val="Hyperlink"/>
@@ -15636,7 +15975,7 @@
       <w:r>
         <w:t xml:space="preserve"> </w:t>
       </w:r>
-      <w:hyperlink r:id="rId122">
+      <w:hyperlink r:id="rId123">
         <w:r>
           <w:rPr>
             <w:rStyle w:val="Hyperlink"/>
@@ -15711,7 +16050,7 @@
       <w:r>
         <w:t xml:space="preserve"> </w:t>
       </w:r>
-      <w:hyperlink r:id="rId123">
+      <w:hyperlink r:id="rId124">
         <w:r>
           <w:rPr>
             <w:rStyle w:val="Hyperlink"/>
@@ -15768,7 +16107,7 @@
       <w:r>
         <w:t xml:space="preserve"> </w:t>
       </w:r>
-      <w:hyperlink r:id="rId124">
+      <w:hyperlink r:id="rId125">
         <w:r>
           <w:rPr>
             <w:rStyle w:val="Hyperlink"/>
@@ -15819,7 +16158,7 @@
       <w:r>
         <w:t xml:space="preserve"> </w:t>
       </w:r>
-      <w:hyperlink r:id="rId125">
+      <w:hyperlink r:id="rId126">
         <w:r>
           <w:rPr>
             <w:rStyle w:val="Hyperlink"/>
@@ -15884,7 +16223,7 @@
       <w:r>
         <w:t xml:space="preserve"> </w:t>
       </w:r>
-      <w:hyperlink r:id="rId126">
+      <w:hyperlink r:id="rId127">
         <w:r>
           <w:rPr>
             <w:rStyle w:val="Hyperlink"/>
@@ -15941,7 +16280,7 @@
       <w:r>
         <w:t xml:space="preserve"> </w:t>
       </w:r>
-      <w:hyperlink r:id="rId127">
+      <w:hyperlink r:id="rId128">
         <w:r>
           <w:rPr>
             <w:rStyle w:val="Hyperlink"/>
@@ -16060,7 +16399,7 @@
       <w:r>
         <w:t xml:space="preserve"> </w:t>
       </w:r>
-      <w:hyperlink r:id="rId128">
+      <w:hyperlink r:id="rId129">
         <w:r>
           <w:rPr>
             <w:rStyle w:val="Hyperlink"/>
@@ -16105,7 +16444,7 @@
       <w:r>
         <w:t xml:space="preserve"> </w:t>
       </w:r>
-      <w:hyperlink r:id="rId129">
+      <w:hyperlink r:id="rId130">
         <w:r>
           <w:rPr>
             <w:rStyle w:val="Hyperlink"/>
@@ -16164,7 +16503,7 @@
       <w:r>
         <w:t xml:space="preserve"> </w:t>
       </w:r>
-      <w:hyperlink r:id="rId130">
+      <w:hyperlink r:id="rId131">
         <w:r>
           <w:rPr>
             <w:rStyle w:val="Hyperlink"/>
@@ -16173,7 +16512,7 @@
         </w:r>
       </w:hyperlink>
     </w:p>
-    <w:bookmarkEnd w:id="131"/>
+    <w:bookmarkEnd w:id="132"/>
     <w:sectPr>
       <w:footnotePr>
         <w:numRestart w:val="eachSect"/>

</xml_diff>

<commit_message>
05: Roo final - 256.1 coincidence reported to 2dp, 2019 rationale, Janiso claim/author corrected, abstract trimmed and de-causalised
</commit_message>
<xml_diff>
--- a/submission/05_marriage_time_reallocation/package/manuscript_anonymised.docx
+++ b/submission/05_marriage_time_reallocation/package/manuscript_anonymised.docx
@@ -55,7 +55,7 @@
         <w:t xml:space="preserve"> </w:t>
       </w:r>
       <w:r>
-        <w:t xml:space="preserve">This study asks where, within the fixed day, the additional unpaid work that marriage brings to Indian women comes from, and how this differs by co-residence with parents-in-law and spouses’ relative resources and ages.</w:t>
+        <w:t xml:space="preserve">This study asks which activities differ alongside the higher unpaid work of married Indian women, within the fixed day, and how this varies with co-residence with parents-in-law and spouses’ relative resources and ages.</w:t>
       </w:r>
     </w:p>
     <w:p>
@@ -73,7 +73,7 @@
         <w:t xml:space="preserve"> </w:t>
       </w:r>
       <w:r>
-        <w:t xml:space="preserve">Studies of marriage and time use usually examine one outcome at a time, yet a day has 1,440 minutes, so gains and losses across activities must sum to zero.</w:t>
+        <w:t xml:space="preserve">Studies of marriage and time use usually examine one outcome at a time, although differences across activities must sum to zero within 1,440 minutes.</w:t>
       </w:r>
     </w:p>
     <w:p>
@@ -91,7 +91,7 @@
         <w:t xml:space="preserve"> </w:t>
       </w:r>
       <w:r>
-        <w:t xml:space="preserve">Using all 450,457 diaries of India’s Time Use Survey 2024, the study compares 88,337 married and never-married women and 87,364 men aged 20 to 39 across nine exhaustive activity divisions, net of single-year age, education, caste, religion, state and diary day. Selection into marriage is addressed by restricting to ages 20 to 26, reweighting and bias adjustment. 106,858 linked couples provide within-household comparisons.</w:t>
+        <w:t xml:space="preserve">Using all 450,457 diaries of India’s Time Use Survey 2024, the study compares 88,337 married and never-married women and 87,364 men aged 20 to 39 across nine activity divisions, with controls. Selection is addressed by restricting ages, reweighting and bias adjustment; 106,858 linked couples give within-household comparisons.</w:t>
       </w:r>
     </w:p>
     <w:p>
@@ -424,67 +424,61 @@
         <w:t xml:space="preserve"> </w:t>
       </w:r>
       <w:r>
-        <w:t xml:space="preserve">and find that being married is associated with about 135 more minutes a</w:t>
-      </w:r>
-      <w:r>
-        <w:t xml:space="preserve"> </w:t>
-      </w:r>
-      <w:r>
-        <w:t xml:space="preserve">day of housework for women; this paper extends that comparison from one</w:t>
-      </w:r>
-      <w:r>
-        <w:t xml:space="preserve"> </w:t>
-      </w:r>
-      <w:r>
-        <w:t xml:space="preserve">activity to the whole day, using the 2024 round. This paper estimates</w:t>
-      </w:r>
-      <w:r>
-        <w:t xml:space="preserve"> </w:t>
-      </w:r>
-      <w:r>
-        <w:t xml:space="preserve">the components together. I decompose the married–never-married</w:t>
-      </w:r>
-      <w:r>
-        <w:t xml:space="preserve"> </w:t>
-      </w:r>
-      <w:r>
-        <w:t xml:space="preserve">difference into all nine divisions of the International Classification</w:t>
-      </w:r>
-      <w:r>
-        <w:t xml:space="preserve"> </w:t>
-      </w:r>
-      <w:r>
-        <w:t xml:space="preserve">of Activities for Time-Use Statistics 2016 (ICATUS 2016,</w:t>
-      </w:r>
-      <w:r>
-        <w:t xml:space="preserve"> </w:t>
-      </w:r>
-      <w:r>
-        <w:t xml:space="preserve">).</w:t>
-      </w:r>
-      <w:r>
-        <w:t xml:space="preserve"> </w:t>
-      </w:r>
-      <w:r>
-        <w:t xml:space="preserve">The divisions partition the day, so the components sum to zero by</w:t>
-      </w:r>
-      <w:r>
-        <w:t xml:space="preserve"> </w:t>
-      </w:r>
-      <w:r>
-        <w:t xml:space="preserve">construction, and sub-rows for sleep, socialising, exercise and</w:t>
-      </w:r>
-      <w:r>
-        <w:t xml:space="preserve"> </w:t>
-      </w:r>
-      <w:r>
-        <w:t xml:space="preserve">religious practice show where these commonly studied outcomes sit within</w:t>
-      </w:r>
-      <w:r>
-        <w:t xml:space="preserve"> </w:t>
-      </w:r>
-      <w:r>
-        <w:t xml:space="preserve">the budget.</w:t>
+        <w:t xml:space="preserve">to decompose the large gap between women and men in unpaid housework and</w:t>
+      </w:r>
+      <w:r>
+        <w:t xml:space="preserve"> </w:t>
+      </w:r>
+      <w:r>
+        <w:t xml:space="preserve">care work; this paper instead compares married with never-married women</w:t>
+      </w:r>
+      <w:r>
+        <w:t xml:space="preserve"> </w:t>
+      </w:r>
+      <w:r>
+        <w:t xml:space="preserve">and men, across the whole day, using the 2024 round. This paper</w:t>
+      </w:r>
+      <w:r>
+        <w:t xml:space="preserve"> </w:t>
+      </w:r>
+      <w:r>
+        <w:t xml:space="preserve">estimates the components together. I decompose the</w:t>
+      </w:r>
+      <w:r>
+        <w:t xml:space="preserve"> </w:t>
+      </w:r>
+      <w:r>
+        <w:t xml:space="preserve">married–never-married difference into all nine divisions of the</w:t>
+      </w:r>
+      <w:r>
+        <w:t xml:space="preserve"> </w:t>
+      </w:r>
+      <w:r>
+        <w:t xml:space="preserve">International Classification of Activities for Time-Use Statistics 2016</w:t>
+      </w:r>
+      <w:r>
+        <w:t xml:space="preserve"> </w:t>
+      </w:r>
+      <w:r>
+        <w:t xml:space="preserve">(ICATUS 2016, ). The divisions partition the day, so the components sum</w:t>
+      </w:r>
+      <w:r>
+        <w:t xml:space="preserve"> </w:t>
+      </w:r>
+      <w:r>
+        <w:t xml:space="preserve">to zero by construction, and sub-rows for sleep, socialising, exercise</w:t>
+      </w:r>
+      <w:r>
+        <w:t xml:space="preserve"> </w:t>
+      </w:r>
+      <w:r>
+        <w:t xml:space="preserve">and religious practice show where these commonly studied outcomes sit</w:t>
+      </w:r>
+      <w:r>
+        <w:t xml:space="preserve"> </w:t>
+      </w:r>
+      <w:r>
+        <w:t xml:space="preserve">within the budget.</w:t>
       </w:r>
     </w:p>
     <w:p>
@@ -2214,97 +2208,133 @@
         <w:pStyle w:val="FirstParagraph"/>
       </w:pPr>
       <w:r>
-        <w:t xml:space="preserve">The Time Use Survey 2024, conducted by India’s National Statistics</w:t>
-      </w:r>
-      <w:r>
-        <w:t xml:space="preserve"> </w:t>
-      </w:r>
-      <w:r>
-        <w:t xml:space="preserve">Office from January to December 2024, records the activities of every</w:t>
-      </w:r>
-      <w:r>
-        <w:t xml:space="preserve"> </w:t>
-      </w:r>
-      <w:r>
-        <w:t xml:space="preserve">household member aged six and above over the 24 hours from 4:00 a.m. on</w:t>
-      </w:r>
-      <w:r>
-        <w:t xml:space="preserve"> </w:t>
-      </w:r>
-      <w:r>
-        <w:t xml:space="preserve">the day before the interview (). Activities are coded to the three-digit level</w:t>
-      </w:r>
-      <w:r>
-        <w:t xml:space="preserve"> </w:t>
-      </w:r>
-      <w:r>
-        <w:t xml:space="preserve">of ICATUS 2016 (). Where activities overlap, the survey flags one as the</w:t>
-      </w:r>
-      <w:r>
-        <w:t xml:space="preserve"> </w:t>
-      </w:r>
-      <w:r>
-        <w:t xml:space="preserve">major activity. I use every activity record (10,211,478 records from</w:t>
-      </w:r>
-      <w:r>
-        <w:t xml:space="preserve"> </w:t>
-      </w:r>
-      <w:r>
-        <w:t xml:space="preserve">450,457 diaries in 139,487 households) and aggregate major activities to</w:t>
-      </w:r>
-      <w:r>
-        <w:t xml:space="preserve"> </w:t>
-      </w:r>
-      <w:r>
-        <w:t xml:space="preserve">the person-day, so all but 5 of the 450,457 diaries partition exactly</w:t>
-      </w:r>
-      <w:r>
-        <w:t xml:space="preserve"> </w:t>
-      </w:r>
-      <w:r>
-        <w:t xml:space="preserve">1,440 minutes. The roster lists 454,192 persons aged six and above;</w:t>
-      </w:r>
-      <w:r>
-        <w:t xml:space="preserve"> </w:t>
-      </w:r>
-      <w:r>
-        <w:t xml:space="preserve">3,735 of them have no diary records in the file, which leaves the</w:t>
-      </w:r>
-      <w:r>
-        <w:t xml:space="preserve"> </w:t>
-      </w:r>
-      <w:r>
-        <w:t xml:space="preserve">450,457 diaries, and the 49 diaries of third-gender respondents are</w:t>
-      </w:r>
-      <w:r>
-        <w:t xml:space="preserve"> </w:t>
-      </w:r>
-      <w:r>
-        <w:t xml:space="preserve">excluded from the comparisons of women and men. Some diaries are</w:t>
-      </w:r>
-      <w:r>
-        <w:t xml:space="preserve"> </w:t>
-      </w:r>
-      <w:r>
-        <w:t xml:space="preserve">reported by another household member; I control for proxy reporting and</w:t>
-      </w:r>
-      <w:r>
-        <w:t xml:space="preserve"> </w:t>
-      </w:r>
-      <w:r>
-        <w:t xml:space="preserve">drop proxy diaries in a robustness check. All estimates use the survey</w:t>
-      </w:r>
-      <w:r>
-        <w:t xml:space="preserve"> </w:t>
-      </w:r>
-      <w:r>
-        <w:t xml:space="preserve">multipliers, and standard errors are clustered on the first-stage unit,</w:t>
-      </w:r>
-      <w:r>
-        <w:t xml:space="preserve"> </w:t>
-      </w:r>
-      <w:r>
-        <w:t xml:space="preserve">the primary sampling unit (; ).</w:t>
+        <w:t xml:space="preserve">I use the 2024 round because it is the most recent and its diaries cover</w:t>
+      </w:r>
+      <w:r>
+        <w:t xml:space="preserve"> </w:t>
+      </w:r>
+      <w:r>
+        <w:t xml:space="preserve">every household member aged six and above; the 2019 round</w:t>
+      </w:r>
+      <w:r>
+        <w:t xml:space="preserve"> </w:t>
+      </w:r>
+      <w:r>
+        <w:t xml:space="preserve">() uses the</w:t>
+      </w:r>
+      <w:r>
+        <w:t xml:space="preserve"> </w:t>
+      </w:r>
+      <w:r>
+        <w:t xml:space="preserve">same design, and a 2019–2024 comparison of the headline</w:t>
+      </w:r>
+      <w:r>
+        <w:t xml:space="preserve"> </w:t>
+      </w:r>
+      <w:r>
+        <w:t xml:space="preserve">married–never-married difference is planned as an extension. The Time</w:t>
+      </w:r>
+      <w:r>
+        <w:t xml:space="preserve"> </w:t>
+      </w:r>
+      <w:r>
+        <w:t xml:space="preserve">Use Survey 2024, conducted by India’s National Statistics Office from</w:t>
+      </w:r>
+      <w:r>
+        <w:t xml:space="preserve"> </w:t>
+      </w:r>
+      <w:r>
+        <w:t xml:space="preserve">January to December 2024, records the activities of every household</w:t>
+      </w:r>
+      <w:r>
+        <w:t xml:space="preserve"> </w:t>
+      </w:r>
+      <w:r>
+        <w:t xml:space="preserve">member aged six and above over the 24 hours from 4:00 a.m. on the day</w:t>
+      </w:r>
+      <w:r>
+        <w:t xml:space="preserve"> </w:t>
+      </w:r>
+      <w:r>
+        <w:t xml:space="preserve">before the interview (). Activities are coded to the three-digit level of ICATUS</w:t>
+      </w:r>
+      <w:r>
+        <w:t xml:space="preserve"> </w:t>
+      </w:r>
+      <w:r>
+        <w:t xml:space="preserve">2016 (). Where activities overlap, the survey flags one as the major</w:t>
+      </w:r>
+      <w:r>
+        <w:t xml:space="preserve"> </w:t>
+      </w:r>
+      <w:r>
+        <w:t xml:space="preserve">activity. I use every activity record (10,211,478 records from 450,457</w:t>
+      </w:r>
+      <w:r>
+        <w:t xml:space="preserve"> </w:t>
+      </w:r>
+      <w:r>
+        <w:t xml:space="preserve">diaries in 139,487 households) and aggregate major activities to the</w:t>
+      </w:r>
+      <w:r>
+        <w:t xml:space="preserve"> </w:t>
+      </w:r>
+      <w:r>
+        <w:t xml:space="preserve">person-day, so all but 5 of the 450,457 diaries partition exactly 1,440</w:t>
+      </w:r>
+      <w:r>
+        <w:t xml:space="preserve"> </w:t>
+      </w:r>
+      <w:r>
+        <w:t xml:space="preserve">minutes. The roster lists 454,192 persons aged six and above; 3,735 of</w:t>
+      </w:r>
+      <w:r>
+        <w:t xml:space="preserve"> </w:t>
+      </w:r>
+      <w:r>
+        <w:t xml:space="preserve">them have no diary records in the file, which leaves the 450,457</w:t>
+      </w:r>
+      <w:r>
+        <w:t xml:space="preserve"> </w:t>
+      </w:r>
+      <w:r>
+        <w:t xml:space="preserve">diaries, and the 49 diaries of third-gender respondents are excluded</w:t>
+      </w:r>
+      <w:r>
+        <w:t xml:space="preserve"> </w:t>
+      </w:r>
+      <w:r>
+        <w:t xml:space="preserve">from the comparisons of women and men. Some diaries are reported by</w:t>
+      </w:r>
+      <w:r>
+        <w:t xml:space="preserve"> </w:t>
+      </w:r>
+      <w:r>
+        <w:t xml:space="preserve">another household member; I control for proxy reporting and drop proxy</w:t>
+      </w:r>
+      <w:r>
+        <w:t xml:space="preserve"> </w:t>
+      </w:r>
+      <w:r>
+        <w:t xml:space="preserve">diaries in a robustness check. All estimates use the survey multipliers,</w:t>
+      </w:r>
+      <w:r>
+        <w:t xml:space="preserve"> </w:t>
+      </w:r>
+      <w:r>
+        <w:t xml:space="preserve">and standard errors are clustered on the first-stage unit, the primary</w:t>
+      </w:r>
+      <w:r>
+        <w:t xml:space="preserve"> </w:t>
+      </w:r>
+      <w:r>
+        <w:t xml:space="preserve">sampling unit (;</w:t>
+      </w:r>
+      <w:r>
+        <w:t xml:space="preserve"> </w:t>
+      </w:r>
+      <w:r>
+        <w:t xml:space="preserve">).</w:t>
       </w:r>
     </w:p>
     <w:bookmarkEnd w:id="16"/>
@@ -8153,19 +8183,19 @@
         <w:t xml:space="preserve"> </w:t>
       </w:r>
       <w:r>
-        <w:t xml:space="preserve">Among women, the coefficient is 256.1 minutes (SE 4.0) at ages 20 to 22,</w:t>
-      </w:r>
-      <w:r>
-        <w:t xml:space="preserve"> </w:t>
-      </w:r>
-      <w:r>
-        <w:t xml:space="preserve">where 53% are never married, and 214.7 minutes (SE 10.8) at ages 35 to</w:t>
-      </w:r>
-      <w:r>
-        <w:t xml:space="preserve"> </w:t>
-      </w:r>
-      <w:r>
-        <w:t xml:space="preserve">39, where 2% are. The gap does not grow significantly as the</w:t>
+        <w:t xml:space="preserve">Among women, the coefficient is 256.10 minutes (SE 3.97) at ages 20 to</w:t>
+      </w:r>
+      <w:r>
+        <w:t xml:space="preserve"> </w:t>
+      </w:r>
+      <w:r>
+        <w:t xml:space="preserve">22, where 53% are never married, and 214.7 minutes (SE 10.8) at ages 35</w:t>
+      </w:r>
+      <w:r>
+        <w:t xml:space="preserve"> </w:t>
+      </w:r>
+      <w:r>
+        <w:t xml:space="preserve">to 39, where 2% are. The gap does not grow significantly as the</w:t>
       </w:r>
       <w:r>
         <w:t xml:space="preserve"> </w:t>
@@ -10626,49 +10656,61 @@
         <w:t xml:space="preserve"> </w:t>
       </w:r>
       <w:r>
-        <w:t xml:space="preserve">minutes. It is positive and statistically significant in every</w:t>
-      </w:r>
-      <w:r>
-        <w:t xml:space="preserve"> </w:t>
-      </w:r>
-      <w:r>
-        <w:t xml:space="preserve">specification. Excluding current students removes the group whose time</w:t>
-      </w:r>
-      <w:r>
-        <w:t xml:space="preserve"> </w:t>
-      </w:r>
-      <w:r>
-        <w:t xml:space="preserve">is most mechanically devoted to learning, but student status is itself</w:t>
-      </w:r>
-      <w:r>
-        <w:t xml:space="preserve"> </w:t>
-      </w:r>
-      <w:r>
-        <w:t xml:space="preserve">affected by marriage, so this row is a bound rather than a preferred</w:t>
-      </w:r>
-      <w:r>
-        <w:t xml:space="preserve"> </w:t>
-      </w:r>
-      <w:r>
-        <w:t xml:space="preserve">estimate. Adding household size, older members and consumption changes</w:t>
-      </w:r>
-      <w:r>
-        <w:t xml:space="preserve"> </w:t>
-      </w:r>
-      <w:r>
-        <w:t xml:space="preserve">the coefficient for women from 279.7 to 277.0 minutes, consistent with</w:t>
-      </w:r>
-      <w:r>
-        <w:t xml:space="preserve"> </w:t>
-      </w:r>
-      <w:r>
-        <w:t xml:space="preserve">part of the association running through the household a woman joins at</w:t>
-      </w:r>
-      <w:r>
-        <w:t xml:space="preserve"> </w:t>
-      </w:r>
-      <w:r>
-        <w:t xml:space="preserve">marriage.</w:t>
+        <w:t xml:space="preserve">minutes. The lowest, for ages 30 to 39 (256.14, SE 6.24), coincides at</w:t>
+      </w:r>
+      <w:r>
+        <w:t xml:space="preserve"> </w:t>
+      </w:r>
+      <w:r>
+        <w:t xml:space="preserve">one decimal with the age 20 to 22 band coefficient (256.10, SE 3.97);</w:t>
+      </w:r>
+      <w:r>
+        <w:t xml:space="preserve"> </w:t>
+      </w:r>
+      <w:r>
+        <w:t xml:space="preserve">the two are separate estimates on different samples. It is positive and</w:t>
+      </w:r>
+      <w:r>
+        <w:t xml:space="preserve"> </w:t>
+      </w:r>
+      <w:r>
+        <w:t xml:space="preserve">statistically significant in every specification. Excluding current</w:t>
+      </w:r>
+      <w:r>
+        <w:t xml:space="preserve"> </w:t>
+      </w:r>
+      <w:r>
+        <w:t xml:space="preserve">students removes the group whose time is most mechanically devoted to</w:t>
+      </w:r>
+      <w:r>
+        <w:t xml:space="preserve"> </w:t>
+      </w:r>
+      <w:r>
+        <w:t xml:space="preserve">learning, but student status is itself affected by marriage, so this row</w:t>
+      </w:r>
+      <w:r>
+        <w:t xml:space="preserve"> </w:t>
+      </w:r>
+      <w:r>
+        <w:t xml:space="preserve">is a bound rather than a preferred estimate. Adding household size,</w:t>
+      </w:r>
+      <w:r>
+        <w:t xml:space="preserve"> </w:t>
+      </w:r>
+      <w:r>
+        <w:t xml:space="preserve">older members and consumption changes the coefficient for women from</w:t>
+      </w:r>
+      <w:r>
+        <w:t xml:space="preserve"> </w:t>
+      </w:r>
+      <w:r>
+        <w:t xml:space="preserve">279.7 to 277.0 minutes, consistent with part of the association running</w:t>
+      </w:r>
+      <w:r>
+        <w:t xml:space="preserve"> </w:t>
+      </w:r>
+      <w:r>
+        <w:t xml:space="preserve">through the household a woman joins at marriage.</w:t>
       </w:r>
     </w:p>
     <w:bookmarkEnd w:id="46"/>
@@ -14161,13 +14203,13 @@
         <w:pStyle w:val="BodyText"/>
       </w:pPr>
       <w:r>
-        <w:t xml:space="preserve">Janiso, A., Shukla, P. K., &amp; Reddy, A. B. (2024). What explains the</w:t>
-      </w:r>
-      <w:r>
-        <w:t xml:space="preserve"> </w:t>
-      </w:r>
-      <w:r>
-        <w:t xml:space="preserve">gender gap in unpaid housework and care work in</w:t>
+        <w:t xml:space="preserve">Janiso, A., Shukla, P. K., &amp; Bheemeshwar Reddy A. (2024). What explains</w:t>
+      </w:r>
+      <w:r>
+        <w:t xml:space="preserve"> </w:t>
+      </w:r>
+      <w:r>
+        <w:t xml:space="preserve">the gender gap in unpaid housework and care work in</w:t>
       </w:r>
       <w:r>
         <w:t xml:space="preserve"> </w:t>
@@ -15291,6 +15333,33 @@
           <w:t xml:space="preserve">https://doi.org/10.1016/j.worlddev.2017.05.003</w:t>
         </w:r>
       </w:hyperlink>
+    </w:p>
+    <w:p>
+      <w:pPr>
+        <w:pStyle w:val="BodyText"/>
+      </w:pPr>
+      <w:r>
+        <w:t xml:space="preserve">National Statistical Office. (2020).</w:t>
+      </w:r>
+      <w:r>
+        <w:t xml:space="preserve"> </w:t>
+      </w:r>
+      <w:r>
+        <w:rPr>
+          <w:i/>
+          <w:iCs/>
+        </w:rPr>
+        <w:t xml:space="preserve">Time use in india 2019</w:t>
+      </w:r>
+      <w:r>
+        <w:t xml:space="preserve">.</w:t>
+      </w:r>
+      <w:r>
+        <w:t xml:space="preserve"> </w:t>
+      </w:r>
+      <w:r>
+        <w:t xml:space="preserve">Ministry of Statistics; Programme Implementation, Government of India.</w:t>
+      </w:r>
     </w:p>
     <w:p>
       <w:pPr>

</xml_diff>

<commit_message>
2019 TUS harmonised comparisons (R/compare_2019.R, aggregates only) in 03/05/06/07; supplement citation fix; final rebuild of all packages, 06 author version, 05 docx
</commit_message>
<xml_diff>
--- a/submission/05_marriage_time_reallocation/package/manuscript_anonymised.docx
+++ b/submission/05_marriage_time_reallocation/package/manuscript_anonymised.docx
@@ -2226,109 +2226,139 @@
         <w:t xml:space="preserve"> </w:t>
       </w:r>
       <w:r>
-        <w:t xml:space="preserve">same design, and a 2019–2024 comparison of the headline</w:t>
-      </w:r>
-      <w:r>
-        <w:t xml:space="preserve"> </w:t>
-      </w:r>
-      <w:r>
-        <w:t xml:space="preserve">married–never-married difference is planned as an extension. The Time</w:t>
-      </w:r>
-      <w:r>
-        <w:t xml:space="preserve"> </w:t>
-      </w:r>
-      <w:r>
-        <w:t xml:space="preserve">Use Survey 2024, conducted by India’s National Statistics Office from</w:t>
-      </w:r>
-      <w:r>
-        <w:t xml:space="preserve"> </w:t>
-      </w:r>
-      <w:r>
-        <w:t xml:space="preserve">January to December 2024, records the activities of every household</w:t>
-      </w:r>
-      <w:r>
-        <w:t xml:space="preserve"> </w:t>
-      </w:r>
-      <w:r>
-        <w:t xml:space="preserve">member aged six and above over the 24 hours from 4:00 a.m. on the day</w:t>
-      </w:r>
-      <w:r>
-        <w:t xml:space="preserve"> </w:t>
-      </w:r>
-      <w:r>
-        <w:t xml:space="preserve">before the interview (). Activities are coded to the three-digit level of ICATUS</w:t>
-      </w:r>
-      <w:r>
-        <w:t xml:space="preserve"> </w:t>
-      </w:r>
-      <w:r>
-        <w:t xml:space="preserve">2016 (). Where activities overlap, the survey flags one as the major</w:t>
-      </w:r>
-      <w:r>
-        <w:t xml:space="preserve"> </w:t>
-      </w:r>
-      <w:r>
-        <w:t xml:space="preserve">activity. I use every activity record (10,211,478 records from 450,457</w:t>
-      </w:r>
-      <w:r>
-        <w:t xml:space="preserve"> </w:t>
-      </w:r>
-      <w:r>
-        <w:t xml:space="preserve">diaries in 139,487 households) and aggregate major activities to the</w:t>
-      </w:r>
-      <w:r>
-        <w:t xml:space="preserve"> </w:t>
-      </w:r>
-      <w:r>
-        <w:t xml:space="preserve">person-day, so all but 5 of the 450,457 diaries partition exactly 1,440</w:t>
-      </w:r>
-      <w:r>
-        <w:t xml:space="preserve"> </w:t>
-      </w:r>
-      <w:r>
-        <w:t xml:space="preserve">minutes. The roster lists 454,192 persons aged six and above; 3,735 of</w:t>
-      </w:r>
-      <w:r>
-        <w:t xml:space="preserve"> </w:t>
-      </w:r>
-      <w:r>
-        <w:t xml:space="preserve">them have no diary records in the file, which leaves the 450,457</w:t>
-      </w:r>
-      <w:r>
-        <w:t xml:space="preserve"> </w:t>
-      </w:r>
-      <w:r>
-        <w:t xml:space="preserve">diaries, and the 49 diaries of third-gender respondents are excluded</w:t>
-      </w:r>
-      <w:r>
-        <w:t xml:space="preserve"> </w:t>
-      </w:r>
-      <w:r>
-        <w:t xml:space="preserve">from the comparisons of women and men. Some diaries are reported by</w:t>
-      </w:r>
-      <w:r>
-        <w:t xml:space="preserve"> </w:t>
-      </w:r>
-      <w:r>
-        <w:t xml:space="preserve">another household member; I control for proxy reporting and drop proxy</w:t>
-      </w:r>
-      <w:r>
-        <w:t xml:space="preserve"> </w:t>
-      </w:r>
-      <w:r>
-        <w:t xml:space="preserve">diaries in a robustness check. All estimates use the survey multipliers,</w:t>
-      </w:r>
-      <w:r>
-        <w:t xml:space="preserve"> </w:t>
-      </w:r>
-      <w:r>
-        <w:t xml:space="preserve">and standard errors are clustered on the first-stage unit, the primary</w:t>
-      </w:r>
-      <w:r>
-        <w:t xml:space="preserve"> </w:t>
-      </w:r>
-      <w:r>
-        <w:t xml:space="preserve">sampling unit (;</w:t>
+        <w:t xml:space="preserve">same design, and with a harmonised specification (age, state, diary day</w:t>
+      </w:r>
+      <w:r>
+        <w:t xml:space="preserve"> </w:t>
+      </w:r>
+      <w:r>
+        <w:t xml:space="preserve">and residence) the married–never-married difference in women’s unpaid</w:t>
+      </w:r>
+      <w:r>
+        <w:t xml:space="preserve"> </w:t>
+      </w:r>
+      <w:r>
+        <w:t xml:space="preserve">work is 284.4 minutes (SE 2.6) in 2019 and 291.7 minutes (SE 2.5) in</w:t>
+      </w:r>
+      <w:r>
+        <w:t xml:space="preserve"> </w:t>
+      </w:r>
+      <w:r>
+        <w:t xml:space="preserve">2024, and for men 15.7 minutes (SE 1.0) and 25.7 minutes (SE 1.0), so</w:t>
+      </w:r>
+      <w:r>
+        <w:t xml:space="preserve"> </w:t>
+      </w:r>
+      <w:r>
+        <w:t xml:space="preserve">the pattern is not specific to one round. The Time Use Survey 2024,</w:t>
+      </w:r>
+      <w:r>
+        <w:t xml:space="preserve"> </w:t>
+      </w:r>
+      <w:r>
+        <w:t xml:space="preserve">conducted by India’s National Statistics Office from January to December</w:t>
+      </w:r>
+      <w:r>
+        <w:t xml:space="preserve"> </w:t>
+      </w:r>
+      <w:r>
+        <w:t xml:space="preserve">2024, records the activities of every household member aged six and</w:t>
+      </w:r>
+      <w:r>
+        <w:t xml:space="preserve"> </w:t>
+      </w:r>
+      <w:r>
+        <w:t xml:space="preserve">above over the 24 hours from 4:00 a.m. on the day before the interview</w:t>
+      </w:r>
+      <w:r>
+        <w:t xml:space="preserve"> </w:t>
+      </w:r>
+      <w:r>
+        <w:t xml:space="preserve">().</w:t>
+      </w:r>
+      <w:r>
+        <w:t xml:space="preserve"> </w:t>
+      </w:r>
+      <w:r>
+        <w:t xml:space="preserve">Activities are coded to the three-digit level of ICATUS 2016</w:t>
+      </w:r>
+      <w:r>
+        <w:t xml:space="preserve"> </w:t>
+      </w:r>
+      <w:r>
+        <w:t xml:space="preserve">().</w:t>
+      </w:r>
+      <w:r>
+        <w:t xml:space="preserve"> </w:t>
+      </w:r>
+      <w:r>
+        <w:t xml:space="preserve">Where activities overlap, the survey flags one as the major activity. I</w:t>
+      </w:r>
+      <w:r>
+        <w:t xml:space="preserve"> </w:t>
+      </w:r>
+      <w:r>
+        <w:t xml:space="preserve">use every activity record (10,211,478 records from 450,457 diaries in</w:t>
+      </w:r>
+      <w:r>
+        <w:t xml:space="preserve"> </w:t>
+      </w:r>
+      <w:r>
+        <w:t xml:space="preserve">139,487 households) and aggregate major activities to the person-day, so</w:t>
+      </w:r>
+      <w:r>
+        <w:t xml:space="preserve"> </w:t>
+      </w:r>
+      <w:r>
+        <w:t xml:space="preserve">all but 5 of the 450,457 diaries partition exactly 1,440 minutes. The</w:t>
+      </w:r>
+      <w:r>
+        <w:t xml:space="preserve"> </w:t>
+      </w:r>
+      <w:r>
+        <w:t xml:space="preserve">roster lists 454,192 persons aged six and above; 3,735 of them have no</w:t>
+      </w:r>
+      <w:r>
+        <w:t xml:space="preserve"> </w:t>
+      </w:r>
+      <w:r>
+        <w:t xml:space="preserve">diary records in the file, which leaves the 450,457 diaries, and the 49</w:t>
+      </w:r>
+      <w:r>
+        <w:t xml:space="preserve"> </w:t>
+      </w:r>
+      <w:r>
+        <w:t xml:space="preserve">diaries of third-gender respondents are excluded from the comparisons of</w:t>
+      </w:r>
+      <w:r>
+        <w:t xml:space="preserve"> </w:t>
+      </w:r>
+      <w:r>
+        <w:t xml:space="preserve">women and men. Some diaries are reported by another household member; I</w:t>
+      </w:r>
+      <w:r>
+        <w:t xml:space="preserve"> </w:t>
+      </w:r>
+      <w:r>
+        <w:t xml:space="preserve">control for proxy reporting and drop proxy diaries in a robustness</w:t>
+      </w:r>
+      <w:r>
+        <w:t xml:space="preserve"> </w:t>
+      </w:r>
+      <w:r>
+        <w:t xml:space="preserve">check. All estimates use the survey multipliers, and standard errors are</w:t>
+      </w:r>
+      <w:r>
+        <w:t xml:space="preserve"> </w:t>
+      </w:r>
+      <w:r>
+        <w:t xml:space="preserve">clustered on the first-stage unit, the primary sampling unit</w:t>
+      </w:r>
+      <w:r>
+        <w:t xml:space="preserve"> </w:t>
+      </w:r>
+      <w:r>
+        <w:t xml:space="preserve">(;</w:t>
       </w:r>
       <w:r>
         <w:t xml:space="preserve"> </w:t>

</xml_diff>

<commit_message>
05: supplement renumbered by first mention; overlap figure now Figure S2 and renders; 'Table Sx in the online supplement' wording
</commit_message>
<xml_diff>
--- a/submission/05_marriage_time_reallocation/package/manuscript_anonymised.docx
+++ b/submission/05_marriage_time_reallocation/package/manuscript_anonymised.docx
@@ -6467,13 +6467,7 @@
         <w:t xml:space="preserve"> </w:t>
       </w:r>
       <w:r>
-        <w:t xml:space="preserve">largest absolute standardised difference across the covariates in</w:t>
-      </w:r>
-      <w:r>
-        <w:t xml:space="preserve"> </w:t>
-      </w:r>
-      <w:r>
-        <w:t xml:space="preserve">Table</w:t>
+        <w:t xml:space="preserve">largest absolute standardised difference across the covariates in Table</w:t>
       </w:r>
       <w:r>
         <w:t xml:space="preserve"> </w:t>
@@ -6490,7 +6484,7 @@
         <w:t xml:space="preserve"> </w:t>
       </w:r>
       <w:r>
-        <w:t xml:space="preserve">is 0.13, and Appendix Table</w:t>
+        <w:t xml:space="preserve">in the online supplement is 0.13, and Table</w:t>
       </w:r>
       <w:r>
         <w:t xml:space="preserve"> </w:t>
@@ -6507,61 +6501,61 @@
         <w:t xml:space="preserve"> </w:t>
       </w:r>
       <w:r>
-        <w:t xml:space="preserve">reports the coefficient-stability calculation in full.</w:t>
-      </w:r>
-      <w:r>
-        <w:t xml:space="preserve"> </w:t>
-      </w:r>
-      <w:r>
-        <w:t xml:space="preserve">The reweighted, regression-adjusted coefficient is 233.0 minutes (SE</w:t>
-      </w:r>
-      <w:r>
-        <w:t xml:space="preserve"> </w:t>
-      </w:r>
-      <w:r>
-        <w:t xml:space="preserve">5.5) (without controls, 248.7 minutes (SE 5.8)). Reweighting</w:t>
-      </w:r>
-      <w:r>
-        <w:t xml:space="preserve"> </w:t>
-      </w:r>
-      <w:r>
-        <w:t xml:space="preserve">concentrates weight on the never-married women who most resemble the</w:t>
-      </w:r>
-      <w:r>
-        <w:t xml:space="preserve"> </w:t>
-      </w:r>
-      <w:r>
-        <w:t xml:space="preserve">married, so the effective sample of never-married women falls from</w:t>
-      </w:r>
-      <w:r>
-        <w:t xml:space="preserve"> </w:t>
-      </w:r>
-      <w:r>
-        <w:t xml:space="preserve">13,940 to about 1,209, and 2.0% of the weighted never-married have</w:t>
-      </w:r>
-      <w:r>
-        <w:t xml:space="preserve"> </w:t>
-      </w:r>
-      <w:r>
-        <w:t xml:space="preserve">propensities above the cap. The bias-adjusted coefficient on unpaid work</w:t>
-      </w:r>
-      <w:r>
-        <w:t xml:space="preserve"> </w:t>
-      </w:r>
-      <w:r>
-        <w:t xml:space="preserve">is 264.3 minutes. Selection on unobservables would have to be 18.1 times</w:t>
-      </w:r>
-      <w:r>
-        <w:t xml:space="preserve"> </w:t>
-      </w:r>
-      <w:r>
-        <w:t xml:space="preserve">as strong as selection on observables to explain away the unpaid-work</w:t>
-      </w:r>
-      <w:r>
-        <w:t xml:space="preserve"> </w:t>
-      </w:r>
-      <w:r>
-        <w:t xml:space="preserve">difference.</w:t>
+        <w:t xml:space="preserve">in the online supplement reports the</w:t>
+      </w:r>
+      <w:r>
+        <w:t xml:space="preserve"> </w:t>
+      </w:r>
+      <w:r>
+        <w:t xml:space="preserve">coefficient-stability calculation in full. The reweighted,</w:t>
+      </w:r>
+      <w:r>
+        <w:t xml:space="preserve"> </w:t>
+      </w:r>
+      <w:r>
+        <w:t xml:space="preserve">regression-adjusted coefficient is 233.0 minutes (SE 5.5) (without</w:t>
+      </w:r>
+      <w:r>
+        <w:t xml:space="preserve"> </w:t>
+      </w:r>
+      <w:r>
+        <w:t xml:space="preserve">controls, 248.7 minutes (SE 5.8)). Reweighting concentrates weight on</w:t>
+      </w:r>
+      <w:r>
+        <w:t xml:space="preserve"> </w:t>
+      </w:r>
+      <w:r>
+        <w:t xml:space="preserve">the never-married women who most resemble the married, so the effective</w:t>
+      </w:r>
+      <w:r>
+        <w:t xml:space="preserve"> </w:t>
+      </w:r>
+      <w:r>
+        <w:t xml:space="preserve">sample of never-married women falls from 13,940 to about 1,209, and</w:t>
+      </w:r>
+      <w:r>
+        <w:t xml:space="preserve"> </w:t>
+      </w:r>
+      <w:r>
+        <w:t xml:space="preserve">2.0% of the weighted never-married have propensities above the cap. The</w:t>
+      </w:r>
+      <w:r>
+        <w:t xml:space="preserve"> </w:t>
+      </w:r>
+      <w:r>
+        <w:t xml:space="preserve">bias-adjusted coefficient on unpaid work is 264.3 minutes. Selection on</w:t>
+      </w:r>
+      <w:r>
+        <w:t xml:space="preserve"> </w:t>
+      </w:r>
+      <w:r>
+        <w:t xml:space="preserve">unobservables would have to be 18.1 times as strong as selection on</w:t>
+      </w:r>
+      <w:r>
+        <w:t xml:space="preserve"> </w:t>
+      </w:r>
+      <w:r>
+        <w:t xml:space="preserve">observables to explain away the unpaid-work difference.</w:t>
       </w:r>
     </w:p>
     <w:p>

</xml_diff>

<commit_message>
05: structured abstract at JMF ~213 words (soft-coded conclusion); rebuild PDF/supplement/docx; docs/SUBMISSION_PRECHECK.md
</commit_message>
<xml_diff>
--- a/submission/05_marriage_time_reallocation/package/manuscript_anonymised.docx
+++ b/submission/05_marriage_time_reallocation/package/manuscript_anonymised.docx
@@ -47,7 +47,7 @@
         <w:t xml:space="preserve"> </w:t>
       </w:r>
       <w:r>
-        <w:t xml:space="preserve">This study asks which activities differ alongside married Indian women’s higher unpaid work, and how this varies within couples.</w:t>
+        <w:t xml:space="preserve">This study asks which activities differ alongside married Indian women’s higher unpaid work, and how the division varies within couples and with co-residence with parents-in-law.</w:t>
       </w:r>
     </w:p>
     <w:p>
@@ -65,7 +65,7 @@
         <w:t xml:space="preserve"> </w:t>
       </w:r>
       <w:r>
-        <w:t xml:space="preserve">Studies usually examine one outcome at a time, though a day’s activities must sum to 1,440 minutes.</w:t>
+        <w:t xml:space="preserve">Studies of marriage and time use usually examine one outcome at a time, such as housework or sleep. Because a day’s activities must sum to 1,440 minutes, differences in one activity must be matched elsewhere, and India’s patrilocal marriage system makes these trade-offs especially consequential for women.</w:t>
       </w:r>
     </w:p>
     <w:p>
@@ -119,7 +119,7 @@
         <w:t xml:space="preserve"> </w:t>
       </w:r>
       <w:r>
-        <w:t xml:space="preserve">Marital status divides women’s days far more than men’s.</w:t>
+        <w:t xml:space="preserve">Marital status divides women’s days far more than men’s; married women’s additional unpaid work coincides mainly with less paid work and learning, and much of it accompanies motherhood rather than marriage alone.</w:t>
       </w:r>
     </w:p>
     <w:p>

</xml_diff>

<commit_message>
05: 35 pages total (removed two forced page breaks); Word file in Times New Roman 12pt double-spaced (tools/jmf_reference.docx); SSRN preprint disclosure in cover letter only; build script wires 03 exhibits and 05 docx
</commit_message>
<xml_diff>
--- a/submission/05_marriage_time_reallocation/package/manuscript_anonymised.docx
+++ b/submission/05_marriage_time_reallocation/package/manuscript_anonymised.docx
@@ -13899,7 +13899,7 @@
   <w:docDefaults>
     <w:rPrDefault>
       <w:rPr>
-        <w:rFonts w:asciiTheme="minorHAnsi" w:cstheme="minorBidi" w:eastAsiaTheme="minorEastAsia" w:hAnsiTheme="minorHAnsi"/>
+        <w:rFonts w:ascii="Times New Roman" w:cs="Times New Roman" w:eastAsia="Times New Roman" w:hAnsi="Times New Roman"/>
         <w:sz w:val="24"/>
         <w:szCs w:val="24"/>
         <w:lang w:bidi="ar-SA" w:eastAsia="zh-CN" w:val="en-US"/>
@@ -13907,7 +13907,7 @@
     </w:rPrDefault>
     <w:pPrDefault>
       <w:pPr>
-        <w:spacing w:after="200"/>
+        <w:spacing w:after="200" w:line="480" w:lineRule="auto"/>
       </w:pPr>
     </w:pPrDefault>
   </w:docDefaults>
@@ -13922,7 +13922,7 @@
     <w:link w:val="BodyTextChar"/>
     <w:qFormat/>
     <w:pPr>
-      <w:spacing w:after="180" w:before="180"/>
+      <w:spacing w:after="180" w:before="180" w:line="480" w:lineRule="auto"/>
     </w:pPr>
   </w:style>
   <w:style w:customStyle="1" w:styleId="FirstParagraph" w:type="paragraph">
@@ -13936,7 +13936,7 @@
     <w:basedOn w:val="BodyText"/>
     <w:qFormat/>
     <w:pPr>
-      <w:spacing w:after="36" w:before="36"/>
+      <w:spacing w:after="36" w:before="36" w:line="480" w:lineRule="auto"/>
     </w:pPr>
   </w:style>
   <w:style w:styleId="Title" w:type="paragraph">
@@ -13948,14 +13948,14 @@
     <w:qFormat/>
     <w:rsid w:val="00A10FD9"/>
     <w:pPr>
-      <w:spacing w:after="80" w:line="240" w:lineRule="auto"/>
+      <w:spacing w:after="80" w:line="480" w:lineRule="auto"/>
       <w:contextualSpacing/>
       <w:jc w:val="center"/>
     </w:pPr>
     <w:rPr>
-      <w:rFonts w:asciiTheme="majorHAnsi" w:cstheme="majorBidi" w:eastAsiaTheme="majorEastAsia" w:hAnsiTheme="majorHAnsi"/>
-      <w:sz w:val="56"/>
-      <w:szCs w:val="56"/>
+      <w:rFonts w:ascii="Times New Roman" w:cs="Times New Roman" w:eastAsia="Times New Roman" w:hAnsi="Times New Roman"/>
+      <w:sz w:val="24"/>
+      <w:szCs w:val="24"/>
     </w:rPr>
   </w:style>
   <w:style w:customStyle="1" w:styleId="TitleChar" w:type="character">
@@ -13965,9 +13965,9 @@
     <w:uiPriority w:val="10"/>
     <w:rsid w:val="00A10FD9"/>
     <w:rPr>
-      <w:rFonts w:asciiTheme="majorHAnsi" w:cstheme="majorBidi" w:eastAsiaTheme="majorEastAsia" w:hAnsiTheme="majorHAnsi"/>
-      <w:sz w:val="56"/>
-      <w:szCs w:val="56"/>
+      <w:rFonts w:ascii="Times New Roman" w:cs="Times New Roman" w:eastAsia="Times New Roman" w:hAnsi="Times New Roman"/>
+      <w:sz w:val="24"/>
+      <w:szCs w:val="24"/>
     </w:rPr>
   </w:style>
   <w:style w:styleId="Subtitle" w:type="paragraph">
@@ -13984,10 +13984,10 @@
       </w:numPr>
     </w:pPr>
     <w:rPr>
-      <w:rFonts w:cstheme="majorBidi" w:eastAsiaTheme="majorEastAsia"/>
-      <w:spacing w:val="15"/>
-      <w:sz w:val="28"/>
-      <w:szCs w:val="28"/>
+      <w:rFonts w:ascii="Times New Roman" w:cs="Times New Roman" w:eastAsia="Times New Roman" w:hAnsi="Times New Roman"/>
+      <w:spacing w:line="480" w:lineRule="auto" w:val="15"/>
+      <w:sz w:val="24"/>
+      <w:szCs w:val="24"/>
     </w:rPr>
   </w:style>
   <w:style w:customStyle="1" w:styleId="SubtitleChar" w:type="character">
@@ -13997,11 +13997,11 @@
     <w:uiPriority w:val="11"/>
     <w:rsid w:val="00A10FD9"/>
     <w:rPr>
-      <w:rFonts w:cstheme="majorBidi" w:eastAsiaTheme="majorEastAsia"/>
-      <w:color w:themeColor="text1" w:themeTint="A6" w:val="595959"/>
-      <w:spacing w:val="15"/>
-      <w:sz w:val="28"/>
-      <w:szCs w:val="28"/>
+      <w:rFonts w:ascii="Times New Roman" w:cs="Times New Roman" w:eastAsia="Times New Roman" w:hAnsi="Times New Roman"/>
+      <w:color w:val="000000"/>
+      <w:spacing w:line="480" w:lineRule="auto" w:val="15"/>
+      <w:sz w:val="24"/>
+      <w:szCs w:val="24"/>
     </w:rPr>
   </w:style>
   <w:style w:customStyle="1" w:styleId="Author" w:type="paragraph">
@@ -14040,13 +14040,13 @@
     <w:pPr>
       <w:keepNext/>
       <w:keepLines/>
-      <w:spacing w:after="0" w:before="300"/>
+      <w:spacing w:after="0" w:before="300" w:line="480" w:lineRule="auto"/>
       <w:jc w:val="center"/>
     </w:pPr>
     <w:rPr>
       <w:b/>
-      <w:sz w:val="20"/>
-      <w:szCs w:val="20"/>
+      <w:sz w:val="24"/>
+      <w:szCs w:val="24"/>
     </w:rPr>
   </w:style>
   <w:style w:customStyle="1" w:styleId="Abstract" w:type="paragraph">
@@ -14057,11 +14057,11 @@
     <w:pPr>
       <w:keepNext/>
       <w:keepLines/>
-      <w:spacing w:after="300" w:before="100"/>
+      <w:spacing w:after="300" w:before="100" w:line="480" w:lineRule="auto"/>
     </w:pPr>
     <w:rPr>
-      <w:sz w:val="20"/>
-      <w:szCs w:val="20"/>
+      <w:sz w:val="24"/>
+      <w:szCs w:val="24"/>
     </w:rPr>
   </w:style>
   <w:style w:styleId="Bibliography" w:type="paragraph">
@@ -14083,14 +14083,14 @@
     <w:pPr>
       <w:keepNext/>
       <w:keepLines/>
-      <w:spacing w:after="80" w:before="360"/>
+      <w:spacing w:after="80" w:before="360" w:line="480" w:lineRule="auto"/>
       <w:outlineLvl w:val="0"/>
     </w:pPr>
     <w:rPr>
-      <w:rFonts w:asciiTheme="majorHAnsi" w:cstheme="majorBidi" w:eastAsiaTheme="majorEastAsia" w:hAnsiTheme="majorHAnsi"/>
-      <w:color w:themeColor="accent1" w:themeShade="BF" w:val="0F4761"/>
-      <w:sz w:val="40"/>
-      <w:szCs w:val="40"/>
+      <w:rFonts w:ascii="Times New Roman" w:cs="Times New Roman" w:eastAsia="Times New Roman" w:hAnsi="Times New Roman"/>
+      <w:color w:val="000000"/>
+      <w:sz w:val="24"/>
+      <w:szCs w:val="24"/>
     </w:rPr>
   </w:style>
   <w:style w:styleId="Heading2" w:type="paragraph">
@@ -14106,14 +14106,14 @@
     <w:pPr>
       <w:keepNext/>
       <w:keepLines/>
-      <w:spacing w:after="80" w:before="160"/>
+      <w:spacing w:after="80" w:before="160" w:line="480" w:lineRule="auto"/>
       <w:outlineLvl w:val="1"/>
     </w:pPr>
     <w:rPr>
-      <w:rFonts w:asciiTheme="majorHAnsi" w:cstheme="majorBidi" w:eastAsiaTheme="majorEastAsia" w:hAnsiTheme="majorHAnsi"/>
-      <w:color w:themeColor="accent1" w:themeShade="BF" w:val="0F4761"/>
-      <w:sz w:val="32"/>
-      <w:szCs w:val="32"/>
+      <w:rFonts w:ascii="Times New Roman" w:cs="Times New Roman" w:eastAsia="Times New Roman" w:hAnsi="Times New Roman"/>
+      <w:color w:val="000000"/>
+      <w:sz w:val="24"/>
+      <w:szCs w:val="24"/>
     </w:rPr>
   </w:style>
   <w:style w:styleId="Heading3" w:type="paragraph">
@@ -14129,14 +14129,14 @@
     <w:pPr>
       <w:keepNext/>
       <w:keepLines/>
-      <w:spacing w:after="80" w:before="160"/>
+      <w:spacing w:after="80" w:before="160" w:line="480" w:lineRule="auto"/>
       <w:outlineLvl w:val="2"/>
     </w:pPr>
     <w:rPr>
-      <w:rFonts w:cstheme="majorBidi" w:eastAsiaTheme="majorEastAsia"/>
-      <w:color w:themeColor="accent1" w:themeShade="BF" w:val="0F4761"/>
-      <w:sz w:val="28"/>
-      <w:szCs w:val="28"/>
+      <w:rFonts w:ascii="Times New Roman" w:cs="Times New Roman" w:eastAsia="Times New Roman" w:hAnsi="Times New Roman"/>
+      <w:color w:val="000000"/>
+      <w:sz w:val="24"/>
+      <w:szCs w:val="24"/>
     </w:rPr>
   </w:style>
   <w:style w:styleId="Heading4" w:type="paragraph">
@@ -14152,14 +14152,14 @@
     <w:pPr>
       <w:keepNext/>
       <w:keepLines/>
-      <w:spacing w:after="40" w:before="80"/>
+      <w:spacing w:after="40" w:before="80" w:line="480" w:lineRule="auto"/>
       <w:outlineLvl w:val="3"/>
     </w:pPr>
     <w:rPr>
-      <w:rFonts w:cstheme="majorBidi" w:eastAsiaTheme="majorEastAsia"/>
+      <w:rFonts w:ascii="Times New Roman" w:cs="Times New Roman" w:eastAsia="Times New Roman" w:hAnsi="Times New Roman"/>
       <w:i/>
       <w:iCs/>
-      <w:color w:themeColor="accent1" w:themeShade="BF" w:val="0F4761"/>
+      <w:color w:val="000000"/>
     </w:rPr>
   </w:style>
   <w:style w:styleId="Heading5" w:type="paragraph">
@@ -14175,12 +14175,12 @@
     <w:pPr>
       <w:keepNext/>
       <w:keepLines/>
-      <w:spacing w:after="40" w:before="80"/>
+      <w:spacing w:after="40" w:before="80" w:line="480" w:lineRule="auto"/>
       <w:outlineLvl w:val="4"/>
     </w:pPr>
     <w:rPr>
-      <w:rFonts w:cstheme="majorBidi" w:eastAsiaTheme="majorEastAsia"/>
-      <w:color w:themeColor="accent1" w:themeShade="BF" w:val="0F4761"/>
+      <w:rFonts w:ascii="Times New Roman" w:cs="Times New Roman" w:eastAsia="Times New Roman" w:hAnsi="Times New Roman"/>
+      <w:color w:val="000000"/>
     </w:rPr>
   </w:style>
   <w:style w:styleId="Heading6" w:type="paragraph">
@@ -14196,14 +14196,14 @@
     <w:pPr>
       <w:keepNext/>
       <w:keepLines/>
-      <w:spacing w:after="0" w:before="40"/>
+      <w:spacing w:after="0" w:before="40" w:line="480" w:lineRule="auto"/>
       <w:outlineLvl w:val="5"/>
     </w:pPr>
     <w:rPr>
-      <w:rFonts w:cstheme="majorBidi" w:eastAsiaTheme="majorEastAsia"/>
+      <w:rFonts w:ascii="Times New Roman" w:cs="Times New Roman" w:eastAsia="Times New Roman" w:hAnsi="Times New Roman"/>
       <w:i/>
       <w:iCs/>
-      <w:color w:themeColor="text1" w:themeTint="A6" w:val="595959"/>
+      <w:color w:val="000000"/>
     </w:rPr>
   </w:style>
   <w:style w:styleId="Heading7" w:type="paragraph">
@@ -14219,12 +14219,12 @@
     <w:pPr>
       <w:keepNext/>
       <w:keepLines/>
-      <w:spacing w:after="0" w:before="40"/>
+      <w:spacing w:after="0" w:before="40" w:line="480" w:lineRule="auto"/>
       <w:outlineLvl w:val="6"/>
     </w:pPr>
     <w:rPr>
-      <w:rFonts w:cstheme="majorBidi" w:eastAsiaTheme="majorEastAsia"/>
-      <w:color w:themeColor="text1" w:themeTint="A6" w:val="595959"/>
+      <w:rFonts w:ascii="Times New Roman" w:cs="Times New Roman" w:eastAsia="Times New Roman" w:hAnsi="Times New Roman"/>
+      <w:color w:val="000000"/>
     </w:rPr>
   </w:style>
   <w:style w:styleId="Heading8" w:type="paragraph">
@@ -14240,14 +14240,14 @@
     <w:pPr>
       <w:keepNext/>
       <w:keepLines/>
-      <w:spacing w:after="0"/>
+      <w:spacing w:after="0" w:line="480" w:lineRule="auto"/>
       <w:outlineLvl w:val="7"/>
     </w:pPr>
     <w:rPr>
-      <w:rFonts w:cstheme="majorBidi" w:eastAsiaTheme="majorEastAsia"/>
+      <w:rFonts w:ascii="Times New Roman" w:cs="Times New Roman" w:eastAsia="Times New Roman" w:hAnsi="Times New Roman"/>
       <w:i/>
       <w:iCs/>
-      <w:color w:themeColor="text1" w:themeTint="D8" w:val="272727"/>
+      <w:color w:val="000000"/>
     </w:rPr>
   </w:style>
   <w:style w:styleId="Heading9" w:type="paragraph">
@@ -14263,12 +14263,12 @@
     <w:pPr>
       <w:keepNext/>
       <w:keepLines/>
-      <w:spacing w:after="0"/>
+      <w:spacing w:after="0" w:line="480" w:lineRule="auto"/>
       <w:outlineLvl w:val="8"/>
     </w:pPr>
     <w:rPr>
-      <w:rFonts w:cstheme="majorBidi" w:eastAsiaTheme="majorEastAsia"/>
-      <w:color w:themeColor="text1" w:themeTint="D8" w:val="272727"/>
+      <w:rFonts w:ascii="Times New Roman" w:cs="Times New Roman" w:eastAsia="Times New Roman" w:hAnsi="Times New Roman"/>
+      <w:color w:val="000000"/>
     </w:rPr>
   </w:style>
   <w:style w:customStyle="1" w:styleId="Heading1Char" w:type="character">
@@ -14278,10 +14278,10 @@
     <w:uiPriority w:val="9"/>
     <w:rsid w:val="00A10FD9"/>
     <w:rPr>
-      <w:rFonts w:asciiTheme="majorHAnsi" w:cstheme="majorBidi" w:eastAsiaTheme="majorEastAsia" w:hAnsiTheme="majorHAnsi"/>
-      <w:color w:themeColor="accent1" w:themeShade="BF" w:val="0F4761"/>
-      <w:sz w:val="40"/>
-      <w:szCs w:val="40"/>
+      <w:rFonts w:ascii="Times New Roman" w:cs="Times New Roman" w:eastAsia="Times New Roman" w:hAnsi="Times New Roman"/>
+      <w:color w:val="000000"/>
+      <w:sz w:val="24"/>
+      <w:szCs w:val="24"/>
     </w:rPr>
   </w:style>
   <w:style w:customStyle="1" w:styleId="Heading2Char" w:type="character">
@@ -14292,10 +14292,10 @@
     <w:semiHidden/>
     <w:rsid w:val="00A10FD9"/>
     <w:rPr>
-      <w:rFonts w:asciiTheme="majorHAnsi" w:cstheme="majorBidi" w:eastAsiaTheme="majorEastAsia" w:hAnsiTheme="majorHAnsi"/>
-      <w:color w:themeColor="accent1" w:themeShade="BF" w:val="0F4761"/>
-      <w:sz w:val="32"/>
-      <w:szCs w:val="32"/>
+      <w:rFonts w:ascii="Times New Roman" w:cs="Times New Roman" w:eastAsia="Times New Roman" w:hAnsi="Times New Roman"/>
+      <w:color w:val="000000"/>
+      <w:sz w:val="24"/>
+      <w:szCs w:val="24"/>
     </w:rPr>
   </w:style>
   <w:style w:customStyle="1" w:styleId="Heading3Char" w:type="character">
@@ -14306,10 +14306,10 @@
     <w:semiHidden/>
     <w:rsid w:val="00A10FD9"/>
     <w:rPr>
-      <w:rFonts w:cstheme="majorBidi" w:eastAsiaTheme="majorEastAsia"/>
-      <w:color w:themeColor="accent1" w:themeShade="BF" w:val="0F4761"/>
-      <w:sz w:val="28"/>
-      <w:szCs w:val="28"/>
+      <w:rFonts w:ascii="Times New Roman" w:cs="Times New Roman" w:eastAsia="Times New Roman" w:hAnsi="Times New Roman"/>
+      <w:color w:val="000000"/>
+      <w:sz w:val="24"/>
+      <w:szCs w:val="24"/>
     </w:rPr>
   </w:style>
   <w:style w:customStyle="1" w:styleId="Heading4Char" w:type="character">
@@ -14320,10 +14320,10 @@
     <w:semiHidden/>
     <w:rsid w:val="00A10FD9"/>
     <w:rPr>
-      <w:rFonts w:cstheme="majorBidi" w:eastAsiaTheme="majorEastAsia"/>
+      <w:rFonts w:ascii="Times New Roman" w:cs="Times New Roman" w:eastAsia="Times New Roman" w:hAnsi="Times New Roman"/>
       <w:i/>
       <w:iCs/>
-      <w:color w:themeColor="accent1" w:themeShade="BF" w:val="0F4761"/>
+      <w:color w:val="000000"/>
     </w:rPr>
   </w:style>
   <w:style w:customStyle="1" w:styleId="Heading5Char" w:type="character">
@@ -14334,8 +14334,8 @@
     <w:semiHidden/>
     <w:rsid w:val="00A10FD9"/>
     <w:rPr>
-      <w:rFonts w:cstheme="majorBidi" w:eastAsiaTheme="majorEastAsia"/>
-      <w:color w:themeColor="accent1" w:themeShade="BF" w:val="0F4761"/>
+      <w:rFonts w:ascii="Times New Roman" w:cs="Times New Roman" w:eastAsia="Times New Roman" w:hAnsi="Times New Roman"/>
+      <w:color w:val="000000"/>
     </w:rPr>
   </w:style>
   <w:style w:customStyle="1" w:styleId="Heading6Char" w:type="character">
@@ -14346,10 +14346,10 @@
     <w:semiHidden/>
     <w:rsid w:val="00A10FD9"/>
     <w:rPr>
-      <w:rFonts w:cstheme="majorBidi" w:eastAsiaTheme="majorEastAsia"/>
+      <w:rFonts w:ascii="Times New Roman" w:cs="Times New Roman" w:eastAsia="Times New Roman" w:hAnsi="Times New Roman"/>
       <w:i/>
       <w:iCs/>
-      <w:color w:themeColor="text1" w:themeTint="A6" w:val="595959"/>
+      <w:color w:val="000000"/>
     </w:rPr>
   </w:style>
   <w:style w:customStyle="1" w:styleId="Heading7Char" w:type="character">
@@ -14360,8 +14360,8 @@
     <w:semiHidden/>
     <w:rsid w:val="00A10FD9"/>
     <w:rPr>
-      <w:rFonts w:cstheme="majorBidi" w:eastAsiaTheme="majorEastAsia"/>
-      <w:color w:themeColor="text1" w:themeTint="A6" w:val="595959"/>
+      <w:rFonts w:ascii="Times New Roman" w:cs="Times New Roman" w:eastAsia="Times New Roman" w:hAnsi="Times New Roman"/>
+      <w:color w:val="000000"/>
     </w:rPr>
   </w:style>
   <w:style w:customStyle="1" w:styleId="Heading8Char" w:type="character">
@@ -14372,10 +14372,10 @@
     <w:semiHidden/>
     <w:rsid w:val="00A10FD9"/>
     <w:rPr>
-      <w:rFonts w:cstheme="majorBidi" w:eastAsiaTheme="majorEastAsia"/>
+      <w:rFonts w:ascii="Times New Roman" w:cs="Times New Roman" w:eastAsia="Times New Roman" w:hAnsi="Times New Roman"/>
       <w:i/>
       <w:iCs/>
-      <w:color w:themeColor="text1" w:themeTint="D8" w:val="272727"/>
+      <w:color w:val="000000"/>
     </w:rPr>
   </w:style>
   <w:style w:customStyle="1" w:styleId="Heading9Char" w:type="character">
@@ -14386,8 +14386,8 @@
     <w:semiHidden/>
     <w:rsid w:val="00A10FD9"/>
     <w:rPr>
-      <w:rFonts w:cstheme="majorBidi" w:eastAsiaTheme="majorEastAsia"/>
-      <w:color w:themeColor="text1" w:themeTint="D8" w:val="272727"/>
+      <w:rFonts w:ascii="Times New Roman" w:cs="Times New Roman" w:eastAsia="Times New Roman" w:hAnsi="Times New Roman"/>
+      <w:color w:val="000000"/>
     </w:rPr>
   </w:style>
   <w:style w:styleId="BlockText" w:type="paragraph">
@@ -14398,7 +14398,7 @@
     <w:unhideWhenUsed/>
     <w:qFormat/>
     <w:pPr>
-      <w:spacing w:after="100" w:before="100"/>
+      <w:spacing w:after="100" w:before="100" w:line="480" w:lineRule="auto"/>
       <w:ind w:firstLine="0" w:left="480" w:right="480"/>
     </w:pPr>
   </w:style>
@@ -14418,7 +14418,7 @@
     <w:unhideWhenUsed/>
     <w:qFormat/>
     <w:pPr>
-      <w:spacing w:after="100" w:before="100"/>
+      <w:spacing w:after="100" w:before="100" w:line="480" w:lineRule="auto"/>
       <w:ind w:firstLine="0" w:left="480" w:right="480"/>
     </w:pPr>
   </w:style>
@@ -14458,7 +14458,7 @@
     <w:pPr>
       <w:keepNext/>
       <w:keepLines/>
-      <w:spacing w:after="0"/>
+      <w:spacing w:after="0" w:line="480" w:lineRule="auto"/>
     </w:pPr>
     <w:rPr>
       <w:b/>
@@ -14473,7 +14473,7 @@
     <w:basedOn w:val="Normal"/>
     <w:link w:val="BodyTextChar"/>
     <w:pPr>
-      <w:spacing w:after="120" w:before="0"/>
+      <w:spacing w:after="120" w:before="0" w:line="480" w:lineRule="auto"/>
     </w:pPr>
     <w:rPr>
       <w:i/>
@@ -14510,8 +14510,8 @@
     <w:name w:val="Verbatim Char"/>
     <w:basedOn w:val="BodyTextChar"/>
     <w:rPr>
-      <w:rFonts w:ascii="Consolas" w:hAnsi="Consolas"/>
-      <w:sz w:val="22"/>
+      <w:rFonts w:ascii="Times New Roman" w:cs="Times New Roman" w:eastAsia="Times New Roman" w:hAnsi="Times New Roman"/>
+      <w:sz w:val="24"/>
     </w:rPr>
   </w:style>
   <w:style w:customStyle="1" w:styleId="SectionNumber" w:type="character">
@@ -14529,7 +14529,7 @@
     <w:name w:val="Hyperlink"/>
     <w:basedOn w:val="BodyTextChar"/>
     <w:rPr>
-      <w:color w:themeColor="accent1" w:val="4F81BD"/>
+      <w:color w:val="000000"/>
     </w:rPr>
   </w:style>
   <w:style w:styleId="TOCHeading" w:type="paragraph">
@@ -14540,14 +14540,14 @@
     <w:unhideWhenUsed/>
     <w:qFormat/>
     <w:pPr>
-      <w:spacing w:before="240" w:line="259" w:lineRule="auto"/>
+      <w:spacing w:before="240" w:line="480" w:lineRule="auto"/>
       <w:outlineLvl w:val="9"/>
     </w:pPr>
     <w:rPr>
-      <w:rFonts w:asciiTheme="majorHAnsi" w:cstheme="majorBidi" w:eastAsiaTheme="majorEastAsia" w:hAnsiTheme="majorHAnsi"/>
+      <w:rFonts w:ascii="Times New Roman" w:cs="Times New Roman" w:eastAsia="Times New Roman" w:hAnsi="Times New Roman"/>
       <w:b w:val="0"/>
       <w:bCs w:val="0"/>
-      <w:color w:themeColor="accent1" w:themeShade="BF" w:val="365F91"/>
+      <w:color w:val="000000"/>
     </w:rPr>
   </w:style>
   <w:style w:type="paragraph" w:customStyle="1" w:styleId="SourceCode">
@@ -14830,9 +14830,9 @@
     </a:clrScheme>
     <a:fontScheme name="Office">
       <a:majorFont>
-        <a:latin typeface="Aptos Display" panose="02110004020202020204"/>
-        <a:ea typeface=""/>
-        <a:cs typeface=""/>
+        <a:latin typeface="Times New Roman" panose="02110004020202020204"/>
+        <a:ea typeface="Times New Roman"/>
+        <a:cs typeface="Times New Roman"/>
         <a:font script="Jpan" typeface="游ゴシック Light"/>
         <a:font script="Hang" typeface="맑은 고딕"/>
         <a:font script="Hans" typeface="等线 Light"/>
@@ -14882,9 +14882,9 @@
         <a:font script="Tfng" typeface="Ebrima"/>
       </a:majorFont>
       <a:minorFont>
-        <a:latin typeface="Aptos" panose="02110004020202020204"/>
-        <a:ea typeface=""/>
-        <a:cs typeface=""/>
+        <a:latin typeface="Times New Roman" panose="02110004020202020204"/>
+        <a:ea typeface="Times New Roman"/>
+        <a:cs typeface="Times New Roman"/>
         <a:font script="Jpan" typeface="游明朝"/>
         <a:font script="Hang" typeface="맑은 고딕"/>
         <a:font script="Hans" typeface="等线"/>

</xml_diff>

<commit_message>
references: brace {{Ministry of Statistics and Programme Implementation}} so it renders as one name (was split at 'and'); {India} in NSO 2019 title; rebuild 03/05/06/07 packages and 06 author version
</commit_message>
<xml_diff>
--- a/submission/05_marriage_time_reallocation/package/manuscript_anonymised.docx
+++ b/submission/05_marriage_time_reallocation/package/manuscript_anonymised.docx
@@ -12726,7 +12726,35 @@
           <w:i/>
           <w:iCs/>
         </w:rPr>
-        <w:t xml:space="preserve">Time use in india 2019</w:t>
+        <w:t xml:space="preserve">Time use in</w:t>
+      </w:r>
+      <w:r>
+        <w:rPr>
+          <w:i/>
+          <w:iCs/>
+        </w:rPr>
+        <w:t xml:space="preserve"> </w:t>
+      </w:r>
+      <w:r>
+        <w:rPr>
+          <w:i/>
+          <w:iCs/>
+        </w:rPr>
+        <w:t xml:space="preserve">India</w:t>
+      </w:r>
+      <w:r>
+        <w:rPr>
+          <w:i/>
+          <w:iCs/>
+        </w:rPr>
+        <w:t xml:space="preserve"> </w:t>
+      </w:r>
+      <w:r>
+        <w:rPr>
+          <w:i/>
+          <w:iCs/>
+        </w:rPr>
+        <w:t xml:space="preserve">2019</w:t>
       </w:r>
       <w:r>
         <w:t xml:space="preserve">.</w:t>
@@ -12735,7 +12763,10 @@
         <w:t xml:space="preserve"> </w:t>
       </w:r>
       <w:r>
-        <w:t xml:space="preserve">Ministry of Statistics; Programme Implementation, Government of India.</w:t>
+        <w:t xml:space="preserve">Ministry of Statistics and Programme Implementation</w:t>
+      </w:r>
+      <w:r>
+        <w:t xml:space="preserve">.</w:t>
       </w:r>
     </w:p>
     <w:p>
@@ -12791,13 +12822,22 @@
         <w:t xml:space="preserve">2024)</w:t>
       </w:r>
       <w:r>
-        <w:t xml:space="preserve">. Ministry of Statistics; Programme</w:t>
-      </w:r>
-      <w:r>
-        <w:t xml:space="preserve"> </w:t>
-      </w:r>
-      <w:r>
-        <w:t xml:space="preserve">Implementation, Government of India.</w:t>
+        <w:t xml:space="preserve">.</w:t>
+      </w:r>
+      <w:r>
+        <w:t xml:space="preserve"> </w:t>
+      </w:r>
+      <w:r>
+        <w:t xml:space="preserve">Ministry of Statistics and Programme</w:t>
+      </w:r>
+      <w:r>
+        <w:t xml:space="preserve"> </w:t>
+      </w:r>
+      <w:r>
+        <w:t xml:space="preserve">Implementation</w:t>
+      </w:r>
+      <w:r>
+        <w:t xml:space="preserve">.</w:t>
       </w:r>
     </w:p>
     <w:p>

</xml_diff>

<commit_message>
05 Word file: literal Figure/Table S references (no [S-...]), 1-inch margins, page numbers, single-spaced tables, abstract on page 1; five literature sentences trimmed. LibreOffice: docx 33 pages; PDF 34 pages
</commit_message>
<xml_diff>
--- a/submission/05_marriage_time_reallocation/package/manuscript_anonymised.docx
+++ b/submission/05_marriage_time_reallocation/package/manuscript_anonymised.docx
@@ -735,49 +735,19 @@
         <w:t xml:space="preserve"> </w:t>
       </w:r>
       <w:r>
-        <w:t xml:space="preserve">Trend studies document a narrowing of husbands’ and wives’ housework</w:t>
-      </w:r>
-      <w:r>
-        <w:t xml:space="preserve"> </w:t>
-      </w:r>
-      <w:r>
-        <w:t xml:space="preserve">since the 1960s, but no convergence to equality</w:t>
-      </w:r>
-      <w:r>
-        <w:t xml:space="preserve"> </w:t>
-      </w:r>
-      <w:r>
-        <w:t xml:space="preserve">(;</w:t>
-      </w:r>
-      <w:r>
-        <w:t xml:space="preserve"> </w:t>
-      </w:r>
-      <w:r>
-        <w:t xml:space="preserve">;</w:t>
-      </w:r>
-      <w:r>
-        <w:t xml:space="preserve"> </w:t>
-      </w:r>
-      <w:r>
-        <w:t xml:space="preserve">). Cross-national studies</w:t>
-      </w:r>
-      <w:r>
-        <w:t xml:space="preserve"> </w:t>
-      </w:r>
-      <w:r>
-        <w:t xml:space="preserve">show that the gap is larger where macro-level gender inequality is</w:t>
-      </w:r>
-      <w:r>
-        <w:t xml:space="preserve"> </w:t>
-      </w:r>
-      <w:r>
-        <w:t xml:space="preserve">greater and where policies support a male-breadwinner arrangement</w:t>
-      </w:r>
-      <w:r>
-        <w:t xml:space="preserve"> </w:t>
-      </w:r>
-      <w:r>
-        <w:t xml:space="preserve">(;</w:t>
+        <w:t xml:space="preserve">Cross-national studies show that the gap is larger where macro-level</w:t>
+      </w:r>
+      <w:r>
+        <w:t xml:space="preserve"> </w:t>
+      </w:r>
+      <w:r>
+        <w:t xml:space="preserve">gender inequality is greater and where policies support a</w:t>
+      </w:r>
+      <w:r>
+        <w:t xml:space="preserve"> </w:t>
+      </w:r>
+      <w:r>
+        <w:t xml:space="preserve">male-breadwinner arrangement (;</w:t>
       </w:r>
       <w:r>
         <w:t xml:space="preserve"> </w:t>
@@ -1069,61 +1039,43 @@
         <w:t xml:space="preserve"> </w:t>
       </w:r>
       <w:r>
-        <w:t xml:space="preserve">). Aguiar &amp;</w:t>
-      </w:r>
-      <w:r>
-        <w:t xml:space="preserve"> </w:t>
-      </w:r>
-      <w:r>
-        <w:t xml:space="preserve">Hurst () and Gimenez-Nadal &amp;</w:t>
-      </w:r>
-      <w:r>
-        <w:t xml:space="preserve"> </w:t>
-      </w:r>
-      <w:r>
-        <w:t xml:space="preserve">Sevilla () use complete time</w:t>
-      </w:r>
-      <w:r>
-        <w:t xml:space="preserve"> </w:t>
-      </w:r>
-      <w:r>
-        <w:t xml:space="preserve">budgets to trace substitution between market work, home production and</w:t>
-      </w:r>
-      <w:r>
-        <w:t xml:space="preserve"> </w:t>
-      </w:r>
-      <w:r>
-        <w:t xml:space="preserve">leisure. Burda et al. () show that in</w:t>
-      </w:r>
-      <w:r>
-        <w:t xml:space="preserve"> </w:t>
-      </w:r>
-      <w:r>
-        <w:t xml:space="preserve">rich countries men and women do roughly the same total amount of paid</w:t>
-      </w:r>
-      <w:r>
-        <w:t xml:space="preserve"> </w:t>
-      </w:r>
-      <w:r>
-        <w:t xml:space="preserve">and unpaid work, while in poorer countries women do more. Marriage could</w:t>
-      </w:r>
-      <w:r>
-        <w:t xml:space="preserve"> </w:t>
-      </w:r>
-      <w:r>
-        <w:t xml:space="preserve">therefore raise women’s total work, or it could shift work from the</w:t>
-      </w:r>
-      <w:r>
-        <w:t xml:space="preserve"> </w:t>
-      </w:r>
-      <w:r>
-        <w:t xml:space="preserve">market to the home with little change in total work. Only a full</w:t>
-      </w:r>
-      <w:r>
-        <w:t xml:space="preserve"> </w:t>
-      </w:r>
-      <w:r>
-        <w:t xml:space="preserve">accounting distinguishes the two.</w:t>
+        <w:t xml:space="preserve">). Burda et al.</w:t>
+      </w:r>
+      <w:r>
+        <w:t xml:space="preserve"> </w:t>
+      </w:r>
+      <w:r>
+        <w:t xml:space="preserve">() show that in rich countries men</w:t>
+      </w:r>
+      <w:r>
+        <w:t xml:space="preserve"> </w:t>
+      </w:r>
+      <w:r>
+        <w:t xml:space="preserve">and women do roughly the same total amount of paid and unpaid work,</w:t>
+      </w:r>
+      <w:r>
+        <w:t xml:space="preserve"> </w:t>
+      </w:r>
+      <w:r>
+        <w:t xml:space="preserve">while in poorer countries women do more. Marriage could therefore raise</w:t>
+      </w:r>
+      <w:r>
+        <w:t xml:space="preserve"> </w:t>
+      </w:r>
+      <w:r>
+        <w:t xml:space="preserve">women’s total work, or it could shift work from the market to the home</w:t>
+      </w:r>
+      <w:r>
+        <w:t xml:space="preserve"> </w:t>
+      </w:r>
+      <w:r>
+        <w:t xml:space="preserve">with little change in total work. Only a full accounting distinguishes</w:t>
+      </w:r>
+      <w:r>
+        <w:t xml:space="preserve"> </w:t>
+      </w:r>
+      <w:r>
+        <w:t xml:space="preserve">the two.</w:t>
       </w:r>
     </w:p>
     <w:p>
@@ -1131,13 +1083,7 @@
         <w:pStyle w:val="BodyText"/>
       </w:pPr>
       <w:r>
-        <w:t xml:space="preserve">Free time also differs in quality: women’s leisure is more often</w:t>
-      </w:r>
-      <w:r>
-        <w:t xml:space="preserve"> </w:t>
-      </w:r>
-      <w:r>
-        <w:t xml:space="preserve">fragmented or combined with care (; ). Marriage may reshape social life too, as a</w:t>
+        <w:t xml:space="preserve">Marriage may reshape social life too, as a</w:t>
       </w:r>
       <w:r>
         <w:t xml:space="preserve"> </w:t>
@@ -1149,19 +1095,25 @@
         <w:t xml:space="preserve"> </w:t>
       </w:r>
       <w:r>
-        <w:t xml:space="preserve">institution (); married</w:t>
-      </w:r>
-      <w:r>
-        <w:t xml:space="preserve"> </w:t>
-      </w:r>
-      <w:r>
-        <w:t xml:space="preserve">Americans have fewer ties to kin, friends and neighbours than the</w:t>
-      </w:r>
-      <w:r>
-        <w:t xml:space="preserve"> </w:t>
-      </w:r>
-      <w:r>
-        <w:t xml:space="preserve">never-married ().</w:t>
+        <w:t xml:space="preserve">institution</w:t>
+      </w:r>
+      <w:r>
+        <w:t xml:space="preserve"> </w:t>
+      </w:r>
+      <w:r>
+        <w:t xml:space="preserve">(); married Americans have</w:t>
+      </w:r>
+      <w:r>
+        <w:t xml:space="preserve"> </w:t>
+      </w:r>
+      <w:r>
+        <w:t xml:space="preserve">fewer ties to kin, friends and neighbours than the never-married</w:t>
+      </w:r>
+      <w:r>
+        <w:t xml:space="preserve"> </w:t>
+      </w:r>
+      <w:r>
+        <w:t xml:space="preserve">().</w:t>
       </w:r>
     </w:p>
     <w:bookmarkEnd w:id="11"/>
@@ -1245,19 +1197,7 @@
         <w:t xml:space="preserve"> </w:t>
       </w:r>
       <w:r>
-        <w:t xml:space="preserve">mothers rather than fathers carry (; ).</w:t>
-      </w:r>
-      <w:r>
-        <w:t xml:space="preserve"> </w:t>
-      </w:r>
-      <w:r>
-        <w:t xml:space="preserve">Self-reported sleep problems follow both gender and socio-economic</w:t>
-      </w:r>
-      <w:r>
-        <w:t xml:space="preserve"> </w:t>
-      </w:r>
-      <w:r>
-        <w:t xml:space="preserve">position (). If</w:t>
+        <w:t xml:space="preserve">mothers rather than fathers carry (; ). If</w:t>
       </w:r>
       <w:r>
         <w:t xml:space="preserve"> </w:t>
@@ -1439,37 +1379,31 @@
         <w:t xml:space="preserve"> </w:t>
       </w:r>
       <w:r>
-        <w:t xml:space="preserve">(). Regional</w:t>
-      </w:r>
-      <w:r>
-        <w:t xml:space="preserve"> </w:t>
-      </w:r>
-      <w:r>
-        <w:t xml:space="preserve">differences in women’s autonomy are large and are not explained by</w:t>
-      </w:r>
-      <w:r>
-        <w:t xml:space="preserve"> </w:t>
-      </w:r>
-      <w:r>
-        <w:t xml:space="preserve">religion alone (). Joint residence could reduce a young wife’s domestic load if</w:t>
-      </w:r>
-      <w:r>
-        <w:t xml:space="preserve"> </w:t>
-      </w:r>
-      <w:r>
-        <w:t xml:space="preserve">senior women share the cooking and cleaning, or increase it if the</w:t>
-      </w:r>
-      <w:r>
-        <w:t xml:space="preserve"> </w:t>
-      </w:r>
-      <w:r>
-        <w:t xml:space="preserve">junior wife does the heaviest work. Its effect is an empirical question</w:t>
-      </w:r>
-      <w:r>
-        <w:t xml:space="preserve"> </w:t>
-      </w:r>
-      <w:r>
-        <w:t xml:space="preserve">that the household roster can address.</w:t>
+        <w:t xml:space="preserve">(). Joint</w:t>
+      </w:r>
+      <w:r>
+        <w:t xml:space="preserve"> </w:t>
+      </w:r>
+      <w:r>
+        <w:t xml:space="preserve">residence could reduce a young wife’s domestic load if senior women</w:t>
+      </w:r>
+      <w:r>
+        <w:t xml:space="preserve"> </w:t>
+      </w:r>
+      <w:r>
+        <w:t xml:space="preserve">share the cooking and cleaning, or increase it if the junior wife does</w:t>
+      </w:r>
+      <w:r>
+        <w:t xml:space="preserve"> </w:t>
+      </w:r>
+      <w:r>
+        <w:t xml:space="preserve">the heaviest work. Its effect is an empirical question that the</w:t>
+      </w:r>
+      <w:r>
+        <w:t xml:space="preserve"> </w:t>
+      </w:r>
+      <w:r>
+        <w:t xml:space="preserve">household roster can address.</w:t>
       </w:r>
     </w:p>
     <w:p>
@@ -3204,16 +3138,17 @@
     <w:tbl>
       <w:tblPr>
         <w:tblStyle w:val="Table"/>
-        <w:tblW w:type="auto" w:w="0"/>
         <w:tblLook w:firstRow="1" w:lastRow="0" w:firstColumn="0" w:lastColumn="0" w:noHBand="0" w:noVBand="0" w:val="0020"/>
         <w:tblCaption w:val="Weighted means by sex and marital status, ages 20–39"/>
+        <w:tblW w:type="pct" w:w="5000"/>
+        <w:tblLayout w:type="autofit"/>
       </w:tblPr>
       <w:tblGrid>
-        <w:gridCol w:w="1584"/>
-        <w:gridCol w:w="1584"/>
-        <w:gridCol w:w="1584"/>
-        <w:gridCol w:w="1584"/>
-        <w:gridCol w:w="1584"/>
+        <w:gridCol/>
+        <w:gridCol/>
+        <w:gridCol/>
+        <w:gridCol/>
+        <w:gridCol/>
       </w:tblGrid>
       <w:tr>
         <w:trPr>
@@ -3224,14 +3159,16 @@
           <w:p>
             <w:pPr>
               <w:pStyle w:val="Compact"/>
-            </w:pPr>
-          </w:p>
-        </w:tc>
-        <w:tc>
-          <w:tcPr/>
-          <w:p>
-            <w:pPr>
-              <w:pStyle w:val="Compact"/>
+              <w:spacing w:line="240" w:lineRule="auto" w:after="0" w:before="0"/>
+            </w:pPr>
+          </w:p>
+        </w:tc>
+        <w:tc>
+          <w:tcPr/>
+          <w:p>
+            <w:pPr>
+              <w:pStyle w:val="Compact"/>
+              <w:spacing w:line="240" w:lineRule="auto" w:after="0" w:before="0"/>
               <w:jc w:val="right"/>
             </w:pPr>
             <w:r>
@@ -3244,6 +3181,7 @@
           <w:p>
             <w:pPr>
               <w:pStyle w:val="Compact"/>
+              <w:spacing w:line="240" w:lineRule="auto" w:after="0" w:before="0"/>
               <w:jc w:val="right"/>
             </w:pPr>
             <w:r>
@@ -3256,6 +3194,7 @@
           <w:p>
             <w:pPr>
               <w:pStyle w:val="Compact"/>
+              <w:spacing w:line="240" w:lineRule="auto" w:after="0" w:before="0"/>
               <w:jc w:val="right"/>
             </w:pPr>
             <w:r>
@@ -3268,6 +3207,7 @@
           <w:p>
             <w:pPr>
               <w:pStyle w:val="Compact"/>
+              <w:spacing w:line="240" w:lineRule="auto" w:after="0" w:before="0"/>
               <w:jc w:val="right"/>
             </w:pPr>
             <w:r>
@@ -3282,6 +3222,7 @@
           <w:p>
             <w:pPr>
               <w:pStyle w:val="Compact"/>
+              <w:spacing w:line="240" w:lineRule="auto" w:after="0" w:before="0"/>
               <w:jc w:val="left"/>
             </w:pPr>
             <w:r>
@@ -3294,6 +3235,7 @@
           <w:p>
             <w:pPr>
               <w:pStyle w:val="Compact"/>
+              <w:spacing w:line="240" w:lineRule="auto" w:after="0" w:before="0"/>
               <w:jc w:val="right"/>
             </w:pPr>
             <w:r>
@@ -3306,6 +3248,7 @@
           <w:p>
             <w:pPr>
               <w:pStyle w:val="Compact"/>
+              <w:spacing w:line="240" w:lineRule="auto" w:after="0" w:before="0"/>
               <w:jc w:val="right"/>
             </w:pPr>
             <w:r>
@@ -3318,6 +3261,7 @@
           <w:p>
             <w:pPr>
               <w:pStyle w:val="Compact"/>
+              <w:spacing w:line="240" w:lineRule="auto" w:after="0" w:before="0"/>
               <w:jc w:val="right"/>
             </w:pPr>
             <w:r>
@@ -3330,6 +3274,7 @@
           <w:p>
             <w:pPr>
               <w:pStyle w:val="Compact"/>
+              <w:spacing w:line="240" w:lineRule="auto" w:after="0" w:before="0"/>
               <w:jc w:val="right"/>
             </w:pPr>
             <w:r>
@@ -3344,6 +3289,7 @@
           <w:p>
             <w:pPr>
               <w:pStyle w:val="Compact"/>
+              <w:spacing w:line="240" w:lineRule="auto" w:after="0" w:before="0"/>
               <w:jc w:val="left"/>
             </w:pPr>
             <w:r>
@@ -3356,6 +3302,7 @@
           <w:p>
             <w:pPr>
               <w:pStyle w:val="Compact"/>
+              <w:spacing w:line="240" w:lineRule="auto" w:after="0" w:before="0"/>
               <w:jc w:val="right"/>
             </w:pPr>
             <w:r>
@@ -3368,6 +3315,7 @@
           <w:p>
             <w:pPr>
               <w:pStyle w:val="Compact"/>
+              <w:spacing w:line="240" w:lineRule="auto" w:after="0" w:before="0"/>
               <w:jc w:val="right"/>
             </w:pPr>
             <w:r>
@@ -3380,6 +3328,7 @@
           <w:p>
             <w:pPr>
               <w:pStyle w:val="Compact"/>
+              <w:spacing w:line="240" w:lineRule="auto" w:after="0" w:before="0"/>
               <w:jc w:val="right"/>
             </w:pPr>
             <w:r>
@@ -3392,6 +3341,7 @@
           <w:p>
             <w:pPr>
               <w:pStyle w:val="Compact"/>
+              <w:spacing w:line="240" w:lineRule="auto" w:after="0" w:before="0"/>
               <w:jc w:val="right"/>
             </w:pPr>
             <w:r>
@@ -3406,6 +3356,7 @@
           <w:p>
             <w:pPr>
               <w:pStyle w:val="Compact"/>
+              <w:spacing w:line="240" w:lineRule="auto" w:after="0" w:before="0"/>
               <w:jc w:val="left"/>
             </w:pPr>
             <w:r>
@@ -3418,6 +3369,7 @@
           <w:p>
             <w:pPr>
               <w:pStyle w:val="Compact"/>
+              <w:spacing w:line="240" w:lineRule="auto" w:after="0" w:before="0"/>
               <w:jc w:val="right"/>
             </w:pPr>
             <w:r>
@@ -3430,6 +3382,7 @@
           <w:p>
             <w:pPr>
               <w:pStyle w:val="Compact"/>
+              <w:spacing w:line="240" w:lineRule="auto" w:after="0" w:before="0"/>
               <w:jc w:val="right"/>
             </w:pPr>
             <w:r>
@@ -3442,6 +3395,7 @@
           <w:p>
             <w:pPr>
               <w:pStyle w:val="Compact"/>
+              <w:spacing w:line="240" w:lineRule="auto" w:after="0" w:before="0"/>
               <w:jc w:val="right"/>
             </w:pPr>
             <w:r>
@@ -3454,6 +3408,7 @@
           <w:p>
             <w:pPr>
               <w:pStyle w:val="Compact"/>
+              <w:spacing w:line="240" w:lineRule="auto" w:after="0" w:before="0"/>
               <w:jc w:val="right"/>
             </w:pPr>
             <w:r>
@@ -3468,6 +3423,7 @@
           <w:p>
             <w:pPr>
               <w:pStyle w:val="Compact"/>
+              <w:spacing w:line="240" w:lineRule="auto" w:after="0" w:before="0"/>
               <w:jc w:val="left"/>
             </w:pPr>
             <w:r>
@@ -3480,6 +3436,7 @@
           <w:p>
             <w:pPr>
               <w:pStyle w:val="Compact"/>
+              <w:spacing w:line="240" w:lineRule="auto" w:after="0" w:before="0"/>
               <w:jc w:val="right"/>
             </w:pPr>
             <w:r>
@@ -3492,6 +3449,7 @@
           <w:p>
             <w:pPr>
               <w:pStyle w:val="Compact"/>
+              <w:spacing w:line="240" w:lineRule="auto" w:after="0" w:before="0"/>
               <w:jc w:val="right"/>
             </w:pPr>
             <w:r>
@@ -3504,6 +3462,7 @@
           <w:p>
             <w:pPr>
               <w:pStyle w:val="Compact"/>
+              <w:spacing w:line="240" w:lineRule="auto" w:after="0" w:before="0"/>
               <w:jc w:val="right"/>
             </w:pPr>
             <w:r>
@@ -3516,6 +3475,7 @@
           <w:p>
             <w:pPr>
               <w:pStyle w:val="Compact"/>
+              <w:spacing w:line="240" w:lineRule="auto" w:after="0" w:before="0"/>
               <w:jc w:val="right"/>
             </w:pPr>
             <w:r>
@@ -3530,6 +3490,7 @@
           <w:p>
             <w:pPr>
               <w:pStyle w:val="Compact"/>
+              <w:spacing w:line="240" w:lineRule="auto" w:after="0" w:before="0"/>
               <w:jc w:val="left"/>
             </w:pPr>
             <w:r>
@@ -3542,6 +3503,7 @@
           <w:p>
             <w:pPr>
               <w:pStyle w:val="Compact"/>
+              <w:spacing w:line="240" w:lineRule="auto" w:after="0" w:before="0"/>
               <w:jc w:val="right"/>
             </w:pPr>
             <w:r>
@@ -3554,6 +3516,7 @@
           <w:p>
             <w:pPr>
               <w:pStyle w:val="Compact"/>
+              <w:spacing w:line="240" w:lineRule="auto" w:after="0" w:before="0"/>
               <w:jc w:val="right"/>
             </w:pPr>
             <w:r>
@@ -3566,6 +3529,7 @@
           <w:p>
             <w:pPr>
               <w:pStyle w:val="Compact"/>
+              <w:spacing w:line="240" w:lineRule="auto" w:after="0" w:before="0"/>
               <w:jc w:val="right"/>
             </w:pPr>
             <w:r>
@@ -3578,6 +3542,7 @@
           <w:p>
             <w:pPr>
               <w:pStyle w:val="Compact"/>
+              <w:spacing w:line="240" w:lineRule="auto" w:after="0" w:before="0"/>
               <w:jc w:val="right"/>
             </w:pPr>
             <w:r>
@@ -3592,6 +3557,7 @@
           <w:p>
             <w:pPr>
               <w:pStyle w:val="Compact"/>
+              <w:spacing w:line="240" w:lineRule="auto" w:after="0" w:before="0"/>
               <w:jc w:val="left"/>
             </w:pPr>
             <w:r>
@@ -3604,6 +3570,7 @@
           <w:p>
             <w:pPr>
               <w:pStyle w:val="Compact"/>
+              <w:spacing w:line="240" w:lineRule="auto" w:after="0" w:before="0"/>
               <w:jc w:val="right"/>
             </w:pPr>
             <w:r>
@@ -3616,6 +3583,7 @@
           <w:p>
             <w:pPr>
               <w:pStyle w:val="Compact"/>
+              <w:spacing w:line="240" w:lineRule="auto" w:after="0" w:before="0"/>
               <w:jc w:val="right"/>
             </w:pPr>
             <w:r>
@@ -3628,6 +3596,7 @@
           <w:p>
             <w:pPr>
               <w:pStyle w:val="Compact"/>
+              <w:spacing w:line="240" w:lineRule="auto" w:after="0" w:before="0"/>
               <w:jc w:val="right"/>
             </w:pPr>
             <w:r>
@@ -3640,6 +3609,7 @@
           <w:p>
             <w:pPr>
               <w:pStyle w:val="Compact"/>
+              <w:spacing w:line="240" w:lineRule="auto" w:after="0" w:before="0"/>
               <w:jc w:val="right"/>
             </w:pPr>
             <w:r>
@@ -3654,6 +3624,7 @@
           <w:p>
             <w:pPr>
               <w:pStyle w:val="Compact"/>
+              <w:spacing w:line="240" w:lineRule="auto" w:after="0" w:before="0"/>
               <w:jc w:val="left"/>
             </w:pPr>
             <w:r>
@@ -3666,6 +3637,7 @@
           <w:p>
             <w:pPr>
               <w:pStyle w:val="Compact"/>
+              <w:spacing w:line="240" w:lineRule="auto" w:after="0" w:before="0"/>
               <w:jc w:val="right"/>
             </w:pPr>
             <w:r>
@@ -3678,6 +3650,7 @@
           <w:p>
             <w:pPr>
               <w:pStyle w:val="Compact"/>
+              <w:spacing w:line="240" w:lineRule="auto" w:after="0" w:before="0"/>
               <w:jc w:val="right"/>
             </w:pPr>
             <w:r>
@@ -3690,6 +3663,7 @@
           <w:p>
             <w:pPr>
               <w:pStyle w:val="Compact"/>
+              <w:spacing w:line="240" w:lineRule="auto" w:after="0" w:before="0"/>
               <w:jc w:val="right"/>
             </w:pPr>
             <w:r>
@@ -3702,6 +3676,7 @@
           <w:p>
             <w:pPr>
               <w:pStyle w:val="Compact"/>
+              <w:spacing w:line="240" w:lineRule="auto" w:after="0" w:before="0"/>
               <w:jc w:val="right"/>
             </w:pPr>
             <w:r>
@@ -3716,6 +3691,7 @@
           <w:p>
             <w:pPr>
               <w:pStyle w:val="Compact"/>
+              <w:spacing w:line="240" w:lineRule="auto" w:after="0" w:before="0"/>
               <w:jc w:val="left"/>
             </w:pPr>
             <w:r>
@@ -3728,6 +3704,7 @@
           <w:p>
             <w:pPr>
               <w:pStyle w:val="Compact"/>
+              <w:spacing w:line="240" w:lineRule="auto" w:after="0" w:before="0"/>
               <w:jc w:val="right"/>
             </w:pPr>
             <w:r>
@@ -3740,6 +3717,7 @@
           <w:p>
             <w:pPr>
               <w:pStyle w:val="Compact"/>
+              <w:spacing w:line="240" w:lineRule="auto" w:after="0" w:before="0"/>
               <w:jc w:val="right"/>
             </w:pPr>
             <w:r>
@@ -3752,6 +3730,7 @@
           <w:p>
             <w:pPr>
               <w:pStyle w:val="Compact"/>
+              <w:spacing w:line="240" w:lineRule="auto" w:after="0" w:before="0"/>
               <w:jc w:val="right"/>
             </w:pPr>
             <w:r>
@@ -3764,6 +3743,7 @@
           <w:p>
             <w:pPr>
               <w:pStyle w:val="Compact"/>
+              <w:spacing w:line="240" w:lineRule="auto" w:after="0" w:before="0"/>
               <w:jc w:val="right"/>
             </w:pPr>
             <w:r>
@@ -3778,6 +3758,7 @@
           <w:p>
             <w:pPr>
               <w:pStyle w:val="Compact"/>
+              <w:spacing w:line="240" w:lineRule="auto" w:after="0" w:before="0"/>
               <w:jc w:val="left"/>
             </w:pPr>
             <w:r>
@@ -3790,6 +3771,7 @@
           <w:p>
             <w:pPr>
               <w:pStyle w:val="Compact"/>
+              <w:spacing w:line="240" w:lineRule="auto" w:after="0" w:before="0"/>
               <w:jc w:val="right"/>
             </w:pPr>
             <w:r>
@@ -3802,6 +3784,7 @@
           <w:p>
             <w:pPr>
               <w:pStyle w:val="Compact"/>
+              <w:spacing w:line="240" w:lineRule="auto" w:after="0" w:before="0"/>
               <w:jc w:val="right"/>
             </w:pPr>
             <w:r>
@@ -3814,6 +3797,7 @@
           <w:p>
             <w:pPr>
               <w:pStyle w:val="Compact"/>
+              <w:spacing w:line="240" w:lineRule="auto" w:after="0" w:before="0"/>
               <w:jc w:val="right"/>
             </w:pPr>
             <w:r>
@@ -3826,6 +3810,7 @@
           <w:p>
             <w:pPr>
               <w:pStyle w:val="Compact"/>
+              <w:spacing w:line="240" w:lineRule="auto" w:after="0" w:before="0"/>
               <w:jc w:val="right"/>
             </w:pPr>
             <w:r>
@@ -3840,6 +3825,7 @@
           <w:p>
             <w:pPr>
               <w:pStyle w:val="Compact"/>
+              <w:spacing w:line="240" w:lineRule="auto" w:after="0" w:before="0"/>
               <w:jc w:val="left"/>
             </w:pPr>
             <w:r>
@@ -3852,6 +3838,7 @@
           <w:p>
             <w:pPr>
               <w:pStyle w:val="Compact"/>
+              <w:spacing w:line="240" w:lineRule="auto" w:after="0" w:before="0"/>
               <w:jc w:val="right"/>
             </w:pPr>
             <w:r>
@@ -3864,6 +3851,7 @@
           <w:p>
             <w:pPr>
               <w:pStyle w:val="Compact"/>
+              <w:spacing w:line="240" w:lineRule="auto" w:after="0" w:before="0"/>
               <w:jc w:val="right"/>
             </w:pPr>
             <w:r>
@@ -3876,6 +3864,7 @@
           <w:p>
             <w:pPr>
               <w:pStyle w:val="Compact"/>
+              <w:spacing w:line="240" w:lineRule="auto" w:after="0" w:before="0"/>
               <w:jc w:val="right"/>
             </w:pPr>
             <w:r>
@@ -3888,6 +3877,7 @@
           <w:p>
             <w:pPr>
               <w:pStyle w:val="Compact"/>
+              <w:spacing w:line="240" w:lineRule="auto" w:after="0" w:before="0"/>
               <w:jc w:val="right"/>
             </w:pPr>
             <w:r>
@@ -3902,6 +3892,7 @@
           <w:p>
             <w:pPr>
               <w:pStyle w:val="Compact"/>
+              <w:spacing w:line="240" w:lineRule="auto" w:after="0" w:before="0"/>
               <w:jc w:val="left"/>
             </w:pPr>
             <w:r>
@@ -3914,6 +3905,7 @@
           <w:p>
             <w:pPr>
               <w:pStyle w:val="Compact"/>
+              <w:spacing w:line="240" w:lineRule="auto" w:after="0" w:before="0"/>
               <w:jc w:val="right"/>
             </w:pPr>
             <w:r>
@@ -3926,6 +3918,7 @@
           <w:p>
             <w:pPr>
               <w:pStyle w:val="Compact"/>
+              <w:spacing w:line="240" w:lineRule="auto" w:after="0" w:before="0"/>
               <w:jc w:val="right"/>
             </w:pPr>
             <w:r>
@@ -3938,6 +3931,7 @@
           <w:p>
             <w:pPr>
               <w:pStyle w:val="Compact"/>
+              <w:spacing w:line="240" w:lineRule="auto" w:after="0" w:before="0"/>
               <w:jc w:val="right"/>
             </w:pPr>
             <w:r>
@@ -3950,6 +3944,7 @@
           <w:p>
             <w:pPr>
               <w:pStyle w:val="Compact"/>
+              <w:spacing w:line="240" w:lineRule="auto" w:after="0" w:before="0"/>
               <w:jc w:val="right"/>
             </w:pPr>
             <w:r>
@@ -3964,6 +3959,7 @@
           <w:p>
             <w:pPr>
               <w:pStyle w:val="Compact"/>
+              <w:spacing w:line="240" w:lineRule="auto" w:after="0" w:before="0"/>
               <w:jc w:val="left"/>
             </w:pPr>
             <w:r>
@@ -3976,6 +3972,7 @@
           <w:p>
             <w:pPr>
               <w:pStyle w:val="Compact"/>
+              <w:spacing w:line="240" w:lineRule="auto" w:after="0" w:before="0"/>
               <w:jc w:val="right"/>
             </w:pPr>
             <w:r>
@@ -3988,6 +3985,7 @@
           <w:p>
             <w:pPr>
               <w:pStyle w:val="Compact"/>
+              <w:spacing w:line="240" w:lineRule="auto" w:after="0" w:before="0"/>
               <w:jc w:val="right"/>
             </w:pPr>
             <w:r>
@@ -4000,6 +3998,7 @@
           <w:p>
             <w:pPr>
               <w:pStyle w:val="Compact"/>
+              <w:spacing w:line="240" w:lineRule="auto" w:after="0" w:before="0"/>
               <w:jc w:val="right"/>
             </w:pPr>
             <w:r>
@@ -4012,6 +4011,7 @@
           <w:p>
             <w:pPr>
               <w:pStyle w:val="Compact"/>
+              <w:spacing w:line="240" w:lineRule="auto" w:after="0" w:before="0"/>
               <w:jc w:val="right"/>
             </w:pPr>
             <w:r>
@@ -4026,6 +4026,7 @@
           <w:p>
             <w:pPr>
               <w:pStyle w:val="Compact"/>
+              <w:spacing w:line="240" w:lineRule="auto" w:after="0" w:before="0"/>
               <w:jc w:val="left"/>
             </w:pPr>
             <w:r>
@@ -4038,6 +4039,7 @@
           <w:p>
             <w:pPr>
               <w:pStyle w:val="Compact"/>
+              <w:spacing w:line="240" w:lineRule="auto" w:after="0" w:before="0"/>
               <w:jc w:val="right"/>
             </w:pPr>
             <w:r>
@@ -4050,6 +4052,7 @@
           <w:p>
             <w:pPr>
               <w:pStyle w:val="Compact"/>
+              <w:spacing w:line="240" w:lineRule="auto" w:after="0" w:before="0"/>
               <w:jc w:val="right"/>
             </w:pPr>
             <w:r>
@@ -4062,6 +4065,7 @@
           <w:p>
             <w:pPr>
               <w:pStyle w:val="Compact"/>
+              <w:spacing w:line="240" w:lineRule="auto" w:after="0" w:before="0"/>
               <w:jc w:val="right"/>
             </w:pPr>
             <w:r>
@@ -4074,6 +4078,7 @@
           <w:p>
             <w:pPr>
               <w:pStyle w:val="Compact"/>
+              <w:spacing w:line="240" w:lineRule="auto" w:after="0" w:before="0"/>
               <w:jc w:val="right"/>
             </w:pPr>
             <w:r>
@@ -4088,6 +4093,7 @@
           <w:p>
             <w:pPr>
               <w:pStyle w:val="Compact"/>
+              <w:spacing w:line="240" w:lineRule="auto" w:after="0" w:before="0"/>
               <w:jc w:val="left"/>
             </w:pPr>
             <w:r>
@@ -4100,6 +4106,7 @@
           <w:p>
             <w:pPr>
               <w:pStyle w:val="Compact"/>
+              <w:spacing w:line="240" w:lineRule="auto" w:after="0" w:before="0"/>
               <w:jc w:val="right"/>
             </w:pPr>
             <w:r>
@@ -4112,6 +4119,7 @@
           <w:p>
             <w:pPr>
               <w:pStyle w:val="Compact"/>
+              <w:spacing w:line="240" w:lineRule="auto" w:after="0" w:before="0"/>
               <w:jc w:val="right"/>
             </w:pPr>
             <w:r>
@@ -4124,6 +4132,7 @@
           <w:p>
             <w:pPr>
               <w:pStyle w:val="Compact"/>
+              <w:spacing w:line="240" w:lineRule="auto" w:after="0" w:before="0"/>
               <w:jc w:val="right"/>
             </w:pPr>
             <w:r>
@@ -4136,6 +4145,7 @@
           <w:p>
             <w:pPr>
               <w:pStyle w:val="Compact"/>
+              <w:spacing w:line="240" w:lineRule="auto" w:after="0" w:before="0"/>
               <w:jc w:val="right"/>
             </w:pPr>
             <w:r>
@@ -4150,6 +4160,7 @@
           <w:p>
             <w:pPr>
               <w:pStyle w:val="Compact"/>
+              <w:spacing w:line="240" w:lineRule="auto" w:after="0" w:before="0"/>
               <w:jc w:val="left"/>
             </w:pPr>
             <w:r>
@@ -4162,6 +4173,7 @@
           <w:p>
             <w:pPr>
               <w:pStyle w:val="Compact"/>
+              <w:spacing w:line="240" w:lineRule="auto" w:after="0" w:before="0"/>
               <w:jc w:val="right"/>
             </w:pPr>
             <w:r>
@@ -4174,6 +4186,7 @@
           <w:p>
             <w:pPr>
               <w:pStyle w:val="Compact"/>
+              <w:spacing w:line="240" w:lineRule="auto" w:after="0" w:before="0"/>
               <w:jc w:val="right"/>
             </w:pPr>
             <w:r>
@@ -4186,6 +4199,7 @@
           <w:p>
             <w:pPr>
               <w:pStyle w:val="Compact"/>
+              <w:spacing w:line="240" w:lineRule="auto" w:after="0" w:before="0"/>
               <w:jc w:val="right"/>
             </w:pPr>
             <w:r>
@@ -4198,6 +4212,7 @@
           <w:p>
             <w:pPr>
               <w:pStyle w:val="Compact"/>
+              <w:spacing w:line="240" w:lineRule="auto" w:after="0" w:before="0"/>
               <w:jc w:val="right"/>
             </w:pPr>
             <w:r>
@@ -4315,14 +4330,15 @@
     <w:tbl>
       <w:tblPr>
         <w:tblStyle w:val="Table"/>
-        <w:tblW w:type="auto" w:w="0"/>
         <w:tblLook w:firstRow="1" w:lastRow="0" w:firstColumn="0" w:lastColumn="0" w:noHBand="0" w:noVBand="0" w:val="0020"/>
         <w:tblCaption w:val="Married minus never-married, minutes per day, ages 20–39"/>
+        <w:tblW w:type="pct" w:w="5000"/>
+        <w:tblLayout w:type="autofit"/>
       </w:tblPr>
       <w:tblGrid>
-        <w:gridCol w:w="2640"/>
-        <w:gridCol w:w="2640"/>
-        <w:gridCol w:w="2640"/>
+        <w:gridCol/>
+        <w:gridCol/>
+        <w:gridCol/>
       </w:tblGrid>
       <w:tr>
         <w:trPr>
@@ -4333,6 +4349,7 @@
           <w:p>
             <w:pPr>
               <w:pStyle w:val="Compact"/>
+              <w:spacing w:line="240" w:lineRule="auto" w:after="0" w:before="0"/>
               <w:jc w:val="left"/>
             </w:pPr>
             <w:r>
@@ -4345,6 +4362,7 @@
           <w:p>
             <w:pPr>
               <w:pStyle w:val="Compact"/>
+              <w:spacing w:line="240" w:lineRule="auto" w:after="0" w:before="0"/>
               <w:jc w:val="right"/>
             </w:pPr>
             <w:r>
@@ -4357,6 +4375,7 @@
           <w:p>
             <w:pPr>
               <w:pStyle w:val="Compact"/>
+              <w:spacing w:line="240" w:lineRule="auto" w:after="0" w:before="0"/>
               <w:jc w:val="right"/>
             </w:pPr>
             <w:r>
@@ -4371,6 +4390,7 @@
           <w:p>
             <w:pPr>
               <w:pStyle w:val="Compact"/>
+              <w:spacing w:line="240" w:lineRule="auto" w:after="0" w:before="0"/>
               <w:jc w:val="left"/>
             </w:pPr>
             <w:r>
@@ -4383,6 +4403,7 @@
           <w:p>
             <w:pPr>
               <w:pStyle w:val="Compact"/>
+              <w:spacing w:line="240" w:lineRule="auto" w:after="0" w:before="0"/>
               <w:jc w:val="right"/>
             </w:pPr>
             <w:r>
@@ -4395,6 +4416,7 @@
           <w:p>
             <w:pPr>
               <w:pStyle w:val="Compact"/>
+              <w:spacing w:line="240" w:lineRule="auto" w:after="0" w:before="0"/>
               <w:jc w:val="right"/>
             </w:pPr>
             <w:r>
@@ -4409,6 +4431,7 @@
           <w:p>
             <w:pPr>
               <w:pStyle w:val="Compact"/>
+              <w:spacing w:line="240" w:lineRule="auto" w:after="0" w:before="0"/>
               <w:jc w:val="left"/>
             </w:pPr>
             <w:r>
@@ -4421,6 +4444,7 @@
           <w:p>
             <w:pPr>
               <w:pStyle w:val="Compact"/>
+              <w:spacing w:line="240" w:lineRule="auto" w:after="0" w:before="0"/>
               <w:jc w:val="right"/>
             </w:pPr>
             <w:r>
@@ -4433,6 +4457,7 @@
           <w:p>
             <w:pPr>
               <w:pStyle w:val="Compact"/>
+              <w:spacing w:line="240" w:lineRule="auto" w:after="0" w:before="0"/>
               <w:jc w:val="right"/>
             </w:pPr>
             <w:r>
@@ -4447,6 +4472,7 @@
           <w:p>
             <w:pPr>
               <w:pStyle w:val="Compact"/>
+              <w:spacing w:line="240" w:lineRule="auto" w:after="0" w:before="0"/>
               <w:jc w:val="left"/>
             </w:pPr>
             <w:r>
@@ -4459,6 +4485,7 @@
           <w:p>
             <w:pPr>
               <w:pStyle w:val="Compact"/>
+              <w:spacing w:line="240" w:lineRule="auto" w:after="0" w:before="0"/>
               <w:jc w:val="right"/>
             </w:pPr>
             <w:r>
@@ -4471,6 +4498,7 @@
           <w:p>
             <w:pPr>
               <w:pStyle w:val="Compact"/>
+              <w:spacing w:line="240" w:lineRule="auto" w:after="0" w:before="0"/>
               <w:jc w:val="right"/>
             </w:pPr>
             <w:r>
@@ -4485,6 +4513,7 @@
           <w:p>
             <w:pPr>
               <w:pStyle w:val="Compact"/>
+              <w:spacing w:line="240" w:lineRule="auto" w:after="0" w:before="0"/>
               <w:jc w:val="left"/>
             </w:pPr>
             <w:r>
@@ -4497,6 +4526,7 @@
           <w:p>
             <w:pPr>
               <w:pStyle w:val="Compact"/>
+              <w:spacing w:line="240" w:lineRule="auto" w:after="0" w:before="0"/>
               <w:jc w:val="right"/>
             </w:pPr>
             <w:r>
@@ -4509,6 +4539,7 @@
           <w:p>
             <w:pPr>
               <w:pStyle w:val="Compact"/>
+              <w:spacing w:line="240" w:lineRule="auto" w:after="0" w:before="0"/>
               <w:jc w:val="right"/>
             </w:pPr>
             <w:r>
@@ -4523,6 +4554,7 @@
           <w:p>
             <w:pPr>
               <w:pStyle w:val="Compact"/>
+              <w:spacing w:line="240" w:lineRule="auto" w:after="0" w:before="0"/>
               <w:jc w:val="left"/>
             </w:pPr>
             <w:r>
@@ -4535,6 +4567,7 @@
           <w:p>
             <w:pPr>
               <w:pStyle w:val="Compact"/>
+              <w:spacing w:line="240" w:lineRule="auto" w:after="0" w:before="0"/>
               <w:jc w:val="right"/>
             </w:pPr>
             <w:r>
@@ -4547,6 +4580,7 @@
           <w:p>
             <w:pPr>
               <w:pStyle w:val="Compact"/>
+              <w:spacing w:line="240" w:lineRule="auto" w:after="0" w:before="0"/>
               <w:jc w:val="right"/>
             </w:pPr>
             <w:r>
@@ -4561,6 +4595,7 @@
           <w:p>
             <w:pPr>
               <w:pStyle w:val="Compact"/>
+              <w:spacing w:line="240" w:lineRule="auto" w:after="0" w:before="0"/>
               <w:jc w:val="left"/>
             </w:pPr>
             <w:r>
@@ -4573,6 +4608,7 @@
           <w:p>
             <w:pPr>
               <w:pStyle w:val="Compact"/>
+              <w:spacing w:line="240" w:lineRule="auto" w:after="0" w:before="0"/>
               <w:jc w:val="right"/>
             </w:pPr>
             <w:r>
@@ -4585,6 +4621,7 @@
           <w:p>
             <w:pPr>
               <w:pStyle w:val="Compact"/>
+              <w:spacing w:line="240" w:lineRule="auto" w:after="0" w:before="0"/>
               <w:jc w:val="right"/>
             </w:pPr>
             <w:r>
@@ -4599,6 +4636,7 @@
           <w:p>
             <w:pPr>
               <w:pStyle w:val="Compact"/>
+              <w:spacing w:line="240" w:lineRule="auto" w:after="0" w:before="0"/>
               <w:jc w:val="left"/>
             </w:pPr>
             <w:r>
@@ -4611,6 +4649,7 @@
           <w:p>
             <w:pPr>
               <w:pStyle w:val="Compact"/>
+              <w:spacing w:line="240" w:lineRule="auto" w:after="0" w:before="0"/>
               <w:jc w:val="right"/>
             </w:pPr>
             <w:r>
@@ -4623,6 +4662,7 @@
           <w:p>
             <w:pPr>
               <w:pStyle w:val="Compact"/>
+              <w:spacing w:line="240" w:lineRule="auto" w:after="0" w:before="0"/>
               <w:jc w:val="right"/>
             </w:pPr>
             <w:r>
@@ -4637,6 +4677,7 @@
           <w:p>
             <w:pPr>
               <w:pStyle w:val="Compact"/>
+              <w:spacing w:line="240" w:lineRule="auto" w:after="0" w:before="0"/>
               <w:jc w:val="left"/>
             </w:pPr>
             <w:r>
@@ -4649,6 +4690,7 @@
           <w:p>
             <w:pPr>
               <w:pStyle w:val="Compact"/>
+              <w:spacing w:line="240" w:lineRule="auto" w:after="0" w:before="0"/>
               <w:jc w:val="right"/>
             </w:pPr>
             <w:r>
@@ -4661,6 +4703,7 @@
           <w:p>
             <w:pPr>
               <w:pStyle w:val="Compact"/>
+              <w:spacing w:line="240" w:lineRule="auto" w:after="0" w:before="0"/>
               <w:jc w:val="right"/>
             </w:pPr>
             <w:r>
@@ -4675,6 +4718,7 @@
           <w:p>
             <w:pPr>
               <w:pStyle w:val="Compact"/>
+              <w:spacing w:line="240" w:lineRule="auto" w:after="0" w:before="0"/>
               <w:jc w:val="left"/>
             </w:pPr>
             <w:r>
@@ -4687,6 +4731,7 @@
           <w:p>
             <w:pPr>
               <w:pStyle w:val="Compact"/>
+              <w:spacing w:line="240" w:lineRule="auto" w:after="0" w:before="0"/>
               <w:jc w:val="right"/>
             </w:pPr>
             <w:r>
@@ -4699,6 +4744,7 @@
           <w:p>
             <w:pPr>
               <w:pStyle w:val="Compact"/>
+              <w:spacing w:line="240" w:lineRule="auto" w:after="0" w:before="0"/>
               <w:jc w:val="right"/>
             </w:pPr>
             <w:r>
@@ -4713,6 +4759,7 @@
           <w:p>
             <w:pPr>
               <w:pStyle w:val="Compact"/>
+              <w:spacing w:line="240" w:lineRule="auto" w:after="0" w:before="0"/>
               <w:jc w:val="left"/>
             </w:pPr>
             <w:r>
@@ -4725,6 +4772,7 @@
           <w:p>
             <w:pPr>
               <w:pStyle w:val="Compact"/>
+              <w:spacing w:line="240" w:lineRule="auto" w:after="0" w:before="0"/>
               <w:jc w:val="right"/>
             </w:pPr>
             <w:r>
@@ -4737,6 +4785,7 @@
           <w:p>
             <w:pPr>
               <w:pStyle w:val="Compact"/>
+              <w:spacing w:line="240" w:lineRule="auto" w:after="0" w:before="0"/>
               <w:jc w:val="right"/>
             </w:pPr>
             <w:r>
@@ -4751,6 +4800,7 @@
           <w:p>
             <w:pPr>
               <w:pStyle w:val="Compact"/>
+              <w:spacing w:line="240" w:lineRule="auto" w:after="0" w:before="0"/>
               <w:jc w:val="left"/>
             </w:pPr>
             <w:r>
@@ -4763,6 +4813,7 @@
           <w:p>
             <w:pPr>
               <w:pStyle w:val="Compact"/>
+              <w:spacing w:line="240" w:lineRule="auto" w:after="0" w:before="0"/>
               <w:jc w:val="right"/>
             </w:pPr>
             <w:r>
@@ -4775,6 +4826,7 @@
           <w:p>
             <w:pPr>
               <w:pStyle w:val="Compact"/>
+              <w:spacing w:line="240" w:lineRule="auto" w:after="0" w:before="0"/>
               <w:jc w:val="right"/>
             </w:pPr>
             <w:r>
@@ -4789,6 +4841,7 @@
           <w:p>
             <w:pPr>
               <w:pStyle w:val="Compact"/>
+              <w:spacing w:line="240" w:lineRule="auto" w:after="0" w:before="0"/>
               <w:jc w:val="left"/>
             </w:pPr>
             <w:r>
@@ -4801,6 +4854,7 @@
           <w:p>
             <w:pPr>
               <w:pStyle w:val="Compact"/>
+              <w:spacing w:line="240" w:lineRule="auto" w:after="0" w:before="0"/>
               <w:jc w:val="right"/>
             </w:pPr>
             <w:r>
@@ -4813,6 +4867,7 @@
           <w:p>
             <w:pPr>
               <w:pStyle w:val="Compact"/>
+              <w:spacing w:line="240" w:lineRule="auto" w:after="0" w:before="0"/>
               <w:jc w:val="right"/>
             </w:pPr>
             <w:r>
@@ -4827,6 +4882,7 @@
           <w:p>
             <w:pPr>
               <w:pStyle w:val="Compact"/>
+              <w:spacing w:line="240" w:lineRule="auto" w:after="0" w:before="0"/>
               <w:jc w:val="left"/>
             </w:pPr>
             <w:r>
@@ -4839,6 +4895,7 @@
           <w:p>
             <w:pPr>
               <w:pStyle w:val="Compact"/>
+              <w:spacing w:line="240" w:lineRule="auto" w:after="0" w:before="0"/>
               <w:jc w:val="right"/>
             </w:pPr>
             <w:r>
@@ -4851,6 +4908,7 @@
           <w:p>
             <w:pPr>
               <w:pStyle w:val="Compact"/>
+              <w:spacing w:line="240" w:lineRule="auto" w:after="0" w:before="0"/>
               <w:jc w:val="right"/>
             </w:pPr>
             <w:r>
@@ -4865,6 +4923,7 @@
           <w:p>
             <w:pPr>
               <w:pStyle w:val="Compact"/>
+              <w:spacing w:line="240" w:lineRule="auto" w:after="0" w:before="0"/>
               <w:jc w:val="left"/>
             </w:pPr>
             <w:r>
@@ -4877,6 +4936,7 @@
           <w:p>
             <w:pPr>
               <w:pStyle w:val="Compact"/>
+              <w:spacing w:line="240" w:lineRule="auto" w:after="0" w:before="0"/>
               <w:jc w:val="right"/>
             </w:pPr>
             <w:r>
@@ -4889,6 +4949,7 @@
           <w:p>
             <w:pPr>
               <w:pStyle w:val="Compact"/>
+              <w:spacing w:line="240" w:lineRule="auto" w:after="0" w:before="0"/>
               <w:jc w:val="right"/>
             </w:pPr>
             <w:r>
@@ -4903,6 +4964,7 @@
           <w:p>
             <w:pPr>
               <w:pStyle w:val="Compact"/>
+              <w:spacing w:line="240" w:lineRule="auto" w:after="0" w:before="0"/>
               <w:jc w:val="left"/>
             </w:pPr>
             <w:r>
@@ -4915,6 +4977,7 @@
           <w:p>
             <w:pPr>
               <w:pStyle w:val="Compact"/>
+              <w:spacing w:line="240" w:lineRule="auto" w:after="0" w:before="0"/>
               <w:jc w:val="right"/>
             </w:pPr>
             <w:r>
@@ -4927,6 +4990,7 @@
           <w:p>
             <w:pPr>
               <w:pStyle w:val="Compact"/>
+              <w:spacing w:line="240" w:lineRule="auto" w:after="0" w:before="0"/>
               <w:jc w:val="right"/>
             </w:pPr>
             <w:r>
@@ -4941,6 +5005,7 @@
           <w:p>
             <w:pPr>
               <w:pStyle w:val="Compact"/>
+              <w:spacing w:line="240" w:lineRule="auto" w:after="0" w:before="0"/>
               <w:jc w:val="left"/>
             </w:pPr>
             <w:r>
@@ -4953,6 +5018,7 @@
           <w:p>
             <w:pPr>
               <w:pStyle w:val="Compact"/>
+              <w:spacing w:line="240" w:lineRule="auto" w:after="0" w:before="0"/>
               <w:jc w:val="right"/>
             </w:pPr>
             <w:r>
@@ -4965,6 +5031,7 @@
           <w:p>
             <w:pPr>
               <w:pStyle w:val="Compact"/>
+              <w:spacing w:line="240" w:lineRule="auto" w:after="0" w:before="0"/>
               <w:jc w:val="right"/>
             </w:pPr>
             <w:r>
@@ -5015,24 +5082,7 @@
         <w:t xml:space="preserve"> </w:t>
       </w:r>
       <w:r>
-        <w:t xml:space="preserve">and Figure</w:t>
-      </w:r>
-      <w:r>
-        <w:t xml:space="preserve"> </w:t>
-      </w:r>
-      <w:hyperlink w:anchor="S-fig:fig-decomp">
-        <w:r>
-          <w:rPr>
-            <w:rStyle w:val="Hyperlink"/>
-          </w:rPr>
-          <w:t xml:space="preserve">[S-fig:fig-decomp]</w:t>
-        </w:r>
-      </w:hyperlink>
-      <w:r>
-        <w:t xml:space="preserve"> </w:t>
-      </w:r>
-      <w:r>
-        <w:t xml:space="preserve">report the</w:t>
+        <w:t xml:space="preserve">and Figure S1 report the</w:t>
       </w:r>
       <w:r>
         <w:t xml:space="preserve"> </w:t>
@@ -5277,24 +5327,7 @@
         <w:pStyle w:val="FirstParagraph"/>
       </w:pPr>
       <w:r>
-        <w:t xml:space="preserve">Table</w:t>
-      </w:r>
-      <w:r>
-        <w:t xml:space="preserve"> </w:t>
-      </w:r>
-      <w:hyperlink w:anchor="S-tab:residence">
-        <w:r>
-          <w:rPr>
-            <w:rStyle w:val="Hyperlink"/>
-          </w:rPr>
-          <w:t xml:space="preserve">[S-tab:residence]</w:t>
-        </w:r>
-      </w:hyperlink>
-      <w:r>
-        <w:t xml:space="preserve"> </w:t>
-      </w:r>
-      <w:r>
-        <w:t xml:space="preserve">splits married women and men by residence</w:t>
+        <w:t xml:space="preserve">Table S1 splits married women and men by residence</w:t>
       </w:r>
       <w:r>
         <w:t xml:space="preserve"> </w:t>
@@ -5429,17 +5462,18 @@
     <w:tbl>
       <w:tblPr>
         <w:tblStyle w:val="Table"/>
-        <w:tblW w:type="auto" w:w="0"/>
         <w:tblLook w:firstRow="1" w:lastRow="0" w:firstColumn="0" w:lastColumn="0" w:noHBand="0" w:noVBand="0" w:val="0020"/>
         <w:tblCaption w:val="Women: married minus never-married under alternative treatments of selection, minutes per day"/>
+        <w:tblW w:type="pct" w:w="5000"/>
+        <w:tblLayout w:type="autofit"/>
       </w:tblPr>
       <w:tblGrid>
-        <w:gridCol w:w="1320"/>
-        <w:gridCol w:w="1320"/>
-        <w:gridCol w:w="1320"/>
-        <w:gridCol w:w="1320"/>
-        <w:gridCol w:w="1320"/>
-        <w:gridCol w:w="1320"/>
+        <w:gridCol/>
+        <w:gridCol/>
+        <w:gridCol/>
+        <w:gridCol/>
+        <w:gridCol/>
+        <w:gridCol/>
       </w:tblGrid>
       <w:tr>
         <w:trPr>
@@ -5450,6 +5484,7 @@
           <w:p>
             <w:pPr>
               <w:pStyle w:val="Compact"/>
+              <w:spacing w:line="240" w:lineRule="auto" w:after="0" w:before="0"/>
               <w:jc w:val="left"/>
             </w:pPr>
             <w:r>
@@ -5462,6 +5497,7 @@
           <w:p>
             <w:pPr>
               <w:pStyle w:val="Compact"/>
+              <w:spacing w:line="240" w:lineRule="auto" w:after="0" w:before="0"/>
               <w:jc w:val="right"/>
             </w:pPr>
             <w:r>
@@ -5474,6 +5510,7 @@
           <w:p>
             <w:pPr>
               <w:pStyle w:val="Compact"/>
+              <w:spacing w:line="240" w:lineRule="auto" w:after="0" w:before="0"/>
               <w:jc w:val="right"/>
             </w:pPr>
             <w:r>
@@ -5486,6 +5523,7 @@
           <w:p>
             <w:pPr>
               <w:pStyle w:val="Compact"/>
+              <w:spacing w:line="240" w:lineRule="auto" w:after="0" w:before="0"/>
               <w:jc w:val="right"/>
             </w:pPr>
             <w:r>
@@ -5498,6 +5536,7 @@
           <w:p>
             <w:pPr>
               <w:pStyle w:val="Compact"/>
+              <w:spacing w:line="240" w:lineRule="auto" w:after="0" w:before="0"/>
               <w:jc w:val="right"/>
             </w:pPr>
             <w:r>
@@ -5510,6 +5549,7 @@
           <w:p>
             <w:pPr>
               <w:pStyle w:val="Compact"/>
+              <w:spacing w:line="240" w:lineRule="auto" w:after="0" w:before="0"/>
               <w:jc w:val="right"/>
             </w:pPr>
             <w:r>
@@ -5524,6 +5564,7 @@
           <w:p>
             <w:pPr>
               <w:pStyle w:val="Compact"/>
+              <w:spacing w:line="240" w:lineRule="auto" w:after="0" w:before="0"/>
               <w:jc w:val="left"/>
             </w:pPr>
             <w:r>
@@ -5536,6 +5577,7 @@
           <w:p>
             <w:pPr>
               <w:pStyle w:val="Compact"/>
+              <w:spacing w:line="240" w:lineRule="auto" w:after="0" w:before="0"/>
               <w:jc w:val="right"/>
             </w:pPr>
             <w:r>
@@ -5548,6 +5590,7 @@
           <w:p>
             <w:pPr>
               <w:pStyle w:val="Compact"/>
+              <w:spacing w:line="240" w:lineRule="auto" w:after="0" w:before="0"/>
               <w:jc w:val="right"/>
             </w:pPr>
             <w:r>
@@ -5560,6 +5603,7 @@
           <w:p>
             <w:pPr>
               <w:pStyle w:val="Compact"/>
+              <w:spacing w:line="240" w:lineRule="auto" w:after="0" w:before="0"/>
               <w:jc w:val="right"/>
             </w:pPr>
             <w:r>
@@ -5572,6 +5616,7 @@
           <w:p>
             <w:pPr>
               <w:pStyle w:val="Compact"/>
+              <w:spacing w:line="240" w:lineRule="auto" w:after="0" w:before="0"/>
               <w:jc w:val="right"/>
             </w:pPr>
             <w:r>
@@ -5584,6 +5629,7 @@
           <w:p>
             <w:pPr>
               <w:pStyle w:val="Compact"/>
+              <w:spacing w:line="240" w:lineRule="auto" w:after="0" w:before="0"/>
               <w:jc w:val="right"/>
             </w:pPr>
             <w:r>
@@ -5598,6 +5644,7 @@
           <w:p>
             <w:pPr>
               <w:pStyle w:val="Compact"/>
+              <w:spacing w:line="240" w:lineRule="auto" w:after="0" w:before="0"/>
               <w:jc w:val="left"/>
             </w:pPr>
             <w:r>
@@ -5610,6 +5657,7 @@
           <w:p>
             <w:pPr>
               <w:pStyle w:val="Compact"/>
+              <w:spacing w:line="240" w:lineRule="auto" w:after="0" w:before="0"/>
               <w:jc w:val="right"/>
             </w:pPr>
             <w:r>
@@ -5622,6 +5670,7 @@
           <w:p>
             <w:pPr>
               <w:pStyle w:val="Compact"/>
+              <w:spacing w:line="240" w:lineRule="auto" w:after="0" w:before="0"/>
               <w:jc w:val="right"/>
             </w:pPr>
             <w:r>
@@ -5634,6 +5683,7 @@
           <w:p>
             <w:pPr>
               <w:pStyle w:val="Compact"/>
+              <w:spacing w:line="240" w:lineRule="auto" w:after="0" w:before="0"/>
               <w:jc w:val="right"/>
             </w:pPr>
             <w:r>
@@ -5646,14 +5696,16 @@
           <w:p>
             <w:pPr>
               <w:pStyle w:val="Compact"/>
-            </w:pPr>
-          </w:p>
-        </w:tc>
-        <w:tc>
-          <w:tcPr/>
-          <w:p>
-            <w:pPr>
-              <w:pStyle w:val="Compact"/>
+              <w:spacing w:line="240" w:lineRule="auto" w:after="0" w:before="0"/>
+            </w:pPr>
+          </w:p>
+        </w:tc>
+        <w:tc>
+          <w:tcPr/>
+          <w:p>
+            <w:pPr>
+              <w:pStyle w:val="Compact"/>
+              <w:spacing w:line="240" w:lineRule="auto" w:after="0" w:before="0"/>
             </w:pPr>
           </w:p>
         </w:tc>
@@ -5664,6 +5716,7 @@
           <w:p>
             <w:pPr>
               <w:pStyle w:val="Compact"/>
+              <w:spacing w:line="240" w:lineRule="auto" w:after="0" w:before="0"/>
               <w:jc w:val="left"/>
             </w:pPr>
             <w:r>
@@ -5676,6 +5729,7 @@
           <w:p>
             <w:pPr>
               <w:pStyle w:val="Compact"/>
+              <w:spacing w:line="240" w:lineRule="auto" w:after="0" w:before="0"/>
               <w:jc w:val="right"/>
             </w:pPr>
             <w:r>
@@ -5688,6 +5742,7 @@
           <w:p>
             <w:pPr>
               <w:pStyle w:val="Compact"/>
+              <w:spacing w:line="240" w:lineRule="auto" w:after="0" w:before="0"/>
               <w:jc w:val="right"/>
             </w:pPr>
             <w:r>
@@ -5700,6 +5755,7 @@
           <w:p>
             <w:pPr>
               <w:pStyle w:val="Compact"/>
+              <w:spacing w:line="240" w:lineRule="auto" w:after="0" w:before="0"/>
               <w:jc w:val="right"/>
             </w:pPr>
             <w:r>
@@ -5712,14 +5768,16 @@
           <w:p>
             <w:pPr>
               <w:pStyle w:val="Compact"/>
-            </w:pPr>
-          </w:p>
-        </w:tc>
-        <w:tc>
-          <w:tcPr/>
-          <w:p>
-            <w:pPr>
-              <w:pStyle w:val="Compact"/>
+              <w:spacing w:line="240" w:lineRule="auto" w:after="0" w:before="0"/>
+            </w:pPr>
+          </w:p>
+        </w:tc>
+        <w:tc>
+          <w:tcPr/>
+          <w:p>
+            <w:pPr>
+              <w:pStyle w:val="Compact"/>
+              <w:spacing w:line="240" w:lineRule="auto" w:after="0" w:before="0"/>
             </w:pPr>
           </w:p>
         </w:tc>
@@ -5730,6 +5788,7 @@
           <w:p>
             <w:pPr>
               <w:pStyle w:val="Compact"/>
+              <w:spacing w:line="240" w:lineRule="auto" w:after="0" w:before="0"/>
               <w:jc w:val="left"/>
             </w:pPr>
             <w:r>
@@ -5742,6 +5801,7 @@
           <w:p>
             <w:pPr>
               <w:pStyle w:val="Compact"/>
+              <w:spacing w:line="240" w:lineRule="auto" w:after="0" w:before="0"/>
               <w:jc w:val="right"/>
             </w:pPr>
             <w:r>
@@ -5754,6 +5814,7 @@
           <w:p>
             <w:pPr>
               <w:pStyle w:val="Compact"/>
+              <w:spacing w:line="240" w:lineRule="auto" w:after="0" w:before="0"/>
               <w:jc w:val="right"/>
             </w:pPr>
             <w:r>
@@ -5766,6 +5827,7 @@
           <w:p>
             <w:pPr>
               <w:pStyle w:val="Compact"/>
+              <w:spacing w:line="240" w:lineRule="auto" w:after="0" w:before="0"/>
               <w:jc w:val="right"/>
             </w:pPr>
             <w:r>
@@ -5778,14 +5840,16 @@
           <w:p>
             <w:pPr>
               <w:pStyle w:val="Compact"/>
-            </w:pPr>
-          </w:p>
-        </w:tc>
-        <w:tc>
-          <w:tcPr/>
-          <w:p>
-            <w:pPr>
-              <w:pStyle w:val="Compact"/>
+              <w:spacing w:line="240" w:lineRule="auto" w:after="0" w:before="0"/>
+            </w:pPr>
+          </w:p>
+        </w:tc>
+        <w:tc>
+          <w:tcPr/>
+          <w:p>
+            <w:pPr>
+              <w:pStyle w:val="Compact"/>
+              <w:spacing w:line="240" w:lineRule="auto" w:after="0" w:before="0"/>
             </w:pPr>
           </w:p>
         </w:tc>
@@ -5796,6 +5860,7 @@
           <w:p>
             <w:pPr>
               <w:pStyle w:val="Compact"/>
+              <w:spacing w:line="240" w:lineRule="auto" w:after="0" w:before="0"/>
               <w:jc w:val="left"/>
             </w:pPr>
             <w:r>
@@ -5808,6 +5873,7 @@
           <w:p>
             <w:pPr>
               <w:pStyle w:val="Compact"/>
+              <w:spacing w:line="240" w:lineRule="auto" w:after="0" w:before="0"/>
               <w:jc w:val="right"/>
             </w:pPr>
             <w:r>
@@ -5820,6 +5886,7 @@
           <w:p>
             <w:pPr>
               <w:pStyle w:val="Compact"/>
+              <w:spacing w:line="240" w:lineRule="auto" w:after="0" w:before="0"/>
               <w:jc w:val="right"/>
             </w:pPr>
             <w:r>
@@ -5832,6 +5899,7 @@
           <w:p>
             <w:pPr>
               <w:pStyle w:val="Compact"/>
+              <w:spacing w:line="240" w:lineRule="auto" w:after="0" w:before="0"/>
               <w:jc w:val="right"/>
             </w:pPr>
             <w:r>
@@ -5844,14 +5912,16 @@
           <w:p>
             <w:pPr>
               <w:pStyle w:val="Compact"/>
-            </w:pPr>
-          </w:p>
-        </w:tc>
-        <w:tc>
-          <w:tcPr/>
-          <w:p>
-            <w:pPr>
-              <w:pStyle w:val="Compact"/>
+              <w:spacing w:line="240" w:lineRule="auto" w:after="0" w:before="0"/>
+            </w:pPr>
+          </w:p>
+        </w:tc>
+        <w:tc>
+          <w:tcPr/>
+          <w:p>
+            <w:pPr>
+              <w:pStyle w:val="Compact"/>
+              <w:spacing w:line="240" w:lineRule="auto" w:after="0" w:before="0"/>
             </w:pPr>
           </w:p>
         </w:tc>
@@ -5862,6 +5932,7 @@
           <w:p>
             <w:pPr>
               <w:pStyle w:val="Compact"/>
+              <w:spacing w:line="240" w:lineRule="auto" w:after="0" w:before="0"/>
               <w:jc w:val="left"/>
             </w:pPr>
             <w:r>
@@ -5874,6 +5945,7 @@
           <w:p>
             <w:pPr>
               <w:pStyle w:val="Compact"/>
+              <w:spacing w:line="240" w:lineRule="auto" w:after="0" w:before="0"/>
               <w:jc w:val="right"/>
             </w:pPr>
             <w:r>
@@ -5886,6 +5958,7 @@
           <w:p>
             <w:pPr>
               <w:pStyle w:val="Compact"/>
+              <w:spacing w:line="240" w:lineRule="auto" w:after="0" w:before="0"/>
               <w:jc w:val="right"/>
             </w:pPr>
             <w:r>
@@ -5898,6 +5971,7 @@
           <w:p>
             <w:pPr>
               <w:pStyle w:val="Compact"/>
+              <w:spacing w:line="240" w:lineRule="auto" w:after="0" w:before="0"/>
               <w:jc w:val="right"/>
             </w:pPr>
             <w:r>
@@ -5910,6 +5984,7 @@
           <w:p>
             <w:pPr>
               <w:pStyle w:val="Compact"/>
+              <w:spacing w:line="240" w:lineRule="auto" w:after="0" w:before="0"/>
               <w:jc w:val="right"/>
             </w:pPr>
             <w:r>
@@ -5922,6 +5997,7 @@
           <w:p>
             <w:pPr>
               <w:pStyle w:val="Compact"/>
+              <w:spacing w:line="240" w:lineRule="auto" w:after="0" w:before="0"/>
               <w:jc w:val="right"/>
             </w:pPr>
             <w:r>
@@ -5936,6 +6012,7 @@
           <w:p>
             <w:pPr>
               <w:pStyle w:val="Compact"/>
+              <w:spacing w:line="240" w:lineRule="auto" w:after="0" w:before="0"/>
               <w:jc w:val="left"/>
             </w:pPr>
             <w:r>
@@ -5948,6 +6025,7 @@
           <w:p>
             <w:pPr>
               <w:pStyle w:val="Compact"/>
+              <w:spacing w:line="240" w:lineRule="auto" w:after="0" w:before="0"/>
               <w:jc w:val="right"/>
             </w:pPr>
             <w:r>
@@ -5960,6 +6038,7 @@
           <w:p>
             <w:pPr>
               <w:pStyle w:val="Compact"/>
+              <w:spacing w:line="240" w:lineRule="auto" w:after="0" w:before="0"/>
               <w:jc w:val="right"/>
             </w:pPr>
             <w:r>
@@ -5972,6 +6051,7 @@
           <w:p>
             <w:pPr>
               <w:pStyle w:val="Compact"/>
+              <w:spacing w:line="240" w:lineRule="auto" w:after="0" w:before="0"/>
               <w:jc w:val="right"/>
             </w:pPr>
             <w:r>
@@ -5984,6 +6064,7 @@
           <w:p>
             <w:pPr>
               <w:pStyle w:val="Compact"/>
+              <w:spacing w:line="240" w:lineRule="auto" w:after="0" w:before="0"/>
               <w:jc w:val="right"/>
             </w:pPr>
             <w:r>
@@ -5996,6 +6077,7 @@
           <w:p>
             <w:pPr>
               <w:pStyle w:val="Compact"/>
+              <w:spacing w:line="240" w:lineRule="auto" w:after="0" w:before="0"/>
               <w:jc w:val="right"/>
             </w:pPr>
             <w:r>
@@ -6010,6 +6092,7 @@
           <w:p>
             <w:pPr>
               <w:pStyle w:val="Compact"/>
+              <w:spacing w:line="240" w:lineRule="auto" w:after="0" w:before="0"/>
               <w:jc w:val="left"/>
             </w:pPr>
             <w:r>
@@ -6022,6 +6105,7 @@
           <w:p>
             <w:pPr>
               <w:pStyle w:val="Compact"/>
+              <w:spacing w:line="240" w:lineRule="auto" w:after="0" w:before="0"/>
               <w:jc w:val="right"/>
             </w:pPr>
             <w:r>
@@ -6034,6 +6118,7 @@
           <w:p>
             <w:pPr>
               <w:pStyle w:val="Compact"/>
+              <w:spacing w:line="240" w:lineRule="auto" w:after="0" w:before="0"/>
               <w:jc w:val="right"/>
             </w:pPr>
             <w:r>
@@ -6046,6 +6131,7 @@
           <w:p>
             <w:pPr>
               <w:pStyle w:val="Compact"/>
+              <w:spacing w:line="240" w:lineRule="auto" w:after="0" w:before="0"/>
               <w:jc w:val="right"/>
             </w:pPr>
             <w:r>
@@ -6058,6 +6144,7 @@
           <w:p>
             <w:pPr>
               <w:pStyle w:val="Compact"/>
+              <w:spacing w:line="240" w:lineRule="auto" w:after="0" w:before="0"/>
               <w:jc w:val="right"/>
             </w:pPr>
             <w:r>
@@ -6070,6 +6157,7 @@
           <w:p>
             <w:pPr>
               <w:pStyle w:val="Compact"/>
+              <w:spacing w:line="240" w:lineRule="auto" w:after="0" w:before="0"/>
               <w:jc w:val="right"/>
             </w:pPr>
             <w:r>
@@ -6084,6 +6172,7 @@
           <w:p>
             <w:pPr>
               <w:pStyle w:val="Compact"/>
+              <w:spacing w:line="240" w:lineRule="auto" w:after="0" w:before="0"/>
               <w:jc w:val="left"/>
             </w:pPr>
             <w:r>
@@ -6096,6 +6185,7 @@
           <w:p>
             <w:pPr>
               <w:pStyle w:val="Compact"/>
+              <w:spacing w:line="240" w:lineRule="auto" w:after="0" w:before="0"/>
               <w:jc w:val="right"/>
             </w:pPr>
             <w:r>
@@ -6108,6 +6198,7 @@
           <w:p>
             <w:pPr>
               <w:pStyle w:val="Compact"/>
+              <w:spacing w:line="240" w:lineRule="auto" w:after="0" w:before="0"/>
               <w:jc w:val="right"/>
             </w:pPr>
             <w:r>
@@ -6120,6 +6211,7 @@
           <w:p>
             <w:pPr>
               <w:pStyle w:val="Compact"/>
+              <w:spacing w:line="240" w:lineRule="auto" w:after="0" w:before="0"/>
               <w:jc w:val="right"/>
             </w:pPr>
             <w:r>
@@ -6132,14 +6224,16 @@
           <w:p>
             <w:pPr>
               <w:pStyle w:val="Compact"/>
-            </w:pPr>
-          </w:p>
-        </w:tc>
-        <w:tc>
-          <w:tcPr/>
-          <w:p>
-            <w:pPr>
-              <w:pStyle w:val="Compact"/>
+              <w:spacing w:line="240" w:lineRule="auto" w:after="0" w:before="0"/>
+            </w:pPr>
+          </w:p>
+        </w:tc>
+        <w:tc>
+          <w:tcPr/>
+          <w:p>
+            <w:pPr>
+              <w:pStyle w:val="Compact"/>
+              <w:spacing w:line="240" w:lineRule="auto" w:after="0" w:before="0"/>
             </w:pPr>
           </w:p>
         </w:tc>
@@ -6150,6 +6244,7 @@
           <w:p>
             <w:pPr>
               <w:pStyle w:val="Compact"/>
+              <w:spacing w:line="240" w:lineRule="auto" w:after="0" w:before="0"/>
               <w:jc w:val="left"/>
             </w:pPr>
             <w:r>
@@ -6162,6 +6257,7 @@
           <w:p>
             <w:pPr>
               <w:pStyle w:val="Compact"/>
+              <w:spacing w:line="240" w:lineRule="auto" w:after="0" w:before="0"/>
               <w:jc w:val="right"/>
             </w:pPr>
             <w:r>
@@ -6174,6 +6270,7 @@
           <w:p>
             <w:pPr>
               <w:pStyle w:val="Compact"/>
+              <w:spacing w:line="240" w:lineRule="auto" w:after="0" w:before="0"/>
               <w:jc w:val="right"/>
             </w:pPr>
             <w:r>
@@ -6186,6 +6283,7 @@
           <w:p>
             <w:pPr>
               <w:pStyle w:val="Compact"/>
+              <w:spacing w:line="240" w:lineRule="auto" w:after="0" w:before="0"/>
               <w:jc w:val="right"/>
             </w:pPr>
             <w:r>
@@ -6198,6 +6296,7 @@
           <w:p>
             <w:pPr>
               <w:pStyle w:val="Compact"/>
+              <w:spacing w:line="240" w:lineRule="auto" w:after="0" w:before="0"/>
               <w:jc w:val="right"/>
             </w:pPr>
             <w:r>
@@ -6210,6 +6309,7 @@
           <w:p>
             <w:pPr>
               <w:pStyle w:val="Compact"/>
+              <w:spacing w:line="240" w:lineRule="auto" w:after="0" w:before="0"/>
               <w:jc w:val="right"/>
             </w:pPr>
             <w:r>
@@ -6224,6 +6324,7 @@
           <w:p>
             <w:pPr>
               <w:pStyle w:val="Compact"/>
+              <w:spacing w:line="240" w:lineRule="auto" w:after="0" w:before="0"/>
               <w:jc w:val="left"/>
             </w:pPr>
             <w:r>
@@ -6236,6 +6337,7 @@
           <w:p>
             <w:pPr>
               <w:pStyle w:val="Compact"/>
+              <w:spacing w:line="240" w:lineRule="auto" w:after="0" w:before="0"/>
               <w:jc w:val="right"/>
             </w:pPr>
             <w:r>
@@ -6248,6 +6350,7 @@
           <w:p>
             <w:pPr>
               <w:pStyle w:val="Compact"/>
+              <w:spacing w:line="240" w:lineRule="auto" w:after="0" w:before="0"/>
               <w:jc w:val="right"/>
             </w:pPr>
             <w:r>
@@ -6260,6 +6363,7 @@
           <w:p>
             <w:pPr>
               <w:pStyle w:val="Compact"/>
+              <w:spacing w:line="240" w:lineRule="auto" w:after="0" w:before="0"/>
               <w:jc w:val="right"/>
             </w:pPr>
             <w:r>
@@ -6272,6 +6376,7 @@
           <w:p>
             <w:pPr>
               <w:pStyle w:val="Compact"/>
+              <w:spacing w:line="240" w:lineRule="auto" w:after="0" w:before="0"/>
               <w:jc w:val="right"/>
             </w:pPr>
             <w:r>
@@ -6284,6 +6389,7 @@
           <w:p>
             <w:pPr>
               <w:pStyle w:val="Compact"/>
+              <w:spacing w:line="240" w:lineRule="auto" w:after="0" w:before="0"/>
               <w:jc w:val="right"/>
             </w:pPr>
             <w:r>
@@ -6395,24 +6501,7 @@
         <w:t xml:space="preserve"> </w:t>
       </w:r>
       <w:r>
-        <w:t xml:space="preserve">guides. Figure</w:t>
-      </w:r>
-      <w:r>
-        <w:t xml:space="preserve"> </w:t>
-      </w:r>
-      <w:hyperlink w:anchor="S-fig:fig-overlap">
-        <w:r>
-          <w:rPr>
-            <w:rStyle w:val="Hyperlink"/>
-          </w:rPr>
-          <w:t xml:space="preserve">[S-fig:fig-overlap]</w:t>
-        </w:r>
-      </w:hyperlink>
-      <w:r>
-        <w:t xml:space="preserve"> </w:t>
-      </w:r>
-      <w:r>
-        <w:t xml:space="preserve">in the online supplement shows the</w:t>
+        <w:t xml:space="preserve">guides. Figure S2 in the online supplement shows the</w:t>
       </w:r>
       <w:r>
         <w:t xml:space="preserve"> </w:t>
@@ -6472,36 +6561,14 @@
       <w:r>
         <w:t xml:space="preserve"> </w:t>
       </w:r>
-      <w:hyperlink w:anchor="S-tab:balance">
-        <w:r>
-          <w:rPr>
-            <w:rStyle w:val="Hyperlink"/>
-          </w:rPr>
-          <w:t xml:space="preserve">[S-tab:balance]</w:t>
-        </w:r>
-      </w:hyperlink>
-      <w:r>
-        <w:t xml:space="preserve"> </w:t>
-      </w:r>
-      <w:r>
-        <w:t xml:space="preserve">in the online supplement is 0.13, and Table</w:t>
-      </w:r>
-      <w:r>
-        <w:t xml:space="preserve"> </w:t>
-      </w:r>
-      <w:hyperlink w:anchor="S-tab:oster">
-        <w:r>
-          <w:rPr>
-            <w:rStyle w:val="Hyperlink"/>
-          </w:rPr>
-          <w:t xml:space="preserve">[S-tab:oster]</w:t>
-        </w:r>
-      </w:hyperlink>
-      <w:r>
-        <w:t xml:space="preserve"> </w:t>
-      </w:r>
-      <w:r>
-        <w:t xml:space="preserve">in the online supplement reports the</w:t>
+      <w:r>
+        <w:t xml:space="preserve">S2 in the online supplement is 0.13, and Table</w:t>
+      </w:r>
+      <w:r>
+        <w:t xml:space="preserve"> </w:t>
+      </w:r>
+      <w:r>
+        <w:t xml:space="preserve">S3 in the online supplement reports the</w:t>
       </w:r>
       <w:r>
         <w:t xml:space="preserve"> </w:t>
@@ -6563,24 +6630,7 @@
         <w:pStyle w:val="BodyText"/>
       </w:pPr>
       <w:r>
-        <w:t xml:space="preserve">Figure</w:t>
-      </w:r>
-      <w:r>
-        <w:t xml:space="preserve"> </w:t>
-      </w:r>
-      <w:hyperlink w:anchor="S-fig:fig-agegrad">
-        <w:r>
-          <w:rPr>
-            <w:rStyle w:val="Hyperlink"/>
-          </w:rPr>
-          <w:t xml:space="preserve">[S-fig:fig-agegrad]</w:t>
-        </w:r>
-      </w:hyperlink>
-      <w:r>
-        <w:t xml:space="preserve"> </w:t>
-      </w:r>
-      <w:r>
-        <w:t xml:space="preserve">shows the unpaid-work gap by age band.</w:t>
+        <w:t xml:space="preserve">Figure S3 shows the unpaid-work gap by age band.</w:t>
       </w:r>
       <w:r>
         <w:t xml:space="preserve"> </w:t>
@@ -6647,16 +6697,17 @@
     <w:tbl>
       <w:tblPr>
         <w:tblStyle w:val="Table"/>
-        <w:tblW w:type="auto" w:w="0"/>
         <w:tblLook w:firstRow="1" w:lastRow="0" w:firstColumn="0" w:lastColumn="0" w:noHBand="0" w:noVBand="0" w:val="0020"/>
         <w:tblCaption w:val="Within-couple gaps, linked couples with wives aged 20–59"/>
+        <w:tblW w:type="pct" w:w="5000"/>
+        <w:tblLayout w:type="autofit"/>
       </w:tblPr>
       <w:tblGrid>
-        <w:gridCol w:w="1584"/>
-        <w:gridCol w:w="1584"/>
-        <w:gridCol w:w="1584"/>
-        <w:gridCol w:w="1584"/>
-        <w:gridCol w:w="1584"/>
+        <w:gridCol/>
+        <w:gridCol/>
+        <w:gridCol/>
+        <w:gridCol/>
+        <w:gridCol/>
       </w:tblGrid>
       <w:tr>
         <w:trPr>
@@ -6667,14 +6718,16 @@
           <w:p>
             <w:pPr>
               <w:pStyle w:val="Compact"/>
-            </w:pPr>
-          </w:p>
-        </w:tc>
-        <w:tc>
-          <w:tcPr/>
-          <w:p>
-            <w:pPr>
-              <w:pStyle w:val="Compact"/>
+              <w:spacing w:line="240" w:lineRule="auto" w:after="0" w:before="0"/>
+            </w:pPr>
+          </w:p>
+        </w:tc>
+        <w:tc>
+          <w:tcPr/>
+          <w:p>
+            <w:pPr>
+              <w:pStyle w:val="Compact"/>
+              <w:spacing w:line="240" w:lineRule="auto" w:after="0" w:before="0"/>
               <w:jc w:val="right"/>
             </w:pPr>
             <w:r>
@@ -6698,6 +6751,7 @@
           <w:p>
             <w:pPr>
               <w:pStyle w:val="Compact"/>
+              <w:spacing w:line="240" w:lineRule="auto" w:after="0" w:before="0"/>
               <w:jc w:val="right"/>
             </w:pPr>
             <w:r>
@@ -6710,6 +6764,7 @@
           <w:p>
             <w:pPr>
               <w:pStyle w:val="Compact"/>
+              <w:spacing w:line="240" w:lineRule="auto" w:after="0" w:before="0"/>
               <w:jc w:val="right"/>
             </w:pPr>
             <w:r>
@@ -6733,6 +6788,7 @@
           <w:p>
             <w:pPr>
               <w:pStyle w:val="Compact"/>
+              <w:spacing w:line="240" w:lineRule="auto" w:after="0" w:before="0"/>
               <w:jc w:val="right"/>
             </w:pPr>
             <w:r>
@@ -6747,6 +6803,7 @@
           <w:p>
             <w:pPr>
               <w:pStyle w:val="Compact"/>
+              <w:spacing w:line="240" w:lineRule="auto" w:after="0" w:before="0"/>
               <w:jc w:val="left"/>
             </w:pPr>
             <w:r>
@@ -6759,6 +6816,7 @@
           <w:p>
             <w:pPr>
               <w:pStyle w:val="Compact"/>
+              <w:spacing w:line="240" w:lineRule="auto" w:after="0" w:before="0"/>
               <w:jc w:val="right"/>
             </w:pPr>
             <w:r>
@@ -6771,6 +6829,7 @@
           <w:p>
             <w:pPr>
               <w:pStyle w:val="Compact"/>
+              <w:spacing w:line="240" w:lineRule="auto" w:after="0" w:before="0"/>
               <w:jc w:val="right"/>
             </w:pPr>
             <w:r>
@@ -6783,6 +6842,7 @@
           <w:p>
             <w:pPr>
               <w:pStyle w:val="Compact"/>
+              <w:spacing w:line="240" w:lineRule="auto" w:after="0" w:before="0"/>
               <w:jc w:val="right"/>
             </w:pPr>
             <w:r>
@@ -6795,6 +6855,7 @@
           <w:p>
             <w:pPr>
               <w:pStyle w:val="Compact"/>
+              <w:spacing w:line="240" w:lineRule="auto" w:after="0" w:before="0"/>
               <w:jc w:val="right"/>
             </w:pPr>
             <w:r>
@@ -6809,6 +6870,7 @@
           <w:p>
             <w:pPr>
               <w:pStyle w:val="Compact"/>
+              <w:spacing w:line="240" w:lineRule="auto" w:after="0" w:before="0"/>
               <w:jc w:val="left"/>
             </w:pPr>
             <w:r>
@@ -6821,30 +6883,34 @@
           <w:p>
             <w:pPr>
               <w:pStyle w:val="Compact"/>
-            </w:pPr>
-          </w:p>
-        </w:tc>
-        <w:tc>
-          <w:tcPr/>
-          <w:p>
-            <w:pPr>
-              <w:pStyle w:val="Compact"/>
-            </w:pPr>
-          </w:p>
-        </w:tc>
-        <w:tc>
-          <w:tcPr/>
-          <w:p>
-            <w:pPr>
-              <w:pStyle w:val="Compact"/>
-            </w:pPr>
-          </w:p>
-        </w:tc>
-        <w:tc>
-          <w:tcPr/>
-          <w:p>
-            <w:pPr>
-              <w:pStyle w:val="Compact"/>
+              <w:spacing w:line="240" w:lineRule="auto" w:after="0" w:before="0"/>
+            </w:pPr>
+          </w:p>
+        </w:tc>
+        <w:tc>
+          <w:tcPr/>
+          <w:p>
+            <w:pPr>
+              <w:pStyle w:val="Compact"/>
+              <w:spacing w:line="240" w:lineRule="auto" w:after="0" w:before="0"/>
+            </w:pPr>
+          </w:p>
+        </w:tc>
+        <w:tc>
+          <w:tcPr/>
+          <w:p>
+            <w:pPr>
+              <w:pStyle w:val="Compact"/>
+              <w:spacing w:line="240" w:lineRule="auto" w:after="0" w:before="0"/>
+            </w:pPr>
+          </w:p>
+        </w:tc>
+        <w:tc>
+          <w:tcPr/>
+          <w:p>
+            <w:pPr>
+              <w:pStyle w:val="Compact"/>
+              <w:spacing w:line="240" w:lineRule="auto" w:after="0" w:before="0"/>
             </w:pPr>
           </w:p>
         </w:tc>
@@ -6855,6 +6921,7 @@
           <w:p>
             <w:pPr>
               <w:pStyle w:val="Compact"/>
+              <w:spacing w:line="240" w:lineRule="auto" w:after="0" w:before="0"/>
               <w:jc w:val="left"/>
             </w:pPr>
             <w:r>
@@ -6867,6 +6934,7 @@
           <w:p>
             <w:pPr>
               <w:pStyle w:val="Compact"/>
+              <w:spacing w:line="240" w:lineRule="auto" w:after="0" w:before="0"/>
               <w:jc w:val="right"/>
             </w:pPr>
             <w:r>
@@ -6879,6 +6947,7 @@
           <w:p>
             <w:pPr>
               <w:pStyle w:val="Compact"/>
+              <w:spacing w:line="240" w:lineRule="auto" w:after="0" w:before="0"/>
               <w:jc w:val="right"/>
             </w:pPr>
             <w:r>
@@ -6891,6 +6960,7 @@
           <w:p>
             <w:pPr>
               <w:pStyle w:val="Compact"/>
+              <w:spacing w:line="240" w:lineRule="auto" w:after="0" w:before="0"/>
               <w:jc w:val="right"/>
             </w:pPr>
             <w:r>
@@ -6903,6 +6973,7 @@
           <w:p>
             <w:pPr>
               <w:pStyle w:val="Compact"/>
+              <w:spacing w:line="240" w:lineRule="auto" w:after="0" w:before="0"/>
               <w:jc w:val="right"/>
             </w:pPr>
             <w:r>
@@ -6917,6 +6988,7 @@
           <w:p>
             <w:pPr>
               <w:pStyle w:val="Compact"/>
+              <w:spacing w:line="240" w:lineRule="auto" w:after="0" w:before="0"/>
               <w:jc w:val="left"/>
             </w:pPr>
             <w:r>
@@ -6929,6 +7001,7 @@
           <w:p>
             <w:pPr>
               <w:pStyle w:val="Compact"/>
+              <w:spacing w:line="240" w:lineRule="auto" w:after="0" w:before="0"/>
               <w:jc w:val="right"/>
             </w:pPr>
             <w:r>
@@ -6941,6 +7014,7 @@
           <w:p>
             <w:pPr>
               <w:pStyle w:val="Compact"/>
+              <w:spacing w:line="240" w:lineRule="auto" w:after="0" w:before="0"/>
               <w:jc w:val="right"/>
             </w:pPr>
             <w:r>
@@ -6953,6 +7027,7 @@
           <w:p>
             <w:pPr>
               <w:pStyle w:val="Compact"/>
+              <w:spacing w:line="240" w:lineRule="auto" w:after="0" w:before="0"/>
               <w:jc w:val="right"/>
             </w:pPr>
             <w:r>
@@ -6965,6 +7040,7 @@
           <w:p>
             <w:pPr>
               <w:pStyle w:val="Compact"/>
+              <w:spacing w:line="240" w:lineRule="auto" w:after="0" w:before="0"/>
               <w:jc w:val="right"/>
             </w:pPr>
             <w:r>
@@ -6979,6 +7055,7 @@
           <w:p>
             <w:pPr>
               <w:pStyle w:val="Compact"/>
+              <w:spacing w:line="240" w:lineRule="auto" w:after="0" w:before="0"/>
               <w:jc w:val="left"/>
             </w:pPr>
             <w:r>
@@ -6991,30 +7068,34 @@
           <w:p>
             <w:pPr>
               <w:pStyle w:val="Compact"/>
-            </w:pPr>
-          </w:p>
-        </w:tc>
-        <w:tc>
-          <w:tcPr/>
-          <w:p>
-            <w:pPr>
-              <w:pStyle w:val="Compact"/>
-            </w:pPr>
-          </w:p>
-        </w:tc>
-        <w:tc>
-          <w:tcPr/>
-          <w:p>
-            <w:pPr>
-              <w:pStyle w:val="Compact"/>
-            </w:pPr>
-          </w:p>
-        </w:tc>
-        <w:tc>
-          <w:tcPr/>
-          <w:p>
-            <w:pPr>
-              <w:pStyle w:val="Compact"/>
+              <w:spacing w:line="240" w:lineRule="auto" w:after="0" w:before="0"/>
+            </w:pPr>
+          </w:p>
+        </w:tc>
+        <w:tc>
+          <w:tcPr/>
+          <w:p>
+            <w:pPr>
+              <w:pStyle w:val="Compact"/>
+              <w:spacing w:line="240" w:lineRule="auto" w:after="0" w:before="0"/>
+            </w:pPr>
+          </w:p>
+        </w:tc>
+        <w:tc>
+          <w:tcPr/>
+          <w:p>
+            <w:pPr>
+              <w:pStyle w:val="Compact"/>
+              <w:spacing w:line="240" w:lineRule="auto" w:after="0" w:before="0"/>
+            </w:pPr>
+          </w:p>
+        </w:tc>
+        <w:tc>
+          <w:tcPr/>
+          <w:p>
+            <w:pPr>
+              <w:pStyle w:val="Compact"/>
+              <w:spacing w:line="240" w:lineRule="auto" w:after="0" w:before="0"/>
             </w:pPr>
           </w:p>
         </w:tc>
@@ -7025,6 +7106,7 @@
           <w:p>
             <w:pPr>
               <w:pStyle w:val="Compact"/>
+              <w:spacing w:line="240" w:lineRule="auto" w:after="0" w:before="0"/>
               <w:jc w:val="left"/>
             </w:pPr>
             <w:r>
@@ -7037,6 +7119,7 @@
           <w:p>
             <w:pPr>
               <w:pStyle w:val="Compact"/>
+              <w:spacing w:line="240" w:lineRule="auto" w:after="0" w:before="0"/>
               <w:jc w:val="right"/>
             </w:pPr>
             <w:r>
@@ -7049,6 +7132,7 @@
           <w:p>
             <w:pPr>
               <w:pStyle w:val="Compact"/>
+              <w:spacing w:line="240" w:lineRule="auto" w:after="0" w:before="0"/>
               <w:jc w:val="right"/>
             </w:pPr>
             <w:r>
@@ -7061,6 +7145,7 @@
           <w:p>
             <w:pPr>
               <w:pStyle w:val="Compact"/>
+              <w:spacing w:line="240" w:lineRule="auto" w:after="0" w:before="0"/>
               <w:jc w:val="right"/>
             </w:pPr>
             <w:r>
@@ -7073,6 +7158,7 @@
           <w:p>
             <w:pPr>
               <w:pStyle w:val="Compact"/>
+              <w:spacing w:line="240" w:lineRule="auto" w:after="0" w:before="0"/>
               <w:jc w:val="right"/>
             </w:pPr>
             <w:r>
@@ -7087,6 +7173,7 @@
           <w:p>
             <w:pPr>
               <w:pStyle w:val="Compact"/>
+              <w:spacing w:line="240" w:lineRule="auto" w:after="0" w:before="0"/>
               <w:jc w:val="left"/>
             </w:pPr>
             <w:r>
@@ -7099,6 +7186,7 @@
           <w:p>
             <w:pPr>
               <w:pStyle w:val="Compact"/>
+              <w:spacing w:line="240" w:lineRule="auto" w:after="0" w:before="0"/>
               <w:jc w:val="right"/>
             </w:pPr>
             <w:r>
@@ -7111,6 +7199,7 @@
           <w:p>
             <w:pPr>
               <w:pStyle w:val="Compact"/>
+              <w:spacing w:line="240" w:lineRule="auto" w:after="0" w:before="0"/>
               <w:jc w:val="right"/>
             </w:pPr>
             <w:r>
@@ -7123,6 +7212,7 @@
           <w:p>
             <w:pPr>
               <w:pStyle w:val="Compact"/>
+              <w:spacing w:line="240" w:lineRule="auto" w:after="0" w:before="0"/>
               <w:jc w:val="right"/>
             </w:pPr>
             <w:r>
@@ -7135,6 +7225,7 @@
           <w:p>
             <w:pPr>
               <w:pStyle w:val="Compact"/>
+              <w:spacing w:line="240" w:lineRule="auto" w:after="0" w:before="0"/>
               <w:jc w:val="right"/>
             </w:pPr>
             <w:r>
@@ -7149,6 +7240,7 @@
           <w:p>
             <w:pPr>
               <w:pStyle w:val="Compact"/>
+              <w:spacing w:line="240" w:lineRule="auto" w:after="0" w:before="0"/>
               <w:jc w:val="left"/>
             </w:pPr>
             <w:r>
@@ -7161,6 +7253,7 @@
           <w:p>
             <w:pPr>
               <w:pStyle w:val="Compact"/>
+              <w:spacing w:line="240" w:lineRule="auto" w:after="0" w:before="0"/>
               <w:jc w:val="right"/>
             </w:pPr>
             <w:r>
@@ -7173,6 +7266,7 @@
           <w:p>
             <w:pPr>
               <w:pStyle w:val="Compact"/>
+              <w:spacing w:line="240" w:lineRule="auto" w:after="0" w:before="0"/>
               <w:jc w:val="right"/>
             </w:pPr>
             <w:r>
@@ -7185,6 +7279,7 @@
           <w:p>
             <w:pPr>
               <w:pStyle w:val="Compact"/>
+              <w:spacing w:line="240" w:lineRule="auto" w:after="0" w:before="0"/>
               <w:jc w:val="right"/>
             </w:pPr>
             <w:r>
@@ -7197,6 +7292,7 @@
           <w:p>
             <w:pPr>
               <w:pStyle w:val="Compact"/>
+              <w:spacing w:line="240" w:lineRule="auto" w:after="0" w:before="0"/>
               <w:jc w:val="right"/>
             </w:pPr>
             <w:r>
@@ -7211,6 +7307,7 @@
           <w:p>
             <w:pPr>
               <w:pStyle w:val="Compact"/>
+              <w:spacing w:line="240" w:lineRule="auto" w:after="0" w:before="0"/>
               <w:jc w:val="left"/>
             </w:pPr>
             <w:r>
@@ -7223,30 +7320,34 @@
           <w:p>
             <w:pPr>
               <w:pStyle w:val="Compact"/>
-            </w:pPr>
-          </w:p>
-        </w:tc>
-        <w:tc>
-          <w:tcPr/>
-          <w:p>
-            <w:pPr>
-              <w:pStyle w:val="Compact"/>
-            </w:pPr>
-          </w:p>
-        </w:tc>
-        <w:tc>
-          <w:tcPr/>
-          <w:p>
-            <w:pPr>
-              <w:pStyle w:val="Compact"/>
-            </w:pPr>
-          </w:p>
-        </w:tc>
-        <w:tc>
-          <w:tcPr/>
-          <w:p>
-            <w:pPr>
-              <w:pStyle w:val="Compact"/>
+              <w:spacing w:line="240" w:lineRule="auto" w:after="0" w:before="0"/>
+            </w:pPr>
+          </w:p>
+        </w:tc>
+        <w:tc>
+          <w:tcPr/>
+          <w:p>
+            <w:pPr>
+              <w:pStyle w:val="Compact"/>
+              <w:spacing w:line="240" w:lineRule="auto" w:after="0" w:before="0"/>
+            </w:pPr>
+          </w:p>
+        </w:tc>
+        <w:tc>
+          <w:tcPr/>
+          <w:p>
+            <w:pPr>
+              <w:pStyle w:val="Compact"/>
+              <w:spacing w:line="240" w:lineRule="auto" w:after="0" w:before="0"/>
+            </w:pPr>
+          </w:p>
+        </w:tc>
+        <w:tc>
+          <w:tcPr/>
+          <w:p>
+            <w:pPr>
+              <w:pStyle w:val="Compact"/>
+              <w:spacing w:line="240" w:lineRule="auto" w:after="0" w:before="0"/>
             </w:pPr>
           </w:p>
         </w:tc>
@@ -7257,6 +7358,7 @@
           <w:p>
             <w:pPr>
               <w:pStyle w:val="Compact"/>
+              <w:spacing w:line="240" w:lineRule="auto" w:after="0" w:before="0"/>
               <w:jc w:val="left"/>
             </w:pPr>
             <w:r>
@@ -7269,6 +7371,7 @@
           <w:p>
             <w:pPr>
               <w:pStyle w:val="Compact"/>
+              <w:spacing w:line="240" w:lineRule="auto" w:after="0" w:before="0"/>
               <w:jc w:val="right"/>
             </w:pPr>
             <w:r>
@@ -7281,6 +7384,7 @@
           <w:p>
             <w:pPr>
               <w:pStyle w:val="Compact"/>
+              <w:spacing w:line="240" w:lineRule="auto" w:after="0" w:before="0"/>
               <w:jc w:val="right"/>
             </w:pPr>
             <w:r>
@@ -7293,6 +7397,7 @@
           <w:p>
             <w:pPr>
               <w:pStyle w:val="Compact"/>
+              <w:spacing w:line="240" w:lineRule="auto" w:after="0" w:before="0"/>
               <w:jc w:val="right"/>
             </w:pPr>
             <w:r>
@@ -7305,6 +7410,7 @@
           <w:p>
             <w:pPr>
               <w:pStyle w:val="Compact"/>
+              <w:spacing w:line="240" w:lineRule="auto" w:after="0" w:before="0"/>
               <w:jc w:val="right"/>
             </w:pPr>
             <w:r>
@@ -7319,6 +7425,7 @@
           <w:p>
             <w:pPr>
               <w:pStyle w:val="Compact"/>
+              <w:spacing w:line="240" w:lineRule="auto" w:after="0" w:before="0"/>
               <w:jc w:val="left"/>
             </w:pPr>
             <w:r>
@@ -7331,6 +7438,7 @@
           <w:p>
             <w:pPr>
               <w:pStyle w:val="Compact"/>
+              <w:spacing w:line="240" w:lineRule="auto" w:after="0" w:before="0"/>
               <w:jc w:val="right"/>
             </w:pPr>
             <w:r>
@@ -7343,6 +7451,7 @@
           <w:p>
             <w:pPr>
               <w:pStyle w:val="Compact"/>
+              <w:spacing w:line="240" w:lineRule="auto" w:after="0" w:before="0"/>
               <w:jc w:val="right"/>
             </w:pPr>
             <w:r>
@@ -7355,6 +7464,7 @@
           <w:p>
             <w:pPr>
               <w:pStyle w:val="Compact"/>
+              <w:spacing w:line="240" w:lineRule="auto" w:after="0" w:before="0"/>
               <w:jc w:val="right"/>
             </w:pPr>
             <w:r>
@@ -7367,6 +7477,7 @@
           <w:p>
             <w:pPr>
               <w:pStyle w:val="Compact"/>
+              <w:spacing w:line="240" w:lineRule="auto" w:after="0" w:before="0"/>
               <w:jc w:val="right"/>
             </w:pPr>
             <w:r>
@@ -7381,6 +7492,7 @@
           <w:p>
             <w:pPr>
               <w:pStyle w:val="Compact"/>
+              <w:spacing w:line="240" w:lineRule="auto" w:after="0" w:before="0"/>
               <w:jc w:val="left"/>
             </w:pPr>
             <w:r>
@@ -7393,6 +7505,7 @@
           <w:p>
             <w:pPr>
               <w:pStyle w:val="Compact"/>
+              <w:spacing w:line="240" w:lineRule="auto" w:after="0" w:before="0"/>
               <w:jc w:val="right"/>
             </w:pPr>
             <w:r>
@@ -7405,6 +7518,7 @@
           <w:p>
             <w:pPr>
               <w:pStyle w:val="Compact"/>
+              <w:spacing w:line="240" w:lineRule="auto" w:after="0" w:before="0"/>
               <w:jc w:val="right"/>
             </w:pPr>
             <w:r>
@@ -7417,6 +7531,7 @@
           <w:p>
             <w:pPr>
               <w:pStyle w:val="Compact"/>
+              <w:spacing w:line="240" w:lineRule="auto" w:after="0" w:before="0"/>
               <w:jc w:val="right"/>
             </w:pPr>
             <w:r>
@@ -7429,6 +7544,7 @@
           <w:p>
             <w:pPr>
               <w:pStyle w:val="Compact"/>
+              <w:spacing w:line="240" w:lineRule="auto" w:after="0" w:before="0"/>
               <w:jc w:val="right"/>
             </w:pPr>
             <w:r>
@@ -7443,6 +7559,7 @@
           <w:p>
             <w:pPr>
               <w:pStyle w:val="Compact"/>
+              <w:spacing w:line="240" w:lineRule="auto" w:after="0" w:before="0"/>
               <w:jc w:val="left"/>
             </w:pPr>
             <w:r>
@@ -7455,30 +7572,34 @@
           <w:p>
             <w:pPr>
               <w:pStyle w:val="Compact"/>
-            </w:pPr>
-          </w:p>
-        </w:tc>
-        <w:tc>
-          <w:tcPr/>
-          <w:p>
-            <w:pPr>
-              <w:pStyle w:val="Compact"/>
-            </w:pPr>
-          </w:p>
-        </w:tc>
-        <w:tc>
-          <w:tcPr/>
-          <w:p>
-            <w:pPr>
-              <w:pStyle w:val="Compact"/>
-            </w:pPr>
-          </w:p>
-        </w:tc>
-        <w:tc>
-          <w:tcPr/>
-          <w:p>
-            <w:pPr>
-              <w:pStyle w:val="Compact"/>
+              <w:spacing w:line="240" w:lineRule="auto" w:after="0" w:before="0"/>
+            </w:pPr>
+          </w:p>
+        </w:tc>
+        <w:tc>
+          <w:tcPr/>
+          <w:p>
+            <w:pPr>
+              <w:pStyle w:val="Compact"/>
+              <w:spacing w:line="240" w:lineRule="auto" w:after="0" w:before="0"/>
+            </w:pPr>
+          </w:p>
+        </w:tc>
+        <w:tc>
+          <w:tcPr/>
+          <w:p>
+            <w:pPr>
+              <w:pStyle w:val="Compact"/>
+              <w:spacing w:line="240" w:lineRule="auto" w:after="0" w:before="0"/>
+            </w:pPr>
+          </w:p>
+        </w:tc>
+        <w:tc>
+          <w:tcPr/>
+          <w:p>
+            <w:pPr>
+              <w:pStyle w:val="Compact"/>
+              <w:spacing w:line="240" w:lineRule="auto" w:after="0" w:before="0"/>
             </w:pPr>
           </w:p>
         </w:tc>
@@ -7489,6 +7610,7 @@
           <w:p>
             <w:pPr>
               <w:pStyle w:val="Compact"/>
+              <w:spacing w:line="240" w:lineRule="auto" w:after="0" w:before="0"/>
               <w:jc w:val="left"/>
             </w:pPr>
             <w:r>
@@ -7501,6 +7623,7 @@
           <w:p>
             <w:pPr>
               <w:pStyle w:val="Compact"/>
+              <w:spacing w:line="240" w:lineRule="auto" w:after="0" w:before="0"/>
               <w:jc w:val="right"/>
             </w:pPr>
             <w:r>
@@ -7513,6 +7636,7 @@
           <w:p>
             <w:pPr>
               <w:pStyle w:val="Compact"/>
+              <w:spacing w:line="240" w:lineRule="auto" w:after="0" w:before="0"/>
               <w:jc w:val="right"/>
             </w:pPr>
             <w:r>
@@ -7525,6 +7649,7 @@
           <w:p>
             <w:pPr>
               <w:pStyle w:val="Compact"/>
+              <w:spacing w:line="240" w:lineRule="auto" w:after="0" w:before="0"/>
               <w:jc w:val="right"/>
             </w:pPr>
             <w:r>
@@ -7537,6 +7662,7 @@
           <w:p>
             <w:pPr>
               <w:pStyle w:val="Compact"/>
+              <w:spacing w:line="240" w:lineRule="auto" w:after="0" w:before="0"/>
               <w:jc w:val="right"/>
             </w:pPr>
             <w:r>
@@ -7551,6 +7677,7 @@
           <w:p>
             <w:pPr>
               <w:pStyle w:val="Compact"/>
+              <w:spacing w:line="240" w:lineRule="auto" w:after="0" w:before="0"/>
               <w:jc w:val="left"/>
             </w:pPr>
             <w:r>
@@ -7563,6 +7690,7 @@
           <w:p>
             <w:pPr>
               <w:pStyle w:val="Compact"/>
+              <w:spacing w:line="240" w:lineRule="auto" w:after="0" w:before="0"/>
               <w:jc w:val="right"/>
             </w:pPr>
             <w:r>
@@ -7575,6 +7703,7 @@
           <w:p>
             <w:pPr>
               <w:pStyle w:val="Compact"/>
+              <w:spacing w:line="240" w:lineRule="auto" w:after="0" w:before="0"/>
               <w:jc w:val="right"/>
             </w:pPr>
             <w:r>
@@ -7587,6 +7716,7 @@
           <w:p>
             <w:pPr>
               <w:pStyle w:val="Compact"/>
+              <w:spacing w:line="240" w:lineRule="auto" w:after="0" w:before="0"/>
               <w:jc w:val="right"/>
             </w:pPr>
             <w:r>
@@ -7599,6 +7729,7 @@
           <w:p>
             <w:pPr>
               <w:pStyle w:val="Compact"/>
+              <w:spacing w:line="240" w:lineRule="auto" w:after="0" w:before="0"/>
               <w:jc w:val="right"/>
             </w:pPr>
             <w:r>
@@ -7613,6 +7744,7 @@
           <w:p>
             <w:pPr>
               <w:pStyle w:val="Compact"/>
+              <w:spacing w:line="240" w:lineRule="auto" w:after="0" w:before="0"/>
               <w:jc w:val="left"/>
             </w:pPr>
             <w:r>
@@ -7625,6 +7757,7 @@
           <w:p>
             <w:pPr>
               <w:pStyle w:val="Compact"/>
+              <w:spacing w:line="240" w:lineRule="auto" w:after="0" w:before="0"/>
               <w:jc w:val="right"/>
             </w:pPr>
             <w:r>
@@ -7637,6 +7770,7 @@
           <w:p>
             <w:pPr>
               <w:pStyle w:val="Compact"/>
+              <w:spacing w:line="240" w:lineRule="auto" w:after="0" w:before="0"/>
               <w:jc w:val="right"/>
             </w:pPr>
             <w:r>
@@ -7649,6 +7783,7 @@
           <w:p>
             <w:pPr>
               <w:pStyle w:val="Compact"/>
+              <w:spacing w:line="240" w:lineRule="auto" w:after="0" w:before="0"/>
               <w:jc w:val="right"/>
             </w:pPr>
             <w:r>
@@ -7661,6 +7796,7 @@
           <w:p>
             <w:pPr>
               <w:pStyle w:val="Compact"/>
+              <w:spacing w:line="240" w:lineRule="auto" w:after="0" w:before="0"/>
               <w:jc w:val="right"/>
             </w:pPr>
             <w:r>
@@ -7675,6 +7811,7 @@
           <w:p>
             <w:pPr>
               <w:pStyle w:val="Compact"/>
+              <w:spacing w:line="240" w:lineRule="auto" w:after="0" w:before="0"/>
               <w:jc w:val="left"/>
             </w:pPr>
             <w:r>
@@ -7687,6 +7824,7 @@
           <w:p>
             <w:pPr>
               <w:pStyle w:val="Compact"/>
+              <w:spacing w:line="240" w:lineRule="auto" w:after="0" w:before="0"/>
               <w:jc w:val="right"/>
             </w:pPr>
             <w:r>
@@ -7699,6 +7837,7 @@
           <w:p>
             <w:pPr>
               <w:pStyle w:val="Compact"/>
+              <w:spacing w:line="240" w:lineRule="auto" w:after="0" w:before="0"/>
               <w:jc w:val="right"/>
             </w:pPr>
             <w:r>
@@ -7711,6 +7850,7 @@
           <w:p>
             <w:pPr>
               <w:pStyle w:val="Compact"/>
+              <w:spacing w:line="240" w:lineRule="auto" w:after="0" w:before="0"/>
               <w:jc w:val="right"/>
             </w:pPr>
             <w:r>
@@ -7723,6 +7863,7 @@
           <w:p>
             <w:pPr>
               <w:pStyle w:val="Compact"/>
+              <w:spacing w:line="240" w:lineRule="auto" w:after="0" w:before="0"/>
               <w:jc w:val="right"/>
             </w:pPr>
             <w:r>
@@ -7737,6 +7878,7 @@
           <w:p>
             <w:pPr>
               <w:pStyle w:val="Compact"/>
+              <w:spacing w:line="240" w:lineRule="auto" w:after="0" w:before="0"/>
               <w:jc w:val="left"/>
             </w:pPr>
             <w:r>
@@ -7749,6 +7891,7 @@
           <w:p>
             <w:pPr>
               <w:pStyle w:val="Compact"/>
+              <w:spacing w:line="240" w:lineRule="auto" w:after="0" w:before="0"/>
               <w:jc w:val="right"/>
             </w:pPr>
             <w:r>
@@ -7761,6 +7904,7 @@
           <w:p>
             <w:pPr>
               <w:pStyle w:val="Compact"/>
+              <w:spacing w:line="240" w:lineRule="auto" w:after="0" w:before="0"/>
               <w:jc w:val="right"/>
             </w:pPr>
             <w:r>
@@ -7773,6 +7917,7 @@
           <w:p>
             <w:pPr>
               <w:pStyle w:val="Compact"/>
+              <w:spacing w:line="240" w:lineRule="auto" w:after="0" w:before="0"/>
               <w:jc w:val="right"/>
             </w:pPr>
             <w:r>
@@ -7785,6 +7930,7 @@
           <w:p>
             <w:pPr>
               <w:pStyle w:val="Compact"/>
+              <w:spacing w:line="240" w:lineRule="auto" w:after="0" w:before="0"/>
               <w:jc w:val="right"/>
             </w:pPr>
             <w:r>
@@ -7947,24 +8093,7 @@
         <w:t xml:space="preserve"> </w:t>
       </w:r>
       <w:r>
-        <w:t xml:space="preserve">than his wife. Figure</w:t>
-      </w:r>
-      <w:r>
-        <w:t xml:space="preserve"> </w:t>
-      </w:r>
-      <w:hyperlink w:anchor="S-fig:fig-agegap">
-        <w:r>
-          <w:rPr>
-            <w:rStyle w:val="Hyperlink"/>
-          </w:rPr>
-          <w:t xml:space="preserve">[S-fig:fig-agegap]</w:t>
-        </w:r>
-      </w:hyperlink>
-      <w:r>
-        <w:t xml:space="preserve"> </w:t>
-      </w:r>
-      <w:r>
-        <w:t xml:space="preserve">plots the unpaid-work gap by</w:t>
+        <w:t xml:space="preserve">than his wife. Figure S4 plots the unpaid-work gap by</w:t>
       </w:r>
       <w:r>
         <w:t xml:space="preserve"> </w:t>
@@ -8080,24 +8209,7 @@
         <w:pStyle w:val="FirstParagraph"/>
       </w:pPr>
       <w:r>
-        <w:t xml:space="preserve">Table</w:t>
-      </w:r>
-      <w:r>
-        <w:t xml:space="preserve"> </w:t>
-      </w:r>
-      <w:hyperlink w:anchor="S-tab:widow">
-        <w:r>
-          <w:rPr>
-            <w:rStyle w:val="Hyperlink"/>
-          </w:rPr>
-          <w:t xml:space="preserve">[S-tab:widow]</w:t>
-        </w:r>
-      </w:hyperlink>
-      <w:r>
-        <w:t xml:space="preserve"> </w:t>
-      </w:r>
-      <w:r>
-        <w:t xml:space="preserve">applies the same accounting to the end of</w:t>
+        <w:t xml:space="preserve">Table S4 applies the same accounting to the end of</w:t>
       </w:r>
       <w:r>
         <w:t xml:space="preserve"> </w:t>
@@ -8157,24 +8269,7 @@
         <w:pStyle w:val="FirstParagraph"/>
       </w:pPr>
       <w:r>
-        <w:t xml:space="preserve">Table</w:t>
-      </w:r>
-      <w:r>
-        <w:t xml:space="preserve"> </w:t>
-      </w:r>
-      <w:hyperlink w:anchor="S-tab:robust">
-        <w:r>
-          <w:rPr>
-            <w:rStyle w:val="Hyperlink"/>
-          </w:rPr>
-          <w:t xml:space="preserve">[S-tab:robust]</w:t>
-        </w:r>
-      </w:hyperlink>
-      <w:r>
-        <w:t xml:space="preserve"> </w:t>
-      </w:r>
-      <w:r>
-        <w:t xml:space="preserve">re-estimates the unpaid-work coefficient for</w:t>
+        <w:t xml:space="preserve">Table S5 re-estimates the unpaid-work coefficient for</w:t>
       </w:r>
       <w:r>
         <w:t xml:space="preserve"> </w:t>
@@ -8759,7 +8854,7 @@
       </w:r>
     </w:p>
     <w:bookmarkEnd w:id="37"/>
-    <w:bookmarkStart w:id="112" w:name="references"/>
+    <w:bookmarkStart w:id="104" w:name="references"/>
     <w:p>
       <w:pPr>
         <w:pStyle w:val="Heading1"/>
@@ -8975,37 +9070,17 @@
         <w:pStyle w:val="BodyText"/>
       </w:pPr>
       <w:r>
-        <w:t xml:space="preserve">Aguiar, M., &amp; Hurst, E. (2007). Measuring trends in leisure: The</w:t>
-      </w:r>
-      <w:r>
-        <w:t xml:space="preserve"> </w:t>
-      </w:r>
-      <w:r>
-        <w:t xml:space="preserve">allocation of time over five decades.</w:t>
-      </w:r>
-      <w:r>
-        <w:t xml:space="preserve"> </w:t>
-      </w:r>
-      <w:r>
-        <w:rPr>
-          <w:i/>
-          <w:iCs/>
-        </w:rPr>
-        <w:t xml:space="preserve">Quarterly Journal of</w:t>
-      </w:r>
-      <w:r>
-        <w:rPr>
-          <w:i/>
-          <w:iCs/>
-        </w:rPr>
-        <w:t xml:space="preserve"> </w:t>
-      </w:r>
-      <w:r>
-        <w:rPr>
-          <w:i/>
-          <w:iCs/>
-        </w:rPr>
-        <w:t xml:space="preserve">Economics</w:t>
+        <w:t xml:space="preserve">Akerlof, G. A., &amp; Kranton, R. E. (2000). Economics and identity.</w:t>
+      </w:r>
+      <w:r>
+        <w:t xml:space="preserve"> </w:t>
+      </w:r>
+      <w:r>
+        <w:rPr>
+          <w:i/>
+          <w:iCs/>
+        </w:rPr>
+        <w:t xml:space="preserve">Quarterly Journal of Economics</w:t>
       </w:r>
       <w:r>
         <w:t xml:space="preserve">,</w:t>
@@ -9018,60 +9093,15 @@
           <w:i/>
           <w:iCs/>
         </w:rPr>
-        <w:t xml:space="preserve">122</w:t>
-      </w:r>
-      <w:r>
-        <w:t xml:space="preserve">(3), 969–1006.</w:t>
+        <w:t xml:space="preserve">115</w:t>
+      </w:r>
+      <w:r>
+        <w:t xml:space="preserve">(3), 715–753.</w:t>
       </w:r>
       <w:r>
         <w:t xml:space="preserve"> </w:t>
       </w:r>
       <w:hyperlink r:id="rId41">
-        <w:r>
-          <w:rPr>
-            <w:rStyle w:val="Hyperlink"/>
-          </w:rPr>
-          <w:t xml:space="preserve">https://doi.org/10.1162/qjec.122.3.969</w:t>
-        </w:r>
-      </w:hyperlink>
-    </w:p>
-    <w:p>
-      <w:pPr>
-        <w:pStyle w:val="BodyText"/>
-      </w:pPr>
-      <w:r>
-        <w:t xml:space="preserve">Akerlof, G. A., &amp; Kranton, R. E. (2000). Economics and identity.</w:t>
-      </w:r>
-      <w:r>
-        <w:t xml:space="preserve"> </w:t>
-      </w:r>
-      <w:r>
-        <w:rPr>
-          <w:i/>
-          <w:iCs/>
-        </w:rPr>
-        <w:t xml:space="preserve">Quarterly Journal of Economics</w:t>
-      </w:r>
-      <w:r>
-        <w:t xml:space="preserve">,</w:t>
-      </w:r>
-      <w:r>
-        <w:t xml:space="preserve"> </w:t>
-      </w:r>
-      <w:r>
-        <w:rPr>
-          <w:i/>
-          <w:iCs/>
-        </w:rPr>
-        <w:t xml:space="preserve">115</w:t>
-      </w:r>
-      <w:r>
-        <w:t xml:space="preserve">(3), 715–753.</w:t>
-      </w:r>
-      <w:r>
-        <w:t xml:space="preserve"> </w:t>
-      </w:r>
-      <w:hyperlink r:id="rId42">
         <w:r>
           <w:rPr>
             <w:rStyle w:val="Hyperlink"/>
@@ -9145,7 +9175,7 @@
       <w:r>
         <w:t xml:space="preserve"> </w:t>
       </w:r>
-      <w:hyperlink r:id="rId43">
+      <w:hyperlink r:id="rId42">
         <w:r>
           <w:rPr>
             <w:rStyle w:val="Hyperlink"/>
@@ -9214,7 +9244,7 @@
       <w:r>
         <w:t xml:space="preserve"> </w:t>
       </w:r>
-      <w:hyperlink r:id="rId44">
+      <w:hyperlink r:id="rId43">
         <w:r>
           <w:rPr>
             <w:rStyle w:val="Hyperlink"/>
@@ -9277,46 +9307,38 @@
         <w:pStyle w:val="BodyText"/>
       </w:pPr>
       <w:r>
-        <w:t xml:space="preserve">Arber, S., Bote, M., &amp; Meadows, R. (2009). Gender and socio-economic</w:t>
-      </w:r>
-      <w:r>
-        <w:t xml:space="preserve"> </w:t>
-      </w:r>
-      <w:r>
-        <w:t xml:space="preserve">patterning of self-reported sleep problems in</w:t>
-      </w:r>
-      <w:r>
-        <w:t xml:space="preserve"> </w:t>
-      </w:r>
-      <w:r>
-        <w:t xml:space="preserve">Britain</w:t>
-      </w:r>
-      <w:r>
-        <w:t xml:space="preserve">.</w:t>
-      </w:r>
-      <w:r>
-        <w:t xml:space="preserve"> </w:t>
-      </w:r>
-      <w:r>
-        <w:rPr>
-          <w:i/>
-          <w:iCs/>
-        </w:rPr>
-        <w:t xml:space="preserve">Social</w:t>
-      </w:r>
-      <w:r>
-        <w:rPr>
-          <w:i/>
-          <w:iCs/>
-        </w:rPr>
-        <w:t xml:space="preserve"> </w:t>
-      </w:r>
-      <w:r>
-        <w:rPr>
-          <w:i/>
-          <w:iCs/>
-        </w:rPr>
-        <w:t xml:space="preserve">Science &amp; Medicine</w:t>
+        <w:t xml:space="preserve">Basner, M., Fomberstein, K. M., Razavi, F. M., Banks, S., William, J.</w:t>
+      </w:r>
+      <w:r>
+        <w:t xml:space="preserve"> </w:t>
+      </w:r>
+      <w:r>
+        <w:t xml:space="preserve">H., Rosa, R. R., &amp; Dinges, D. F. (2007).</w:t>
+      </w:r>
+      <w:r>
+        <w:t xml:space="preserve"> </w:t>
+      </w:r>
+      <w:r>
+        <w:t xml:space="preserve">American Time Use Survey</w:t>
+      </w:r>
+      <w:r>
+        <w:t xml:space="preserve">:</w:t>
+      </w:r>
+      <w:r>
+        <w:t xml:space="preserve"> </w:t>
+      </w:r>
+      <w:r>
+        <w:t xml:space="preserve">Sleep time and its relationship to waking activities.</w:t>
+      </w:r>
+      <w:r>
+        <w:t xml:space="preserve"> </w:t>
+      </w:r>
+      <w:r>
+        <w:rPr>
+          <w:i/>
+          <w:iCs/>
+        </w:rPr>
+        <w:t xml:space="preserve">Sleep</w:t>
       </w:r>
       <w:r>
         <w:t xml:space="preserve">,</w:t>
@@ -9329,72 +9351,6 @@
           <w:i/>
           <w:iCs/>
         </w:rPr>
-        <w:t xml:space="preserve">68</w:t>
-      </w:r>
-      <w:r>
-        <w:t xml:space="preserve">(2), 281–289.</w:t>
-      </w:r>
-      <w:r>
-        <w:t xml:space="preserve"> </w:t>
-      </w:r>
-      <w:hyperlink r:id="rId45">
-        <w:r>
-          <w:rPr>
-            <w:rStyle w:val="Hyperlink"/>
-          </w:rPr>
-          <w:t xml:space="preserve">https://doi.org/10.1016/j.socscimed.2008.10.016</w:t>
-        </w:r>
-      </w:hyperlink>
-    </w:p>
-    <w:p>
-      <w:pPr>
-        <w:pStyle w:val="BodyText"/>
-      </w:pPr>
-      <w:r>
-        <w:t xml:space="preserve">Basner, M., Fomberstein, K. M., Razavi, F. M., Banks, S., William, J.</w:t>
-      </w:r>
-      <w:r>
-        <w:t xml:space="preserve"> </w:t>
-      </w:r>
-      <w:r>
-        <w:t xml:space="preserve">H., Rosa, R. R., &amp; Dinges, D. F. (2007).</w:t>
-      </w:r>
-      <w:r>
-        <w:t xml:space="preserve"> </w:t>
-      </w:r>
-      <w:r>
-        <w:t xml:space="preserve">American Time Use Survey</w:t>
-      </w:r>
-      <w:r>
-        <w:t xml:space="preserve">:</w:t>
-      </w:r>
-      <w:r>
-        <w:t xml:space="preserve"> </w:t>
-      </w:r>
-      <w:r>
-        <w:t xml:space="preserve">Sleep time and its relationship to waking activities.</w:t>
-      </w:r>
-      <w:r>
-        <w:t xml:space="preserve"> </w:t>
-      </w:r>
-      <w:r>
-        <w:rPr>
-          <w:i/>
-          <w:iCs/>
-        </w:rPr>
-        <w:t xml:space="preserve">Sleep</w:t>
-      </w:r>
-      <w:r>
-        <w:t xml:space="preserve">,</w:t>
-      </w:r>
-      <w:r>
-        <w:t xml:space="preserve"> </w:t>
-      </w:r>
-      <w:r>
-        <w:rPr>
-          <w:i/>
-          <w:iCs/>
-        </w:rPr>
         <w:t xml:space="preserve">30</w:t>
       </w:r>
       <w:r>
@@ -9403,7 +9359,7 @@
       <w:r>
         <w:t xml:space="preserve"> </w:t>
       </w:r>
-      <w:hyperlink r:id="rId46">
+      <w:hyperlink r:id="rId44">
         <w:r>
           <w:rPr>
             <w:rStyle w:val="Hyperlink"/>
@@ -9454,7 +9410,7 @@
       <w:r>
         <w:t xml:space="preserve"> </w:t>
       </w:r>
-      <w:hyperlink r:id="rId47">
+      <w:hyperlink r:id="rId45">
         <w:r>
           <w:rPr>
             <w:rStyle w:val="Hyperlink"/>
@@ -9513,7 +9469,7 @@
       <w:r>
         <w:t xml:space="preserve"> </w:t>
       </w:r>
-      <w:hyperlink r:id="rId48">
+      <w:hyperlink r:id="rId46">
         <w:r>
           <w:rPr>
             <w:rStyle w:val="Hyperlink"/>
@@ -9564,7 +9520,7 @@
       <w:r>
         <w:t xml:space="preserve"> </w:t>
       </w:r>
-      <w:hyperlink r:id="rId49">
+      <w:hyperlink r:id="rId47">
         <w:r>
           <w:rPr>
             <w:rStyle w:val="Hyperlink"/>
@@ -9605,7 +9561,7 @@
       <w:r>
         <w:t xml:space="preserve"> </w:t>
       </w:r>
-      <w:hyperlink r:id="rId50">
+      <w:hyperlink r:id="rId48">
         <w:r>
           <w:rPr>
             <w:rStyle w:val="Hyperlink"/>
@@ -9670,7 +9626,7 @@
       <w:r>
         <w:t xml:space="preserve"> </w:t>
       </w:r>
-      <w:hyperlink r:id="rId51">
+      <w:hyperlink r:id="rId49">
         <w:r>
           <w:rPr>
             <w:rStyle w:val="Hyperlink"/>
@@ -9684,29 +9640,23 @@
         <w:pStyle w:val="BodyText"/>
       </w:pPr>
       <w:r>
-        <w:t xml:space="preserve">Bianchi, S. M., Milkie, M. A., Sayer, L. C., &amp; Robinson, J. P. (2000).</w:t>
-      </w:r>
-      <w:r>
-        <w:t xml:space="preserve"> </w:t>
-      </w:r>
-      <w:r>
-        <w:t xml:space="preserve">Is anyone doing the housework? Trends in the gender division of</w:t>
-      </w:r>
-      <w:r>
-        <w:t xml:space="preserve"> </w:t>
-      </w:r>
-      <w:r>
-        <w:t xml:space="preserve">household labor.</w:t>
-      </w:r>
-      <w:r>
-        <w:t xml:space="preserve"> </w:t>
-      </w:r>
-      <w:r>
-        <w:rPr>
-          <w:i/>
-          <w:iCs/>
-        </w:rPr>
-        <w:t xml:space="preserve">Social Forces</w:t>
+        <w:t xml:space="preserve">Biddle, J. E., &amp; Hamermesh, D. S. (1990). Sleep and the allocation of</w:t>
+      </w:r>
+      <w:r>
+        <w:t xml:space="preserve"> </w:t>
+      </w:r>
+      <w:r>
+        <w:t xml:space="preserve">time.</w:t>
+      </w:r>
+      <w:r>
+        <w:t xml:space="preserve"> </w:t>
+      </w:r>
+      <w:r>
+        <w:rPr>
+          <w:i/>
+          <w:iCs/>
+        </w:rPr>
+        <w:t xml:space="preserve">Journal of Political Economy</w:t>
       </w:r>
       <w:r>
         <w:t xml:space="preserve">,</w:t>
@@ -9719,57 +9669,6 @@
           <w:i/>
           <w:iCs/>
         </w:rPr>
-        <w:t xml:space="preserve">79</w:t>
-      </w:r>
-      <w:r>
-        <w:t xml:space="preserve">(1), 191–228.</w:t>
-      </w:r>
-      <w:r>
-        <w:t xml:space="preserve"> </w:t>
-      </w:r>
-      <w:hyperlink r:id="rId52">
-        <w:r>
-          <w:rPr>
-            <w:rStyle w:val="Hyperlink"/>
-          </w:rPr>
-          <w:t xml:space="preserve">https://doi.org/10.2307/2675569</w:t>
-        </w:r>
-      </w:hyperlink>
-    </w:p>
-    <w:p>
-      <w:pPr>
-        <w:pStyle w:val="BodyText"/>
-      </w:pPr>
-      <w:r>
-        <w:t xml:space="preserve">Biddle, J. E., &amp; Hamermesh, D. S. (1990). Sleep and the allocation of</w:t>
-      </w:r>
-      <w:r>
-        <w:t xml:space="preserve"> </w:t>
-      </w:r>
-      <w:r>
-        <w:t xml:space="preserve">time.</w:t>
-      </w:r>
-      <w:r>
-        <w:t xml:space="preserve"> </w:t>
-      </w:r>
-      <w:r>
-        <w:rPr>
-          <w:i/>
-          <w:iCs/>
-        </w:rPr>
-        <w:t xml:space="preserve">Journal of Political Economy</w:t>
-      </w:r>
-      <w:r>
-        <w:t xml:space="preserve">,</w:t>
-      </w:r>
-      <w:r>
-        <w:t xml:space="preserve"> </w:t>
-      </w:r>
-      <w:r>
-        <w:rPr>
-          <w:i/>
-          <w:iCs/>
-        </w:rPr>
         <w:t xml:space="preserve">98</w:t>
       </w:r>
       <w:r>
@@ -9778,7 +9677,7 @@
       <w:r>
         <w:t xml:space="preserve"> </w:t>
       </w:r>
-      <w:hyperlink r:id="rId53">
+      <w:hyperlink r:id="rId50">
         <w:r>
           <w:rPr>
             <w:rStyle w:val="Hyperlink"/>
@@ -9829,7 +9728,7 @@
       <w:r>
         <w:t xml:space="preserve"> </w:t>
       </w:r>
-      <w:hyperlink r:id="rId54">
+      <w:hyperlink r:id="rId51">
         <w:r>
           <w:rPr>
             <w:rStyle w:val="Hyperlink"/>
@@ -9843,23 +9742,58 @@
         <w:pStyle w:val="BodyText"/>
       </w:pPr>
       <w:r>
-        <w:t xml:space="preserve">Bittman, M., &amp; Wajcman, J. (2000). The rush hour: The character of</w:t>
-      </w:r>
-      <w:r>
-        <w:t xml:space="preserve"> </w:t>
-      </w:r>
-      <w:r>
-        <w:t xml:space="preserve">leisure time and gender equity.</w:t>
-      </w:r>
-      <w:r>
-        <w:t xml:space="preserve"> </w:t>
-      </w:r>
-      <w:r>
-        <w:rPr>
-          <w:i/>
-          <w:iCs/>
-        </w:rPr>
-        <w:t xml:space="preserve">Social Forces</w:t>
+        <w:t xml:space="preserve">Blood, R. O., &amp; Wolfe, D. M. (1960).</w:t>
+      </w:r>
+      <w:r>
+        <w:t xml:space="preserve"> </w:t>
+      </w:r>
+      <w:r>
+        <w:rPr>
+          <w:i/>
+          <w:iCs/>
+        </w:rPr>
+        <w:t xml:space="preserve">Husbands and wives: The</w:t>
+      </w:r>
+      <w:r>
+        <w:rPr>
+          <w:i/>
+          <w:iCs/>
+        </w:rPr>
+        <w:t xml:space="preserve"> </w:t>
+      </w:r>
+      <w:r>
+        <w:rPr>
+          <w:i/>
+          <w:iCs/>
+        </w:rPr>
+        <w:t xml:space="preserve">dynamics of married living</w:t>
+      </w:r>
+      <w:r>
+        <w:t xml:space="preserve">. Free Press.</w:t>
+      </w:r>
+    </w:p>
+    <w:p>
+      <w:pPr>
+        <w:pStyle w:val="BodyText"/>
+      </w:pPr>
+      <w:r>
+        <w:t xml:space="preserve">Brines, J. (1994). Economic dependency, gender, and the division of</w:t>
+      </w:r>
+      <w:r>
+        <w:t xml:space="preserve"> </w:t>
+      </w:r>
+      <w:r>
+        <w:t xml:space="preserve">labor at home.</w:t>
+      </w:r>
+      <w:r>
+        <w:t xml:space="preserve"> </w:t>
+      </w:r>
+      <w:r>
+        <w:rPr>
+          <w:i/>
+          <w:iCs/>
+        </w:rPr>
+        <w:t xml:space="preserve">American Journal of Sociology</w:t>
       </w:r>
       <w:r>
         <w:t xml:space="preserve">,</w:t>
@@ -9872,98 +9806,6 @@
           <w:i/>
           <w:iCs/>
         </w:rPr>
-        <w:t xml:space="preserve">79</w:t>
-      </w:r>
-      <w:r>
-        <w:t xml:space="preserve">(1),</w:t>
-      </w:r>
-      <w:r>
-        <w:t xml:space="preserve"> </w:t>
-      </w:r>
-      <w:r>
-        <w:t xml:space="preserve">165–189.</w:t>
-      </w:r>
-      <w:r>
-        <w:t xml:space="preserve"> </w:t>
-      </w:r>
-      <w:hyperlink r:id="rId55">
-        <w:r>
-          <w:rPr>
-            <w:rStyle w:val="Hyperlink"/>
-          </w:rPr>
-          <w:t xml:space="preserve">https://doi.org/10.2307/2675568</w:t>
-        </w:r>
-      </w:hyperlink>
-    </w:p>
-    <w:p>
-      <w:pPr>
-        <w:pStyle w:val="BodyText"/>
-      </w:pPr>
-      <w:r>
-        <w:t xml:space="preserve">Blood, R. O., &amp; Wolfe, D. M. (1960).</w:t>
-      </w:r>
-      <w:r>
-        <w:t xml:space="preserve"> </w:t>
-      </w:r>
-      <w:r>
-        <w:rPr>
-          <w:i/>
-          <w:iCs/>
-        </w:rPr>
-        <w:t xml:space="preserve">Husbands and wives: The</w:t>
-      </w:r>
-      <w:r>
-        <w:rPr>
-          <w:i/>
-          <w:iCs/>
-        </w:rPr>
-        <w:t xml:space="preserve"> </w:t>
-      </w:r>
-      <w:r>
-        <w:rPr>
-          <w:i/>
-          <w:iCs/>
-        </w:rPr>
-        <w:t xml:space="preserve">dynamics of married living</w:t>
-      </w:r>
-      <w:r>
-        <w:t xml:space="preserve">. Free Press.</w:t>
-      </w:r>
-    </w:p>
-    <w:p>
-      <w:pPr>
-        <w:pStyle w:val="BodyText"/>
-      </w:pPr>
-      <w:r>
-        <w:t xml:space="preserve">Brines, J. (1994). Economic dependency, gender, and the division of</w:t>
-      </w:r>
-      <w:r>
-        <w:t xml:space="preserve"> </w:t>
-      </w:r>
-      <w:r>
-        <w:t xml:space="preserve">labor at home.</w:t>
-      </w:r>
-      <w:r>
-        <w:t xml:space="preserve"> </w:t>
-      </w:r>
-      <w:r>
-        <w:rPr>
-          <w:i/>
-          <w:iCs/>
-        </w:rPr>
-        <w:t xml:space="preserve">American Journal of Sociology</w:t>
-      </w:r>
-      <w:r>
-        <w:t xml:space="preserve">,</w:t>
-      </w:r>
-      <w:r>
-        <w:t xml:space="preserve"> </w:t>
-      </w:r>
-      <w:r>
-        <w:rPr>
-          <w:i/>
-          <w:iCs/>
-        </w:rPr>
         <w:t xml:space="preserve">100</w:t>
       </w:r>
       <w:r>
@@ -9978,7 +9820,7 @@
       <w:r>
         <w:t xml:space="preserve"> </w:t>
       </w:r>
-      <w:hyperlink r:id="rId56">
+      <w:hyperlink r:id="rId52">
         <w:r>
           <w:rPr>
             <w:rStyle w:val="Hyperlink"/>
@@ -10029,7 +9871,7 @@
       <w:r>
         <w:t xml:space="preserve"> </w:t>
       </w:r>
-      <w:hyperlink r:id="rId57">
+      <w:hyperlink r:id="rId53">
         <w:r>
           <w:rPr>
             <w:rStyle w:val="Hyperlink"/>
@@ -10098,7 +9940,7 @@
       <w:r>
         <w:t xml:space="preserve"> </w:t>
       </w:r>
-      <w:hyperlink r:id="rId58">
+      <w:hyperlink r:id="rId54">
         <w:r>
           <w:rPr>
             <w:rStyle w:val="Hyperlink"/>
@@ -10163,7 +10005,7 @@
       <w:r>
         <w:t xml:space="preserve"> </w:t>
       </w:r>
-      <w:hyperlink r:id="rId59">
+      <w:hyperlink r:id="rId55">
         <w:r>
           <w:rPr>
             <w:rStyle w:val="Hyperlink"/>
@@ -10208,7 +10050,7 @@
       <w:r>
         <w:t xml:space="preserve"> </w:t>
       </w:r>
-      <w:hyperlink r:id="rId60">
+      <w:hyperlink r:id="rId56">
         <w:r>
           <w:rPr>
             <w:rStyle w:val="Hyperlink"/>
@@ -10273,7 +10115,7 @@
       <w:r>
         <w:t xml:space="preserve"> </w:t>
       </w:r>
-      <w:hyperlink r:id="rId61">
+      <w:hyperlink r:id="rId57">
         <w:r>
           <w:rPr>
             <w:rStyle w:val="Hyperlink"/>
@@ -10359,7 +10201,7 @@
       <w:r>
         <w:t xml:space="preserve"> </w:t>
       </w:r>
-      <w:hyperlink r:id="rId62">
+      <w:hyperlink r:id="rId58">
         <w:r>
           <w:rPr>
             <w:rStyle w:val="Hyperlink"/>
@@ -10410,7 +10252,7 @@
       <w:r>
         <w:t xml:space="preserve"> </w:t>
       </w:r>
-      <w:hyperlink r:id="rId63">
+      <w:hyperlink r:id="rId59">
         <w:r>
           <w:rPr>
             <w:rStyle w:val="Hyperlink"/>
@@ -10461,7 +10303,7 @@
       <w:r>
         <w:t xml:space="preserve"> </w:t>
       </w:r>
-      <w:hyperlink r:id="rId64">
+      <w:hyperlink r:id="rId60">
         <w:r>
           <w:rPr>
             <w:rStyle w:val="Hyperlink"/>
@@ -10515,7 +10357,7 @@
       <w:r>
         <w:t xml:space="preserve"> </w:t>
       </w:r>
-      <w:hyperlink r:id="rId65">
+      <w:hyperlink r:id="rId61">
         <w:r>
           <w:rPr>
             <w:rStyle w:val="Hyperlink"/>
@@ -10575,7 +10417,7 @@
       <w:r>
         <w:t xml:space="preserve"> </w:t>
       </w:r>
-      <w:hyperlink r:id="rId66">
+      <w:hyperlink r:id="rId62">
         <w:r>
           <w:rPr>
             <w:rStyle w:val="Hyperlink"/>
@@ -10632,7 +10474,7 @@
       <w:r>
         <w:t xml:space="preserve"> </w:t>
       </w:r>
-      <w:hyperlink r:id="rId67">
+      <w:hyperlink r:id="rId63">
         <w:r>
           <w:rPr>
             <w:rStyle w:val="Hyperlink"/>
@@ -10706,7 +10548,7 @@
       <w:r>
         <w:t xml:space="preserve"> </w:t>
       </w:r>
-      <w:hyperlink r:id="rId68">
+      <w:hyperlink r:id="rId64">
         <w:r>
           <w:rPr>
             <w:rStyle w:val="Hyperlink"/>
@@ -10780,7 +10622,7 @@
       <w:r>
         <w:t xml:space="preserve"> </w:t>
       </w:r>
-      <w:hyperlink r:id="rId69">
+      <w:hyperlink r:id="rId65">
         <w:r>
           <w:rPr>
             <w:rStyle w:val="Hyperlink"/>
@@ -10854,7 +10696,7 @@
       <w:r>
         <w:t xml:space="preserve"> </w:t>
       </w:r>
-      <w:hyperlink r:id="rId70">
+      <w:hyperlink r:id="rId66">
         <w:r>
           <w:rPr>
             <w:rStyle w:val="Hyperlink"/>
@@ -10911,7 +10753,7 @@
       <w:r>
         <w:t xml:space="preserve"> </w:t>
       </w:r>
-      <w:hyperlink r:id="rId71">
+      <w:hyperlink r:id="rId67">
         <w:r>
           <w:rPr>
             <w:rStyle w:val="Hyperlink"/>
@@ -11007,7 +10849,7 @@
       <w:r>
         <w:t xml:space="preserve"> </w:t>
       </w:r>
-      <w:hyperlink r:id="rId72">
+      <w:hyperlink r:id="rId68">
         <w:r>
           <w:rPr>
             <w:rStyle w:val="Hyperlink"/>
@@ -11056,23 +10898,23 @@
         <w:pStyle w:val="BodyText"/>
       </w:pPr>
       <w:r>
-        <w:t xml:space="preserve">Gimenez-Nadal, J. I., &amp; Sevilla, A. (2012). Trends in time allocation:</w:t>
-      </w:r>
-      <w:r>
-        <w:t xml:space="preserve"> </w:t>
-      </w:r>
-      <w:r>
-        <w:t xml:space="preserve">A cross-country analysis.</w:t>
-      </w:r>
-      <w:r>
-        <w:t xml:space="preserve"> </w:t>
-      </w:r>
-      <w:r>
-        <w:rPr>
-          <w:i/>
-          <w:iCs/>
-        </w:rPr>
-        <w:t xml:space="preserve">European Economic Review</w:t>
+        <w:t xml:space="preserve">Goldman, N. (1993). Marriage selection and mortality patterns:</w:t>
+      </w:r>
+      <w:r>
+        <w:t xml:space="preserve"> </w:t>
+      </w:r>
+      <w:r>
+        <w:t xml:space="preserve">Inferences and fallacies.</w:t>
+      </w:r>
+      <w:r>
+        <w:t xml:space="preserve"> </w:t>
+      </w:r>
+      <w:r>
+        <w:rPr>
+          <w:i/>
+          <w:iCs/>
+        </w:rPr>
+        <w:t xml:space="preserve">Demography</w:t>
       </w:r>
       <w:r>
         <w:t xml:space="preserve">,</w:t>
@@ -11085,63 +10927,6 @@
           <w:i/>
           <w:iCs/>
         </w:rPr>
-        <w:t xml:space="preserve">56</w:t>
-      </w:r>
-      <w:r>
-        <w:t xml:space="preserve">(6),</w:t>
-      </w:r>
-      <w:r>
-        <w:t xml:space="preserve"> </w:t>
-      </w:r>
-      <w:r>
-        <w:t xml:space="preserve">1338–1359.</w:t>
-      </w:r>
-      <w:r>
-        <w:t xml:space="preserve"> </w:t>
-      </w:r>
-      <w:hyperlink r:id="rId73">
-        <w:r>
-          <w:rPr>
-            <w:rStyle w:val="Hyperlink"/>
-          </w:rPr>
-          <w:t xml:space="preserve">https://doi.org/10.1016/j.euroecorev.2012.02.011</w:t>
-        </w:r>
-      </w:hyperlink>
-    </w:p>
-    <w:p>
-      <w:pPr>
-        <w:pStyle w:val="BodyText"/>
-      </w:pPr>
-      <w:r>
-        <w:t xml:space="preserve">Goldman, N. (1993). Marriage selection and mortality patterns:</w:t>
-      </w:r>
-      <w:r>
-        <w:t xml:space="preserve"> </w:t>
-      </w:r>
-      <w:r>
-        <w:t xml:space="preserve">Inferences and fallacies.</w:t>
-      </w:r>
-      <w:r>
-        <w:t xml:space="preserve"> </w:t>
-      </w:r>
-      <w:r>
-        <w:rPr>
-          <w:i/>
-          <w:iCs/>
-        </w:rPr>
-        <w:t xml:space="preserve">Demography</w:t>
-      </w:r>
-      <w:r>
-        <w:t xml:space="preserve">,</w:t>
-      </w:r>
-      <w:r>
-        <w:t xml:space="preserve"> </w:t>
-      </w:r>
-      <w:r>
-        <w:rPr>
-          <w:i/>
-          <w:iCs/>
-        </w:rPr>
         <w:t xml:space="preserve">30</w:t>
       </w:r>
       <w:r>
@@ -11150,7 +10935,7 @@
       <w:r>
         <w:t xml:space="preserve"> </w:t>
       </w:r>
-      <w:hyperlink r:id="rId74">
+      <w:hyperlink r:id="rId69">
         <w:r>
           <w:rPr>
             <w:rStyle w:val="Hyperlink"/>
@@ -11215,7 +11000,7 @@
       <w:r>
         <w:t xml:space="preserve"> </w:t>
       </w:r>
-      <w:hyperlink r:id="rId75">
+      <w:hyperlink r:id="rId70">
         <w:r>
           <w:rPr>
             <w:rStyle w:val="Hyperlink"/>
@@ -11266,7 +11051,7 @@
       <w:r>
         <w:t xml:space="preserve"> </w:t>
       </w:r>
-      <w:hyperlink r:id="rId76">
+      <w:hyperlink r:id="rId71">
         <w:r>
           <w:rPr>
             <w:rStyle w:val="Hyperlink"/>
@@ -11317,7 +11102,7 @@
       <w:r>
         <w:t xml:space="preserve"> </w:t>
       </w:r>
-      <w:hyperlink r:id="rId77">
+      <w:hyperlink r:id="rId72">
         <w:r>
           <w:rPr>
             <w:rStyle w:val="Hyperlink"/>
@@ -11382,7 +11167,7 @@
       <w:r>
         <w:t xml:space="preserve"> </w:t>
       </w:r>
-      <w:hyperlink r:id="rId78">
+      <w:hyperlink r:id="rId73">
         <w:r>
           <w:rPr>
             <w:rStyle w:val="Hyperlink"/>
@@ -11442,7 +11227,7 @@
       <w:r>
         <w:t xml:space="preserve"> </w:t>
       </w:r>
-      <w:hyperlink r:id="rId79">
+      <w:hyperlink r:id="rId74">
         <w:r>
           <w:rPr>
             <w:rStyle w:val="Hyperlink"/>
@@ -11493,7 +11278,7 @@
       <w:r>
         <w:t xml:space="preserve"> </w:t>
       </w:r>
-      <w:hyperlink r:id="rId80">
+      <w:hyperlink r:id="rId75">
         <w:r>
           <w:rPr>
             <w:rStyle w:val="Hyperlink"/>
@@ -11558,7 +11343,7 @@
       <w:r>
         <w:t xml:space="preserve"> </w:t>
       </w:r>
-      <w:hyperlink r:id="rId81">
+      <w:hyperlink r:id="rId76">
         <w:r>
           <w:rPr>
             <w:rStyle w:val="Hyperlink"/>
@@ -11623,7 +11408,7 @@
       <w:r>
         <w:t xml:space="preserve"> </w:t>
       </w:r>
-      <w:hyperlink r:id="rId82">
+      <w:hyperlink r:id="rId77">
         <w:r>
           <w:rPr>
             <w:rStyle w:val="Hyperlink"/>
@@ -11683,7 +11468,7 @@
       <w:r>
         <w:t xml:space="preserve"> </w:t>
       </w:r>
-      <w:hyperlink r:id="rId83">
+      <w:hyperlink r:id="rId78">
         <w:r>
           <w:rPr>
             <w:rStyle w:val="Hyperlink"/>
@@ -11740,7 +11525,7 @@
       <w:r>
         <w:t xml:space="preserve"> </w:t>
       </w:r>
-      <w:hyperlink r:id="rId84">
+      <w:hyperlink r:id="rId79">
         <w:r>
           <w:rPr>
             <w:rStyle w:val="Hyperlink"/>
@@ -11754,7 +11539,13 @@
         <w:pStyle w:val="BodyText"/>
       </w:pPr>
       <w:r>
-        <w:t xml:space="preserve">Jejeebhoy, S. J., &amp; Sathar, Z. A. (2001). Women’s autonomy in</w:t>
+        <w:t xml:space="preserve">Jensen, R. (2012). Do labor market opportunities affect young women’s</w:t>
+      </w:r>
+      <w:r>
+        <w:t xml:space="preserve"> </w:t>
+      </w:r>
+      <w:r>
+        <w:t xml:space="preserve">work and family decisions? Experimental evidence from</w:t>
       </w:r>
       <w:r>
         <w:t xml:space="preserve"> </w:t>
@@ -11763,43 +11554,17 @@
         <w:t xml:space="preserve">India</w:t>
       </w:r>
       <w:r>
-        <w:t xml:space="preserve"> </w:t>
-      </w:r>
-      <w:r>
-        <w:t xml:space="preserve">and</w:t>
-      </w:r>
-      <w:r>
-        <w:t xml:space="preserve"> </w:t>
-      </w:r>
-      <w:r>
-        <w:t xml:space="preserve">Pakistan</w:t>
-      </w:r>
-      <w:r>
-        <w:t xml:space="preserve">: The influence of religion and region.</w:t>
-      </w:r>
-      <w:r>
-        <w:t xml:space="preserve"> </w:t>
-      </w:r>
-      <w:r>
-        <w:rPr>
-          <w:i/>
-          <w:iCs/>
-        </w:rPr>
-        <w:t xml:space="preserve">Population</w:t>
-      </w:r>
-      <w:r>
-        <w:rPr>
-          <w:i/>
-          <w:iCs/>
-        </w:rPr>
-        <w:t xml:space="preserve"> </w:t>
-      </w:r>
-      <w:r>
-        <w:rPr>
-          <w:i/>
-          <w:iCs/>
-        </w:rPr>
-        <w:t xml:space="preserve">and Development Review</w:t>
+        <w:t xml:space="preserve">.</w:t>
+      </w:r>
+      <w:r>
+        <w:t xml:space="preserve"> </w:t>
+      </w:r>
+      <w:r>
+        <w:rPr>
+          <w:i/>
+          <w:iCs/>
+        </w:rPr>
+        <w:t xml:space="preserve">Quarterly Journal of Economics</w:t>
       </w:r>
       <w:r>
         <w:t xml:space="preserve">,</w:t>
@@ -11812,66 +11577,6 @@
           <w:i/>
           <w:iCs/>
         </w:rPr>
-        <w:t xml:space="preserve">27</w:t>
-      </w:r>
-      <w:r>
-        <w:t xml:space="preserve">(4), 687–712.</w:t>
-      </w:r>
-      <w:r>
-        <w:t xml:space="preserve"> </w:t>
-      </w:r>
-      <w:hyperlink r:id="rId85">
-        <w:r>
-          <w:rPr>
-            <w:rStyle w:val="Hyperlink"/>
-          </w:rPr>
-          <w:t xml:space="preserve">https://doi.org/10.1111/j.1728-4457.2001.00687.x</w:t>
-        </w:r>
-      </w:hyperlink>
-    </w:p>
-    <w:p>
-      <w:pPr>
-        <w:pStyle w:val="BodyText"/>
-      </w:pPr>
-      <w:r>
-        <w:t xml:space="preserve">Jensen, R. (2012). Do labor market opportunities affect young women’s</w:t>
-      </w:r>
-      <w:r>
-        <w:t xml:space="preserve"> </w:t>
-      </w:r>
-      <w:r>
-        <w:t xml:space="preserve">work and family decisions? Experimental evidence from</w:t>
-      </w:r>
-      <w:r>
-        <w:t xml:space="preserve"> </w:t>
-      </w:r>
-      <w:r>
-        <w:t xml:space="preserve">India</w:t>
-      </w:r>
-      <w:r>
-        <w:t xml:space="preserve">.</w:t>
-      </w:r>
-      <w:r>
-        <w:t xml:space="preserve"> </w:t>
-      </w:r>
-      <w:r>
-        <w:rPr>
-          <w:i/>
-          <w:iCs/>
-        </w:rPr>
-        <w:t xml:space="preserve">Quarterly Journal of Economics</w:t>
-      </w:r>
-      <w:r>
-        <w:t xml:space="preserve">,</w:t>
-      </w:r>
-      <w:r>
-        <w:t xml:space="preserve"> </w:t>
-      </w:r>
-      <w:r>
-        <w:rPr>
-          <w:i/>
-          <w:iCs/>
-        </w:rPr>
         <w:t xml:space="preserve">127</w:t>
       </w:r>
       <w:r>
@@ -11880,7 +11585,7 @@
       <w:r>
         <w:t xml:space="preserve"> </w:t>
       </w:r>
-      <w:hyperlink r:id="rId86">
+      <w:hyperlink r:id="rId80">
         <w:r>
           <w:rPr>
             <w:rStyle w:val="Hyperlink"/>
@@ -11934,29 +11639,31 @@
         <w:pStyle w:val="BodyText"/>
       </w:pPr>
       <w:r>
-        <w:t xml:space="preserve">Kan, M. Y., Sullivan, O., &amp; Gershuny, J. (2011). Gender convergence in</w:t>
-      </w:r>
-      <w:r>
-        <w:t xml:space="preserve"> </w:t>
-      </w:r>
-      <w:r>
-        <w:t xml:space="preserve">domestic work: Discerning the effects of interactional and institutional</w:t>
-      </w:r>
-      <w:r>
-        <w:t xml:space="preserve"> </w:t>
-      </w:r>
-      <w:r>
-        <w:t xml:space="preserve">barriers from large-scale data.</w:t>
-      </w:r>
-      <w:r>
-        <w:t xml:space="preserve"> </w:t>
-      </w:r>
-      <w:r>
-        <w:rPr>
-          <w:i/>
-          <w:iCs/>
-        </w:rPr>
-        <w:t xml:space="preserve">Sociology</w:t>
+        <w:t xml:space="preserve">Kandiyoti, D. (1988). Bargaining with patriarchy.</w:t>
+      </w:r>
+      <w:r>
+        <w:t xml:space="preserve"> </w:t>
+      </w:r>
+      <w:r>
+        <w:rPr>
+          <w:i/>
+          <w:iCs/>
+        </w:rPr>
+        <w:t xml:space="preserve">Gender &amp;</w:t>
+      </w:r>
+      <w:r>
+        <w:rPr>
+          <w:i/>
+          <w:iCs/>
+        </w:rPr>
+        <w:t xml:space="preserve"> </w:t>
+      </w:r>
+      <w:r>
+        <w:rPr>
+          <w:i/>
+          <w:iCs/>
+        </w:rPr>
+        <w:t xml:space="preserve">Society</w:t>
       </w:r>
       <w:r>
         <w:t xml:space="preserve">,</w:t>
@@ -11969,71 +11676,6 @@
           <w:i/>
           <w:iCs/>
         </w:rPr>
-        <w:t xml:space="preserve">45</w:t>
-      </w:r>
-      <w:r>
-        <w:t xml:space="preserve">(2),</w:t>
-      </w:r>
-      <w:r>
-        <w:t xml:space="preserve"> </w:t>
-      </w:r>
-      <w:r>
-        <w:t xml:space="preserve">234–251.</w:t>
-      </w:r>
-      <w:r>
-        <w:t xml:space="preserve"> </w:t>
-      </w:r>
-      <w:hyperlink r:id="rId87">
-        <w:r>
-          <w:rPr>
-            <w:rStyle w:val="Hyperlink"/>
-          </w:rPr>
-          <w:t xml:space="preserve">https://doi.org/10.1177/0038038510394014</w:t>
-        </w:r>
-      </w:hyperlink>
-    </w:p>
-    <w:p>
-      <w:pPr>
-        <w:pStyle w:val="BodyText"/>
-      </w:pPr>
-      <w:r>
-        <w:t xml:space="preserve">Kandiyoti, D. (1988). Bargaining with patriarchy.</w:t>
-      </w:r>
-      <w:r>
-        <w:t xml:space="preserve"> </w:t>
-      </w:r>
-      <w:r>
-        <w:rPr>
-          <w:i/>
-          <w:iCs/>
-        </w:rPr>
-        <w:t xml:space="preserve">Gender &amp;</w:t>
-      </w:r>
-      <w:r>
-        <w:rPr>
-          <w:i/>
-          <w:iCs/>
-        </w:rPr>
-        <w:t xml:space="preserve"> </w:t>
-      </w:r>
-      <w:r>
-        <w:rPr>
-          <w:i/>
-          <w:iCs/>
-        </w:rPr>
-        <w:t xml:space="preserve">Society</w:t>
-      </w:r>
-      <w:r>
-        <w:t xml:space="preserve">,</w:t>
-      </w:r>
-      <w:r>
-        <w:t xml:space="preserve"> </w:t>
-      </w:r>
-      <w:r>
-        <w:rPr>
-          <w:i/>
-          <w:iCs/>
-        </w:rPr>
         <w:t xml:space="preserve">2</w:t>
       </w:r>
       <w:r>
@@ -12042,7 +11684,7 @@
       <w:r>
         <w:t xml:space="preserve"> </w:t>
       </w:r>
-      <w:hyperlink r:id="rId88">
+      <w:hyperlink r:id="rId81">
         <w:r>
           <w:rPr>
             <w:rStyle w:val="Hyperlink"/>
@@ -12116,7 +11758,7 @@
       <w:r>
         <w:t xml:space="preserve"> </w:t>
       </w:r>
-      <w:hyperlink r:id="rId89">
+      <w:hyperlink r:id="rId82">
         <w:r>
           <w:rPr>
             <w:rStyle w:val="Hyperlink"/>
@@ -12167,7 +11809,7 @@
       <w:r>
         <w:t xml:space="preserve"> </w:t>
       </w:r>
-      <w:hyperlink r:id="rId90">
+      <w:hyperlink r:id="rId83">
         <w:r>
           <w:rPr>
             <w:rStyle w:val="Hyperlink"/>
@@ -12304,7 +11946,7 @@
       <w:r>
         <w:t xml:space="preserve"> </w:t>
       </w:r>
-      <w:hyperlink r:id="rId91">
+      <w:hyperlink r:id="rId84">
         <w:r>
           <w:rPr>
             <w:rStyle w:val="Hyperlink"/>
@@ -12355,7 +11997,7 @@
       <w:r>
         <w:t xml:space="preserve"> </w:t>
       </w:r>
-      <w:hyperlink r:id="rId92">
+      <w:hyperlink r:id="rId85">
         <w:r>
           <w:rPr>
             <w:rStyle w:val="Hyperlink"/>
@@ -12412,7 +12054,7 @@
       <w:r>
         <w:t xml:space="preserve"> </w:t>
       </w:r>
-      <w:hyperlink r:id="rId93">
+      <w:hyperlink r:id="rId86">
         <w:r>
           <w:rPr>
             <w:rStyle w:val="Hyperlink"/>
@@ -12463,7 +12105,7 @@
       <w:r>
         <w:t xml:space="preserve"> </w:t>
       </w:r>
-      <w:hyperlink r:id="rId94">
+      <w:hyperlink r:id="rId87">
         <w:r>
           <w:rPr>
             <w:rStyle w:val="Hyperlink"/>
@@ -12540,7 +12182,7 @@
       <w:r>
         <w:t xml:space="preserve"> </w:t>
       </w:r>
-      <w:hyperlink r:id="rId95">
+      <w:hyperlink r:id="rId88">
         <w:r>
           <w:rPr>
             <w:rStyle w:val="Hyperlink"/>
@@ -12591,7 +12233,7 @@
       <w:r>
         <w:t xml:space="preserve"> </w:t>
       </w:r>
-      <w:hyperlink r:id="rId96">
+      <w:hyperlink r:id="rId89">
         <w:r>
           <w:rPr>
             <w:rStyle w:val="Hyperlink"/>
@@ -12642,7 +12284,7 @@
       <w:r>
         <w:t xml:space="preserve"> </w:t>
       </w:r>
-      <w:hyperlink r:id="rId97">
+      <w:hyperlink r:id="rId90">
         <w:r>
           <w:rPr>
             <w:rStyle w:val="Hyperlink"/>
@@ -12702,7 +12344,7 @@
       <w:r>
         <w:t xml:space="preserve"> </w:t>
       </w:r>
-      <w:hyperlink r:id="rId98">
+      <w:hyperlink r:id="rId91">
         <w:r>
           <w:rPr>
             <w:rStyle w:val="Hyperlink"/>
@@ -12882,7 +12524,7 @@
       <w:r>
         <w:t xml:space="preserve"> </w:t>
       </w:r>
-      <w:hyperlink r:id="rId99">
+      <w:hyperlink r:id="rId92">
         <w:r>
           <w:rPr>
             <w:rStyle w:val="Hyperlink"/>
@@ -12933,7 +12575,7 @@
       <w:r>
         <w:t xml:space="preserve"> </w:t>
       </w:r>
-      <w:hyperlink r:id="rId100">
+      <w:hyperlink r:id="rId93">
         <w:r>
           <w:rPr>
             <w:rStyle w:val="Hyperlink"/>
@@ -13011,7 +12653,7 @@
       <w:r>
         <w:t xml:space="preserve"> </w:t>
       </w:r>
-      <w:hyperlink r:id="rId101">
+      <w:hyperlink r:id="rId94">
         <w:r>
           <w:rPr>
             <w:rStyle w:val="Hyperlink"/>
@@ -13183,7 +12825,7 @@
       <w:r>
         <w:t xml:space="preserve"> </w:t>
       </w:r>
-      <w:hyperlink r:id="rId102">
+      <w:hyperlink r:id="rId95">
         <w:r>
           <w:rPr>
             <w:rStyle w:val="Hyperlink"/>
@@ -13294,7 +12936,7 @@
       <w:r>
         <w:t xml:space="preserve"> </w:t>
       </w:r>
-      <w:hyperlink r:id="rId103">
+      <w:hyperlink r:id="rId96">
         <w:r>
           <w:rPr>
             <w:rStyle w:val="Hyperlink"/>
@@ -13308,23 +12950,47 @@
         <w:pStyle w:val="BodyText"/>
       </w:pPr>
       <w:r>
-        <w:t xml:space="preserve">Sayer, L. C. (2005). Gender, time and inequality: Trends in women’s and</w:t>
-      </w:r>
-      <w:r>
-        <w:t xml:space="preserve"> </w:t>
-      </w:r>
-      <w:r>
-        <w:t xml:space="preserve">men’s paid work, unpaid work and free time.</w:t>
-      </w:r>
-      <w:r>
-        <w:t xml:space="preserve"> </w:t>
-      </w:r>
-      <w:r>
-        <w:rPr>
-          <w:i/>
-          <w:iCs/>
-        </w:rPr>
-        <w:t xml:space="preserve">Social Forces</w:t>
+        <w:t xml:space="preserve">Sen, A. K. (1990). Gender and cooperative conflicts. In I. Tinker (Ed.),</w:t>
+      </w:r>
+      <w:r>
+        <w:t xml:space="preserve"> </w:t>
+      </w:r>
+      <w:r>
+        <w:rPr>
+          <w:i/>
+          <w:iCs/>
+        </w:rPr>
+        <w:t xml:space="preserve">Persistent inequalities: Women and world development</w:t>
+      </w:r>
+      <w:r>
+        <w:t xml:space="preserve"> </w:t>
+      </w:r>
+      <w:r>
+        <w:t xml:space="preserve">(pp.</w:t>
+      </w:r>
+      <w:r>
+        <w:t xml:space="preserve"> </w:t>
+      </w:r>
+      <w:r>
+        <w:t xml:space="preserve">123–149). Oxford University Press.</w:t>
+      </w:r>
+    </w:p>
+    <w:p>
+      <w:pPr>
+        <w:pStyle w:val="BodyText"/>
+      </w:pPr>
+      <w:r>
+        <w:t xml:space="preserve">Shelton, B. A., &amp; John, D. (1996). The division of household labor.</w:t>
+      </w:r>
+      <w:r>
+        <w:t xml:space="preserve"> </w:t>
+      </w:r>
+      <w:r>
+        <w:rPr>
+          <w:i/>
+          <w:iCs/>
+        </w:rPr>
+        <w:t xml:space="preserve">Annual Review of Sociology</w:t>
       </w:r>
       <w:r>
         <w:t xml:space="preserve">,</w:t>
@@ -13337,81 +13003,6 @@
           <w:i/>
           <w:iCs/>
         </w:rPr>
-        <w:t xml:space="preserve">84</w:t>
-      </w:r>
-      <w:r>
-        <w:t xml:space="preserve">(1), 285–303.</w:t>
-      </w:r>
-      <w:r>
-        <w:t xml:space="preserve"> </w:t>
-      </w:r>
-      <w:hyperlink r:id="rId104">
-        <w:r>
-          <w:rPr>
-            <w:rStyle w:val="Hyperlink"/>
-          </w:rPr>
-          <w:t xml:space="preserve">https://doi.org/10.1353/sof.2005.0126</w:t>
-        </w:r>
-      </w:hyperlink>
-    </w:p>
-    <w:p>
-      <w:pPr>
-        <w:pStyle w:val="BodyText"/>
-      </w:pPr>
-      <w:r>
-        <w:t xml:space="preserve">Sen, A. K. (1990). Gender and cooperative conflicts. In I. Tinker (Ed.),</w:t>
-      </w:r>
-      <w:r>
-        <w:t xml:space="preserve"> </w:t>
-      </w:r>
-      <w:r>
-        <w:rPr>
-          <w:i/>
-          <w:iCs/>
-        </w:rPr>
-        <w:t xml:space="preserve">Persistent inequalities: Women and world development</w:t>
-      </w:r>
-      <w:r>
-        <w:t xml:space="preserve"> </w:t>
-      </w:r>
-      <w:r>
-        <w:t xml:space="preserve">(pp.</w:t>
-      </w:r>
-      <w:r>
-        <w:t xml:space="preserve"> </w:t>
-      </w:r>
-      <w:r>
-        <w:t xml:space="preserve">123–149). Oxford University Press.</w:t>
-      </w:r>
-    </w:p>
-    <w:p>
-      <w:pPr>
-        <w:pStyle w:val="BodyText"/>
-      </w:pPr>
-      <w:r>
-        <w:t xml:space="preserve">Shelton, B. A., &amp; John, D. (1996). The division of household labor.</w:t>
-      </w:r>
-      <w:r>
-        <w:t xml:space="preserve"> </w:t>
-      </w:r>
-      <w:r>
-        <w:rPr>
-          <w:i/>
-          <w:iCs/>
-        </w:rPr>
-        <w:t xml:space="preserve">Annual Review of Sociology</w:t>
-      </w:r>
-      <w:r>
-        <w:t xml:space="preserve">,</w:t>
-      </w:r>
-      <w:r>
-        <w:t xml:space="preserve"> </w:t>
-      </w:r>
-      <w:r>
-        <w:rPr>
-          <w:i/>
-          <w:iCs/>
-        </w:rPr>
         <w:t xml:space="preserve">22</w:t>
       </w:r>
       <w:r>
@@ -13420,7 +13011,7 @@
       <w:r>
         <w:t xml:space="preserve"> </w:t>
       </w:r>
-      <w:hyperlink r:id="rId105">
+      <w:hyperlink r:id="rId97">
         <w:r>
           <w:rPr>
             <w:rStyle w:val="Hyperlink"/>
@@ -13477,7 +13068,7 @@
       <w:r>
         <w:t xml:space="preserve"> </w:t>
       </w:r>
-      <w:hyperlink r:id="rId106">
+      <w:hyperlink r:id="rId98">
         <w:r>
           <w:rPr>
             <w:rStyle w:val="Hyperlink"/>
@@ -13528,7 +13119,7 @@
       <w:r>
         <w:t xml:space="preserve"> </w:t>
       </w:r>
-      <w:hyperlink r:id="rId107">
+      <w:hyperlink r:id="rId99">
         <w:r>
           <w:rPr>
             <w:rStyle w:val="Hyperlink"/>
@@ -13585,7 +13176,7 @@
       <w:r>
         <w:t xml:space="preserve"> </w:t>
       </w:r>
-      <w:hyperlink r:id="rId108">
+      <w:hyperlink r:id="rId100">
         <w:r>
           <w:rPr>
             <w:rStyle w:val="Hyperlink"/>
@@ -13704,7 +13295,7 @@
       <w:r>
         <w:t xml:space="preserve"> </w:t>
       </w:r>
-      <w:hyperlink r:id="rId109">
+      <w:hyperlink r:id="rId101">
         <w:r>
           <w:rPr>
             <w:rStyle w:val="Hyperlink"/>
@@ -13749,7 +13340,7 @@
       <w:r>
         <w:t xml:space="preserve"> </w:t>
       </w:r>
-      <w:hyperlink r:id="rId110">
+      <w:hyperlink r:id="rId102">
         <w:r>
           <w:rPr>
             <w:rStyle w:val="Hyperlink"/>
@@ -13808,7 +13399,7 @@
       <w:r>
         <w:t xml:space="preserve"> </w:t>
       </w:r>
-      <w:hyperlink r:id="rId111">
+      <w:hyperlink r:id="rId103">
         <w:r>
           <w:rPr>
             <w:rStyle w:val="Hyperlink"/>
@@ -13817,11 +13408,13 @@
         </w:r>
       </w:hyperlink>
     </w:p>
-    <w:bookmarkEnd w:id="112"/>
+    <w:bookmarkEnd w:id="104"/>
     <w:sectPr>
+      <w:footerReference w:type="default" r:id="rId9"/>
       <w:footnotePr>
         <w:numRestart w:val="eachSect"/>
       </w:footnotePr>
+      <w:pgMar w:left="1440" w:right="1440" w:top="1440" w:bottom="1440" w:footer="720"/>
     </w:sectPr>
   </w:body>
 </w:document>
@@ -13829,6 +13422,27 @@
 
 <file path=word/comments.xml><?xml version="1.0" encoding="utf-8"?>
 <w:comments xmlns:w="http://schemas.openxmlformats.org/wordprocessingml/2006/main" xmlns:m="http://schemas.openxmlformats.org/officeDocument/2006/math" xmlns:r="http://schemas.openxmlformats.org/officeDocument/2006/relationships" xmlns:o="urn:schemas-microsoft-com:office:office" xmlns:v="urn:schemas-microsoft-com:vml" xmlns:w10="urn:schemas-microsoft-com:office:word" xmlns:a="http://schemas.openxmlformats.org/drawingml/2006/main" xmlns:pic="http://schemas.openxmlformats.org/drawingml/2006/picture" xmlns:wp="http://schemas.openxmlformats.org/drawingml/2006/wordprocessingDrawing"/>
+</file>
+
+<file path=word/footer1.xml><?xml version="1.0" encoding="utf-8"?>
+<w:ftr xmlns:m="http://schemas.openxmlformats.org/officeDocument/2006/math" xmlns:mc="http://schemas.openxmlformats.org/markup-compatibility/2006" xmlns:mo="http://schemas.microsoft.com/office/mac/office/2008/main" xmlns:mv="urn:schemas-microsoft-com:mac:vml" xmlns:o="urn:schemas-microsoft-com:office:office" xmlns:r="http://schemas.openxmlformats.org/officeDocument/2006/relationships" xmlns:v="urn:schemas-microsoft-com:vml" xmlns:w10="urn:schemas-microsoft-com:office:word" xmlns:w14="http://schemas.microsoft.com/office/word/2010/wordml" xmlns:w="http://schemas.openxmlformats.org/wordprocessingml/2006/main" xmlns:wne="http://schemas.microsoft.com/office/word/2006/wordml" xmlns:wp14="http://schemas.microsoft.com/office/word/2010/wordprocessingDrawing" xmlns:wp="http://schemas.openxmlformats.org/drawingml/2006/wordprocessingDrawing" xmlns:wpc="http://schemas.microsoft.com/office/word/2010/wordprocessingCanvas" xmlns:wpg="http://schemas.microsoft.com/office/word/2010/wordprocessingGroup" xmlns:wpi="http://schemas.microsoft.com/office/word/2010/wordprocessingInk" xmlns:wps="http://schemas.microsoft.com/office/word/2010/wordprocessingShape" mc:Ignorable="w14 wp14">
+  <w:p>
+    <w:pPr>
+      <w:pStyle w:val="Footer"/>
+      <w:spacing w:line="240" w:lineRule="auto"/>
+      <w:jc w:val="center"/>
+    </w:pPr>
+    <w:r>
+      <w:rPr>
+        <w:rFonts w:ascii="Times New Roman" w:hAnsi="Times New Roman"/>
+        <w:sz w:val="24"/>
+      </w:rPr>
+      <w:fldChar w:fldCharType="begin"/>
+      <w:instrText xml:space="preserve">PAGE</w:instrText>
+      <w:fldChar w:fldCharType="end"/>
+    </w:r>
+  </w:p>
+</w:ftr>
 </file>
 
 <file path=word/footnotes.xml><?xml version="1.0" encoding="utf-8"?>
@@ -13988,6 +13602,8 @@
     <w:qFormat/>
     <w:rsid w:val="00A10FD9"/>
     <w:pPr>
+      <w:keepNext w:val="0"/>
+      <w:keepLines w:val="0"/>
       <w:spacing w:after="80" w:line="480" w:lineRule="auto"/>
       <w:contextualSpacing/>
       <w:jc w:val="center"/>
@@ -14050,8 +13666,8 @@
     <w:next w:val="BodyText"/>
     <w:qFormat/>
     <w:pPr>
-      <w:keepNext/>
-      <w:keepLines/>
+      <w:keepNext w:val="0"/>
+      <w:keepLines w:val="0"/>
     </w:pPr>
     <w:rPr>
       <w:sz w:val="24"/>
@@ -14064,8 +13680,8 @@
     <w:next w:val="BodyText"/>
     <w:qFormat/>
     <w:pPr>
-      <w:keepNext/>
-      <w:keepLines/>
+      <w:keepNext w:val="0"/>
+      <w:keepLines w:val="0"/>
     </w:pPr>
     <w:rPr>
       <w:sz w:val="24"/>
@@ -14078,8 +13694,8 @@
     <w:next w:val="Abstract"/>
     <w:qFormat/>
     <w:pPr>
-      <w:keepNext/>
-      <w:keepLines/>
+      <w:keepNext w:val="0"/>
+      <w:keepLines w:val="0"/>
       <w:spacing w:after="0" w:before="300" w:line="480" w:lineRule="auto"/>
       <w:jc w:val="center"/>
     </w:pPr>
@@ -14095,8 +13711,8 @@
     <w:next w:val="BodyText"/>
     <w:qFormat/>
     <w:pPr>
-      <w:keepNext/>
-      <w:keepLines/>
+      <w:keepNext w:val="0"/>
+      <w:keepLines w:val="0"/>
       <w:spacing w:after="300" w:before="100" w:line="480" w:lineRule="auto"/>
     </w:pPr>
     <w:rPr>

</xml_diff>

<commit_message>
05: Word file with citations restored (no empty '(; )' groups), American spelling in manuscript and supplement, four literature sentences trimmed (33 pages docx and PDF); PORTAL_CHECKLIST refreshed; tex2docx resolves citeproc citations
</commit_message>
<xml_diff>
--- a/submission/05_marriage_time_reallocation/package/manuscript_anonymised.docx
+++ b/submission/05_marriage_time_reallocation/package/manuscript_anonymised.docx
@@ -21,7 +21,7 @@
         <w:pStyle w:val="Author"/>
       </w:pPr>
       <w:r>
-        <w:t xml:space="preserve">Manuscript anonymised for review</w:t>
+        <w:t xml:space="preserve">Manuscript anonymized for review</w:t>
       </w:r>
     </w:p>
     <w:p>
@@ -172,7 +172,13 @@
         <w:t xml:space="preserve"> </w:t>
       </w:r>
       <w:r>
-        <w:t xml:space="preserve">among the married (; ). Men’s</w:t>
+        <w:t xml:space="preserve">among the married (Shelton &amp; John,</w:t>
+      </w:r>
+      <w:r>
+        <w:t xml:space="preserve"> </w:t>
+      </w:r>
+      <w:r>
+        <w:t xml:space="preserve">1996; South &amp; Spitze, 1994). Men’s</w:t>
       </w:r>
       <w:r>
         <w:t xml:space="preserve"> </w:t>
@@ -184,37 +190,43 @@
         <w:t xml:space="preserve"> </w:t>
       </w:r>
       <w:r>
-        <w:t xml:space="preserve">(;</w:t>
-      </w:r>
-      <w:r>
-        <w:t xml:space="preserve"> </w:t>
-      </w:r>
-      <w:r>
-        <w:t xml:space="preserve">). Explanations range</w:t>
-      </w:r>
-      <w:r>
-        <w:t xml:space="preserve"> </w:t>
-      </w:r>
-      <w:r>
-        <w:t xml:space="preserve">from specialisation within the household</w:t>
-      </w:r>
-      <w:r>
-        <w:t xml:space="preserve"> </w:t>
-      </w:r>
-      <w:r>
-        <w:t xml:space="preserve">(,</w:t>
-      </w:r>
-      <w:r>
-        <w:t xml:space="preserve"> </w:t>
-      </w:r>
-      <w:r>
-        <w:t xml:space="preserve">) and bargaining over the</w:t>
-      </w:r>
-      <w:r>
-        <w:t xml:space="preserve"> </w:t>
-      </w:r>
-      <w:r>
-        <w:t xml:space="preserve">division of labour (; )</w:t>
+        <w:t xml:space="preserve">(Baxter et al., 2008;</w:t>
+      </w:r>
+      <w:r>
+        <w:t xml:space="preserve"> </w:t>
+      </w:r>
+      <w:r>
+        <w:t xml:space="preserve">Gupta, 1999). Explanations range</w:t>
+      </w:r>
+      <w:r>
+        <w:t xml:space="preserve"> </w:t>
+      </w:r>
+      <w:r>
+        <w:t xml:space="preserve">from specialization within the household</w:t>
+      </w:r>
+      <w:r>
+        <w:t xml:space="preserve"> </w:t>
+      </w:r>
+      <w:r>
+        <w:t xml:space="preserve">(Becker, 1985,</w:t>
+      </w:r>
+      <w:r>
+        <w:t xml:space="preserve"> </w:t>
+      </w:r>
+      <w:r>
+        <w:t xml:space="preserve">1991) and bargaining over the</w:t>
+      </w:r>
+      <w:r>
+        <w:t xml:space="preserve"> </w:t>
+      </w:r>
+      <w:r>
+        <w:t xml:space="preserve">division of labor (Lundberg &amp;</w:t>
+      </w:r>
+      <w:r>
+        <w:t xml:space="preserve"> </w:t>
+      </w:r>
+      <w:r>
+        <w:t xml:space="preserve">Pollak, 1993; Manser &amp; Brown, 1980)</w:t>
       </w:r>
       <w:r>
         <w:t xml:space="preserve"> </w:t>
@@ -226,19 +238,19 @@
         <w:t xml:space="preserve"> </w:t>
       </w:r>
       <w:r>
-        <w:t xml:space="preserve">(;</w:t>
-      </w:r>
-      <w:r>
-        <w:t xml:space="preserve"> </w:t>
-      </w:r>
-      <w:r>
-        <w:t xml:space="preserve">;</w:t>
-      </w:r>
-      <w:r>
-        <w:t xml:space="preserve"> </w:t>
-      </w:r>
-      <w:r>
-        <w:t xml:space="preserve">).</w:t>
+        <w:t xml:space="preserve">(Akerlof &amp; Kranton, 2000;</w:t>
+      </w:r>
+      <w:r>
+        <w:t xml:space="preserve"> </w:t>
+      </w:r>
+      <w:r>
+        <w:t xml:space="preserve">Brines, 1994;</w:t>
+      </w:r>
+      <w:r>
+        <w:t xml:space="preserve"> </w:t>
+      </w:r>
+      <w:r>
+        <w:t xml:space="preserve">West &amp; Zimmerman, 1987).</w:t>
       </w:r>
     </w:p>
     <w:p>
@@ -264,13 +276,13 @@
         <w:t xml:space="preserve"> </w:t>
       </w:r>
       <w:r>
-        <w:t xml:space="preserve">(;</w:t>
-      </w:r>
-      <w:r>
-        <w:t xml:space="preserve"> </w:t>
-      </w:r>
-      <w:r>
-        <w:t xml:space="preserve">): 29% of</w:t>
+        <w:t xml:space="preserve">(Dyson &amp; Moore, 1983;</w:t>
+      </w:r>
+      <w:r>
+        <w:t xml:space="preserve"> </w:t>
+      </w:r>
+      <w:r>
+        <w:t xml:space="preserve">Khalil &amp; Mookerjee, 2019): 29% of</w:t>
       </w:r>
       <w:r>
         <w:t xml:space="preserve"> </w:t>
@@ -288,19 +300,19 @@
         <w:t xml:space="preserve"> </w:t>
       </w:r>
       <w:r>
-        <w:t xml:space="preserve">education (;</w:t>
-      </w:r>
-      <w:r>
-        <w:t xml:space="preserve"> </w:t>
-      </w:r>
-      <w:r>
-        <w:t xml:space="preserve">;</w:t>
-      </w:r>
-      <w:r>
-        <w:t xml:space="preserve"> </w:t>
-      </w:r>
-      <w:r>
-        <w:t xml:space="preserve">). For most</w:t>
+        <w:t xml:space="preserve">education (Afridi et al., 2018;</w:t>
+      </w:r>
+      <w:r>
+        <w:t xml:space="preserve"> </w:t>
+      </w:r>
+      <w:r>
+        <w:t xml:space="preserve">Chatterjee et al., 2018;</w:t>
+      </w:r>
+      <w:r>
+        <w:t xml:space="preserve"> </w:t>
+      </w:r>
+      <w:r>
+        <w:t xml:space="preserve">Klasen &amp; Pieters, 2015). For most</w:t>
       </w:r>
       <w:r>
         <w:t xml:space="preserve"> </w:t>
@@ -332,43 +344,49 @@
         <w:t xml:space="preserve"> </w:t>
       </w:r>
       <w:r>
-        <w:t xml:space="preserve">(;</w:t>
-      </w:r>
-      <w:r>
-        <w:t xml:space="preserve"> </w:t>
-      </w:r>
-      <w:r>
-        <w:t xml:space="preserve">),</w:t>
-      </w:r>
-      <w:r>
-        <w:t xml:space="preserve"> </w:t>
-      </w:r>
-      <w:r>
-        <w:t xml:space="preserve">sleep (;</w:t>
-      </w:r>
-      <w:r>
-        <w:t xml:space="preserve"> </w:t>
-      </w:r>
-      <w:r>
-        <w:t xml:space="preserve">), free time</w:t>
-      </w:r>
-      <w:r>
-        <w:t xml:space="preserve"> </w:t>
-      </w:r>
-      <w:r>
-        <w:t xml:space="preserve">(), exercise</w:t>
-      </w:r>
-      <w:r>
-        <w:t xml:space="preserve"> </w:t>
-      </w:r>
-      <w:r>
-        <w:t xml:space="preserve">() and</w:t>
-      </w:r>
-      <w:r>
-        <w:t xml:space="preserve"> </w:t>
-      </w:r>
-      <w:r>
-        <w:t xml:space="preserve">social ties (). A day is a fixed budget, however. Any increase in</w:t>
+        <w:t xml:space="preserve">(Coltrane, 2000;</w:t>
+      </w:r>
+      <w:r>
+        <w:t xml:space="preserve"> </w:t>
+      </w:r>
+      <w:r>
+        <w:t xml:space="preserve">Lachance-Grzela &amp; Bouchard, 2010),</w:t>
+      </w:r>
+      <w:r>
+        <w:t xml:space="preserve"> </w:t>
+      </w:r>
+      <w:r>
+        <w:t xml:space="preserve">sleep (Burgard &amp; Ailshire, 2013;</w:t>
+      </w:r>
+      <w:r>
+        <w:t xml:space="preserve"> </w:t>
+      </w:r>
+      <w:r>
+        <w:t xml:space="preserve">Maume et al., 2010), free time</w:t>
+      </w:r>
+      <w:r>
+        <w:t xml:space="preserve"> </w:t>
+      </w:r>
+      <w:r>
+        <w:t xml:space="preserve">(Mattingly &amp; Bianchi, 2003), exercise</w:t>
+      </w:r>
+      <w:r>
+        <w:t xml:space="preserve"> </w:t>
+      </w:r>
+      <w:r>
+        <w:t xml:space="preserve">(Nomaguchi &amp; Bianchi, 2004) and</w:t>
+      </w:r>
+      <w:r>
+        <w:t xml:space="preserve"> </w:t>
+      </w:r>
+      <w:r>
+        <w:t xml:space="preserve">social ties (Sarkisian &amp;</w:t>
+      </w:r>
+      <w:r>
+        <w:t xml:space="preserve"> </w:t>
+      </w:r>
+      <w:r>
+        <w:t xml:space="preserve">Gerstel, 2016). A day is a fixed budget, however. Any increase in</w:t>
       </w:r>
       <w:r>
         <w:t xml:space="preserve"> </w:t>
@@ -410,7 +428,7 @@
         <w:t xml:space="preserve"> </w:t>
       </w:r>
       <w:r>
-        <w:t xml:space="preserve">() use the Time Use Survey 2019</w:t>
+        <w:t xml:space="preserve">(2024) use the Time Use Survey 2019</w:t>
       </w:r>
       <w:r>
         <w:t xml:space="preserve"> </w:t>
@@ -452,13 +470,19 @@
         <w:t xml:space="preserve"> </w:t>
       </w:r>
       <w:r>
-        <w:t xml:space="preserve">(ICATUS 2016, ). The divisions partition the day, so the components sum</w:t>
-      </w:r>
-      <w:r>
-        <w:t xml:space="preserve"> </w:t>
-      </w:r>
-      <w:r>
-        <w:t xml:space="preserve">to zero by construction, and sub-rows for sleep, socialising, exercise</w:t>
+        <w:t xml:space="preserve">(ICATUS 2016, United Nations Statistics</w:t>
+      </w:r>
+      <w:r>
+        <w:t xml:space="preserve"> </w:t>
+      </w:r>
+      <w:r>
+        <w:t xml:space="preserve">Division, 2016). The divisions partition the day, so the components sum</w:t>
+      </w:r>
+      <w:r>
+        <w:t xml:space="preserve"> </w:t>
+      </w:r>
+      <w:r>
+        <w:t xml:space="preserve">to zero by construction, and sub-rows for sleep, socializing, exercise</w:t>
       </w:r>
       <w:r>
         <w:t xml:space="preserve"> </w:t>
@@ -502,7 +526,7 @@
         <w:t xml:space="preserve"> </w:t>
       </w:r>
       <w:r>
-        <w:t xml:space="preserve">(). I report the</w:t>
+        <w:t xml:space="preserve">(Goldman, 1993). I report the</w:t>
       </w:r>
       <w:r>
         <w:t xml:space="preserve"> </w:t>
@@ -520,7 +544,7 @@
         <w:t xml:space="preserve"> </w:t>
       </w:r>
       <w:r>
-        <w:t xml:space="preserve">of the married ();</w:t>
+        <w:t xml:space="preserve">of the married (DiNardo et al., 1996);</w:t>
       </w:r>
       <w:r>
         <w:t xml:space="preserve"> </w:t>
@@ -532,7 +556,7 @@
         <w:t xml:space="preserve"> </w:t>
       </w:r>
       <w:r>
-        <w:t xml:space="preserve">Oster (); and trace how the</w:t>
+        <w:t xml:space="preserve">Oster (2019); and trace how the</w:t>
       </w:r>
       <w:r>
         <w:t xml:space="preserve"> </w:t>
@@ -574,7 +598,7 @@
         <w:t xml:space="preserve"> </w:t>
       </w:r>
       <w:r>
-        <w:t xml:space="preserve">(). Third, it</w:t>
+        <w:t xml:space="preserve">(Kandiyoti, 1988). Third, it</w:t>
       </w:r>
       <w:r>
         <w:t xml:space="preserve"> </w:t>
@@ -673,7 +697,7 @@
         <w:t xml:space="preserve">Background</w:t>
       </w:r>
     </w:p>
-    <w:bookmarkStart w:id="10" w:name="X0dac2ea29f4428eb6a040cbd1dfcf94d3973794"/>
+    <w:bookmarkStart w:id="10" w:name="X1d6b3771fd25023756a600574cba792d743594c"/>
     <w:p>
       <w:pPr>
         <w:pStyle w:val="Heading2"/>
@@ -685,7 +709,7 @@
         <w:t xml:space="preserve"> </w:t>
       </w:r>
       <w:r>
-        <w:t xml:space="preserve">labour</w:t>
+        <w:t xml:space="preserve">labor</w:t>
       </w:r>
     </w:p>
     <w:p>
@@ -705,7 +729,7 @@
         <w:t xml:space="preserve"> </w:t>
       </w:r>
       <w:r>
-        <w:t xml:space="preserve">() show that women in</w:t>
+        <w:t xml:space="preserve">(1994) show that women in</w:t>
       </w:r>
       <w:r>
         <w:t xml:space="preserve"> </w:t>
@@ -723,79 +747,25 @@
         <w:t xml:space="preserve"> </w:t>
       </w:r>
       <w:r>
-        <w:t xml:space="preserve">when they marry or cohabit (), and that women’s housework responds more than men’s to union and</w:t>
-      </w:r>
-      <w:r>
-        <w:t xml:space="preserve"> </w:t>
-      </w:r>
-      <w:r>
-        <w:t xml:space="preserve">parenthood transitions (; ).</w:t>
-      </w:r>
-      <w:r>
-        <w:t xml:space="preserve"> </w:t>
-      </w:r>
-      <w:r>
-        <w:t xml:space="preserve">Cross-national studies show that the gap is larger where macro-level</w:t>
-      </w:r>
-      <w:r>
-        <w:t xml:space="preserve"> </w:t>
-      </w:r>
-      <w:r>
-        <w:t xml:space="preserve">gender inequality is greater and where policies support a</w:t>
-      </w:r>
-      <w:r>
-        <w:t xml:space="preserve"> </w:t>
-      </w:r>
-      <w:r>
-        <w:t xml:space="preserve">male-breadwinner arrangement (;</w:t>
-      </w:r>
-      <w:r>
-        <w:t xml:space="preserve"> </w:t>
-      </w:r>
-      <w:r>
-        <w:t xml:space="preserve">,</w:t>
-      </w:r>
-      <w:r>
-        <w:t xml:space="preserve"> </w:t>
-      </w:r>
-      <w:r>
-        <w:t xml:space="preserve">). Reviews of this literature agree</w:t>
-      </w:r>
-      <w:r>
-        <w:t xml:space="preserve"> </w:t>
-      </w:r>
-      <w:r>
-        <w:t xml:space="preserve">on the main correlates (relative resources, time availability and gender</w:t>
-      </w:r>
-      <w:r>
-        <w:t xml:space="preserve"> </w:t>
-      </w:r>
-      <w:r>
-        <w:t xml:space="preserve">ideology) but not on their relative weight</w:t>
-      </w:r>
-      <w:r>
-        <w:t xml:space="preserve"> </w:t>
-      </w:r>
-      <w:r>
-        <w:t xml:space="preserve">(;</w:t>
-      </w:r>
-      <w:r>
-        <w:t xml:space="preserve"> </w:t>
-      </w:r>
-      <w:r>
-        <w:t xml:space="preserve">;</w:t>
-      </w:r>
-      <w:r>
-        <w:t xml:space="preserve"> </w:t>
-      </w:r>
-      <w:r>
-        <w:t xml:space="preserve">;</w:t>
-      </w:r>
-      <w:r>
-        <w:t xml:space="preserve"> </w:t>
-      </w:r>
-      <w:r>
-        <w:t xml:space="preserve">).</w:t>
+        <w:t xml:space="preserve">when they marry or cohabit (Gupta,</w:t>
+      </w:r>
+      <w:r>
+        <w:t xml:space="preserve"> </w:t>
+      </w:r>
+      <w:r>
+        <w:t xml:space="preserve">1999), and that women’s housework responds more than men’s to union and</w:t>
+      </w:r>
+      <w:r>
+        <w:t xml:space="preserve"> </w:t>
+      </w:r>
+      <w:r>
+        <w:t xml:space="preserve">parenthood transitions (Baxter et al.,</w:t>
+      </w:r>
+      <w:r>
+        <w:t xml:space="preserve"> </w:t>
+      </w:r>
+      <w:r>
+        <w:t xml:space="preserve">2008; Sanchez &amp; Thomson, 1997).</w:t>
       </w:r>
     </w:p>
     <w:p>
@@ -803,37 +773,37 @@
         <w:pStyle w:val="BodyText"/>
       </w:pPr>
       <w:r>
-        <w:t xml:space="preserve">Two families of theory organise this work. In economic models, spouses</w:t>
-      </w:r>
-      <w:r>
-        <w:t xml:space="preserve"> </w:t>
-      </w:r>
-      <w:r>
-        <w:t xml:space="preserve">specialise by comparative advantage</w:t>
-      </w:r>
-      <w:r>
-        <w:t xml:space="preserve"> </w:t>
-      </w:r>
-      <w:r>
-        <w:t xml:space="preserve">(,</w:t>
-      </w:r>
-      <w:r>
-        <w:t xml:space="preserve"> </w:t>
-      </w:r>
-      <w:r>
-        <w:t xml:space="preserve">), home production competes with</w:t>
-      </w:r>
-      <w:r>
-        <w:t xml:space="preserve"> </w:t>
-      </w:r>
-      <w:r>
-        <w:t xml:space="preserve">market work and leisure (;</w:t>
-      </w:r>
-      <w:r>
-        <w:t xml:space="preserve"> </w:t>
-      </w:r>
-      <w:r>
-        <w:t xml:space="preserve">), and in bargaining</w:t>
+        <w:t xml:space="preserve">Two families of theory organize this work. In economic models, spouses</w:t>
+      </w:r>
+      <w:r>
+        <w:t xml:space="preserve"> </w:t>
+      </w:r>
+      <w:r>
+        <w:t xml:space="preserve">specialize by comparative advantage</w:t>
+      </w:r>
+      <w:r>
+        <w:t xml:space="preserve"> </w:t>
+      </w:r>
+      <w:r>
+        <w:t xml:space="preserve">(Becker, 1985,</w:t>
+      </w:r>
+      <w:r>
+        <w:t xml:space="preserve"> </w:t>
+      </w:r>
+      <w:r>
+        <w:t xml:space="preserve">1991), home production competes with</w:t>
+      </w:r>
+      <w:r>
+        <w:t xml:space="preserve"> </w:t>
+      </w:r>
+      <w:r>
+        <w:t xml:space="preserve">market work and leisure (Becker, 1965;</w:t>
+      </w:r>
+      <w:r>
+        <w:t xml:space="preserve"> </w:t>
+      </w:r>
+      <w:r>
+        <w:t xml:space="preserve">Gronau, 1977), and in bargaining</w:t>
       </w:r>
       <w:r>
         <w:t xml:space="preserve"> </w:t>
@@ -845,25 +815,25 @@
         <w:t xml:space="preserve"> </w:t>
       </w:r>
       <w:r>
-        <w:t xml:space="preserve">(;</w:t>
-      </w:r>
-      <w:r>
-        <w:t xml:space="preserve"> </w:t>
-      </w:r>
-      <w:r>
-        <w:t xml:space="preserve">;</w:t>
-      </w:r>
-      <w:r>
-        <w:t xml:space="preserve"> </w:t>
-      </w:r>
-      <w:r>
-        <w:t xml:space="preserve">;</w:t>
-      </w:r>
-      <w:r>
-        <w:t xml:space="preserve"> </w:t>
-      </w:r>
-      <w:r>
-        <w:t xml:space="preserve">);</w:t>
+        <w:t xml:space="preserve">(Chiappori, 1992;</w:t>
+      </w:r>
+      <w:r>
+        <w:t xml:space="preserve"> </w:t>
+      </w:r>
+      <w:r>
+        <w:t xml:space="preserve">Lundberg &amp; Pollak, 1993;</w:t>
+      </w:r>
+      <w:r>
+        <w:t xml:space="preserve"> </w:t>
+      </w:r>
+      <w:r>
+        <w:t xml:space="preserve">Manser &amp; Brown, 1980;</w:t>
+      </w:r>
+      <w:r>
+        <w:t xml:space="preserve"> </w:t>
+      </w:r>
+      <w:r>
+        <w:t xml:space="preserve">McElroy &amp; Horney, 1981);</w:t>
       </w:r>
       <w:r>
         <w:t xml:space="preserve"> </w:t>
@@ -875,7 +845,7 @@
         <w:t xml:space="preserve"> </w:t>
       </w:r>
       <w:r>
-        <w:t xml:space="preserve">(), and feminist</w:t>
+        <w:t xml:space="preserve">(Blood &amp; Wolfe, 1960), and feminist</w:t>
       </w:r>
       <w:r>
         <w:t xml:space="preserve"> </w:t>
@@ -887,13 +857,13 @@
         <w:t xml:space="preserve"> </w:t>
       </w:r>
       <w:r>
-        <w:t xml:space="preserve">(;</w:t>
-      </w:r>
-      <w:r>
-        <w:t xml:space="preserve"> </w:t>
-      </w:r>
-      <w:r>
-        <w:t xml:space="preserve">).</w:t>
+        <w:t xml:space="preserve">(Agarwal, 1997;</w:t>
+      </w:r>
+      <w:r>
+        <w:t xml:space="preserve"> </w:t>
+      </w:r>
+      <w:r>
+        <w:t xml:space="preserve">Sen, 1990).</w:t>
       </w:r>
     </w:p>
     <w:p>
@@ -907,7 +877,7 @@
         <w:t xml:space="preserve"> </w:t>
       </w:r>
       <w:r>
-        <w:t xml:space="preserve">(). Economically</w:t>
+        <w:t xml:space="preserve">(West &amp; Zimmerman, 1987). Economically</w:t>
       </w:r>
       <w:r>
         <w:t xml:space="preserve"> </w:t>
@@ -919,13 +889,13 @@
         <w:t xml:space="preserve"> </w:t>
       </w:r>
       <w:r>
-        <w:t xml:space="preserve">(;</w:t>
-      </w:r>
-      <w:r>
-        <w:t xml:space="preserve"> </w:t>
-      </w:r>
-      <w:r>
-        <w:t xml:space="preserve">), wives’</w:t>
+        <w:t xml:space="preserve">(Brines, 1994;</w:t>
+      </w:r>
+      <w:r>
+        <w:t xml:space="preserve"> </w:t>
+      </w:r>
+      <w:r>
+        <w:t xml:space="preserve">Greenstein, 2000), wives’</w:t>
       </w:r>
       <w:r>
         <w:t xml:space="preserve"> </w:t>
@@ -937,19 +907,19 @@
         <w:t xml:space="preserve"> </w:t>
       </w:r>
       <w:r>
-        <w:t xml:space="preserve">(;</w:t>
-      </w:r>
-      <w:r>
-        <w:t xml:space="preserve"> </w:t>
-      </w:r>
-      <w:r>
-        <w:t xml:space="preserve">), and Akerlof &amp;</w:t>
-      </w:r>
-      <w:r>
-        <w:t xml:space="preserve"> </w:t>
-      </w:r>
-      <w:r>
-        <w:t xml:space="preserve">Kranton () formalise the idea as</w:t>
+        <w:t xml:space="preserve">(Bertrand et al., 2015;</w:t>
+      </w:r>
+      <w:r>
+        <w:t xml:space="preserve"> </w:t>
+      </w:r>
+      <w:r>
+        <w:t xml:space="preserve">Bittman et al., 2003), and Akerlof &amp;</w:t>
+      </w:r>
+      <w:r>
+        <w:t xml:space="preserve"> </w:t>
+      </w:r>
+      <w:r>
+        <w:t xml:space="preserve">Kranton (2000) formalize the idea as</w:t>
       </w:r>
       <w:r>
         <w:t xml:space="preserve"> </w:t>
@@ -961,13 +931,13 @@
         <w:t xml:space="preserve"> </w:t>
       </w:r>
       <w:r>
-        <w:t xml:space="preserve">(;</w:t>
-      </w:r>
-      <w:r>
-        <w:t xml:space="preserve"> </w:t>
-      </w:r>
-      <w:r>
-        <w:t xml:space="preserve">), and</w:t>
+        <w:t xml:space="preserve">(Gupta, 2007;</w:t>
+      </w:r>
+      <w:r>
+        <w:t xml:space="preserve"> </w:t>
+      </w:r>
+      <w:r>
+        <w:t xml:space="preserve">Killewald &amp; Gough, 2010), and</w:t>
       </w:r>
       <w:r>
         <w:t xml:space="preserve"> </w:t>
@@ -979,13 +949,13 @@
         <w:t xml:space="preserve"> </w:t>
       </w:r>
       <w:r>
-        <w:t xml:space="preserve">(;</w:t>
-      </w:r>
-      <w:r>
-        <w:t xml:space="preserve"> </w:t>
-      </w:r>
-      <w:r>
-        <w:t xml:space="preserve">), one reason couple-level</w:t>
+        <w:t xml:space="preserve">(Ridgeway &amp; Correll, 2004;</w:t>
+      </w:r>
+      <w:r>
+        <w:t xml:space="preserve"> </w:t>
+      </w:r>
+      <w:r>
+        <w:t xml:space="preserve">Risman, 2004), one reason couple-level</w:t>
       </w:r>
       <w:r>
         <w:t xml:space="preserve"> </w:t>
@@ -1027,25 +997,25 @@
         <w:t xml:space="preserve"> </w:t>
       </w:r>
       <w:r>
-        <w:t xml:space="preserve">(;</w:t>
-      </w:r>
-      <w:r>
-        <w:t xml:space="preserve"> </w:t>
-      </w:r>
-      <w:r>
-        <w:t xml:space="preserve">;</w:t>
-      </w:r>
-      <w:r>
-        <w:t xml:space="preserve"> </w:t>
-      </w:r>
-      <w:r>
-        <w:t xml:space="preserve">). Burda et al.</w:t>
-      </w:r>
-      <w:r>
-        <w:t xml:space="preserve"> </w:t>
-      </w:r>
-      <w:r>
-        <w:t xml:space="preserve">() show that in rich countries men</w:t>
+        <w:t xml:space="preserve">(Gershuny, 2000;</w:t>
+      </w:r>
+      <w:r>
+        <w:t xml:space="preserve"> </w:t>
+      </w:r>
+      <w:r>
+        <w:t xml:space="preserve">Juster &amp; Stafford, 1991;</w:t>
+      </w:r>
+      <w:r>
+        <w:t xml:space="preserve"> </w:t>
+      </w:r>
+      <w:r>
+        <w:t xml:space="preserve">Robinson &amp; Godbey, 1997). Burda et al.</w:t>
+      </w:r>
+      <w:r>
+        <w:t xml:space="preserve"> </w:t>
+      </w:r>
+      <w:r>
+        <w:t xml:space="preserve">(2013) show that in rich countries men</w:t>
       </w:r>
       <w:r>
         <w:t xml:space="preserve"> </w:t>
@@ -1101,29 +1071,29 @@
         <w:t xml:space="preserve"> </w:t>
       </w:r>
       <w:r>
-        <w:t xml:space="preserve">(); married Americans have</w:t>
-      </w:r>
-      <w:r>
-        <w:t xml:space="preserve"> </w:t>
-      </w:r>
-      <w:r>
-        <w:t xml:space="preserve">fewer ties to kin, friends and neighbours than the never-married</w:t>
-      </w:r>
-      <w:r>
-        <w:t xml:space="preserve"> </w:t>
-      </w:r>
-      <w:r>
-        <w:t xml:space="preserve">().</w:t>
+        <w:t xml:space="preserve">(Coser, 1974); married Americans have</w:t>
+      </w:r>
+      <w:r>
+        <w:t xml:space="preserve"> </w:t>
+      </w:r>
+      <w:r>
+        <w:t xml:space="preserve">fewer ties to kin, friends and neighbors than the never-married</w:t>
+      </w:r>
+      <w:r>
+        <w:t xml:space="preserve"> </w:t>
+      </w:r>
+      <w:r>
+        <w:t xml:space="preserve">(Sarkisian &amp; Gerstel, 2016).</w:t>
       </w:r>
     </w:p>
     <w:bookmarkEnd w:id="11"/>
-    <w:bookmarkStart w:id="12" w:name="sleep-health-behaviour-and-marriage"/>
+    <w:bookmarkStart w:id="12" w:name="sleep-health-behavior-and-marriage"/>
     <w:p>
       <w:pPr>
         <w:pStyle w:val="Heading2"/>
       </w:pPr>
       <w:r>
-        <w:t xml:space="preserve">Sleep, health behaviour and</w:t>
+        <w:t xml:space="preserve">Sleep, health behavior and</w:t>
       </w:r>
       <w:r>
         <w:t xml:space="preserve"> </w:t>
@@ -1143,7 +1113,7 @@
         <w:t xml:space="preserve"> </w:t>
       </w:r>
       <w:r>
-        <w:t xml:space="preserve">Hamermesh () show that sleep</w:t>
+        <w:t xml:space="preserve">Hamermesh (1990) show that sleep</w:t>
       </w:r>
       <w:r>
         <w:t xml:space="preserve"> </w:t>
@@ -1161,61 +1131,25 @@
         <w:t xml:space="preserve"> </w:t>
       </w:r>
       <w:r>
-        <w:t xml:space="preserve">(). Gender matters</w:t>
-      </w:r>
-      <w:r>
-        <w:t xml:space="preserve"> </w:t>
-      </w:r>
-      <w:r>
-        <w:t xml:space="preserve">for sleep as well. Women’s sleep is more often interrupted by caregiving</w:t>
-      </w:r>
-      <w:r>
-        <w:t xml:space="preserve"> </w:t>
-      </w:r>
-      <w:r>
-        <w:t xml:space="preserve">(), and</w:t>
-      </w:r>
-      <w:r>
-        <w:t xml:space="preserve"> </w:t>
-      </w:r>
-      <w:r>
-        <w:t xml:space="preserve">qualitative studies describe a</w:t>
-      </w:r>
-      <w:r>
-        <w:t xml:space="preserve"> </w:t>
-      </w:r>
-      <w:r>
-        <w:t xml:space="preserve">“fourth shift”</w:t>
-      </w:r>
-      <w:r>
-        <w:t xml:space="preserve"> </w:t>
-      </w:r>
-      <w:r>
-        <w:t xml:space="preserve">of night-time care that</w:t>
-      </w:r>
-      <w:r>
-        <w:t xml:space="preserve"> </w:t>
-      </w:r>
-      <w:r>
-        <w:t xml:space="preserve">mothers rather than fathers carry (; ). If</w:t>
-      </w:r>
-      <w:r>
-        <w:t xml:space="preserve"> </w:t>
-      </w:r>
-      <w:r>
-        <w:t xml:space="preserve">marriage adds morning and evening domestic tasks (cooking before others</w:t>
-      </w:r>
-      <w:r>
-        <w:t xml:space="preserve"> </w:t>
-      </w:r>
-      <w:r>
-        <w:t xml:space="preserve">wake, cleaning up after others eat), sleep is a plausible margin of</w:t>
-      </w:r>
-      <w:r>
-        <w:t xml:space="preserve"> </w:t>
-      </w:r>
-      <w:r>
-        <w:t xml:space="preserve">adjustment.</w:t>
+        <w:t xml:space="preserve">(Basner et al., 2007). Gender matters</w:t>
+      </w:r>
+      <w:r>
+        <w:t xml:space="preserve"> </w:t>
+      </w:r>
+      <w:r>
+        <w:t xml:space="preserve">for sleep as well. If marriage adds morning and evening domestic tasks</w:t>
+      </w:r>
+      <w:r>
+        <w:t xml:space="preserve"> </w:t>
+      </w:r>
+      <w:r>
+        <w:t xml:space="preserve">(cooking before others wake, cleaning up after others eat), sleep is a</w:t>
+      </w:r>
+      <w:r>
+        <w:t xml:space="preserve"> </w:t>
+      </w:r>
+      <w:r>
+        <w:t xml:space="preserve">plausible margin of adjustment.</w:t>
       </w:r>
     </w:p>
     <w:p>
@@ -1223,43 +1157,13 @@
         <w:pStyle w:val="BodyText"/>
       </w:pPr>
       <w:r>
-        <w:t xml:space="preserve">Marriage is also associated with health behaviour and health</w:t>
-      </w:r>
-      <w:r>
-        <w:t xml:space="preserve"> </w:t>
-      </w:r>
-      <w:r>
-        <w:t xml:space="preserve">(;</w:t>
-      </w:r>
-      <w:r>
-        <w:t xml:space="preserve"> </w:t>
-      </w:r>
-      <w:r>
-        <w:t xml:space="preserve">), partly through selection</w:t>
-      </w:r>
-      <w:r>
-        <w:t xml:space="preserve"> </w:t>
-      </w:r>
-      <w:r>
-        <w:t xml:space="preserve">of the healthy into marriage</w:t>
-      </w:r>
-      <w:r>
-        <w:t xml:space="preserve"> </w:t>
-      </w:r>
-      <w:r>
-        <w:t xml:space="preserve">(), and with exercise</w:t>
-      </w:r>
-      <w:r>
-        <w:t xml:space="preserve"> </w:t>
-      </w:r>
-      <w:r>
-        <w:t xml:space="preserve">time in gendered ways (). Sleep, exercise and personal care fall in divisions 8</w:t>
-      </w:r>
-      <w:r>
-        <w:t xml:space="preserve"> </w:t>
-      </w:r>
-      <w:r>
-        <w:t xml:space="preserve">and 9, so their marriage gaps can be read against the gaps in work.</w:t>
+        <w:t xml:space="preserve">Sleep, exercise and personal care fall in divisions 8 and 9, so their</w:t>
+      </w:r>
+      <w:r>
+        <w:t xml:space="preserve"> </w:t>
+      </w:r>
+      <w:r>
+        <w:t xml:space="preserve">marriage gaps can be read against the gaps in work.</w:t>
       </w:r>
     </w:p>
     <w:bookmarkEnd w:id="12"/>
@@ -1295,13 +1199,13 @@
         <w:t xml:space="preserve"> </w:t>
       </w:r>
       <w:r>
-        <w:t xml:space="preserve">(;</w:t>
-      </w:r>
-      <w:r>
-        <w:t xml:space="preserve"> </w:t>
-      </w:r>
-      <w:r>
-        <w:t xml:space="preserve">). In a joint</w:t>
+        <w:t xml:space="preserve">(Dyson &amp; Moore, 1983;</w:t>
+      </w:r>
+      <w:r>
+        <w:t xml:space="preserve"> </w:t>
+      </w:r>
+      <w:r>
+        <w:t xml:space="preserve">Rahman &amp; Rao, 2004). In a joint</w:t>
       </w:r>
       <w:r>
         <w:t xml:space="preserve"> </w:t>
@@ -1313,7 +1217,7 @@
         <w:t xml:space="preserve"> </w:t>
       </w:r>
       <w:r>
-        <w:t xml:space="preserve">() describes a</w:t>
+        <w:t xml:space="preserve">(1988) describes a</w:t>
       </w:r>
       <w:r>
         <w:t xml:space="preserve"> </w:t>
@@ -1355,13 +1259,13 @@
         <w:t xml:space="preserve"> </w:t>
       </w:r>
       <w:r>
-        <w:t xml:space="preserve">(;</w:t>
-      </w:r>
-      <w:r>
-        <w:t xml:space="preserve"> </w:t>
-      </w:r>
-      <w:r>
-        <w:t xml:space="preserve">), and</w:t>
+        <w:t xml:space="preserve">(Debnath, 2015;</w:t>
+      </w:r>
+      <w:r>
+        <w:t xml:space="preserve"> </w:t>
+      </w:r>
+      <w:r>
+        <w:t xml:space="preserve">Khalil &amp; Mookerjee, 2019), and</w:t>
       </w:r>
       <w:r>
         <w:t xml:space="preserve"> </w:t>
@@ -1379,7 +1283,7 @@
         <w:t xml:space="preserve"> </w:t>
       </w:r>
       <w:r>
-        <w:t xml:space="preserve">(). Joint</w:t>
+        <w:t xml:space="preserve">(Anukriti et al., 2020). Joint</w:t>
       </w:r>
       <w:r>
         <w:t xml:space="preserve"> </w:t>
@@ -1423,7 +1327,7 @@
         <w:t xml:space="preserve"> </w:t>
       </w:r>
       <w:r>
-        <w:t xml:space="preserve">(); age</w:t>
+        <w:t xml:space="preserve">(Allendorf &amp; Pandian, 2016); age</w:t>
       </w:r>
       <w:r>
         <w:t xml:space="preserve"> </w:t>
@@ -1435,19 +1339,19 @@
         <w:t xml:space="preserve"> </w:t>
       </w:r>
       <w:r>
-        <w:t xml:space="preserve">(), labour-market</w:t>
-      </w:r>
-      <w:r>
-        <w:t xml:space="preserve"> </w:t>
-      </w:r>
-      <w:r>
-        <w:t xml:space="preserve">opportunity () and schooling</w:t>
-      </w:r>
-      <w:r>
-        <w:t xml:space="preserve"> </w:t>
-      </w:r>
-      <w:r>
-        <w:t xml:space="preserve">(). Women who remain</w:t>
+        <w:t xml:space="preserve">(Desai &amp; Andrist, 2010), labor-market</w:t>
+      </w:r>
+      <w:r>
+        <w:t xml:space="preserve"> </w:t>
+      </w:r>
+      <w:r>
+        <w:t xml:space="preserve">opportunity (Jensen, 2012) and schooling</w:t>
+      </w:r>
+      <w:r>
+        <w:t xml:space="preserve"> </w:t>
+      </w:r>
+      <w:r>
+        <w:t xml:space="preserve">(Field &amp; Ambrus, 2008). Women who remain</w:t>
       </w:r>
       <w:r>
         <w:t xml:space="preserve"> </w:t>
@@ -1479,49 +1383,55 @@
         <w:t xml:space="preserve"> </w:t>
       </w:r>
       <w:r>
-        <w:t xml:space="preserve">(;</w:t>
-      </w:r>
-      <w:r>
-        <w:t xml:space="preserve"> </w:t>
-      </w:r>
-      <w:r>
-        <w:t xml:space="preserve">;</w:t>
-      </w:r>
-      <w:r>
-        <w:t xml:space="preserve"> </w:t>
-      </w:r>
-      <w:r>
-        <w:t xml:space="preserve">), with</w:t>
-      </w:r>
-      <w:r>
-        <w:t xml:space="preserve"> </w:t>
-      </w:r>
-      <w:r>
-        <w:t xml:space="preserve">explanations ranging from rising incomes and labour demand to status and</w:t>
-      </w:r>
-      <w:r>
-        <w:t xml:space="preserve"> </w:t>
-      </w:r>
-      <w:r>
-        <w:t xml:space="preserve">mobility norms (; ;</w:t>
-      </w:r>
-      <w:r>
-        <w:t xml:space="preserve"> </w:t>
-      </w:r>
-      <w:r>
-        <w:t xml:space="preserve">;</w:t>
-      </w:r>
-      <w:r>
-        <w:t xml:space="preserve"> </w:t>
-      </w:r>
-      <w:r>
-        <w:t xml:space="preserve">;</w:t>
-      </w:r>
-      <w:r>
-        <w:t xml:space="preserve"> </w:t>
-      </w:r>
-      <w:r>
-        <w:t xml:space="preserve">). Women</w:t>
+        <w:t xml:space="preserve">(Afridi et al., 2018;</w:t>
+      </w:r>
+      <w:r>
+        <w:t xml:space="preserve"> </w:t>
+      </w:r>
+      <w:r>
+        <w:t xml:space="preserve">Fletcher et al., 2017;</w:t>
+      </w:r>
+      <w:r>
+        <w:t xml:space="preserve"> </w:t>
+      </w:r>
+      <w:r>
+        <w:t xml:space="preserve">Mehrotra &amp; Parida, 2017), with</w:t>
+      </w:r>
+      <w:r>
+        <w:t xml:space="preserve"> </w:t>
+      </w:r>
+      <w:r>
+        <w:t xml:space="preserve">explanations ranging from rising incomes and labor demand to status and</w:t>
+      </w:r>
+      <w:r>
+        <w:t xml:space="preserve"> </w:t>
+      </w:r>
+      <w:r>
+        <w:t xml:space="preserve">mobility norms (Dhanaraj &amp; Mahambare,</w:t>
+      </w:r>
+      <w:r>
+        <w:t xml:space="preserve"> </w:t>
+      </w:r>
+      <w:r>
+        <w:t xml:space="preserve">2019; Eswaran et al., 2013;</w:t>
+      </w:r>
+      <w:r>
+        <w:t xml:space="preserve"> </w:t>
+      </w:r>
+      <w:r>
+        <w:t xml:space="preserve">Field et al., 2021;</w:t>
+      </w:r>
+      <w:r>
+        <w:t xml:space="preserve"> </w:t>
+      </w:r>
+      <w:r>
+        <w:t xml:space="preserve">Jayachandran, 2021;</w:t>
+      </w:r>
+      <w:r>
+        <w:t xml:space="preserve"> </w:t>
+      </w:r>
+      <w:r>
+        <w:t xml:space="preserve">Klasen &amp; Pieters, 2015). Women</w:t>
       </w:r>
       <w:r>
         <w:t xml:space="preserve"> </w:t>
@@ -1533,7 +1443,7 @@
         <w:t xml:space="preserve"> </w:t>
       </w:r>
       <w:r>
-        <w:t xml:space="preserve">(). If</w:t>
+        <w:t xml:space="preserve">(Hirway &amp; Jose, 2011). If</w:t>
       </w:r>
       <w:r>
         <w:t xml:space="preserve"> </w:t>
@@ -1612,7 +1522,7 @@
         <w:t xml:space="preserve"> </w:t>
       </w:r>
       <w:r>
-        <w:t xml:space="preserve">Specialisation, bargaining with gendered threat points, doing gender and</w:t>
+        <w:t xml:space="preserve">Specialization, bargaining with gendered threat points, doing gender and</w:t>
       </w:r>
       <w:r>
         <w:t xml:space="preserve"> </w:t>
@@ -1636,7 +1546,7 @@
         <w:t xml:space="preserve"> </w:t>
       </w:r>
       <w:r>
-        <w:t xml:space="preserve">Specialisation</w:t>
+        <w:t xml:space="preserve">Specialization</w:t>
       </w:r>
       <w:r>
         <w:t xml:space="preserve"> </w:t>
@@ -1672,7 +1582,13 @@
         <w:t xml:space="preserve"> </w:t>
       </w:r>
       <w:r>
-        <w:t xml:space="preserve">has a biological floor (; ), I</w:t>
+        <w:t xml:space="preserve">has a biological floor (Basner et al.,</w:t>
+      </w:r>
+      <w:r>
+        <w:t xml:space="preserve"> </w:t>
+      </w:r>
+      <w:r>
+        <w:t xml:space="preserve">2007; Biddle &amp; Hamermesh, 1990), I</w:t>
       </w:r>
       <w:r>
         <w:t xml:space="preserve"> </w:t>
@@ -1720,7 +1636,13 @@
         <w:t xml:space="preserve"> </w:t>
       </w:r>
       <w:r>
-        <w:t xml:space="preserve">restricts her movement (; ),</w:t>
+        <w:t xml:space="preserve">restricts her movement (Anukriti et</w:t>
+      </w:r>
+      <w:r>
+        <w:t xml:space="preserve"> </w:t>
+      </w:r>
+      <w:r>
+        <w:t xml:space="preserve">al., 2020; Kandiyoti, 1988),</w:t>
       </w:r>
       <w:r>
         <w:t xml:space="preserve"> </w:t>
@@ -1780,7 +1702,7 @@
         <w:t xml:space="preserve"> </w:t>
       </w:r>
       <w:r>
-        <w:t xml:space="preserve">marry young ().</w:t>
+        <w:t xml:space="preserve">marry young (Desai &amp; Andrist, 2010).</w:t>
       </w:r>
       <w:r>
         <w:t xml:space="preserve"> </w:t>
@@ -1798,13 +1720,13 @@
         <w:t xml:space="preserve"> </w:t>
       </w:r>
       <w:r>
-        <w:t xml:space="preserve">(;</w:t>
-      </w:r>
-      <w:r>
-        <w:t xml:space="preserve"> </w:t>
-      </w:r>
-      <w:r>
-        <w:t xml:space="preserve">).</w:t>
+        <w:t xml:space="preserve">(Brines, 1994;</w:t>
+      </w:r>
+      <w:r>
+        <w:t xml:space="preserve"> </w:t>
+      </w:r>
+      <w:r>
+        <w:t xml:space="preserve">Greenstein, 2000).</w:t>
       </w:r>
     </w:p>
     <w:bookmarkEnd w:id="15"/>
@@ -1843,13 +1765,13 @@
         <w:t xml:space="preserve"> </w:t>
       </w:r>
       <w:r>
-        <w:t xml:space="preserve">() uses the</w:t>
-      </w:r>
-      <w:r>
-        <w:t xml:space="preserve"> </w:t>
-      </w:r>
-      <w:r>
-        <w:t xml:space="preserve">same design, and with a harmonised specification (age, state, diary day</w:t>
+        <w:t xml:space="preserve">(National Statistical Office, 2020) uses the</w:t>
+      </w:r>
+      <w:r>
+        <w:t xml:space="preserve"> </w:t>
+      </w:r>
+      <w:r>
+        <w:t xml:space="preserve">same design, and with a harmonized specification (age, state, diary day</w:t>
       </w:r>
       <w:r>
         <w:t xml:space="preserve"> </w:t>
@@ -1897,7 +1819,7 @@
         <w:t xml:space="preserve"> </w:t>
       </w:r>
       <w:r>
-        <w:t xml:space="preserve">().</w:t>
+        <w:t xml:space="preserve">(National Statistics Office, 2025).</w:t>
       </w:r>
       <w:r>
         <w:t xml:space="preserve"> </w:t>
@@ -1909,7 +1831,7 @@
         <w:t xml:space="preserve"> </w:t>
       </w:r>
       <w:r>
-        <w:t xml:space="preserve">().</w:t>
+        <w:t xml:space="preserve">(United Nations Statistics Division, 2016).</w:t>
       </w:r>
       <w:r>
         <w:t xml:space="preserve"> </w:t>
@@ -1981,13 +1903,13 @@
         <w:t xml:space="preserve"> </w:t>
       </w:r>
       <w:r>
-        <w:t xml:space="preserve">(;</w:t>
-      </w:r>
-      <w:r>
-        <w:t xml:space="preserve"> </w:t>
-      </w:r>
-      <w:r>
-        <w:t xml:space="preserve">).</w:t>
+        <w:t xml:space="preserve">(Abadie et al., 2023;</w:t>
+      </w:r>
+      <w:r>
+        <w:t xml:space="preserve"> </w:t>
+      </w:r>
+      <w:r>
+        <w:t xml:space="preserve">Solon et al., 2015).</w:t>
       </w:r>
     </w:p>
     <w:bookmarkEnd w:id="16"/>
@@ -2133,7 +2055,7 @@
         <w:t xml:space="preserve"> </w:t>
       </w:r>
       <w:r>
-        <w:t xml:space="preserve">caregiving for household members, volunteering, learning, socialising</w:t>
+        <w:t xml:space="preserve">caregiving for household members, volunteering, learning, socializing</w:t>
       </w:r>
       <w:r>
         <w:t xml:space="preserve"> </w:t>
@@ -2163,7 +2085,7 @@
         <w:t xml:space="preserve"> </w:t>
       </w:r>
       <w:r>
-        <w:t xml:space="preserve">indicator 5.4.1. Sub-rows report sleep, socialising (talking and getting</w:t>
+        <w:t xml:space="preserve">indicator 5.4.1. Sub-rows report sleep, socializing (talking and getting</w:t>
       </w:r>
       <w:r>
         <w:t xml:space="preserve"> </w:t>
@@ -2853,7 +2775,7 @@
         <w:t xml:space="preserve"> </w:t>
       </w:r>
       <w:r>
-        <w:t xml:space="preserve">(). The weights are</w:t>
+        <w:t xml:space="preserve">(DiNardo et al., 1996). The weights are</w:t>
       </w:r>
       <w:r>
         <w:t xml:space="preserve"> </w:t>
@@ -2871,13 +2793,13 @@
         <w:t xml:space="preserve"> </w:t>
       </w:r>
       <w:r>
-        <w:t xml:space="preserve">(;</w:t>
-      </w:r>
-      <w:r>
-        <w:t xml:space="preserve"> </w:t>
-      </w:r>
-      <w:r>
-        <w:t xml:space="preserve">), with</w:t>
+        <w:t xml:space="preserve">(Imbens, 2004;</w:t>
+      </w:r>
+      <w:r>
+        <w:t xml:space="preserve"> </w:t>
+      </w:r>
+      <w:r>
+        <w:t xml:space="preserve">Rosenbaum &amp; Rubin, 1983), with</w:t>
       </w:r>
       <w:r>
         <w:t xml:space="preserve"> </w:t>
@@ -3005,13 +2927,13 @@
         <w:t xml:space="preserve"> </w:t>
       </w:r>
       <w:r>
-        <w:t xml:space="preserve">(;</w:t>
-      </w:r>
-      <w:r>
-        <w:t xml:space="preserve"> </w:t>
-      </w:r>
-      <w:r>
-        <w:t xml:space="preserve">). (4) I estimate the</w:t>
+        <w:t xml:space="preserve">(Altonji et al., 2005;</w:t>
+      </w:r>
+      <w:r>
+        <w:t xml:space="preserve"> </w:t>
+      </w:r>
+      <w:r>
+        <w:t xml:space="preserve">Oster, 2019). (4) I estimate the</w:t>
       </w:r>
       <w:r>
         <w:t xml:space="preserve"> </w:t>
@@ -3091,7 +3013,7 @@
         <w:t xml:space="preserve"> </w:t>
       </w:r>
       <w:r>
-        <w:t xml:space="preserve">division of labour within marriage, not the effect of marriage, and the</w:t>
+        <w:t xml:space="preserve">division of labor within marriage, not the effect of marriage, and the</w:t>
       </w:r>
       <w:r>
         <w:t xml:space="preserve"> </w:t>
@@ -3561,7 +3483,7 @@
               <w:jc w:val="left"/>
             </w:pPr>
             <w:r>
-              <w:t xml:space="preserve">Socialising, community, religion, min</w:t>
+              <w:t xml:space="preserve">Socializing, community, religion, min</w:t>
             </w:r>
           </w:p>
         </w:tc>
@@ -4640,7 +4562,7 @@
               <w:jc w:val="left"/>
             </w:pPr>
             <w:r>
-              <w:t xml:space="preserve">Socialising, community, religion</w:t>
+              <w:t xml:space="preserve">Socializing, community, religion</w:t>
             </w:r>
           </w:p>
         </w:tc>
@@ -4845,7 +4767,7 @@
               <w:jc w:val="left"/>
             </w:pPr>
             <w:r>
-              <w:t xml:space="preserve">of which: socialising</w:t>
+              <w:t xml:space="preserve">of which: socializing</w:t>
             </w:r>
           </w:p>
         </w:tc>
@@ -5241,7 +5163,7 @@
         <w:t xml:space="preserve"> </w:t>
       </w:r>
       <w:r>
-        <w:t xml:space="preserve">reductions, socialising and leisure for 17%, and self-care for 10%.</w:t>
+        <w:t xml:space="preserve">reductions, socializing and leisure for 17%, and self-care for 10%.</w:t>
       </w:r>
       <w:r>
         <w:t xml:space="preserve"> </w:t>
@@ -5253,7 +5175,7 @@
         <w:t xml:space="preserve"> </w:t>
       </w:r>
       <w:r>
-        <w:t xml:space="preserve">the specialisation account (H2a) than to a squeeze on free time.</w:t>
+        <w:t xml:space="preserve">the specialization account (H2a) than to a squeeze on free time.</w:t>
       </w:r>
     </w:p>
     <w:p>
@@ -5285,7 +5207,7 @@
         <w:t xml:space="preserve"> </w:t>
       </w:r>
       <w:r>
-        <w:t xml:space="preserve">(SE 1.4). The coefficients for socialising, exercise and sport, and</w:t>
+        <w:t xml:space="preserve">(SE 1.4). The coefficients for socializing, exercise and sport, and</w:t>
       </w:r>
       <w:r>
         <w:t xml:space="preserve"> </w:t>
@@ -5369,7 +5291,7 @@
         <w:t xml:space="preserve"> </w:t>
       </w:r>
       <w:r>
-        <w:t xml:space="preserve">less employment, 0.8 minutes (SE 1.1) more socialising, community and</w:t>
+        <w:t xml:space="preserve">less employment, 0.8 minutes (SE 1.1) more socializing, community and</w:t>
       </w:r>
       <w:r>
         <w:t xml:space="preserve"> </w:t>
@@ -5437,7 +5359,7 @@
         <w:t xml:space="preserve"> </w:t>
       </w:r>
       <w:r>
-        <w:t xml:space="preserve">().</w:t>
+        <w:t xml:space="preserve">(Debnath, 2015).</w:t>
       </w:r>
     </w:p>
     <w:bookmarkEnd w:id="25"/>
@@ -6016,7 +5938,7 @@
               <w:jc w:val="left"/>
             </w:pPr>
             <w:r>
-              <w:t xml:space="preserve">Socialising, community, religion</w:t>
+              <w:t xml:space="preserve">Socializing, community, religion</w:t>
             </w:r>
           </w:p>
         </w:tc>
@@ -6483,7 +6405,13 @@
         <w:t xml:space="preserve"> </w:t>
       </w:r>
       <w:r>
-        <w:t xml:space="preserve">268.6 minutes (SE 3.1) (3,842) (). The learning and employment coefficients move more across</w:t>
+        <w:t xml:space="preserve">268.6 minutes (SE 3.1) (3,842) (Crump et</w:t>
+      </w:r>
+      <w:r>
+        <w:t xml:space="preserve"> </w:t>
+      </w:r>
+      <w:r>
+        <w:t xml:space="preserve">al., 2009). The learning and employment coefficients move more across</w:t>
       </w:r>
       <w:r>
         <w:t xml:space="preserve"> </w:t>
@@ -6556,7 +6484,7 @@
         <w:t xml:space="preserve"> </w:t>
       </w:r>
       <w:r>
-        <w:t xml:space="preserve">largest absolute standardised difference across the covariates in Table</w:t>
+        <w:t xml:space="preserve">largest absolute standardized difference across the covariates in Table</w:t>
       </w:r>
       <w:r>
         <w:t xml:space="preserve"> </w:t>
@@ -8185,13 +8113,13 @@
         <w:t xml:space="preserve"> </w:t>
       </w:r>
       <w:r>
-        <w:t xml:space="preserve">(;</w:t>
-      </w:r>
-      <w:r>
-        <w:t xml:space="preserve"> </w:t>
-      </w:r>
-      <w:r>
-        <w:t xml:space="preserve">).</w:t>
+        <w:t xml:space="preserve">(Desai &amp; Andrist, 2010;</w:t>
+      </w:r>
+      <w:r>
+        <w:t xml:space="preserve"> </w:t>
+      </w:r>
+      <w:r>
+        <w:t xml:space="preserve">Field &amp; Ambrus, 2008).</w:t>
       </w:r>
     </w:p>
     <w:bookmarkEnd w:id="29"/>
@@ -8408,7 +8336,7 @@
         <w:t xml:space="preserve"> </w:t>
       </w:r>
       <w:r>
-        <w:t xml:space="preserve">learning, which fits the specialisation account, but specialisation in</w:t>
+        <w:t xml:space="preserve">learning, which fits the specialization account, but specialization in</w:t>
       </w:r>
       <w:r>
         <w:t xml:space="preserve"> </w:t>
@@ -8464,13 +8392,13 @@
         <w:t xml:space="preserve"> </w:t>
       </w:r>
       <w:r>
-        <w:t xml:space="preserve">(;</w:t>
-      </w:r>
-      <w:r>
-        <w:t xml:space="preserve"> </w:t>
-      </w:r>
-      <w:r>
-        <w:t xml:space="preserve">). Third,</w:t>
+        <w:t xml:space="preserve">(Anukriti et al., 2020;</w:t>
+      </w:r>
+      <w:r>
+        <w:t xml:space="preserve"> </w:t>
+      </w:r>
+      <w:r>
+        <w:t xml:space="preserve">Khalil &amp; Mookerjee, 2019). Third,</w:t>
       </w:r>
       <w:r>
         <w:t xml:space="preserve"> </w:t>
@@ -8514,13 +8442,13 @@
         <w:t xml:space="preserve"> </w:t>
       </w:r>
       <w:r>
-        <w:t xml:space="preserve">(;</w:t>
-      </w:r>
-      <w:r>
-        <w:t xml:space="preserve"> </w:t>
-      </w:r>
-      <w:r>
-        <w:t xml:space="preserve">).</w:t>
+        <w:t xml:space="preserve">(Ridgeway &amp; Correll, 2004;</w:t>
+      </w:r>
+      <w:r>
+        <w:t xml:space="preserve"> </w:t>
+      </w:r>
+      <w:r>
+        <w:t xml:space="preserve">Risman, 2004).</w:t>
       </w:r>
     </w:p>
     <w:bookmarkStart w:id="33" w:name="limitations"/>
@@ -8657,13 +8585,13 @@
         <w:t xml:space="preserve"> </w:t>
       </w:r>
       <w:r>
-        <w:t xml:space="preserve">(;</w:t>
-      </w:r>
-      <w:r>
-        <w:t xml:space="preserve"> </w:t>
-      </w:r>
-      <w:r>
-        <w:t xml:space="preserve">). The check</w:t>
+        <w:t xml:space="preserve">(Baxter et al., 2008;</w:t>
+      </w:r>
+      <w:r>
+        <w:t xml:space="preserve"> </w:t>
+      </w:r>
+      <w:r>
+        <w:t xml:space="preserve">Sanchez &amp; Thomson, 1997). The check</w:t>
       </w:r>
       <w:r>
         <w:t xml:space="preserve"> </w:t>
@@ -8687,7 +8615,7 @@
         <w:t xml:space="preserve"> </w:t>
       </w:r>
       <w:r>
-        <w:t xml:space="preserve">().</w:t>
+        <w:t xml:space="preserve">(2019).</w:t>
       </w:r>
     </w:p>
     <w:bookmarkEnd w:id="33"/>
@@ -8838,7 +8766,7 @@
         <w:t xml:space="preserve"> </w:t>
       </w:r>
       <w:r>
-        <w:t xml:space="preserve">Government of India (microdata.gov.in, catalogue 236), to registered</w:t>
+        <w:t xml:space="preserve">Government of India (microdata.gov.in, catalog 236), to registered</w:t>
       </w:r>
       <w:r>
         <w:t xml:space="preserve"> </w:t>
@@ -8854,7 +8782,7 @@
       </w:r>
     </w:p>
     <w:bookmarkEnd w:id="37"/>
-    <w:bookmarkStart w:id="104" w:name="references"/>
+    <w:bookmarkStart w:id="97" w:name="references"/>
     <w:p>
       <w:pPr>
         <w:pStyle w:val="Heading1"/>
@@ -10215,23 +10143,23 @@
         <w:pStyle w:val="BodyText"/>
       </w:pPr>
       <w:r>
-        <w:t xml:space="preserve">Davis, S. N., &amp; Greenstein, T. N. (2009). Gender ideology: Components,</w:t>
-      </w:r>
-      <w:r>
-        <w:t xml:space="preserve"> </w:t>
-      </w:r>
-      <w:r>
-        <w:t xml:space="preserve">predictors, and consequences.</w:t>
-      </w:r>
-      <w:r>
-        <w:t xml:space="preserve"> </w:t>
-      </w:r>
-      <w:r>
-        <w:rPr>
-          <w:i/>
-          <w:iCs/>
-        </w:rPr>
-        <w:t xml:space="preserve">Annual Review of Sociology</w:t>
+        <w:t xml:space="preserve">Debnath, S. (2015). The impact of household structure on female autonomy</w:t>
+      </w:r>
+      <w:r>
+        <w:t xml:space="preserve"> </w:t>
+      </w:r>
+      <w:r>
+        <w:t xml:space="preserve">in developing countries.</w:t>
+      </w:r>
+      <w:r>
+        <w:t xml:space="preserve"> </w:t>
+      </w:r>
+      <w:r>
+        <w:rPr>
+          <w:i/>
+          <w:iCs/>
+        </w:rPr>
+        <w:t xml:space="preserve">Journal of Development Studies</w:t>
       </w:r>
       <w:r>
         <w:t xml:space="preserve">,</w:t>
@@ -10244,66 +10172,15 @@
           <w:i/>
           <w:iCs/>
         </w:rPr>
-        <w:t xml:space="preserve">35</w:t>
-      </w:r>
-      <w:r>
-        <w:t xml:space="preserve">, 87–105.</w:t>
+        <w:t xml:space="preserve">51</w:t>
+      </w:r>
+      <w:r>
+        <w:t xml:space="preserve">(5), 485–502.</w:t>
       </w:r>
       <w:r>
         <w:t xml:space="preserve"> </w:t>
       </w:r>
       <w:hyperlink r:id="rId59">
-        <w:r>
-          <w:rPr>
-            <w:rStyle w:val="Hyperlink"/>
-          </w:rPr>
-          <w:t xml:space="preserve">https://doi.org/10.1146/annurev-soc-070308-115920</w:t>
-        </w:r>
-      </w:hyperlink>
-    </w:p>
-    <w:p>
-      <w:pPr>
-        <w:pStyle w:val="BodyText"/>
-      </w:pPr>
-      <w:r>
-        <w:t xml:space="preserve">Debnath, S. (2015). The impact of household structure on female autonomy</w:t>
-      </w:r>
-      <w:r>
-        <w:t xml:space="preserve"> </w:t>
-      </w:r>
-      <w:r>
-        <w:t xml:space="preserve">in developing countries.</w:t>
-      </w:r>
-      <w:r>
-        <w:t xml:space="preserve"> </w:t>
-      </w:r>
-      <w:r>
-        <w:rPr>
-          <w:i/>
-          <w:iCs/>
-        </w:rPr>
-        <w:t xml:space="preserve">Journal of Development Studies</w:t>
-      </w:r>
-      <w:r>
-        <w:t xml:space="preserve">,</w:t>
-      </w:r>
-      <w:r>
-        <w:t xml:space="preserve"> </w:t>
-      </w:r>
-      <w:r>
-        <w:rPr>
-          <w:i/>
-          <w:iCs/>
-        </w:rPr>
-        <w:t xml:space="preserve">51</w:t>
-      </w:r>
-      <w:r>
-        <w:t xml:space="preserve">(5), 485–502.</w:t>
-      </w:r>
-      <w:r>
-        <w:t xml:space="preserve"> </w:t>
-      </w:r>
-      <w:hyperlink r:id="rId60">
         <w:r>
           <w:rPr>
             <w:rStyle w:val="Hyperlink"/>
@@ -10357,7 +10234,7 @@
       <w:r>
         <w:t xml:space="preserve"> </w:t>
       </w:r>
-      <w:hyperlink r:id="rId61">
+      <w:hyperlink r:id="rId60">
         <w:r>
           <w:rPr>
             <w:rStyle w:val="Hyperlink"/>
@@ -10417,7 +10294,7 @@
       <w:r>
         <w:t xml:space="preserve"> </w:t>
       </w:r>
-      <w:hyperlink r:id="rId62">
+      <w:hyperlink r:id="rId61">
         <w:r>
           <w:rPr>
             <w:rStyle w:val="Hyperlink"/>
@@ -10474,7 +10351,7 @@
       <w:r>
         <w:t xml:space="preserve"> </w:t>
       </w:r>
-      <w:hyperlink r:id="rId63">
+      <w:hyperlink r:id="rId62">
         <w:r>
           <w:rPr>
             <w:rStyle w:val="Hyperlink"/>
@@ -10548,7 +10425,7 @@
       <w:r>
         <w:t xml:space="preserve"> </w:t>
       </w:r>
-      <w:hyperlink r:id="rId64">
+      <w:hyperlink r:id="rId63">
         <w:r>
           <w:rPr>
             <w:rStyle w:val="Hyperlink"/>
@@ -10622,7 +10499,7 @@
       <w:r>
         <w:t xml:space="preserve"> </w:t>
       </w:r>
-      <w:hyperlink r:id="rId65">
+      <w:hyperlink r:id="rId64">
         <w:r>
           <w:rPr>
             <w:rStyle w:val="Hyperlink"/>
@@ -10696,7 +10573,7 @@
       <w:r>
         <w:t xml:space="preserve"> </w:t>
       </w:r>
-      <w:hyperlink r:id="rId66">
+      <w:hyperlink r:id="rId65">
         <w:r>
           <w:rPr>
             <w:rStyle w:val="Hyperlink"/>
@@ -10753,7 +10630,7 @@
       <w:r>
         <w:t xml:space="preserve"> </w:t>
       </w:r>
-      <w:hyperlink r:id="rId67">
+      <w:hyperlink r:id="rId66">
         <w:r>
           <w:rPr>
             <w:rStyle w:val="Hyperlink"/>
@@ -10812,23 +10689,58 @@
         <w:pStyle w:val="BodyText"/>
       </w:pPr>
       <w:r>
-        <w:t xml:space="preserve">Fuwa, M. (2004). Macro-level gender inequality and the division of</w:t>
-      </w:r>
-      <w:r>
-        <w:t xml:space="preserve"> </w:t>
-      </w:r>
-      <w:r>
-        <w:t xml:space="preserve">household labor in 22 countries.</w:t>
-      </w:r>
-      <w:r>
-        <w:t xml:space="preserve"> </w:t>
-      </w:r>
-      <w:r>
-        <w:rPr>
-          <w:i/>
-          <w:iCs/>
-        </w:rPr>
-        <w:t xml:space="preserve">American Sociological Review</w:t>
+        <w:t xml:space="preserve">Gershuny, J. (2000).</w:t>
+      </w:r>
+      <w:r>
+        <w:t xml:space="preserve"> </w:t>
+      </w:r>
+      <w:r>
+        <w:rPr>
+          <w:i/>
+          <w:iCs/>
+        </w:rPr>
+        <w:t xml:space="preserve">Changing times: Work and leisure in</w:t>
+      </w:r>
+      <w:r>
+        <w:rPr>
+          <w:i/>
+          <w:iCs/>
+        </w:rPr>
+        <w:t xml:space="preserve"> </w:t>
+      </w:r>
+      <w:r>
+        <w:rPr>
+          <w:i/>
+          <w:iCs/>
+        </w:rPr>
+        <w:t xml:space="preserve">postindustrial society</w:t>
+      </w:r>
+      <w:r>
+        <w:t xml:space="preserve">. Oxford University Press.</w:t>
+      </w:r>
+    </w:p>
+    <w:p>
+      <w:pPr>
+        <w:pStyle w:val="BodyText"/>
+      </w:pPr>
+      <w:r>
+        <w:t xml:space="preserve">Goldman, N. (1993). Marriage selection and mortality patterns:</w:t>
+      </w:r>
+      <w:r>
+        <w:t xml:space="preserve"> </w:t>
+      </w:r>
+      <w:r>
+        <w:t xml:space="preserve">Inferences and fallacies.</w:t>
+      </w:r>
+      <w:r>
+        <w:t xml:space="preserve"> </w:t>
+      </w:r>
+      <w:r>
+        <w:rPr>
+          <w:i/>
+          <w:iCs/>
+        </w:rPr>
+        <w:t xml:space="preserve">Demography</w:t>
       </w:r>
       <w:r>
         <w:t xml:space="preserve">,</w:t>
@@ -10841,92 +10753,6 @@
           <w:i/>
           <w:iCs/>
         </w:rPr>
-        <w:t xml:space="preserve">69</w:t>
-      </w:r>
-      <w:r>
-        <w:t xml:space="preserve">(6), 751–767.</w:t>
-      </w:r>
-      <w:r>
-        <w:t xml:space="preserve"> </w:t>
-      </w:r>
-      <w:hyperlink r:id="rId68">
-        <w:r>
-          <w:rPr>
-            <w:rStyle w:val="Hyperlink"/>
-          </w:rPr>
-          <w:t xml:space="preserve">https://doi.org/10.1177/000312240406900601</w:t>
-        </w:r>
-      </w:hyperlink>
-    </w:p>
-    <w:p>
-      <w:pPr>
-        <w:pStyle w:val="BodyText"/>
-      </w:pPr>
-      <w:r>
-        <w:t xml:space="preserve">Gershuny, J. (2000).</w:t>
-      </w:r>
-      <w:r>
-        <w:t xml:space="preserve"> </w:t>
-      </w:r>
-      <w:r>
-        <w:rPr>
-          <w:i/>
-          <w:iCs/>
-        </w:rPr>
-        <w:t xml:space="preserve">Changing times: Work and leisure in</w:t>
-      </w:r>
-      <w:r>
-        <w:rPr>
-          <w:i/>
-          <w:iCs/>
-        </w:rPr>
-        <w:t xml:space="preserve"> </w:t>
-      </w:r>
-      <w:r>
-        <w:rPr>
-          <w:i/>
-          <w:iCs/>
-        </w:rPr>
-        <w:t xml:space="preserve">postindustrial society</w:t>
-      </w:r>
-      <w:r>
-        <w:t xml:space="preserve">. Oxford University Press.</w:t>
-      </w:r>
-    </w:p>
-    <w:p>
-      <w:pPr>
-        <w:pStyle w:val="BodyText"/>
-      </w:pPr>
-      <w:r>
-        <w:t xml:space="preserve">Goldman, N. (1993). Marriage selection and mortality patterns:</w:t>
-      </w:r>
-      <w:r>
-        <w:t xml:space="preserve"> </w:t>
-      </w:r>
-      <w:r>
-        <w:t xml:space="preserve">Inferences and fallacies.</w:t>
-      </w:r>
-      <w:r>
-        <w:t xml:space="preserve"> </w:t>
-      </w:r>
-      <w:r>
-        <w:rPr>
-          <w:i/>
-          <w:iCs/>
-        </w:rPr>
-        <w:t xml:space="preserve">Demography</w:t>
-      </w:r>
-      <w:r>
-        <w:t xml:space="preserve">,</w:t>
-      </w:r>
-      <w:r>
-        <w:t xml:space="preserve"> </w:t>
-      </w:r>
-      <w:r>
-        <w:rPr>
-          <w:i/>
-          <w:iCs/>
-        </w:rPr>
         <w:t xml:space="preserve">30</w:t>
       </w:r>
       <w:r>
@@ -10935,7 +10761,7 @@
       <w:r>
         <w:t xml:space="preserve"> </w:t>
       </w:r>
-      <w:hyperlink r:id="rId69">
+      <w:hyperlink r:id="rId67">
         <w:r>
           <w:rPr>
             <w:rStyle w:val="Hyperlink"/>
@@ -11000,7 +10826,7 @@
       <w:r>
         <w:t xml:space="preserve"> </w:t>
       </w:r>
-      <w:hyperlink r:id="rId70">
+      <w:hyperlink r:id="rId68">
         <w:r>
           <w:rPr>
             <w:rStyle w:val="Hyperlink"/>
@@ -11051,7 +10877,7 @@
       <w:r>
         <w:t xml:space="preserve"> </w:t>
       </w:r>
-      <w:hyperlink r:id="rId71">
+      <w:hyperlink r:id="rId69">
         <w:r>
           <w:rPr>
             <w:rStyle w:val="Hyperlink"/>
@@ -11102,7 +10928,7 @@
       <w:r>
         <w:t xml:space="preserve"> </w:t>
       </w:r>
-      <w:hyperlink r:id="rId72">
+      <w:hyperlink r:id="rId70">
         <w:r>
           <w:rPr>
             <w:rStyle w:val="Hyperlink"/>
@@ -11167,7 +10993,7 @@
       <w:r>
         <w:t xml:space="preserve"> </w:t>
       </w:r>
-      <w:hyperlink r:id="rId73">
+      <w:hyperlink r:id="rId71">
         <w:r>
           <w:rPr>
             <w:rStyle w:val="Hyperlink"/>
@@ -11227,7 +11053,7 @@
       <w:r>
         <w:t xml:space="preserve"> </w:t>
       </w:r>
-      <w:hyperlink r:id="rId74">
+      <w:hyperlink r:id="rId72">
         <w:r>
           <w:rPr>
             <w:rStyle w:val="Hyperlink"/>
@@ -11241,23 +11067,37 @@
         <w:pStyle w:val="BodyText"/>
       </w:pPr>
       <w:r>
-        <w:t xml:space="preserve">Hook, J. L. (2006). Care in context: Men’s unpaid work in 20 countries,</w:t>
-      </w:r>
-      <w:r>
-        <w:t xml:space="preserve"> </w:t>
-      </w:r>
-      <w:r>
-        <w:t xml:space="preserve">1965–2003.</w:t>
-      </w:r>
-      <w:r>
-        <w:t xml:space="preserve"> </w:t>
-      </w:r>
-      <w:r>
-        <w:rPr>
-          <w:i/>
-          <w:iCs/>
-        </w:rPr>
-        <w:t xml:space="preserve">American Sociological Review</w:t>
+        <w:t xml:space="preserve">Imbens, G. W. (2004). Nonparametric estimation of average treatment</w:t>
+      </w:r>
+      <w:r>
+        <w:t xml:space="preserve"> </w:t>
+      </w:r>
+      <w:r>
+        <w:t xml:space="preserve">effects under exogeneity: A review.</w:t>
+      </w:r>
+      <w:r>
+        <w:t xml:space="preserve"> </w:t>
+      </w:r>
+      <w:r>
+        <w:rPr>
+          <w:i/>
+          <w:iCs/>
+        </w:rPr>
+        <w:t xml:space="preserve">Review of Economics and</w:t>
+      </w:r>
+      <w:r>
+        <w:rPr>
+          <w:i/>
+          <w:iCs/>
+        </w:rPr>
+        <w:t xml:space="preserve"> </w:t>
+      </w:r>
+      <w:r>
+        <w:rPr>
+          <w:i/>
+          <w:iCs/>
+        </w:rPr>
+        <w:t xml:space="preserve">Statistics</w:t>
       </w:r>
       <w:r>
         <w:t xml:space="preserve">,</w:t>
@@ -11270,136 +11110,6 @@
           <w:i/>
           <w:iCs/>
         </w:rPr>
-        <w:t xml:space="preserve">71</w:t>
-      </w:r>
-      <w:r>
-        <w:t xml:space="preserve">(4), 639–660.</w:t>
-      </w:r>
-      <w:r>
-        <w:t xml:space="preserve"> </w:t>
-      </w:r>
-      <w:hyperlink r:id="rId75">
-        <w:r>
-          <w:rPr>
-            <w:rStyle w:val="Hyperlink"/>
-          </w:rPr>
-          <w:t xml:space="preserve">https://doi.org/10.1177/000312240607100406</w:t>
-        </w:r>
-      </w:hyperlink>
-    </w:p>
-    <w:p>
-      <w:pPr>
-        <w:pStyle w:val="BodyText"/>
-      </w:pPr>
-      <w:r>
-        <w:t xml:space="preserve">Hook, J. L. (2010). Gender inequality in the welfare state: Sex</w:t>
-      </w:r>
-      <w:r>
-        <w:t xml:space="preserve"> </w:t>
-      </w:r>
-      <w:r>
-        <w:t xml:space="preserve">segregation in housework, 1965–2003.</w:t>
-      </w:r>
-      <w:r>
-        <w:t xml:space="preserve"> </w:t>
-      </w:r>
-      <w:r>
-        <w:rPr>
-          <w:i/>
-          <w:iCs/>
-        </w:rPr>
-        <w:t xml:space="preserve">American Journal of</w:t>
-      </w:r>
-      <w:r>
-        <w:rPr>
-          <w:i/>
-          <w:iCs/>
-        </w:rPr>
-        <w:t xml:space="preserve"> </w:t>
-      </w:r>
-      <w:r>
-        <w:rPr>
-          <w:i/>
-          <w:iCs/>
-        </w:rPr>
-        <w:t xml:space="preserve">Sociology</w:t>
-      </w:r>
-      <w:r>
-        <w:t xml:space="preserve">,</w:t>
-      </w:r>
-      <w:r>
-        <w:t xml:space="preserve"> </w:t>
-      </w:r>
-      <w:r>
-        <w:rPr>
-          <w:i/>
-          <w:iCs/>
-        </w:rPr>
-        <w:t xml:space="preserve">115</w:t>
-      </w:r>
-      <w:r>
-        <w:t xml:space="preserve">(5), 1480–1523.</w:t>
-      </w:r>
-      <w:r>
-        <w:t xml:space="preserve"> </w:t>
-      </w:r>
-      <w:hyperlink r:id="rId76">
-        <w:r>
-          <w:rPr>
-            <w:rStyle w:val="Hyperlink"/>
-          </w:rPr>
-          <w:t xml:space="preserve">https://doi.org/10.1086/651384</w:t>
-        </w:r>
-      </w:hyperlink>
-    </w:p>
-    <w:p>
-      <w:pPr>
-        <w:pStyle w:val="BodyText"/>
-      </w:pPr>
-      <w:r>
-        <w:t xml:space="preserve">Imbens, G. W. (2004). Nonparametric estimation of average treatment</w:t>
-      </w:r>
-      <w:r>
-        <w:t xml:space="preserve"> </w:t>
-      </w:r>
-      <w:r>
-        <w:t xml:space="preserve">effects under exogeneity: A review.</w:t>
-      </w:r>
-      <w:r>
-        <w:t xml:space="preserve"> </w:t>
-      </w:r>
-      <w:r>
-        <w:rPr>
-          <w:i/>
-          <w:iCs/>
-        </w:rPr>
-        <w:t xml:space="preserve">Review of Economics and</w:t>
-      </w:r>
-      <w:r>
-        <w:rPr>
-          <w:i/>
-          <w:iCs/>
-        </w:rPr>
-        <w:t xml:space="preserve"> </w:t>
-      </w:r>
-      <w:r>
-        <w:rPr>
-          <w:i/>
-          <w:iCs/>
-        </w:rPr>
-        <w:t xml:space="preserve">Statistics</w:t>
-      </w:r>
-      <w:r>
-        <w:t xml:space="preserve">,</w:t>
-      </w:r>
-      <w:r>
-        <w:t xml:space="preserve"> </w:t>
-      </w:r>
-      <w:r>
-        <w:rPr>
-          <w:i/>
-          <w:iCs/>
-        </w:rPr>
         <w:t xml:space="preserve">86</w:t>
       </w:r>
       <w:r>
@@ -11408,7 +11118,7 @@
       <w:r>
         <w:t xml:space="preserve"> </w:t>
       </w:r>
-      <w:hyperlink r:id="rId77">
+      <w:hyperlink r:id="rId73">
         <w:r>
           <w:rPr>
             <w:rStyle w:val="Hyperlink"/>
@@ -11468,7 +11178,7 @@
       <w:r>
         <w:t xml:space="preserve"> </w:t>
       </w:r>
-      <w:hyperlink r:id="rId78">
+      <w:hyperlink r:id="rId74">
         <w:r>
           <w:rPr>
             <w:rStyle w:val="Hyperlink"/>
@@ -11525,7 +11235,7 @@
       <w:r>
         <w:t xml:space="preserve"> </w:t>
       </w:r>
-      <w:hyperlink r:id="rId79">
+      <w:hyperlink r:id="rId75">
         <w:r>
           <w:rPr>
             <w:rStyle w:val="Hyperlink"/>
@@ -11585,7 +11295,7 @@
       <w:r>
         <w:t xml:space="preserve"> </w:t>
       </w:r>
-      <w:hyperlink r:id="rId80">
+      <w:hyperlink r:id="rId76">
         <w:r>
           <w:rPr>
             <w:rStyle w:val="Hyperlink"/>
@@ -11684,7 +11394,7 @@
       <w:r>
         <w:t xml:space="preserve"> </w:t>
       </w:r>
-      <w:hyperlink r:id="rId81">
+      <w:hyperlink r:id="rId77">
         <w:r>
           <w:rPr>
             <w:rStyle w:val="Hyperlink"/>
@@ -11758,7 +11468,7 @@
       <w:r>
         <w:t xml:space="preserve"> </w:t>
       </w:r>
-      <w:hyperlink r:id="rId82">
+      <w:hyperlink r:id="rId78">
         <w:r>
           <w:rPr>
             <w:rStyle w:val="Hyperlink"/>
@@ -11809,7 +11519,7 @@
       <w:r>
         <w:t xml:space="preserve"> </w:t>
       </w:r>
-      <w:hyperlink r:id="rId83">
+      <w:hyperlink r:id="rId79">
         <w:r>
           <w:rPr>
             <w:rStyle w:val="Hyperlink"/>
@@ -11946,7 +11656,7 @@
       <w:r>
         <w:t xml:space="preserve"> </w:t>
       </w:r>
-      <w:hyperlink r:id="rId84">
+      <w:hyperlink r:id="rId80">
         <w:r>
           <w:rPr>
             <w:rStyle w:val="Hyperlink"/>
@@ -11997,7 +11707,7 @@
       <w:r>
         <w:t xml:space="preserve"> </w:t>
       </w:r>
-      <w:hyperlink r:id="rId85">
+      <w:hyperlink r:id="rId81">
         <w:r>
           <w:rPr>
             <w:rStyle w:val="Hyperlink"/>
@@ -12054,7 +11764,7 @@
       <w:r>
         <w:t xml:space="preserve"> </w:t>
       </w:r>
-      <w:hyperlink r:id="rId86">
+      <w:hyperlink r:id="rId82">
         <w:r>
           <w:rPr>
             <w:rStyle w:val="Hyperlink"/>
@@ -12105,7 +11815,7 @@
       <w:r>
         <w:t xml:space="preserve"> </w:t>
       </w:r>
-      <w:hyperlink r:id="rId87">
+      <w:hyperlink r:id="rId83">
         <w:r>
           <w:rPr>
             <w:rStyle w:val="Hyperlink"/>
@@ -12182,7 +11892,7 @@
       <w:r>
         <w:t xml:space="preserve"> </w:t>
       </w:r>
-      <w:hyperlink r:id="rId88">
+      <w:hyperlink r:id="rId84">
         <w:r>
           <w:rPr>
             <w:rStyle w:val="Hyperlink"/>
@@ -12233,7 +11943,7 @@
       <w:r>
         <w:t xml:space="preserve"> </w:t>
       </w:r>
-      <w:hyperlink r:id="rId89">
+      <w:hyperlink r:id="rId85">
         <w:r>
           <w:rPr>
             <w:rStyle w:val="Hyperlink"/>
@@ -12284,7 +11994,7 @@
       <w:r>
         <w:t xml:space="preserve"> </w:t>
       </w:r>
-      <w:hyperlink r:id="rId90">
+      <w:hyperlink r:id="rId86">
         <w:r>
           <w:rPr>
             <w:rStyle w:val="Hyperlink"/>
@@ -12344,7 +12054,7 @@
       <w:r>
         <w:t xml:space="preserve"> </w:t>
       </w:r>
-      <w:hyperlink r:id="rId91">
+      <w:hyperlink r:id="rId87">
         <w:r>
           <w:rPr>
             <w:rStyle w:val="Hyperlink"/>
@@ -12524,7 +12234,7 @@
       <w:r>
         <w:t xml:space="preserve"> </w:t>
       </w:r>
-      <w:hyperlink r:id="rId92">
+      <w:hyperlink r:id="rId88">
         <w:r>
           <w:rPr>
             <w:rStyle w:val="Hyperlink"/>
@@ -12575,7 +12285,7 @@
       <w:r>
         <w:t xml:space="preserve"> </w:t>
       </w:r>
-      <w:hyperlink r:id="rId93">
+      <w:hyperlink r:id="rId89">
         <w:r>
           <w:rPr>
             <w:rStyle w:val="Hyperlink"/>
@@ -12653,7 +12363,7 @@
       <w:r>
         <w:t xml:space="preserve"> </w:t>
       </w:r>
-      <w:hyperlink r:id="rId94">
+      <w:hyperlink r:id="rId90">
         <w:r>
           <w:rPr>
             <w:rStyle w:val="Hyperlink"/>
@@ -12825,7 +12535,7 @@
       <w:r>
         <w:t xml:space="preserve"> </w:t>
       </w:r>
-      <w:hyperlink r:id="rId95">
+      <w:hyperlink r:id="rId91">
         <w:r>
           <w:rPr>
             <w:rStyle w:val="Hyperlink"/>
@@ -12936,7 +12646,7 @@
       <w:r>
         <w:t xml:space="preserve"> </w:t>
       </w:r>
-      <w:hyperlink r:id="rId96">
+      <w:hyperlink r:id="rId92">
         <w:r>
           <w:rPr>
             <w:rStyle w:val="Hyperlink"/>
@@ -13011,7 +12721,7 @@
       <w:r>
         <w:t xml:space="preserve"> </w:t>
       </w:r>
-      <w:hyperlink r:id="rId97">
+      <w:hyperlink r:id="rId93">
         <w:r>
           <w:rPr>
             <w:rStyle w:val="Hyperlink"/>
@@ -13068,7 +12778,7 @@
       <w:r>
         <w:t xml:space="preserve"> </w:t>
       </w:r>
-      <w:hyperlink r:id="rId98">
+      <w:hyperlink r:id="rId94">
         <w:r>
           <w:rPr>
             <w:rStyle w:val="Hyperlink"/>
@@ -13119,7 +12829,7 @@
       <w:r>
         <w:t xml:space="preserve"> </w:t>
       </w:r>
-      <w:hyperlink r:id="rId99">
+      <w:hyperlink r:id="rId95">
         <w:r>
           <w:rPr>
             <w:rStyle w:val="Hyperlink"/>
@@ -13133,23 +12843,87 @@
         <w:pStyle w:val="BodyText"/>
       </w:pPr>
       <w:r>
-        <w:t xml:space="preserve">Umberson, D. (1992). Gender, marital status and the social control of</w:t>
-      </w:r>
-      <w:r>
-        <w:t xml:space="preserve"> </w:t>
-      </w:r>
-      <w:r>
-        <w:t xml:space="preserve">health behavior.</w:t>
-      </w:r>
-      <w:r>
-        <w:t xml:space="preserve"> </w:t>
-      </w:r>
-      <w:r>
-        <w:rPr>
-          <w:i/>
-          <w:iCs/>
-        </w:rPr>
-        <w:t xml:space="preserve">Social Science &amp; Medicine</w:t>
+        <w:t xml:space="preserve">United Nations Statistics Division. (2016).</w:t>
+      </w:r>
+      <w:r>
+        <w:t xml:space="preserve"> </w:t>
+      </w:r>
+      <w:r>
+        <w:rPr>
+          <w:i/>
+          <w:iCs/>
+        </w:rPr>
+        <w:t xml:space="preserve">International</w:t>
+      </w:r>
+      <w:r>
+        <w:rPr>
+          <w:i/>
+          <w:iCs/>
+        </w:rPr>
+        <w:t xml:space="preserve"> </w:t>
+      </w:r>
+      <w:r>
+        <w:rPr>
+          <w:i/>
+          <w:iCs/>
+        </w:rPr>
+        <w:t xml:space="preserve">classification of activities for time-use statistics 2016 (</w:t>
+      </w:r>
+      <w:r>
+        <w:rPr>
+          <w:i/>
+          <w:iCs/>
+        </w:rPr>
+        <w:t xml:space="preserve">ICATUS</w:t>
+      </w:r>
+      <w:r>
+        <w:rPr>
+          <w:i/>
+          <w:iCs/>
+        </w:rPr>
+        <w:t xml:space="preserve"> </w:t>
+      </w:r>
+      <w:r>
+        <w:rPr>
+          <w:i/>
+          <w:iCs/>
+        </w:rPr>
+        <w:t xml:space="preserve">2016)</w:t>
+      </w:r>
+      <w:r>
+        <w:t xml:space="preserve">. United Nations.</w:t>
+      </w:r>
+    </w:p>
+    <w:p>
+      <w:pPr>
+        <w:pStyle w:val="BodyText"/>
+      </w:pPr>
+      <w:r>
+        <w:t xml:space="preserve">West, C., &amp; Zimmerman, D. H. (1987). Doing gender.</w:t>
+      </w:r>
+      <w:r>
+        <w:t xml:space="preserve"> </w:t>
+      </w:r>
+      <w:r>
+        <w:rPr>
+          <w:i/>
+          <w:iCs/>
+        </w:rPr>
+        <w:t xml:space="preserve">Gender &amp;</w:t>
+      </w:r>
+      <w:r>
+        <w:rPr>
+          <w:i/>
+          <w:iCs/>
+        </w:rPr>
+        <w:t xml:space="preserve"> </w:t>
+      </w:r>
+      <w:r>
+        <w:rPr>
+          <w:i/>
+          <w:iCs/>
+        </w:rPr>
+        <w:t xml:space="preserve">Society</w:t>
       </w:r>
       <w:r>
         <w:t xml:space="preserve">,</w:t>
@@ -13162,235 +12936,6 @@
           <w:i/>
           <w:iCs/>
         </w:rPr>
-        <w:t xml:space="preserve">34</w:t>
-      </w:r>
-      <w:r>
-        <w:t xml:space="preserve">(8),</w:t>
-      </w:r>
-      <w:r>
-        <w:t xml:space="preserve"> </w:t>
-      </w:r>
-      <w:r>
-        <w:t xml:space="preserve">907–917.</w:t>
-      </w:r>
-      <w:r>
-        <w:t xml:space="preserve"> </w:t>
-      </w:r>
-      <w:hyperlink r:id="rId100">
-        <w:r>
-          <w:rPr>
-            <w:rStyle w:val="Hyperlink"/>
-          </w:rPr>
-          <w:t xml:space="preserve">https://doi.org/10.1016/0277-9536(92)90259-s</w:t>
-        </w:r>
-      </w:hyperlink>
-    </w:p>
-    <w:p>
-      <w:pPr>
-        <w:pStyle w:val="BodyText"/>
-      </w:pPr>
-      <w:r>
-        <w:t xml:space="preserve">United Nations Statistics Division. (2016).</w:t>
-      </w:r>
-      <w:r>
-        <w:t xml:space="preserve"> </w:t>
-      </w:r>
-      <w:r>
-        <w:rPr>
-          <w:i/>
-          <w:iCs/>
-        </w:rPr>
-        <w:t xml:space="preserve">International</w:t>
-      </w:r>
-      <w:r>
-        <w:rPr>
-          <w:i/>
-          <w:iCs/>
-        </w:rPr>
-        <w:t xml:space="preserve"> </w:t>
-      </w:r>
-      <w:r>
-        <w:rPr>
-          <w:i/>
-          <w:iCs/>
-        </w:rPr>
-        <w:t xml:space="preserve">classification of activities for time-use statistics 2016 (</w:t>
-      </w:r>
-      <w:r>
-        <w:rPr>
-          <w:i/>
-          <w:iCs/>
-        </w:rPr>
-        <w:t xml:space="preserve">ICATUS</w:t>
-      </w:r>
-      <w:r>
-        <w:rPr>
-          <w:i/>
-          <w:iCs/>
-        </w:rPr>
-        <w:t xml:space="preserve"> </w:t>
-      </w:r>
-      <w:r>
-        <w:rPr>
-          <w:i/>
-          <w:iCs/>
-        </w:rPr>
-        <w:t xml:space="preserve">2016)</w:t>
-      </w:r>
-      <w:r>
-        <w:t xml:space="preserve">. United Nations.</w:t>
-      </w:r>
-    </w:p>
-    <w:p>
-      <w:pPr>
-        <w:pStyle w:val="BodyText"/>
-      </w:pPr>
-      <w:r>
-        <w:t xml:space="preserve">Venn, S., Arber, S., Meadows, R., &amp; Hislop, J. (2008). The fourth</w:t>
-      </w:r>
-      <w:r>
-        <w:t xml:space="preserve"> </w:t>
-      </w:r>
-      <w:r>
-        <w:t xml:space="preserve">shift: Exploring the gendered nature of sleep disruption among couples</w:t>
-      </w:r>
-      <w:r>
-        <w:t xml:space="preserve"> </w:t>
-      </w:r>
-      <w:r>
-        <w:t xml:space="preserve">with children.</w:t>
-      </w:r>
-      <w:r>
-        <w:t xml:space="preserve"> </w:t>
-      </w:r>
-      <w:r>
-        <w:rPr>
-          <w:i/>
-          <w:iCs/>
-        </w:rPr>
-        <w:t xml:space="preserve">British Journal of Sociology</w:t>
-      </w:r>
-      <w:r>
-        <w:t xml:space="preserve">,</w:t>
-      </w:r>
-      <w:r>
-        <w:t xml:space="preserve"> </w:t>
-      </w:r>
-      <w:r>
-        <w:rPr>
-          <w:i/>
-          <w:iCs/>
-        </w:rPr>
-        <w:t xml:space="preserve">59</w:t>
-      </w:r>
-      <w:r>
-        <w:t xml:space="preserve">(1),</w:t>
-      </w:r>
-      <w:r>
-        <w:t xml:space="preserve"> </w:t>
-      </w:r>
-      <w:r>
-        <w:t xml:space="preserve">79–97.</w:t>
-      </w:r>
-      <w:r>
-        <w:t xml:space="preserve"> </w:t>
-      </w:r>
-      <w:hyperlink r:id="rId101">
-        <w:r>
-          <w:rPr>
-            <w:rStyle w:val="Hyperlink"/>
-          </w:rPr>
-          <w:t xml:space="preserve">https://doi.org/10.1111/j.1468-4446.2007.00183.x</w:t>
-        </w:r>
-      </w:hyperlink>
-    </w:p>
-    <w:p>
-      <w:pPr>
-        <w:pStyle w:val="BodyText"/>
-      </w:pPr>
-      <w:r>
-        <w:t xml:space="preserve">Waite, L. J. (1995). Does marriage matter?</w:t>
-      </w:r>
-      <w:r>
-        <w:t xml:space="preserve"> </w:t>
-      </w:r>
-      <w:r>
-        <w:rPr>
-          <w:i/>
-          <w:iCs/>
-        </w:rPr>
-        <w:t xml:space="preserve">Demography</w:t>
-      </w:r>
-      <w:r>
-        <w:t xml:space="preserve">,</w:t>
-      </w:r>
-      <w:r>
-        <w:t xml:space="preserve"> </w:t>
-      </w:r>
-      <w:r>
-        <w:rPr>
-          <w:i/>
-          <w:iCs/>
-        </w:rPr>
-        <w:t xml:space="preserve">32</w:t>
-      </w:r>
-      <w:r>
-        <w:t xml:space="preserve">(4), 483–507.</w:t>
-      </w:r>
-      <w:r>
-        <w:t xml:space="preserve"> </w:t>
-      </w:r>
-      <w:hyperlink r:id="rId102">
-        <w:r>
-          <w:rPr>
-            <w:rStyle w:val="Hyperlink"/>
-          </w:rPr>
-          <w:t xml:space="preserve">https://doi.org/10.2307/2061670</w:t>
-        </w:r>
-      </w:hyperlink>
-    </w:p>
-    <w:p>
-      <w:pPr>
-        <w:pStyle w:val="BodyText"/>
-      </w:pPr>
-      <w:r>
-        <w:t xml:space="preserve">West, C., &amp; Zimmerman, D. H. (1987). Doing gender.</w:t>
-      </w:r>
-      <w:r>
-        <w:t xml:space="preserve"> </w:t>
-      </w:r>
-      <w:r>
-        <w:rPr>
-          <w:i/>
-          <w:iCs/>
-        </w:rPr>
-        <w:t xml:space="preserve">Gender &amp;</w:t>
-      </w:r>
-      <w:r>
-        <w:rPr>
-          <w:i/>
-          <w:iCs/>
-        </w:rPr>
-        <w:t xml:space="preserve"> </w:t>
-      </w:r>
-      <w:r>
-        <w:rPr>
-          <w:i/>
-          <w:iCs/>
-        </w:rPr>
-        <w:t xml:space="preserve">Society</w:t>
-      </w:r>
-      <w:r>
-        <w:t xml:space="preserve">,</w:t>
-      </w:r>
-      <w:r>
-        <w:t xml:space="preserve"> </w:t>
-      </w:r>
-      <w:r>
-        <w:rPr>
-          <w:i/>
-          <w:iCs/>
-        </w:rPr>
         <w:t xml:space="preserve">1</w:t>
       </w:r>
       <w:r>
@@ -13399,7 +12944,7 @@
       <w:r>
         <w:t xml:space="preserve"> </w:t>
       </w:r>
-      <w:hyperlink r:id="rId103">
+      <w:hyperlink r:id="rId96">
         <w:r>
           <w:rPr>
             <w:rStyle w:val="Hyperlink"/>
@@ -13408,7 +12953,7 @@
         </w:r>
       </w:hyperlink>
     </w:p>
-    <w:bookmarkEnd w:id="104"/>
+    <w:bookmarkEnd w:id="97"/>
     <w:sectPr>
       <w:footerReference w:type="default" r:id="rId9"/>
       <w:footnotePr>

</xml_diff>

<commit_message>
references: official titles and issuing body for the time-use reports ('Time Use in India-2019', National Statistical Office; 'Time Use in India, 2024', National Statistics Office); rebuild 03/05/06/07 and 06 author version
</commit_message>
<xml_diff>
--- a/submission/05_marriage_time_reallocation/package/manuscript_anonymised.docx
+++ b/submission/05_marriage_time_reallocation/package/manuscript_anonymised.docx
@@ -12099,14 +12099,7 @@
           <w:i/>
           <w:iCs/>
         </w:rPr>
-        <w:t xml:space="preserve"> </w:t>
-      </w:r>
-      <w:r>
-        <w:rPr>
-          <w:i/>
-          <w:iCs/>
-        </w:rPr>
-        <w:t xml:space="preserve">2019</w:t>
+        <w:t xml:space="preserve">-2019</w:t>
       </w:r>
       <w:r>
         <w:t xml:space="preserve">.</w:t>
@@ -12136,42 +12129,28 @@
           <w:i/>
           <w:iCs/>
         </w:rPr>
-        <w:t xml:space="preserve">Time use survey</w:t>
-      </w:r>
-      <w:r>
-        <w:rPr>
-          <w:i/>
-          <w:iCs/>
-        </w:rPr>
-        <w:t xml:space="preserve"> </w:t>
-      </w:r>
-      <w:r>
-        <w:rPr>
-          <w:i/>
-          <w:iCs/>
-        </w:rPr>
-        <w:t xml:space="preserve">(</w:t>
-      </w:r>
-      <w:r>
-        <w:rPr>
-          <w:i/>
-          <w:iCs/>
-        </w:rPr>
-        <w:t xml:space="preserve">January–December</w:t>
-      </w:r>
-      <w:r>
-        <w:rPr>
-          <w:i/>
-          <w:iCs/>
-        </w:rPr>
-        <w:t xml:space="preserve"> </w:t>
-      </w:r>
-      <w:r>
-        <w:rPr>
-          <w:i/>
-          <w:iCs/>
-        </w:rPr>
-        <w:t xml:space="preserve">2024)</w:t>
+        <w:t xml:space="preserve">Time use in</w:t>
+      </w:r>
+      <w:r>
+        <w:rPr>
+          <w:i/>
+          <w:iCs/>
+        </w:rPr>
+        <w:t xml:space="preserve"> </w:t>
+      </w:r>
+      <w:r>
+        <w:rPr>
+          <w:i/>
+          <w:iCs/>
+        </w:rPr>
+        <w:t xml:space="preserve">India</w:t>
+      </w:r>
+      <w:r>
+        <w:rPr>
+          <w:i/>
+          <w:iCs/>
+        </w:rPr>
+        <w:t xml:space="preserve">, 2024</w:t>
       </w:r>
       <w:r>
         <w:t xml:space="preserve">.</w:t>
@@ -12180,13 +12159,7 @@
         <w:t xml:space="preserve"> </w:t>
       </w:r>
       <w:r>
-        <w:t xml:space="preserve">Ministry of Statistics and Programme</w:t>
-      </w:r>
-      <w:r>
-        <w:t xml:space="preserve"> </w:t>
-      </w:r>
-      <w:r>
-        <w:t xml:space="preserve">Implementation</w:t>
+        <w:t xml:space="preserve">Ministry of Statistics and Programme Implementation</w:t>
       </w:r>
       <w:r>
         <w:t xml:space="preserve">.</w:t>

</xml_diff>

<commit_message>
05: 'whereas' for the contrast and 'because' for three causal uses of 'since'/'while'; PORTAL_CHECKLIST: no figures in docx, abstract 211 words; rebuild PDF and docx (33 pages)
</commit_message>
<xml_diff>
--- a/submission/05_marriage_time_reallocation/package/manuscript_anonymised.docx
+++ b/submission/05_marriage_time_reallocation/package/manuscript_anonymised.docx
@@ -1027,25 +1027,25 @@
         <w:t xml:space="preserve"> </w:t>
       </w:r>
       <w:r>
-        <w:t xml:space="preserve">while in poorer countries women do more. Marriage could therefore raise</w:t>
-      </w:r>
-      <w:r>
-        <w:t xml:space="preserve"> </w:t>
-      </w:r>
-      <w:r>
-        <w:t xml:space="preserve">women’s total work, or it could shift work from the market to the home</w:t>
-      </w:r>
-      <w:r>
-        <w:t xml:space="preserve"> </w:t>
-      </w:r>
-      <w:r>
-        <w:t xml:space="preserve">with little change in total work. Only a full accounting distinguishes</w:t>
-      </w:r>
-      <w:r>
-        <w:t xml:space="preserve"> </w:t>
-      </w:r>
-      <w:r>
-        <w:t xml:space="preserve">the two.</w:t>
+        <w:t xml:space="preserve">whereas in poorer countries women do more. Marriage could therefore</w:t>
+      </w:r>
+      <w:r>
+        <w:t xml:space="preserve"> </w:t>
+      </w:r>
+      <w:r>
+        <w:t xml:space="preserve">raise women’s total work, or it could shift work from the market to the</w:t>
+      </w:r>
+      <w:r>
+        <w:t xml:space="preserve"> </w:t>
+      </w:r>
+      <w:r>
+        <w:t xml:space="preserve">home with little change in total work. Only a full accounting</w:t>
+      </w:r>
+      <w:r>
+        <w:t xml:space="preserve"> </w:t>
+      </w:r>
+      <w:r>
+        <w:t xml:space="preserve">distinguishes the two.</w:t>
       </w:r>
     </w:p>
     <w:p>
@@ -2209,31 +2209,31 @@
         <w:t xml:space="preserve"> </w:t>
       </w:r>
       <w:r>
-        <w:t xml:space="preserve">members or consumption. These are partly consequences of marriage, since</w:t>
-      </w:r>
-      <w:r>
-        <w:t xml:space="preserve"> </w:t>
-      </w:r>
-      <w:r>
-        <w:t xml:space="preserve">at marriage a woman usually moves into a different and often larger</w:t>
-      </w:r>
-      <w:r>
-        <w:t xml:space="preserve"> </w:t>
-      </w:r>
-      <w:r>
-        <w:t xml:space="preserve">household, and controlling for them would remove part of the association</w:t>
-      </w:r>
-      <w:r>
-        <w:t xml:space="preserve"> </w:t>
-      </w:r>
-      <w:r>
-        <w:t xml:space="preserve">I want to measure. They enter an extended specification as a robustness</w:t>
-      </w:r>
-      <w:r>
-        <w:t xml:space="preserve"> </w:t>
-      </w:r>
-      <w:r>
-        <w:t xml:space="preserve">check.</w:t>
+        <w:t xml:space="preserve">members or consumption. These are partly consequences of marriage,</w:t>
+      </w:r>
+      <w:r>
+        <w:t xml:space="preserve"> </w:t>
+      </w:r>
+      <w:r>
+        <w:t xml:space="preserve">because at marriage a woman usually moves into a different and often</w:t>
+      </w:r>
+      <w:r>
+        <w:t xml:space="preserve"> </w:t>
+      </w:r>
+      <w:r>
+        <w:t xml:space="preserve">larger household, and controlling for them would remove part of the</w:t>
+      </w:r>
+      <w:r>
+        <w:t xml:space="preserve"> </w:t>
+      </w:r>
+      <w:r>
+        <w:t xml:space="preserve">association I want to measure. They enter an extended specification as a</w:t>
+      </w:r>
+      <w:r>
+        <w:t xml:space="preserve"> </w:t>
+      </w:r>
+      <w:r>
+        <w:t xml:space="preserve">robustness check.</w:t>
       </w:r>
     </w:p>
     <w:bookmarkEnd w:id="18"/>
@@ -8155,7 +8155,7 @@
         <w:t xml:space="preserve"> </w:t>
       </w:r>
       <w:r>
-        <w:t xml:space="preserve">more than married men. This comparison is also selective, since</w:t>
+        <w:t xml:space="preserve">more than married men. This comparison is also selective, because</w:t>
       </w:r>
       <w:r>
         <w:t xml:space="preserve"> </w:t>
@@ -8687,13 +8687,13 @@
         <w:t xml:space="preserve"> </w:t>
       </w:r>
       <w:r>
-        <w:t xml:space="preserve">that accompanies marriage and motherhood, since that work competes with</w:t>
-      </w:r>
-      <w:r>
-        <w:t xml:space="preserve"> </w:t>
-      </w:r>
-      <w:r>
-        <w:t xml:space="preserve">women’s paid work, learning, leisure or sleep.</w:t>
+        <w:t xml:space="preserve">that accompanies marriage and motherhood, because that work competes</w:t>
+      </w:r>
+      <w:r>
+        <w:t xml:space="preserve"> </w:t>
+      </w:r>
+      <w:r>
+        <w:t xml:space="preserve">with women’s paid work, learning, leisure or sleep.</w:t>
       </w:r>
     </w:p>
     <w:bookmarkEnd w:id="34"/>

</xml_diff>

<commit_message>
05: Word file with no page numbers, headers or footers and blank author metadata; data/code availability statement strengthened; replication archive (code_replication.zip: readme.txt, meta_information.txt, R code, synthetic generator and fake sample, no microdata/.dta); abstract trimmed to 237 words; rebuild
</commit_message>
<xml_diff>
--- a/submission/05_marriage_time_reallocation/package/manuscript_anonymised.docx
+++ b/submission/05_marriage_time_reallocation/package/manuscript_anonymised.docx
@@ -47,7 +47,7 @@
         <w:t xml:space="preserve"> </w:t>
       </w:r>
       <w:r>
-        <w:t xml:space="preserve">Marriage reshapes the day for Indian women, most of whom move into the husband’s household. Studies usually examine one outcome at a time, such as housework or sleep, yet a day’s activities sum to 1,440 minutes, so more unpaid work must come at the expense of other activities.</w:t>
+        <w:t xml:space="preserve">Marriage reshapes the day for Indian women, most of whom move into the husband’s household. Studies usually examine one outcome at a time, such as housework or sleep, yet a day’s activities sum to 1,440 minutes, so more unpaid work must displace other activities.</w:t>
       </w:r>
     </w:p>
     <w:p>
@@ -83,7 +83,7 @@
         <w:t xml:space="preserve"> </w:t>
       </w:r>
       <w:r>
-        <w:t xml:space="preserve">Using all 450,457 diaries of the Time Use Survey 2024 of India’s National Statistics Office, the study compares 88,337 married and never-married women and 87,364 men aged 20 to 39 across nine activity divisions. Selection is addressed by age restriction, reweighting and bias adjustment; 106,858 linked couples give within-household comparisons.</w:t>
+        <w:t xml:space="preserve">Using all 450,457 diaries of India’s Time Use Survey 2024, the study compares 88,337 married and never-married women and 87,364 men aged 20 to 39 across nine activity divisions. Selection is addressed by age restriction, reweighting and bias adjustment; 106,858 linked couples give within-household comparisons.</w:t>
       </w:r>
     </w:p>
     <w:p>
@@ -149,7 +149,7 @@
         <w:t xml:space="preserve"> </w:t>
       </w:r>
       <w:r>
-        <w:t xml:space="preserve">with one time-budget decomposition whose components must sum to zero. It combines selection checks, residence-type comparisons and linked-spouse diaries in a single analysis of the 2024 Time Use Survey of India.</w:t>
+        <w:t xml:space="preserve">with one time-budget decomposition whose components sum to zero, combining selection checks, residence-type comparisons and linked-spouse diaries.</w:t>
       </w:r>
     </w:p>
     <w:p>
@@ -9651,31 +9651,113 @@
         <w:pStyle w:val="FirstParagraph"/>
       </w:pPr>
       <w:r>
-        <w:t xml:space="preserve">The Time Use Survey 2024 unit-level data are distributed by the National</w:t>
-      </w:r>
-      <w:r>
-        <w:t xml:space="preserve"> </w:t>
-      </w:r>
-      <w:r>
-        <w:t xml:space="preserve">Statistics Office, Ministry of Statistics and Programme Implementation,</w:t>
-      </w:r>
-      <w:r>
-        <w:t xml:space="preserve"> </w:t>
-      </w:r>
-      <w:r>
-        <w:t xml:space="preserve">Government of India (microdata.gov.in, catalog 236), to registered</w:t>
-      </w:r>
-      <w:r>
-        <w:t xml:space="preserve"> </w:t>
-      </w:r>
-      <w:r>
-        <w:t xml:space="preserve">users. Code available from the author on request; will be made public on</w:t>
-      </w:r>
-      <w:r>
-        <w:t xml:space="preserve"> </w:t>
-      </w:r>
-      <w:r>
-        <w:t xml:space="preserve">acceptance.</w:t>
+        <w:rPr>
+          <w:i/>
+          <w:iCs/>
+        </w:rPr>
+        <w:t xml:space="preserve">Data.</w:t>
+      </w:r>
+      <w:r>
+        <w:t xml:space="preserve"> </w:t>
+      </w:r>
+      <w:r>
+        <w:t xml:space="preserve">The analysis uses the unit-level data of India’s Time Use</w:t>
+      </w:r>
+      <w:r>
+        <w:t xml:space="preserve"> </w:t>
+      </w:r>
+      <w:r>
+        <w:t xml:space="preserve">Survey 2024, produced by the National Statistics Office, Ministry of</w:t>
+      </w:r>
+      <w:r>
+        <w:t xml:space="preserve"> </w:t>
+      </w:r>
+      <w:r>
+        <w:t xml:space="preserve">Statistics and Programme Implementation, Government of India. The files</w:t>
+      </w:r>
+      <w:r>
+        <w:t xml:space="preserve"> </w:t>
+      </w:r>
+      <w:r>
+        <w:t xml:space="preserve">are available to registered users of the Ministry’s microdata portal</w:t>
+      </w:r>
+      <w:r>
+        <w:t xml:space="preserve"> </w:t>
+      </w:r>
+      <w:r>
+        <w:t xml:space="preserve">(microdata.gov.in, catalog 236) under its terms of use, which do not</w:t>
+      </w:r>
+      <w:r>
+        <w:t xml:space="preserve"> </w:t>
+      </w:r>
+      <w:r>
+        <w:t xml:space="preserve">permit redistribution, so the data are not deposited with this</w:t>
+      </w:r>
+      <w:r>
+        <w:t xml:space="preserve"> </w:t>
+      </w:r>
+      <w:r>
+        <w:t xml:space="preserve">submission. A separate data meta-information file states where and how</w:t>
+      </w:r>
+      <w:r>
+        <w:t xml:space="preserve"> </w:t>
+      </w:r>
+      <w:r>
+        <w:t xml:space="preserve">to obtain the data and under what conditions, how many records and which</w:t>
+      </w:r>
+      <w:r>
+        <w:t xml:space="preserve"> </w:t>
+      </w:r>
+      <w:r>
+        <w:t xml:space="preserve">variables were used, and describes the variables. A generator for a</w:t>
+      </w:r>
+      <w:r>
+        <w:t xml:space="preserve"> </w:t>
+      </w:r>
+      <w:r>
+        <w:t xml:space="preserve">synthetic data set with the same structure is included so that the code</w:t>
+      </w:r>
+      <w:r>
+        <w:t xml:space="preserve"> </w:t>
+      </w:r>
+      <w:r>
+        <w:t xml:space="preserve">can be run without the restricted files.</w:t>
+      </w:r>
+    </w:p>
+    <w:p>
+      <w:pPr>
+        <w:pStyle w:val="BodyText"/>
+      </w:pPr>
+      <w:r>
+        <w:rPr>
+          <w:i/>
+          <w:iCs/>
+        </w:rPr>
+        <w:t xml:space="preserve">Code.</w:t>
+      </w:r>
+      <w:r>
+        <w:t xml:space="preserve"> </w:t>
+      </w:r>
+      <w:r>
+        <w:t xml:space="preserve">All analysis code (R) is provided in a replication archive</w:t>
+      </w:r>
+      <w:r>
+        <w:t xml:space="preserve"> </w:t>
+      </w:r>
+      <w:r>
+        <w:t xml:space="preserve">submitted with this manuscript, with a readme listing each file and the</w:t>
+      </w:r>
+      <w:r>
+        <w:t xml:space="preserve"> </w:t>
+      </w:r>
+      <w:r>
+        <w:t xml:space="preserve">software versions used. The code is available from the author on request</w:t>
+      </w:r>
+      <w:r>
+        <w:t xml:space="preserve"> </w:t>
+      </w:r>
+      <w:r>
+        <w:t xml:space="preserve">and will be made public on acceptance.</w:t>
       </w:r>
     </w:p>
     <w:bookmarkEnd w:id="37"/>
@@ -14007,11 +14089,10 @@
     </w:p>
     <w:bookmarkEnd w:id="100"/>
     <w:sectPr>
-      <w:footerReference w:type="default" r:id="rId9"/>
       <w:footnotePr>
         <w:numRestart w:val="eachSect"/>
       </w:footnotePr>
-      <w:pgMar w:left="1440" w:right="1440" w:top="1440" w:bottom="1440" w:footer="720"/>
+      <w:pgMar w:left="1440" w:right="1440" w:top="1440" w:bottom="1440"/>
     </w:sectPr>
   </w:body>
 </w:document>
@@ -14019,27 +14100,6 @@
 
 <file path=word/comments.xml><?xml version="1.0" encoding="utf-8"?>
 <w:comments xmlns:w="http://schemas.openxmlformats.org/wordprocessingml/2006/main" xmlns:m="http://schemas.openxmlformats.org/officeDocument/2006/math" xmlns:r="http://schemas.openxmlformats.org/officeDocument/2006/relationships" xmlns:o="urn:schemas-microsoft-com:office:office" xmlns:v="urn:schemas-microsoft-com:vml" xmlns:w10="urn:schemas-microsoft-com:office:word" xmlns:a="http://schemas.openxmlformats.org/drawingml/2006/main" xmlns:pic="http://schemas.openxmlformats.org/drawingml/2006/picture" xmlns:wp="http://schemas.openxmlformats.org/drawingml/2006/wordprocessingDrawing"/>
-</file>
-
-<file path=word/footer1.xml><?xml version="1.0" encoding="utf-8"?>
-<w:ftr xmlns:m="http://schemas.openxmlformats.org/officeDocument/2006/math" xmlns:mc="http://schemas.openxmlformats.org/markup-compatibility/2006" xmlns:mo="http://schemas.microsoft.com/office/mac/office/2008/main" xmlns:mv="urn:schemas-microsoft-com:mac:vml" xmlns:o="urn:schemas-microsoft-com:office:office" xmlns:r="http://schemas.openxmlformats.org/officeDocument/2006/relationships" xmlns:v="urn:schemas-microsoft-com:vml" xmlns:w10="urn:schemas-microsoft-com:office:word" xmlns:w14="http://schemas.microsoft.com/office/word/2010/wordml" xmlns:w="http://schemas.openxmlformats.org/wordprocessingml/2006/main" xmlns:wne="http://schemas.microsoft.com/office/word/2006/wordml" xmlns:wp14="http://schemas.microsoft.com/office/word/2010/wordprocessingDrawing" xmlns:wp="http://schemas.openxmlformats.org/drawingml/2006/wordprocessingDrawing" xmlns:wpc="http://schemas.microsoft.com/office/word/2010/wordprocessingCanvas" xmlns:wpg="http://schemas.microsoft.com/office/word/2010/wordprocessingGroup" xmlns:wpi="http://schemas.microsoft.com/office/word/2010/wordprocessingInk" xmlns:wps="http://schemas.microsoft.com/office/word/2010/wordprocessingShape" mc:Ignorable="w14 wp14">
-  <w:p>
-    <w:pPr>
-      <w:pStyle w:val="Footer"/>
-      <w:spacing w:line="240" w:lineRule="auto"/>
-      <w:jc w:val="center"/>
-    </w:pPr>
-    <w:r>
-      <w:rPr>
-        <w:rFonts w:ascii="Times New Roman" w:hAnsi="Times New Roman"/>
-        <w:sz w:val="24"/>
-      </w:rPr>
-      <w:fldChar w:fldCharType="begin"/>
-      <w:instrText xml:space="preserve">PAGE</w:instrText>
-      <w:fldChar w:fldCharType="end"/>
-    </w:r>
-  </w:p>
-</w:ftr>
 </file>
 
 <file path=word/footnotes.xml><?xml version="1.0" encoding="utf-8"?>

</xml_diff>

<commit_message>
05: data-portal URL moved to a footnote with access date; replication archive verified (synthetic run and real-data run reproduce 279.7 / 26.2 / 261.9 minutes); readme and meta-information describe the separate household file; PORTAL_CHECKLIST.md and docs/SUBMISSION_PRECHECK.md refreshed for Demographic Research
</commit_message>
<xml_diff>
--- a/submission/05_marriage_time_reallocation/package/manuscript_anonymised.docx
+++ b/submission/05_marriage_time_reallocation/package/manuscript_anonymised.docx
@@ -9637,7 +9637,7 @@
       </w:r>
     </w:p>
     <w:bookmarkEnd w:id="36"/>
-    <w:bookmarkStart w:id="37" w:name="data-and-code-availability"/>
+    <w:bookmarkStart w:id="39" w:name="data-and-code-availability"/>
     <w:p>
       <w:pPr>
         <w:pStyle w:val="Heading1"/>
@@ -9679,49 +9679,61 @@
         <w:t xml:space="preserve"> </w:t>
       </w:r>
       <w:r>
-        <w:t xml:space="preserve">are available to registered users of the Ministry’s microdata portal</w:t>
-      </w:r>
-      <w:r>
-        <w:t xml:space="preserve"> </w:t>
-      </w:r>
-      <w:r>
-        <w:t xml:space="preserve">(microdata.gov.in, catalog 236) under its terms of use, which do not</w:t>
-      </w:r>
-      <w:r>
-        <w:t xml:space="preserve"> </w:t>
-      </w:r>
-      <w:r>
-        <w:t xml:space="preserve">permit redistribution, so the data are not deposited with this</w:t>
-      </w:r>
-      <w:r>
-        <w:t xml:space="preserve"> </w:t>
-      </w:r>
-      <w:r>
-        <w:t xml:space="preserve">submission. A separate data meta-information file states where and how</w:t>
-      </w:r>
-      <w:r>
-        <w:t xml:space="preserve"> </w:t>
-      </w:r>
-      <w:r>
-        <w:t xml:space="preserve">to obtain the data and under what conditions, how many records and which</w:t>
-      </w:r>
-      <w:r>
-        <w:t xml:space="preserve"> </w:t>
-      </w:r>
-      <w:r>
-        <w:t xml:space="preserve">variables were used, and describes the variables. A generator for a</w:t>
-      </w:r>
-      <w:r>
-        <w:t xml:space="preserve"> </w:t>
-      </w:r>
-      <w:r>
-        <w:t xml:space="preserve">synthetic data set with the same structure is included so that the code</w:t>
-      </w:r>
-      <w:r>
-        <w:t xml:space="preserve"> </w:t>
-      </w:r>
-      <w:r>
-        <w:t xml:space="preserve">can be run without the restricted files.</w:t>
+        <w:t xml:space="preserve">are available to registered users of the Ministry’s microdata</w:t>
+      </w:r>
+      <w:r>
+        <w:t xml:space="preserve"> </w:t>
+      </w:r>
+      <w:r>
+        <w:t xml:space="preserve">portal</w:t>
+      </w:r>
+      <w:r>
+        <w:rPr>
+          <w:rStyle w:val="FootnoteReference"/>
+        </w:rPr>
+        <w:footnoteReference w:id="37"/>
+      </w:r>
+      <w:r>
+        <w:t xml:space="preserve"> </w:t>
+      </w:r>
+      <w:r>
+        <w:t xml:space="preserve">under its terms of use, which do not permit</w:t>
+      </w:r>
+      <w:r>
+        <w:t xml:space="preserve"> </w:t>
+      </w:r>
+      <w:r>
+        <w:t xml:space="preserve">redistribution, so the data are not deposited with this submission. A</w:t>
+      </w:r>
+      <w:r>
+        <w:t xml:space="preserve"> </w:t>
+      </w:r>
+      <w:r>
+        <w:t xml:space="preserve">separate data meta-information file states where and how to obtain the</w:t>
+      </w:r>
+      <w:r>
+        <w:t xml:space="preserve"> </w:t>
+      </w:r>
+      <w:r>
+        <w:t xml:space="preserve">data and under what conditions, how many records and which variables</w:t>
+      </w:r>
+      <w:r>
+        <w:t xml:space="preserve"> </w:t>
+      </w:r>
+      <w:r>
+        <w:t xml:space="preserve">were used, and describes the variables. A generator for a synthetic data</w:t>
+      </w:r>
+      <w:r>
+        <w:t xml:space="preserve"> </w:t>
+      </w:r>
+      <w:r>
+        <w:t xml:space="preserve">set with the same structure is included so that the code can be run</w:t>
+      </w:r>
+      <w:r>
+        <w:t xml:space="preserve"> </w:t>
+      </w:r>
+      <w:r>
+        <w:t xml:space="preserve">without the restricted files.</w:t>
       </w:r>
     </w:p>
     <w:p>
@@ -9760,8 +9772,8 @@
         <w:t xml:space="preserve">and will be made public on acceptance.</w:t>
       </w:r>
     </w:p>
-    <w:bookmarkEnd w:id="37"/>
-    <w:bookmarkStart w:id="100" w:name="references"/>
+    <w:bookmarkEnd w:id="39"/>
+    <w:bookmarkStart w:id="102" w:name="references"/>
     <w:p>
       <w:pPr>
         <w:pStyle w:val="Heading1"/>
@@ -9774,8 +9786,8 @@
       <w:pPr>
         <w:pStyle w:val="FirstParagraph"/>
       </w:pPr>
-      <w:bookmarkStart w:id="38" w:name="refs"/>
-      <w:bookmarkEnd w:id="38"/>
+      <w:bookmarkStart w:id="40" w:name="refs"/>
+      <w:bookmarkEnd w:id="40"/>
     </w:p>
     <w:p>
       <w:pPr>
@@ -9900,7 +9912,7 @@
       <w:r>
         <w:t xml:space="preserve"> </w:t>
       </w:r>
-      <w:hyperlink r:id="rId39">
+      <w:hyperlink r:id="rId41">
         <w:r>
           <w:rPr>
             <w:rStyle w:val="Hyperlink"/>
@@ -9963,7 +9975,7 @@
       <w:r>
         <w:t xml:space="preserve"> </w:t>
       </w:r>
-      <w:hyperlink r:id="rId40">
+      <w:hyperlink r:id="rId42">
         <w:r>
           <w:rPr>
             <w:rStyle w:val="Hyperlink"/>
@@ -10008,7 +10020,7 @@
       <w:r>
         <w:t xml:space="preserve"> </w:t>
       </w:r>
-      <w:hyperlink r:id="rId41">
+      <w:hyperlink r:id="rId43">
         <w:r>
           <w:rPr>
             <w:rStyle w:val="Hyperlink"/>
@@ -10074,7 +10086,7 @@
       <w:r>
         <w:t xml:space="preserve"> </w:t>
       </w:r>
-      <w:hyperlink r:id="rId42">
+      <w:hyperlink r:id="rId44">
         <w:r>
           <w:rPr>
             <w:rStyle w:val="Hyperlink"/>
@@ -10148,7 +10160,7 @@
       <w:r>
         <w:t xml:space="preserve"> </w:t>
       </w:r>
-      <w:hyperlink r:id="rId43">
+      <w:hyperlink r:id="rId45">
         <w:r>
           <w:rPr>
             <w:rStyle w:val="Hyperlink"/>
@@ -10217,7 +10229,7 @@
       <w:r>
         <w:t xml:space="preserve"> </w:t>
       </w:r>
-      <w:hyperlink r:id="rId44">
+      <w:hyperlink r:id="rId46">
         <w:r>
           <w:rPr>
             <w:rStyle w:val="Hyperlink"/>
@@ -10332,7 +10344,7 @@
       <w:r>
         <w:t xml:space="preserve"> </w:t>
       </w:r>
-      <w:hyperlink r:id="rId45">
+      <w:hyperlink r:id="rId47">
         <w:r>
           <w:rPr>
             <w:rStyle w:val="Hyperlink"/>
@@ -10383,7 +10395,7 @@
       <w:r>
         <w:t xml:space="preserve"> </w:t>
       </w:r>
-      <w:hyperlink r:id="rId46">
+      <w:hyperlink r:id="rId48">
         <w:r>
           <w:rPr>
             <w:rStyle w:val="Hyperlink"/>
@@ -10442,7 +10454,7 @@
       <w:r>
         <w:t xml:space="preserve"> </w:t>
       </w:r>
-      <w:hyperlink r:id="rId47">
+      <w:hyperlink r:id="rId49">
         <w:r>
           <w:rPr>
             <w:rStyle w:val="Hyperlink"/>
@@ -10493,7 +10505,7 @@
       <w:r>
         <w:t xml:space="preserve"> </w:t>
       </w:r>
-      <w:hyperlink r:id="rId48">
+      <w:hyperlink r:id="rId50">
         <w:r>
           <w:rPr>
             <w:rStyle w:val="Hyperlink"/>
@@ -10534,7 +10546,7 @@
       <w:r>
         <w:t xml:space="preserve"> </w:t>
       </w:r>
-      <w:hyperlink r:id="rId49">
+      <w:hyperlink r:id="rId51">
         <w:r>
           <w:rPr>
             <w:rStyle w:val="Hyperlink"/>
@@ -10599,7 +10611,7 @@
       <w:r>
         <w:t xml:space="preserve"> </w:t>
       </w:r>
-      <w:hyperlink r:id="rId50">
+      <w:hyperlink r:id="rId52">
         <w:r>
           <w:rPr>
             <w:rStyle w:val="Hyperlink"/>
@@ -10654,7 +10666,7 @@
       <w:r>
         <w:t xml:space="preserve"> </w:t>
       </w:r>
-      <w:hyperlink r:id="rId51">
+      <w:hyperlink r:id="rId53">
         <w:r>
           <w:rPr>
             <w:rStyle w:val="Hyperlink"/>
@@ -10705,7 +10717,7 @@
       <w:r>
         <w:t xml:space="preserve"> </w:t>
       </w:r>
-      <w:hyperlink r:id="rId52">
+      <w:hyperlink r:id="rId54">
         <w:r>
           <w:rPr>
             <w:rStyle w:val="Hyperlink"/>
@@ -10756,7 +10768,7 @@
       <w:r>
         <w:t xml:space="preserve"> </w:t>
       </w:r>
-      <w:hyperlink r:id="rId53">
+      <w:hyperlink r:id="rId55">
         <w:r>
           <w:rPr>
             <w:rStyle w:val="Hyperlink"/>
@@ -10848,7 +10860,7 @@
       <w:r>
         <w:t xml:space="preserve"> </w:t>
       </w:r>
-      <w:hyperlink r:id="rId54">
+      <w:hyperlink r:id="rId56">
         <w:r>
           <w:rPr>
             <w:rStyle w:val="Hyperlink"/>
@@ -10899,7 +10911,7 @@
       <w:r>
         <w:t xml:space="preserve"> </w:t>
       </w:r>
-      <w:hyperlink r:id="rId55">
+      <w:hyperlink r:id="rId57">
         <w:r>
           <w:rPr>
             <w:rStyle w:val="Hyperlink"/>
@@ -10968,7 +10980,7 @@
       <w:r>
         <w:t xml:space="preserve"> </w:t>
       </w:r>
-      <w:hyperlink r:id="rId56">
+      <w:hyperlink r:id="rId58">
         <w:r>
           <w:rPr>
             <w:rStyle w:val="Hyperlink"/>
@@ -11033,7 +11045,7 @@
       <w:r>
         <w:t xml:space="preserve"> </w:t>
       </w:r>
-      <w:hyperlink r:id="rId57">
+      <w:hyperlink r:id="rId59">
         <w:r>
           <w:rPr>
             <w:rStyle w:val="Hyperlink"/>
@@ -11078,7 +11090,7 @@
       <w:r>
         <w:t xml:space="preserve"> </w:t>
       </w:r>
-      <w:hyperlink r:id="rId58">
+      <w:hyperlink r:id="rId60">
         <w:r>
           <w:rPr>
             <w:rStyle w:val="Hyperlink"/>
@@ -11143,7 +11155,7 @@
       <w:r>
         <w:t xml:space="preserve"> </w:t>
       </w:r>
-      <w:hyperlink r:id="rId59">
+      <w:hyperlink r:id="rId61">
         <w:r>
           <w:rPr>
             <w:rStyle w:val="Hyperlink"/>
@@ -11229,7 +11241,7 @@
       <w:r>
         <w:t xml:space="preserve"> </w:t>
       </w:r>
-      <w:hyperlink r:id="rId60">
+      <w:hyperlink r:id="rId62">
         <w:r>
           <w:rPr>
             <w:rStyle w:val="Hyperlink"/>
@@ -11280,7 +11292,7 @@
       <w:r>
         <w:t xml:space="preserve"> </w:t>
       </w:r>
-      <w:hyperlink r:id="rId61">
+      <w:hyperlink r:id="rId63">
         <w:r>
           <w:rPr>
             <w:rStyle w:val="Hyperlink"/>
@@ -11334,7 +11346,7 @@
       <w:r>
         <w:t xml:space="preserve"> </w:t>
       </w:r>
-      <w:hyperlink r:id="rId62">
+      <w:hyperlink r:id="rId64">
         <w:r>
           <w:rPr>
             <w:rStyle w:val="Hyperlink"/>
@@ -11394,7 +11406,7 @@
       <w:r>
         <w:t xml:space="preserve"> </w:t>
       </w:r>
-      <w:hyperlink r:id="rId63">
+      <w:hyperlink r:id="rId65">
         <w:r>
           <w:rPr>
             <w:rStyle w:val="Hyperlink"/>
@@ -11451,7 +11463,7 @@
       <w:r>
         <w:t xml:space="preserve"> </w:t>
       </w:r>
-      <w:hyperlink r:id="rId64">
+      <w:hyperlink r:id="rId66">
         <w:r>
           <w:rPr>
             <w:rStyle w:val="Hyperlink"/>
@@ -11525,7 +11537,7 @@
       <w:r>
         <w:t xml:space="preserve"> </w:t>
       </w:r>
-      <w:hyperlink r:id="rId65">
+      <w:hyperlink r:id="rId67">
         <w:r>
           <w:rPr>
             <w:rStyle w:val="Hyperlink"/>
@@ -11599,7 +11611,7 @@
       <w:r>
         <w:t xml:space="preserve"> </w:t>
       </w:r>
-      <w:hyperlink r:id="rId66">
+      <w:hyperlink r:id="rId68">
         <w:r>
           <w:rPr>
             <w:rStyle w:val="Hyperlink"/>
@@ -11673,7 +11685,7 @@
       <w:r>
         <w:t xml:space="preserve"> </w:t>
       </w:r>
-      <w:hyperlink r:id="rId67">
+      <w:hyperlink r:id="rId69">
         <w:r>
           <w:rPr>
             <w:rStyle w:val="Hyperlink"/>
@@ -11730,7 +11742,7 @@
       <w:r>
         <w:t xml:space="preserve"> </w:t>
       </w:r>
-      <w:hyperlink r:id="rId68">
+      <w:hyperlink r:id="rId70">
         <w:r>
           <w:rPr>
             <w:rStyle w:val="Hyperlink"/>
@@ -11861,7 +11873,7 @@
       <w:r>
         <w:t xml:space="preserve"> </w:t>
       </w:r>
-      <w:hyperlink r:id="rId69">
+      <w:hyperlink r:id="rId71">
         <w:r>
           <w:rPr>
             <w:rStyle w:val="Hyperlink"/>
@@ -11926,7 +11938,7 @@
       <w:r>
         <w:t xml:space="preserve"> </w:t>
       </w:r>
-      <w:hyperlink r:id="rId70">
+      <w:hyperlink r:id="rId72">
         <w:r>
           <w:rPr>
             <w:rStyle w:val="Hyperlink"/>
@@ -11977,7 +11989,7 @@
       <w:r>
         <w:t xml:space="preserve"> </w:t>
       </w:r>
-      <w:hyperlink r:id="rId71">
+      <w:hyperlink r:id="rId73">
         <w:r>
           <w:rPr>
             <w:rStyle w:val="Hyperlink"/>
@@ -12028,7 +12040,7 @@
       <w:r>
         <w:t xml:space="preserve"> </w:t>
       </w:r>
-      <w:hyperlink r:id="rId72">
+      <w:hyperlink r:id="rId74">
         <w:r>
           <w:rPr>
             <w:rStyle w:val="Hyperlink"/>
@@ -12093,7 +12105,7 @@
       <w:r>
         <w:t xml:space="preserve"> </w:t>
       </w:r>
-      <w:hyperlink r:id="rId73">
+      <w:hyperlink r:id="rId75">
         <w:r>
           <w:rPr>
             <w:rStyle w:val="Hyperlink"/>
@@ -12153,7 +12165,7 @@
       <w:r>
         <w:t xml:space="preserve"> </w:t>
       </w:r>
-      <w:hyperlink r:id="rId74">
+      <w:hyperlink r:id="rId76">
         <w:r>
           <w:rPr>
             <w:rStyle w:val="Hyperlink"/>
@@ -12218,7 +12230,7 @@
       <w:r>
         <w:t xml:space="preserve"> </w:t>
       </w:r>
-      <w:hyperlink r:id="rId75">
+      <w:hyperlink r:id="rId77">
         <w:r>
           <w:rPr>
             <w:rStyle w:val="Hyperlink"/>
@@ -12278,7 +12290,7 @@
       <w:r>
         <w:t xml:space="preserve"> </w:t>
       </w:r>
-      <w:hyperlink r:id="rId76">
+      <w:hyperlink r:id="rId78">
         <w:r>
           <w:rPr>
             <w:rStyle w:val="Hyperlink"/>
@@ -12335,7 +12347,7 @@
       <w:r>
         <w:t xml:space="preserve"> </w:t>
       </w:r>
-      <w:hyperlink r:id="rId77">
+      <w:hyperlink r:id="rId79">
         <w:r>
           <w:rPr>
             <w:rStyle w:val="Hyperlink"/>
@@ -12395,7 +12407,7 @@
       <w:r>
         <w:t xml:space="preserve"> </w:t>
       </w:r>
-      <w:hyperlink r:id="rId78">
+      <w:hyperlink r:id="rId80">
         <w:r>
           <w:rPr>
             <w:rStyle w:val="Hyperlink"/>
@@ -12456,7 +12468,7 @@
       <w:r>
         <w:t xml:space="preserve"> </w:t>
       </w:r>
-      <w:hyperlink r:id="rId79">
+      <w:hyperlink r:id="rId81">
         <w:r>
           <w:rPr>
             <w:rStyle w:val="Hyperlink"/>
@@ -12555,7 +12567,7 @@
       <w:r>
         <w:t xml:space="preserve"> </w:t>
       </w:r>
-      <w:hyperlink r:id="rId80">
+      <w:hyperlink r:id="rId82">
         <w:r>
           <w:rPr>
             <w:rStyle w:val="Hyperlink"/>
@@ -12629,7 +12641,7 @@
       <w:r>
         <w:t xml:space="preserve"> </w:t>
       </w:r>
-      <w:hyperlink r:id="rId81">
+      <w:hyperlink r:id="rId83">
         <w:r>
           <w:rPr>
             <w:rStyle w:val="Hyperlink"/>
@@ -12680,7 +12692,7 @@
       <w:r>
         <w:t xml:space="preserve"> </w:t>
       </w:r>
-      <w:hyperlink r:id="rId82">
+      <w:hyperlink r:id="rId84">
         <w:r>
           <w:rPr>
             <w:rStyle w:val="Hyperlink"/>
@@ -12817,7 +12829,7 @@
       <w:r>
         <w:t xml:space="preserve"> </w:t>
       </w:r>
-      <w:hyperlink r:id="rId83">
+      <w:hyperlink r:id="rId85">
         <w:r>
           <w:rPr>
             <w:rStyle w:val="Hyperlink"/>
@@ -12868,7 +12880,7 @@
       <w:r>
         <w:t xml:space="preserve"> </w:t>
       </w:r>
-      <w:hyperlink r:id="rId84">
+      <w:hyperlink r:id="rId86">
         <w:r>
           <w:rPr>
             <w:rStyle w:val="Hyperlink"/>
@@ -12925,7 +12937,7 @@
       <w:r>
         <w:t xml:space="preserve"> </w:t>
       </w:r>
-      <w:hyperlink r:id="rId85">
+      <w:hyperlink r:id="rId87">
         <w:r>
           <w:rPr>
             <w:rStyle w:val="Hyperlink"/>
@@ -12976,7 +12988,7 @@
       <w:r>
         <w:t xml:space="preserve"> </w:t>
       </w:r>
-      <w:hyperlink r:id="rId86">
+      <w:hyperlink r:id="rId88">
         <w:r>
           <w:rPr>
             <w:rStyle w:val="Hyperlink"/>
@@ -13053,7 +13065,7 @@
       <w:r>
         <w:t xml:space="preserve"> </w:t>
       </w:r>
-      <w:hyperlink r:id="rId87">
+      <w:hyperlink r:id="rId89">
         <w:r>
           <w:rPr>
             <w:rStyle w:val="Hyperlink"/>
@@ -13104,7 +13116,7 @@
       <w:r>
         <w:t xml:space="preserve"> </w:t>
       </w:r>
-      <w:hyperlink r:id="rId88">
+      <w:hyperlink r:id="rId90">
         <w:r>
           <w:rPr>
             <w:rStyle w:val="Hyperlink"/>
@@ -13155,7 +13167,7 @@
       <w:r>
         <w:t xml:space="preserve"> </w:t>
       </w:r>
-      <w:hyperlink r:id="rId89">
+      <w:hyperlink r:id="rId91">
         <w:r>
           <w:rPr>
             <w:rStyle w:val="Hyperlink"/>
@@ -13215,7 +13227,7 @@
       <w:r>
         <w:t xml:space="preserve"> </w:t>
       </w:r>
-      <w:hyperlink r:id="rId90">
+      <w:hyperlink r:id="rId92">
         <w:r>
           <w:rPr>
             <w:rStyle w:val="Hyperlink"/>
@@ -13368,7 +13380,7 @@
       <w:r>
         <w:t xml:space="preserve"> </w:t>
       </w:r>
-      <w:hyperlink r:id="rId91">
+      <w:hyperlink r:id="rId93">
         <w:r>
           <w:rPr>
             <w:rStyle w:val="Hyperlink"/>
@@ -13419,7 +13431,7 @@
       <w:r>
         <w:t xml:space="preserve"> </w:t>
       </w:r>
-      <w:hyperlink r:id="rId92">
+      <w:hyperlink r:id="rId94">
         <w:r>
           <w:rPr>
             <w:rStyle w:val="Hyperlink"/>
@@ -13497,7 +13509,7 @@
       <w:r>
         <w:t xml:space="preserve"> </w:t>
       </w:r>
-      <w:hyperlink r:id="rId93">
+      <w:hyperlink r:id="rId95">
         <w:r>
           <w:rPr>
             <w:rStyle w:val="Hyperlink"/>
@@ -13669,7 +13681,7 @@
       <w:r>
         <w:t xml:space="preserve"> </w:t>
       </w:r>
-      <w:hyperlink r:id="rId94">
+      <w:hyperlink r:id="rId96">
         <w:r>
           <w:rPr>
             <w:rStyle w:val="Hyperlink"/>
@@ -13780,7 +13792,7 @@
       <w:r>
         <w:t xml:space="preserve"> </w:t>
       </w:r>
-      <w:hyperlink r:id="rId95">
+      <w:hyperlink r:id="rId97">
         <w:r>
           <w:rPr>
             <w:rStyle w:val="Hyperlink"/>
@@ -13855,7 +13867,7 @@
       <w:r>
         <w:t xml:space="preserve"> </w:t>
       </w:r>
-      <w:hyperlink r:id="rId96">
+      <w:hyperlink r:id="rId98">
         <w:r>
           <w:rPr>
             <w:rStyle w:val="Hyperlink"/>
@@ -13912,7 +13924,7 @@
       <w:r>
         <w:t xml:space="preserve"> </w:t>
       </w:r>
-      <w:hyperlink r:id="rId97">
+      <w:hyperlink r:id="rId99">
         <w:r>
           <w:rPr>
             <w:rStyle w:val="Hyperlink"/>
@@ -13963,7 +13975,7 @@
       <w:r>
         <w:t xml:space="preserve"> </w:t>
       </w:r>
-      <w:hyperlink r:id="rId98">
+      <w:hyperlink r:id="rId100">
         <w:r>
           <w:rPr>
             <w:rStyle w:val="Hyperlink"/>
@@ -14078,7 +14090,7 @@
       <w:r>
         <w:t xml:space="preserve"> </w:t>
       </w:r>
-      <w:hyperlink r:id="rId99">
+      <w:hyperlink r:id="rId101">
         <w:r>
           <w:rPr>
             <w:rStyle w:val="Hyperlink"/>
@@ -14087,7 +14099,7 @@
         </w:r>
       </w:hyperlink>
     </w:p>
-    <w:bookmarkEnd w:id="100"/>
+    <w:bookmarkEnd w:id="102"/>
     <w:sectPr>
       <w:footnotePr>
         <w:numRestart w:val="eachSect"/>
@@ -14115,6 +14127,39 @@
     <w:p>
       <w:r>
         <w:separator/>
+      </w:r>
+    </w:p>
+  </w:footnote>
+  <w:footnote w:id="37">
+    <w:p>
+      <w:pPr>
+        <w:pStyle w:val="FootnoteText"/>
+      </w:pPr>
+      <w:r>
+        <w:rPr>
+          <w:rStyle w:val="FootnoteReference"/>
+        </w:rPr>
+        <w:footnoteRef/>
+      </w:r>
+      <w:r>
+        <w:t xml:space="preserve"> </w:t>
+      </w:r>
+      <w:hyperlink r:id="rId38">
+        <w:r>
+          <w:rPr>
+            <w:rStyle w:val="Hyperlink"/>
+          </w:rPr>
+          <w:t xml:space="preserve">https://microdata.gov.in</w:t>
+        </w:r>
+      </w:hyperlink>
+      <w:r>
+        <w:t xml:space="preserve">, catalog entry 236;</w:t>
+      </w:r>
+      <w:r>
+        <w:t xml:space="preserve"> </w:t>
+      </w:r>
+      <w:r>
+        <w:t xml:space="preserve">accessed 17 October 2026.</w:t>
       </w:r>
     </w:p>
   </w:footnote>

</xml_diff>

<commit_message>
05: rebuild PDF, supplement and docx (numbered table captions Table 1 to Table 4, Jose and Dutta citation, AI wording)
</commit_message>
<xml_diff>
--- a/submission/05_marriage_time_reallocation/package/manuscript_anonymised.docx
+++ b/submission/05_marriage_time_reallocation/package/manuscript_anonymised.docx
@@ -1093,25 +1093,25 @@
         <w:t xml:space="preserve"> </w:t>
       </w:r>
       <w:r>
-        <w:t xml:space="preserve">earnings imputed from the Periodic Labour Force Survey</w:t>
-      </w:r>
-      <w:r>
-        <w:t xml:space="preserve"> </w:t>
-      </w:r>
-      <w:r>
-        <w:t xml:space="preserve">(Jose &amp; Dutta, 2026), and Akerlof &amp;</w:t>
-      </w:r>
-      <w:r>
-        <w:t xml:space="preserve"> </w:t>
-      </w:r>
-      <w:r>
-        <w:t xml:space="preserve">Kranton (2000) formalize the idea as</w:t>
-      </w:r>
-      <w:r>
-        <w:t xml:space="preserve"> </w:t>
-      </w:r>
-      <w:r>
-        <w:t xml:space="preserve">identity. The evidence is contested</w:t>
+        <w:t xml:space="preserve">relative earnings classified by a model trained on the Periodic Labour</w:t>
+      </w:r>
+      <w:r>
+        <w:t xml:space="preserve"> </w:t>
+      </w:r>
+      <w:r>
+        <w:t xml:space="preserve">Force Survey (Jose &amp; Dutta, 2026), and</w:t>
+      </w:r>
+      <w:r>
+        <w:t xml:space="preserve"> </w:t>
+      </w:r>
+      <w:r>
+        <w:t xml:space="preserve">Akerlof &amp; Kranton (2000) formalize</w:t>
+      </w:r>
+      <w:r>
+        <w:t xml:space="preserve"> </w:t>
+      </w:r>
+      <w:r>
+        <w:t xml:space="preserve">the idea as identity. The evidence is contested</w:t>
       </w:r>
       <w:r>
         <w:t xml:space="preserve"> </w:t>
@@ -3354,7 +3354,7 @@
         <w:pStyle w:val="TableCaption"/>
       </w:pPr>
       <w:r>
-        <w:t xml:space="preserve">Weighted means by sex and marital status, ages 20–39</w:t>
+        <w:t>Table 1: Weighted means by sex and marital status, ages 20–39</w:t>
       </w:r>
     </w:p>
     <w:tbl>
@@ -4546,7 +4546,7 @@
         <w:pStyle w:val="TableCaption"/>
       </w:pPr>
       <w:r>
-        <w:t xml:space="preserve">Married minus never-married, minutes per day, ages 20–39</w:t>
+        <w:t>Table 2: Married minus never-married, minutes per day, ages 20–39</w:t>
       </w:r>
     </w:p>
     <w:tbl>
@@ -5927,7 +5927,7 @@
         <w:pStyle w:val="TableCaption"/>
       </w:pPr>
       <w:r>
-        <w:t xml:space="preserve">Women: married minus never-married under alternative treatments of selection, minutes per day</w:t>
+        <w:t>Table 3: Women: married minus never-married under alternative treatments of selection, minutes per day</w:t>
       </w:r>
     </w:p>
     <w:tbl>
@@ -7303,7 +7303,7 @@
         <w:pStyle w:val="TableCaption"/>
       </w:pPr>
       <w:r>
-        <w:t xml:space="preserve">Within-couple gaps, linked couples with wives aged 20–59</w:t>
+        <w:t>Table 4: Within-couple gaps, linked couples with wives aged 20–59</w:t>
       </w:r>
     </w:p>
     <w:tbl>
@@ -9615,25 +9615,31 @@
         <w:pStyle w:val="FirstParagraph"/>
       </w:pPr>
       <w:r>
-        <w:t xml:space="preserve">Generative AI tools (Claude, Anthropic) were used to assist with writing</w:t>
-      </w:r>
-      <w:r>
-        <w:t xml:space="preserve"> </w:t>
-      </w:r>
-      <w:r>
-        <w:t xml:space="preserve">and debugging analysis code, checking references, and drafting and</w:t>
-      </w:r>
-      <w:r>
-        <w:t xml:space="preserve"> </w:t>
-      </w:r>
-      <w:r>
-        <w:t xml:space="preserve">editing text. The author reviewed and verified all analyses, results,</w:t>
-      </w:r>
-      <w:r>
-        <w:t xml:space="preserve"> </w:t>
-      </w:r>
-      <w:r>
-        <w:t xml:space="preserve">and text, and takes full responsibility for the content.</w:t>
+        <w:t xml:space="preserve">Generative AI tools (Claude, Anthropic, and other tools) were used to</w:t>
+      </w:r>
+      <w:r>
+        <w:t xml:space="preserve"> </w:t>
+      </w:r>
+      <w:r>
+        <w:t xml:space="preserve">assist with writing and debugging analysis code, checking references,</w:t>
+      </w:r>
+      <w:r>
+        <w:t xml:space="preserve"> </w:t>
+      </w:r>
+      <w:r>
+        <w:t xml:space="preserve">and drafting and editing text. The author reviewed and verified all</w:t>
+      </w:r>
+      <w:r>
+        <w:t xml:space="preserve"> </w:t>
+      </w:r>
+      <w:r>
+        <w:t xml:space="preserve">analyses, results, and text, and takes full responsibility for the</w:t>
+      </w:r>
+      <w:r>
+        <w:t xml:space="preserve"> </w:t>
+      </w:r>
+      <w:r>
+        <w:t xml:space="preserve">content.</w:t>
       </w:r>
     </w:p>
     <w:bookmarkEnd w:id="36"/>
@@ -12463,7 +12469,7 @@
         <w:t xml:space="preserve">Review</w:t>
       </w:r>
       <w:r>
-        <w:t xml:space="preserve">, 1–30.</w:t>
+        <w:t xml:space="preserve">.</w:t>
       </w:r>
       <w:r>
         <w:t xml:space="preserve"> </w:t>

</xml_diff>